<commit_message>
updated intro and part 1
</commit_message>
<xml_diff>
--- a/my_report/Thesis_Report_English.docx
+++ b/my_report/Thesis_Report_English.docx
@@ -174,7 +174,7 @@
                                     <pic:cNvPicPr/>
                                   </pic:nvPicPr>
                                   <pic:blipFill>
-                                    <a:blip r:embed="rId9">
+                                    <a:blip r:embed="rId8">
                                       <a:extLst>
                                         <a:ext uri="{28A0092B-C50C-407E-A947-70E740481C1C}">
                                           <a14:useLocalDpi xmlns:a14="http://schemas.microsoft.com/office/drawing/2010/main" val="0"/>
@@ -238,7 +238,7 @@
                     <pic:cNvPicPr/>
                   </pic:nvPicPr>
                   <pic:blipFill>
-                    <a:blip r:embed="rId10" cstate="print">
+                    <a:blip r:embed="rId9" cstate="print">
                       <a:extLst>
                         <a:ext uri="{28A0092B-C50C-407E-A947-70E740481C1C}">
                           <a14:useLocalDpi xmlns:a14="http://schemas.microsoft.com/office/drawing/2010/main" val="0"/>
@@ -567,7 +567,7 @@
           <w:b/>
         </w:rPr>
         <w:sectPr>
-          <w:headerReference w:type="default" r:id="rId11"/>
+          <w:headerReference w:type="default" r:id="rId10"/>
           <w:pgSz w:w="11906" w:h="16838"/>
           <w:pgMar w:top="1417" w:right="1417" w:bottom="1417" w:left="1417" w:header="708" w:footer="708" w:gutter="0"/>
           <w:cols w:space="708"/>
@@ -5514,7 +5514,7 @@
           <w:szCs w:val="24"/>
           <w:lang w:val="en-US"/>
         </w:rPr>
-        <w:t>Foreign language teaching has evolved from grammar-translation methods emphasizing memorization and accuracy toward communicative approaches prioritizing authentic interaction</w:t>
+        <w:t>L</w:t>
       </w:r>
       <w:r>
         <w:rPr>
@@ -5523,18 +5523,17 @@
           <w:szCs w:val="24"/>
           <w:lang w:val="en-US"/>
         </w:rPr>
-        <w:t>.</w:t>
-      </w:r>
-    </w:p>
-    <w:p>
-      <w:pPr>
+        <w:t xml:space="preserve">anguage teaching has </w:t>
+      </w:r>
+      <w:r>
         <w:rPr>
           <w:rFonts w:ascii="Times New Roman" w:hAnsi="Times New Roman" w:cs="Times New Roman"/>
           <w:sz w:val="24"/>
           <w:szCs w:val="24"/>
           <w:lang w:val="en-US"/>
         </w:rPr>
-      </w:pPr>
+        <w:t xml:space="preserve">transitioned </w:t>
+      </w:r>
       <w:r>
         <w:rPr>
           <w:rFonts w:ascii="Times New Roman" w:hAnsi="Times New Roman" w:cs="Times New Roman"/>
@@ -5542,7 +5541,7 @@
           <w:szCs w:val="24"/>
           <w:lang w:val="en-US"/>
         </w:rPr>
-        <w:t xml:space="preserve">As T. Pica </w:t>
+        <w:t>from grammar-translation methods</w:t>
       </w:r>
       <w:r>
         <w:rPr>
@@ -5551,7 +5550,7 @@
           <w:szCs w:val="24"/>
           <w:lang w:val="en-US"/>
         </w:rPr>
-        <w:fldChar w:fldCharType="begin"/>
+        <w:t xml:space="preserve"> focusing on </w:t>
       </w:r>
       <w:r>
         <w:rPr>
@@ -5560,7 +5559,34 @@
           <w:szCs w:val="24"/>
           <w:lang w:val="en-US"/>
         </w:rPr>
-        <w:instrText xml:space="preserve"> ADDIN ZOTERO_ITEM CSL_CITATION {"citationID":"HBxM8tMv","properties":{"unsorted":false,"formattedCitation":"(Pica, 2000)","plainCitation":"(Pica, 2000)","noteIndex":0},"citationItems":[{"id":147,"uris":["http://zotero.org/users/18489330/items/YFVUT5VI"],"itemData":{"id":147,"type":"article-journal","abstract":"The field of English language teaching is in transition, as it seeks new approaches, and re-examines older ones, in order to address the range and level of English proficiency required for participation in today's global community. This article describes the context of the transitional period, discusses the contributions of second language acquisition theory and research therein, and reviews classroom principles and related techniques that have already emerged.","container-title":"System","DOI":"10.1016/S0346-251X(99)00057-3","ISSN":"0346-251X","issue":"1","journalAbbreviation":"System","page":"1-18","source":"ScienceDirect","title":"Tradition and transition in English language teaching methodology1","volume":"28","author":[{"family":"Pica","given":"T."}],"issued":{"date-parts":[["2000",3,1]]}}}],"schema":"https://github.com/citation-style-language/schema/raw/master/csl-citation.json"} </w:instrText>
+        <w:t xml:space="preserve"> memorization and accuracy toward communicative approaches prioritizing authentic interaction</w:t>
+      </w:r>
+      <w:r>
+        <w:rPr>
+          <w:rFonts w:ascii="Times New Roman" w:hAnsi="Times New Roman" w:cs="Times New Roman"/>
+          <w:sz w:val="24"/>
+          <w:szCs w:val="24"/>
+          <w:lang w:val="en-US"/>
+        </w:rPr>
+        <w:t xml:space="preserve"> </w:t>
+      </w:r>
+      <w:r>
+        <w:rPr>
+          <w:rFonts w:ascii="Times New Roman" w:hAnsi="Times New Roman" w:cs="Times New Roman"/>
+          <w:sz w:val="24"/>
+          <w:szCs w:val="24"/>
+          <w:lang w:val="en-US"/>
+        </w:rPr>
+        <w:fldChar w:fldCharType="begin"/>
+      </w:r>
+      <w:r>
+        <w:rPr>
+          <w:rFonts w:ascii="Times New Roman" w:hAnsi="Times New Roman" w:cs="Times New Roman"/>
+          <w:sz w:val="24"/>
+          <w:szCs w:val="24"/>
+          <w:lang w:val="en-US"/>
+        </w:rPr>
+        <w:instrText xml:space="preserve"> ADDIN ZOTERO_ITEM CSL_CITATION {"citationID":"DAl51j53","properties":{"unsorted":false,"formattedCitation":"(Richards &amp; Rodgers, 2014)","plainCitation":"(Richards &amp; Rodgers, 2014)","noteIndex":0},"citationItems":[{"id":149,"uris":["http://zotero.org/users/18489330/items/AVDZ9PE3"],"itemData":{"id":149,"type":"book","abstract":"This third edition of Approaches and Methods in Language Teaching is an extensive revision of the popular and accessible text. Like previous editions, this book surveys the major approaches and methods in language teaching such as Grammar Translation, Audiolingualism, Communicative Language Teaching, and the Natural Approach. It examines each approach and method in terms of its theory of language and language learning, goals, syllabus, teaching activities, teacher and learner roles, materials, and classroom techniques. --","ISBN":"978-1-107-67596-4","language":"en","note":"Google-Books-ID: HrhkAwAAQBAJ","number-of-pages":"421","publisher":"Cambridge University Press","source":"Google Books","title":"Approaches and Methods in Language Teaching","author":[{"family":"Richards","given":"Jack C."},{"family":"Rodgers","given":"Theodore S."}],"issued":{"date-parts":[["2014",4,16]]}}}],"schema":"https://github.com/citation-style-language/schema/raw/master/csl-citation.json"} </w:instrText>
       </w:r>
       <w:r>
         <w:rPr>
@@ -5579,7 +5605,7 @@
           <w:szCs w:val="24"/>
           <w:lang w:val="en-US"/>
         </w:rPr>
-        <w:t>(Pica, 2000)</w:t>
+        <w:t>(Richards &amp; Rodgers, 2014)</w:t>
       </w:r>
       <w:r>
         <w:rPr>
@@ -5597,35 +5623,27 @@
           <w:szCs w:val="24"/>
           <w:lang w:val="en-US"/>
         </w:rPr>
-        <w:t xml:space="preserve"> discusses the changes that occur in English language teaching, one can identify the several important moments in the transformation that eventually created a pathway to the modern foreign language teaching practices today.</w:t>
-      </w:r>
-      <w:r>
+        <w:t xml:space="preserve">. </w:t>
+      </w:r>
+    </w:p>
+    <w:p>
+      <w:pPr>
         <w:rPr>
           <w:rFonts w:ascii="Times New Roman" w:hAnsi="Times New Roman" w:cs="Times New Roman"/>
           <w:sz w:val="24"/>
           <w:szCs w:val="24"/>
           <w:lang w:val="en-US"/>
         </w:rPr>
-        <w:br/>
-      </w:r>
-    </w:p>
-    <w:p>
-      <w:pPr>
-        <w:pStyle w:val="Heading2"/>
-      </w:pPr>
-      <w:r>
-        <w:t>Teacher Perspective Before AI</w:t>
-      </w:r>
-    </w:p>
-    <w:p>
-      <w:pPr>
+      </w:pPr>
+      <w:r>
         <w:rPr>
           <w:rFonts w:ascii="Times New Roman" w:hAnsi="Times New Roman" w:cs="Times New Roman"/>
           <w:sz w:val="24"/>
           <w:szCs w:val="24"/>
           <w:lang w:val="en-US"/>
         </w:rPr>
-      </w:pPr>
+        <w:t>However, regardless of the pedagogical approach, one constant remains: teachers must translate these methodological principles into concrete</w:t>
+      </w:r>
       <w:r>
         <w:rPr>
           <w:rFonts w:ascii="Times New Roman" w:hAnsi="Times New Roman" w:cs="Times New Roman"/>
@@ -5633,7 +5651,7 @@
           <w:szCs w:val="24"/>
           <w:lang w:val="en-US"/>
         </w:rPr>
-        <w:t xml:space="preserve">Traditional </w:t>
+        <w:t xml:space="preserve"> </w:t>
       </w:r>
       <w:r>
         <w:rPr>
@@ -5642,7 +5660,7 @@
           <w:szCs w:val="24"/>
           <w:lang w:val="en-US"/>
         </w:rPr>
-        <w:t xml:space="preserve">language </w:t>
+        <w:t>classroom</w:t>
       </w:r>
       <w:r>
         <w:rPr>
@@ -5651,7 +5669,7 @@
           <w:szCs w:val="24"/>
           <w:lang w:val="en-US"/>
         </w:rPr>
-        <w:t xml:space="preserve">education </w:t>
+        <w:t xml:space="preserve"> </w:t>
       </w:r>
       <w:r>
         <w:rPr>
@@ -5660,7 +5678,7 @@
           <w:szCs w:val="24"/>
           <w:lang w:val="en-US"/>
         </w:rPr>
-        <w:t>is known to follow a</w:t>
+        <w:t>practice through lesson</w:t>
       </w:r>
       <w:r>
         <w:rPr>
@@ -5669,9 +5687,8 @@
           <w:szCs w:val="24"/>
           <w:lang w:val="en-US"/>
         </w:rPr>
-        <w:t xml:space="preserve"> teacher-</w:t>
-      </w:r>
-      <w:proofErr w:type="spellStart"/>
+        <w:t xml:space="preserve"> </w:t>
+      </w:r>
       <w:r>
         <w:rPr>
           <w:rFonts w:ascii="Times New Roman" w:hAnsi="Times New Roman" w:cs="Times New Roman"/>
@@ -5679,9 +5696,8 @@
           <w:szCs w:val="24"/>
           <w:lang w:val="en-US"/>
         </w:rPr>
-        <w:t>centred</w:t>
-      </w:r>
-      <w:proofErr w:type="spellEnd"/>
+        <w:t>planning.</w:t>
+      </w:r>
       <w:r>
         <w:rPr>
           <w:rFonts w:ascii="Times New Roman" w:hAnsi="Times New Roman" w:cs="Times New Roman"/>
@@ -5689,17 +5705,40 @@
           <w:szCs w:val="24"/>
           <w:lang w:val="en-US"/>
         </w:rPr>
-        <w:t xml:space="preserve"> approach</w:t>
-      </w:r>
-      <w:r>
+        <w:br/>
+      </w:r>
+    </w:p>
+    <w:p>
+      <w:pPr>
+        <w:jc w:val="center"/>
+        <w:rPr>
+          <w:rFonts w:eastAsiaTheme="majorEastAsia" w:cstheme="majorBidi"/>
+          <w:smallCaps/>
+          <w:sz w:val="36"/>
+          <w:szCs w:val="26"/>
+          <w:lang w:val="en-US"/>
+        </w:rPr>
+      </w:pPr>
+      <w:r>
+        <w:rPr>
+          <w:rFonts w:eastAsiaTheme="majorEastAsia" w:cstheme="majorBidi"/>
+          <w:smallCaps/>
+          <w:sz w:val="36"/>
+          <w:szCs w:val="26"/>
+          <w:lang w:val="en-US"/>
+        </w:rPr>
+        <w:t>TEACHER PERSPECTIVE BEFORE AI</w:t>
+      </w:r>
+    </w:p>
+    <w:p>
+      <w:pPr>
         <w:rPr>
           <w:rFonts w:ascii="Times New Roman" w:hAnsi="Times New Roman" w:cs="Times New Roman"/>
           <w:sz w:val="24"/>
           <w:szCs w:val="24"/>
           <w:lang w:val="en-US"/>
         </w:rPr>
-        <w:t>, putting much emphasis on</w:t>
-      </w:r>
+      </w:pPr>
       <w:r>
         <w:rPr>
           <w:rFonts w:ascii="Times New Roman" w:hAnsi="Times New Roman" w:cs="Times New Roman"/>
@@ -5707,8 +5746,9 @@
           <w:szCs w:val="24"/>
           <w:lang w:val="en-US"/>
         </w:rPr>
-        <w:t xml:space="preserve"> </w:t>
-      </w:r>
+        <w:t xml:space="preserve">Regardless of the pedagogical approach, whether grammar-translation, communicative or any other, the methods were not </w:t>
+      </w:r>
+      <w:proofErr w:type="spellStart"/>
       <w:r>
         <w:rPr>
           <w:rFonts w:ascii="Times New Roman" w:hAnsi="Times New Roman" w:cs="Times New Roman"/>
@@ -5716,8 +5756,9 @@
           <w:szCs w:val="24"/>
           <w:lang w:val="en-US"/>
         </w:rPr>
-        <w:t>literary translations,</w:t>
-      </w:r>
+        <w:t>self executing</w:t>
+      </w:r>
+      <w:proofErr w:type="spellEnd"/>
       <w:r>
         <w:rPr>
           <w:rFonts w:ascii="Times New Roman" w:hAnsi="Times New Roman" w:cs="Times New Roman"/>
@@ -5725,7 +5766,7 @@
           <w:szCs w:val="24"/>
           <w:lang w:val="en-US"/>
         </w:rPr>
-        <w:t xml:space="preserve"> mandatory</w:t>
+        <w:t xml:space="preserve">. Teachers had to translate the methodological principles into sensible instructional sequences, lesson plans and classroom activities. This process place considerable responsibility on the teachers, work they usually performed outside of their classroom time. </w:t>
       </w:r>
       <w:r>
         <w:rPr>
@@ -5734,7 +5775,7 @@
           <w:szCs w:val="24"/>
           <w:lang w:val="en-US"/>
         </w:rPr>
-        <w:t xml:space="preserve"> </w:t>
+        <w:t>Lesson preparation thus became a cognitive and time-intensive process shaped by teachers' beliefs, experience, and interpretations of classroom contexts</w:t>
       </w:r>
       <w:r>
         <w:rPr>
@@ -5743,7 +5784,7 @@
           <w:szCs w:val="24"/>
           <w:lang w:val="en-US"/>
         </w:rPr>
-        <w:t xml:space="preserve">grammatical instructions, memorization </w:t>
+        <w:t xml:space="preserve"> </w:t>
       </w:r>
       <w:r>
         <w:rPr>
@@ -5752,7 +5793,7 @@
           <w:szCs w:val="24"/>
           <w:lang w:val="en-US"/>
         </w:rPr>
-        <w:t>and repetition</w:t>
+        <w:fldChar w:fldCharType="begin"/>
       </w:r>
       <w:r>
         <w:rPr>
@@ -5761,25 +5802,7 @@
           <w:szCs w:val="24"/>
           <w:lang w:val="en-US"/>
         </w:rPr>
-        <w:t xml:space="preserve"> </w:t>
-      </w:r>
-      <w:r>
-        <w:rPr>
-          <w:rFonts w:ascii="Times New Roman" w:hAnsi="Times New Roman" w:cs="Times New Roman"/>
-          <w:sz w:val="24"/>
-          <w:szCs w:val="24"/>
-          <w:lang w:val="en-US"/>
-        </w:rPr>
-        <w:fldChar w:fldCharType="begin"/>
-      </w:r>
-      <w:r>
-        <w:rPr>
-          <w:rFonts w:ascii="Times New Roman" w:hAnsi="Times New Roman" w:cs="Times New Roman"/>
-          <w:sz w:val="24"/>
-          <w:szCs w:val="24"/>
-          <w:lang w:val="en-US"/>
-        </w:rPr>
-        <w:instrText xml:space="preserve"> ADDIN ZOTERO_ITEM CSL_CITATION {"citationID":"pWni6ITm","properties":{"unsorted":false,"formattedCitation":"(Richards &amp; Rodgers, 2014)","plainCitation":"(Richards &amp; Rodgers, 2014)","noteIndex":0},"citationItems":[{"id":149,"uris":["http://zotero.org/users/18489330/items/AVDZ9PE3"],"itemData":{"id":149,"type":"book","abstract":"This third edition of Approaches and Methods in Language Teaching is an extensive revision of the popular and accessible text. Like previous editions, this book surveys the major approaches and methods in language teaching such as Grammar Translation, Audiolingualism, Communicative Language Teaching, and the Natural Approach. It examines each approach and method in terms of its theory of language and language learning, goals, syllabus, teaching activities, teacher and learner roles, materials, and classroom techniques. --","ISBN":"978-1-107-67596-4","language":"en","note":"Google-Books-ID: HrhkAwAAQBAJ","number-of-pages":"421","publisher":"Cambridge University Press","source":"Google Books","title":"Approaches and Methods in Language Teaching","author":[{"family":"Richards","given":"Jack C."},{"family":"Rodgers","given":"Theodore S."}],"issued":{"date-parts":[["2014",4,16]]}}}],"schema":"https://github.com/citation-style-language/schema/raw/master/csl-citation.json"} </w:instrText>
+        <w:instrText xml:space="preserve"> ADDIN ZOTERO_ITEM CSL_CITATION {"citationID":"uBTRXVhy","properties":{"unsorted":false,"formattedCitation":"(Borg, 2003)","plainCitation":"(Borg, 2003)","noteIndex":0},"citationItems":[{"id":151,"uris":["http://zotero.org/users/18489330/items/QSTLSCIW"],"itemData":{"id":151,"type":"article-journal","abstract":"This paper reviews a selection of research from the field of foreign and second language teaching into what is referred to here as teacher cognition – what teachers think, know, and believe and the relationships of these mental constructs to what teachers do in the language teaching classroom. Within a framework suggested by more general mainstream educational research on teacher cognition, language teacher cognition is here discussed with reference to three main themes: (1) cognition and prior language learning experience, (2) cognition and teacher education, and (3) cognition and classroom practice. In addition, the findings of studies into two specific curricular areas in language teaching which have been examined by teacher cognition – grammar teaching and literacy – are discussed. This review indicates that, while the study of teacher cognition has established itself on the research agenda in the field of language teaching and provided valuable insight into the mental lives of language teachers, a clear sense of unity is lacking in the work and there are several major issues in language teaching which have yet to be explored from the perspective of teacher cognition.","container-title":"Language Teaching","DOI":"10.1017/S0261444803001903","ISSN":"1475-3049, 0261-4448","issue":"2","language":"en","page":"81-109","source":"Cambridge University Press","title":"Teacher cognition in language teaching: A review of research on what language teachers think, know, believe, and do","title-short":"Teacher cognition in language teaching","volume":"36","author":[{"family":"Borg","given":"Simon"}],"issued":{"date-parts":[["2003",4]]}}}],"schema":"https://github.com/citation-style-language/schema/raw/master/csl-citation.json"} </w:instrText>
       </w:r>
       <w:r>
         <w:rPr>
@@ -5798,7 +5821,7 @@
           <w:szCs w:val="24"/>
           <w:lang w:val="en-US"/>
         </w:rPr>
-        <w:t>(Richards &amp; Rodgers, 2014)</w:t>
+        <w:t>(Borg, 2003)</w:t>
       </w:r>
       <w:r>
         <w:rPr>
@@ -5825,304 +5848,7 @@
           <w:szCs w:val="24"/>
           <w:lang w:val="en-US"/>
         </w:rPr>
-        <w:t xml:space="preserve">This required prioritization of linguistic accuracy </w:t>
-      </w:r>
-      <w:r>
-        <w:rPr>
-          <w:rFonts w:ascii="Times New Roman" w:hAnsi="Times New Roman" w:cs="Times New Roman"/>
-          <w:sz w:val="24"/>
-          <w:szCs w:val="24"/>
-          <w:lang w:val="en-US"/>
-        </w:rPr>
-        <w:t xml:space="preserve">rather </w:t>
-      </w:r>
-      <w:r>
-        <w:rPr>
-          <w:rFonts w:ascii="Times New Roman" w:hAnsi="Times New Roman" w:cs="Times New Roman"/>
-          <w:sz w:val="24"/>
-          <w:szCs w:val="24"/>
-          <w:lang w:val="en-US"/>
-        </w:rPr>
-        <w:t>than the focusing on the need for language learning that is communication</w:t>
-      </w:r>
-      <w:r>
-        <w:rPr>
-          <w:rFonts w:ascii="Times New Roman" w:hAnsi="Times New Roman" w:cs="Times New Roman"/>
-          <w:sz w:val="24"/>
-          <w:szCs w:val="24"/>
-          <w:lang w:val="en-US"/>
-        </w:rPr>
-        <w:t xml:space="preserve">. </w:t>
-      </w:r>
-      <w:r>
-        <w:rPr>
-          <w:rFonts w:ascii="Times New Roman" w:hAnsi="Times New Roman" w:cs="Times New Roman"/>
-          <w:sz w:val="24"/>
-          <w:szCs w:val="24"/>
-          <w:lang w:val="en-US"/>
-        </w:rPr>
-        <w:t xml:space="preserve">However, these practices did not exist </w:t>
-      </w:r>
-      <w:proofErr w:type="spellStart"/>
-      <w:r>
-        <w:rPr>
-          <w:rFonts w:ascii="Times New Roman" w:hAnsi="Times New Roman" w:cs="Times New Roman"/>
-          <w:sz w:val="24"/>
-          <w:szCs w:val="24"/>
-          <w:lang w:val="en-US"/>
-        </w:rPr>
-        <w:t>idependently</w:t>
-      </w:r>
-      <w:proofErr w:type="spellEnd"/>
-      <w:r>
-        <w:rPr>
-          <w:rFonts w:ascii="Times New Roman" w:hAnsi="Times New Roman" w:cs="Times New Roman"/>
-          <w:sz w:val="24"/>
-          <w:szCs w:val="24"/>
-          <w:lang w:val="en-US"/>
-        </w:rPr>
-        <w:t xml:space="preserve">, for such practices to </w:t>
-      </w:r>
-      <w:proofErr w:type="spellStart"/>
-      <w:r>
-        <w:rPr>
-          <w:rFonts w:ascii="Times New Roman" w:hAnsi="Times New Roman" w:cs="Times New Roman"/>
-          <w:sz w:val="24"/>
-          <w:szCs w:val="24"/>
-          <w:lang w:val="en-US"/>
-        </w:rPr>
-        <w:t>florish</w:t>
-      </w:r>
-      <w:proofErr w:type="spellEnd"/>
-      <w:r>
-        <w:rPr>
-          <w:rFonts w:ascii="Times New Roman" w:hAnsi="Times New Roman" w:cs="Times New Roman"/>
-          <w:sz w:val="24"/>
-          <w:szCs w:val="24"/>
-          <w:lang w:val="en-US"/>
-        </w:rPr>
-        <w:t xml:space="preserve"> teachers were required to </w:t>
-      </w:r>
-      <w:proofErr w:type="spellStart"/>
-      <w:r>
-        <w:rPr>
-          <w:rFonts w:ascii="Times New Roman" w:hAnsi="Times New Roman" w:cs="Times New Roman"/>
-          <w:sz w:val="24"/>
-          <w:szCs w:val="24"/>
-          <w:lang w:val="en-US"/>
-        </w:rPr>
-        <w:t>interpet</w:t>
-      </w:r>
-      <w:proofErr w:type="spellEnd"/>
-      <w:r>
-        <w:rPr>
-          <w:rFonts w:ascii="Times New Roman" w:hAnsi="Times New Roman" w:cs="Times New Roman"/>
-          <w:sz w:val="24"/>
-          <w:szCs w:val="24"/>
-          <w:lang w:val="en-US"/>
-        </w:rPr>
-        <w:t xml:space="preserve"> them into classroom practices, as a result a major part of teacher’s time outside of just providing the classes were concentrated towards lesson planning. </w:t>
-      </w:r>
-    </w:p>
-    <w:p>
-      <w:pPr>
-        <w:rPr>
-          <w:rFonts w:ascii="Times New Roman" w:hAnsi="Times New Roman" w:cs="Times New Roman"/>
-          <w:sz w:val="24"/>
-          <w:szCs w:val="24"/>
-          <w:lang w:val="en-US"/>
-        </w:rPr>
-      </w:pPr>
-      <w:r>
-        <w:rPr>
-          <w:rFonts w:ascii="Times New Roman" w:hAnsi="Times New Roman" w:cs="Times New Roman"/>
-          <w:sz w:val="24"/>
-          <w:szCs w:val="24"/>
-          <w:lang w:val="en-US"/>
-        </w:rPr>
-        <w:t xml:space="preserve">The </w:t>
-      </w:r>
-      <w:r>
-        <w:rPr>
-          <w:rFonts w:ascii="Times New Roman" w:hAnsi="Times New Roman" w:cs="Times New Roman"/>
-          <w:sz w:val="24"/>
-          <w:szCs w:val="24"/>
-          <w:lang w:val="en-US"/>
-        </w:rPr>
-        <w:t>preparation of each lesson</w:t>
-      </w:r>
-      <w:r>
-        <w:rPr>
-          <w:rFonts w:ascii="Times New Roman" w:hAnsi="Times New Roman" w:cs="Times New Roman"/>
-          <w:sz w:val="24"/>
-          <w:szCs w:val="24"/>
-          <w:lang w:val="en-US"/>
-        </w:rPr>
-        <w:t xml:space="preserve"> </w:t>
-      </w:r>
-      <w:r>
-        <w:rPr>
-          <w:rFonts w:ascii="Times New Roman" w:hAnsi="Times New Roman" w:cs="Times New Roman"/>
-          <w:sz w:val="24"/>
-          <w:szCs w:val="24"/>
-          <w:lang w:val="en-US"/>
-        </w:rPr>
-        <w:t>before the emergence generative AI</w:t>
-      </w:r>
-      <w:r>
-        <w:rPr>
-          <w:rFonts w:ascii="Times New Roman" w:hAnsi="Times New Roman" w:cs="Times New Roman"/>
-          <w:sz w:val="24"/>
-          <w:szCs w:val="24"/>
-          <w:lang w:val="en-US"/>
-        </w:rPr>
-        <w:t xml:space="preserve"> therefore relied heavily </w:t>
-      </w:r>
-      <w:r>
-        <w:rPr>
-          <w:rFonts w:ascii="Times New Roman" w:hAnsi="Times New Roman" w:cs="Times New Roman"/>
-          <w:sz w:val="24"/>
-          <w:szCs w:val="24"/>
-          <w:lang w:val="en-US"/>
-        </w:rPr>
-        <w:t xml:space="preserve">on </w:t>
-      </w:r>
-      <w:r>
-        <w:rPr>
-          <w:rFonts w:ascii="Times New Roman" w:hAnsi="Times New Roman" w:cs="Times New Roman"/>
-          <w:sz w:val="24"/>
-          <w:szCs w:val="24"/>
-          <w:lang w:val="en-US"/>
-        </w:rPr>
-        <w:t>the</w:t>
-      </w:r>
-      <w:r>
-        <w:rPr>
-          <w:rFonts w:ascii="Times New Roman" w:hAnsi="Times New Roman" w:cs="Times New Roman"/>
-          <w:sz w:val="24"/>
-          <w:szCs w:val="24"/>
-          <w:lang w:val="en-US"/>
-        </w:rPr>
-        <w:t xml:space="preserve"> </w:t>
-      </w:r>
-      <w:r>
-        <w:rPr>
-          <w:rFonts w:ascii="Times New Roman" w:hAnsi="Times New Roman" w:cs="Times New Roman"/>
-          <w:sz w:val="24"/>
-          <w:szCs w:val="24"/>
-          <w:lang w:val="en-US"/>
-        </w:rPr>
-        <w:t xml:space="preserve">language </w:t>
-      </w:r>
-      <w:r>
-        <w:rPr>
-          <w:rFonts w:ascii="Times New Roman" w:hAnsi="Times New Roman" w:cs="Times New Roman"/>
-          <w:sz w:val="24"/>
-          <w:szCs w:val="24"/>
-          <w:lang w:val="en-US"/>
-        </w:rPr>
-        <w:t>teacher’s cognitive competences to make every decision related to the curriculum that involved not only</w:t>
-      </w:r>
-      <w:r>
-        <w:rPr>
-          <w:rFonts w:ascii="Times New Roman" w:hAnsi="Times New Roman" w:cs="Times New Roman"/>
-          <w:sz w:val="24"/>
-          <w:szCs w:val="24"/>
-          <w:lang w:val="en-US"/>
-        </w:rPr>
-        <w:t xml:space="preserve"> </w:t>
-      </w:r>
-      <w:r>
-        <w:rPr>
-          <w:rFonts w:ascii="Times New Roman" w:hAnsi="Times New Roman" w:cs="Times New Roman"/>
-          <w:sz w:val="24"/>
-          <w:szCs w:val="24"/>
-          <w:lang w:val="en-US"/>
-        </w:rPr>
-        <w:t xml:space="preserve">planning each session but also the selection of resources and </w:t>
-      </w:r>
-      <w:r>
-        <w:rPr>
-          <w:rFonts w:ascii="Times New Roman" w:hAnsi="Times New Roman" w:cs="Times New Roman"/>
-          <w:sz w:val="24"/>
-          <w:szCs w:val="24"/>
-          <w:lang w:val="en-US"/>
-        </w:rPr>
-        <w:t>adaptations according to needs of their students</w:t>
-      </w:r>
-      <w:r>
-        <w:rPr>
-          <w:rFonts w:ascii="Times New Roman" w:hAnsi="Times New Roman" w:cs="Times New Roman"/>
-          <w:sz w:val="24"/>
-          <w:szCs w:val="24"/>
-          <w:lang w:val="en-US"/>
-        </w:rPr>
-        <w:t xml:space="preserve">. </w:t>
-      </w:r>
-      <w:r>
-        <w:rPr>
-          <w:rFonts w:ascii="Times New Roman" w:hAnsi="Times New Roman" w:cs="Times New Roman"/>
-          <w:sz w:val="24"/>
-          <w:szCs w:val="24"/>
-          <w:lang w:val="en-US"/>
-        </w:rPr>
-        <w:fldChar w:fldCharType="begin"/>
-      </w:r>
-      <w:r>
-        <w:rPr>
-          <w:rFonts w:ascii="Times New Roman" w:hAnsi="Times New Roman" w:cs="Times New Roman"/>
-          <w:sz w:val="24"/>
-          <w:szCs w:val="24"/>
-          <w:lang w:val="en-US"/>
-        </w:rPr>
-        <w:instrText xml:space="preserve"> ADDIN ZOTERO_ITEM CSL_CITATION {"citationID":"Jq58MQjI","properties":{"unsorted":false,"formattedCitation":"(Borg, 2003; {\\i{}The Study of Teacher Thinking}, n.d.)","plainCitation":"(Borg, 2003; The Study of Teacher Thinking, n.d.)","noteIndex":0},"citationItems":[{"id":151,"uris":["http://zotero.org/users/18489330/items/QSTLSCIW"],"itemData":{"id":151,"type":"article-journal","abstract":"This paper reviews a selection of research from the field of foreign and second language teaching into what is referred to here as teacher cognition – what teachers think, know, and believe and the relationships of these mental constructs to what teachers do in the language teaching classroom. Within a framework suggested by more general mainstream educational research on teacher cognition, language teacher cognition is here discussed with reference to three main themes: (1) cognition and prior language learning experience, (2) cognition and teacher education, and (3) cognition and classroom practice. In addition, the findings of studies into two specific curricular areas in language teaching which have been examined by teacher cognition – grammar teaching and literacy – are discussed. This review indicates that, while the study of teacher cognition has established itself on the research agenda in the field of language teaching and provided valuable insight into the mental lives of language teachers, a clear sense of unity is lacking in the work and there are several major issues in language teaching which have yet to be explored from the perspective of teacher cognition.","container-title":"Language Teaching","DOI":"10.1017/S0261444803001903","ISSN":"1475-3049, 0261-4448","issue":"2","language":"en","page":"81-109","source":"Cambridge University Press","title":"Teacher cognition in language teaching: A review of research on what language teachers think, know, believe, and do","title-short":"Teacher cognition in language teaching","volume":"36","author":[{"family":"Borg","given":"Simon"}],"issued":{"date-parts":[["2003",4]]}}},{"id":153,"uris":["http://zotero.org/users/18489330/items/73B9KBWT"],"itemData":{"id":153,"type":"webpage","DOI":"10.1177/002248718603700506","language":"en","note":"DOI: 10.1177/002248718603700506","title":"The Study of Teacher Thinking: Implications for Teacher Education","title-short":"The Study of Teacher Thinking","URL":"https://journals.sagepub.com/doi/epdf/10.1177/002248718603700506","accessed":{"date-parts":[["2026",5,15]]}}}],"schema":"https://github.com/citation-style-language/schema/raw/master/csl-citation.json"} </w:instrText>
-      </w:r>
-      <w:r>
-        <w:rPr>
-          <w:rFonts w:ascii="Times New Roman" w:hAnsi="Times New Roman" w:cs="Times New Roman"/>
-          <w:sz w:val="24"/>
-          <w:szCs w:val="24"/>
-          <w:lang w:val="en-US"/>
-        </w:rPr>
-        <w:fldChar w:fldCharType="separate"/>
-      </w:r>
-      <w:r>
-        <w:rPr>
-          <w:rFonts w:ascii="Times New Roman" w:hAnsi="Times New Roman" w:cs="Times New Roman"/>
-          <w:sz w:val="24"/>
-          <w:szCs w:val="24"/>
-          <w:lang w:val="en-GB"/>
-        </w:rPr>
-        <w:t xml:space="preserve">(Borg, 2003; </w:t>
-      </w:r>
-      <w:r>
-        <w:rPr>
-          <w:rFonts w:ascii="Times New Roman" w:hAnsi="Times New Roman" w:cs="Times New Roman"/>
-          <w:i/>
-          <w:iCs/>
-          <w:sz w:val="24"/>
-          <w:szCs w:val="24"/>
-          <w:lang w:val="en-GB"/>
-        </w:rPr>
-        <w:t>The Study of Teacher Thinking</w:t>
-      </w:r>
-      <w:r>
-        <w:rPr>
-          <w:rFonts w:ascii="Times New Roman" w:hAnsi="Times New Roman" w:cs="Times New Roman"/>
-          <w:sz w:val="24"/>
-          <w:szCs w:val="24"/>
-          <w:lang w:val="en-GB"/>
-        </w:rPr>
-        <w:t>, n.d.)</w:t>
-      </w:r>
-      <w:r>
-        <w:rPr>
-          <w:rFonts w:ascii="Times New Roman" w:hAnsi="Times New Roman" w:cs="Times New Roman"/>
-          <w:sz w:val="24"/>
-          <w:szCs w:val="24"/>
-          <w:lang w:val="en-US"/>
-        </w:rPr>
-        <w:fldChar w:fldCharType="end"/>
+        <w:t>This foundation of teacher-driven lesson planning becomes critical when understanding how teachers later adapted to new tools, including generative AI.</w:t>
       </w:r>
     </w:p>
     <w:p>
@@ -6139,16 +5865,6 @@
       <w:r>
         <w:t>EdTech &amp; AI</w:t>
       </w:r>
-    </w:p>
-    <w:p>
-      <w:pPr>
-        <w:rPr>
-          <w:rFonts w:ascii="Times New Roman" w:hAnsi="Times New Roman" w:cs="Times New Roman"/>
-          <w:sz w:val="24"/>
-          <w:szCs w:val="24"/>
-          <w:lang w:val="en-US"/>
-        </w:rPr>
-      </w:pPr>
     </w:p>
     <w:p>
       <w:pPr>
@@ -11137,33 +10853,76 @@
     <w:p>
       <w:pPr>
         <w:pStyle w:val="Heading1"/>
+        <w:rPr>
+          <w:lang w:val="en-US"/>
+        </w:rPr>
       </w:pPr>
       <w:bookmarkStart w:id="42" w:name="_Toc229755642"/>
       <w:bookmarkStart w:id="43" w:name="_Toc89960513"/>
       <w:bookmarkStart w:id="44" w:name="_Toc105689043"/>
-      <w:proofErr w:type="spellStart"/>
       <w:r>
         <w:rPr>
           <w:rFonts w:eastAsia="Times New Roman"/>
-          <w:lang w:eastAsia="en-IN"/>
+          <w:lang w:val="en-US" w:eastAsia="en-IN"/>
         </w:rPr>
         <w:lastRenderedPageBreak/>
         <w:t>Experiment</w:t>
       </w:r>
       <w:bookmarkEnd w:id="42"/>
-      <w:proofErr w:type="spellEnd"/>
-    </w:p>
-    <w:p/>
-    <w:p/>
-    <w:p/>
-    <w:p/>
-    <w:p/>
-    <w:p/>
+    </w:p>
+    <w:p>
+      <w:pPr>
+        <w:rPr>
+          <w:lang w:val="en-US"/>
+        </w:rPr>
+      </w:pPr>
+    </w:p>
+    <w:p>
+      <w:pPr>
+        <w:rPr>
+          <w:lang w:val="en-US"/>
+        </w:rPr>
+      </w:pPr>
+    </w:p>
+    <w:p>
+      <w:pPr>
+        <w:rPr>
+          <w:lang w:val="en-US"/>
+        </w:rPr>
+      </w:pPr>
+    </w:p>
+    <w:p>
+      <w:pPr>
+        <w:rPr>
+          <w:lang w:val="en-US"/>
+        </w:rPr>
+      </w:pPr>
+    </w:p>
+    <w:p>
+      <w:pPr>
+        <w:rPr>
+          <w:lang w:val="en-US"/>
+        </w:rPr>
+      </w:pPr>
+    </w:p>
+    <w:p>
+      <w:pPr>
+        <w:rPr>
+          <w:lang w:val="en-US"/>
+        </w:rPr>
+      </w:pPr>
+    </w:p>
     <w:p>
       <w:pPr>
         <w:pStyle w:val="Heading4"/>
-      </w:pPr>
-      <w:r>
+        <w:rPr>
+          <w:lang w:val="en-US"/>
+        </w:rPr>
+      </w:pPr>
+      <w:r>
+        <w:rPr>
+          <w:lang w:val="en-US"/>
+        </w:rPr>
         <w:br w:type="page"/>
       </w:r>
     </w:p>
@@ -11172,313 +10931,480 @@
         <w:pStyle w:val="Heading1"/>
         <w:rPr>
           <w:rFonts w:eastAsia="Times New Roman"/>
-          <w:lang w:eastAsia="en-IN"/>
+          <w:lang w:val="en-US" w:eastAsia="en-IN"/>
         </w:rPr>
       </w:pPr>
       <w:bookmarkStart w:id="45" w:name="_Toc229755643"/>
-      <w:proofErr w:type="spellStart"/>
       <w:r>
         <w:rPr>
           <w:rFonts w:eastAsia="Times New Roman"/>
-          <w:lang w:eastAsia="en-IN"/>
+          <w:lang w:val="en-US" w:eastAsia="en-IN"/>
         </w:rPr>
         <w:lastRenderedPageBreak/>
         <w:t>Inferences</w:t>
       </w:r>
       <w:bookmarkEnd w:id="45"/>
-      <w:proofErr w:type="spellEnd"/>
-    </w:p>
-    <w:p/>
-    <w:p>
-      <w:r>
+    </w:p>
+    <w:p>
+      <w:pPr>
+        <w:rPr>
+          <w:lang w:val="en-US"/>
+        </w:rPr>
+      </w:pPr>
+    </w:p>
+    <w:p>
+      <w:r>
+        <w:rPr>
+          <w:lang w:val="en-US"/>
+        </w:rPr>
         <w:t xml:space="preserve">Mox dicta </w:t>
       </w:r>
       <w:proofErr w:type="spellStart"/>
       <w:r>
+        <w:rPr>
+          <w:lang w:val="en-US"/>
+        </w:rPr>
         <w:t>finierat</w:t>
       </w:r>
       <w:proofErr w:type="spellEnd"/>
       <w:r>
+        <w:rPr>
+          <w:lang w:val="en-US"/>
+        </w:rPr>
         <w:t xml:space="preserve">, </w:t>
       </w:r>
       <w:proofErr w:type="spellStart"/>
       <w:r>
+        <w:rPr>
+          <w:lang w:val="en-US"/>
+        </w:rPr>
         <w:t>multitudo</w:t>
       </w:r>
       <w:proofErr w:type="spellEnd"/>
       <w:r>
-        <w:t xml:space="preserve"> </w:t>
-      </w:r>
-      <w:proofErr w:type="spellStart"/>
-      <w:r>
+        <w:rPr>
+          <w:lang w:val="en-US"/>
+        </w:rPr>
+        <w:t xml:space="preserve"> </w:t>
+      </w:r>
+      <w:proofErr w:type="spellStart"/>
+      <w:r>
+        <w:rPr>
+          <w:lang w:val="en-US"/>
+        </w:rPr>
         <w:t>omnis</w:t>
       </w:r>
       <w:proofErr w:type="spellEnd"/>
       <w:r>
+        <w:rPr>
+          <w:lang w:val="en-US"/>
+        </w:rPr>
         <w:t xml:space="preserve"> ad, </w:t>
       </w:r>
       <w:proofErr w:type="spellStart"/>
       <w:r>
+        <w:rPr>
+          <w:lang w:val="en-US"/>
+        </w:rPr>
         <w:t>quae</w:t>
       </w:r>
       <w:proofErr w:type="spellEnd"/>
       <w:r>
+        <w:rPr>
+          <w:lang w:val="en-US"/>
+        </w:rPr>
         <w:t xml:space="preserve"> imperator </w:t>
       </w:r>
       <w:proofErr w:type="spellStart"/>
       <w:r>
+        <w:rPr>
+          <w:lang w:val="en-US"/>
+        </w:rPr>
         <w:t>voluit</w:t>
       </w:r>
       <w:proofErr w:type="spellEnd"/>
       <w:r>
+        <w:rPr>
+          <w:lang w:val="en-US"/>
+        </w:rPr>
         <w:t xml:space="preserve">, </w:t>
       </w:r>
       <w:proofErr w:type="spellStart"/>
       <w:r>
+        <w:rPr>
+          <w:lang w:val="en-US"/>
+        </w:rPr>
         <w:t>promptior</w:t>
       </w:r>
       <w:proofErr w:type="spellEnd"/>
       <w:r>
-        <w:t xml:space="preserve"> </w:t>
-      </w:r>
-      <w:proofErr w:type="spellStart"/>
-      <w:r>
+        <w:rPr>
+          <w:lang w:val="en-US"/>
+        </w:rPr>
+        <w:t xml:space="preserve"> </w:t>
+      </w:r>
+      <w:proofErr w:type="spellStart"/>
+      <w:r>
+        <w:rPr>
+          <w:lang w:val="en-US"/>
+        </w:rPr>
         <w:t>laudato</w:t>
       </w:r>
       <w:proofErr w:type="spellEnd"/>
       <w:r>
-        <w:t xml:space="preserve"> </w:t>
-      </w:r>
-      <w:proofErr w:type="spellStart"/>
-      <w:r>
+        <w:rPr>
+          <w:lang w:val="en-US"/>
+        </w:rPr>
+        <w:t xml:space="preserve"> </w:t>
+      </w:r>
+      <w:proofErr w:type="spellStart"/>
+      <w:r>
+        <w:rPr>
+          <w:lang w:val="en-US"/>
+        </w:rPr>
         <w:t>consilio</w:t>
       </w:r>
       <w:proofErr w:type="spellEnd"/>
       <w:r>
-        <w:t xml:space="preserve"> </w:t>
-      </w:r>
-      <w:proofErr w:type="spellStart"/>
-      <w:r>
+        <w:rPr>
+          <w:lang w:val="en-US"/>
+        </w:rPr>
+        <w:t xml:space="preserve"> </w:t>
+      </w:r>
+      <w:proofErr w:type="spellStart"/>
+      <w:r>
+        <w:rPr>
+          <w:lang w:val="en-US"/>
+        </w:rPr>
         <w:t>consensit</w:t>
       </w:r>
       <w:proofErr w:type="spellEnd"/>
       <w:r>
-        <w:t xml:space="preserve"> in </w:t>
-      </w:r>
-      <w:proofErr w:type="spellStart"/>
-      <w:r>
-        <w:t>pacem</w:t>
-      </w:r>
-      <w:proofErr w:type="spellEnd"/>
-      <w:r>
-        <w:t xml:space="preserve"> </w:t>
-      </w:r>
-      <w:proofErr w:type="spellStart"/>
-      <w:r>
+        <w:rPr>
+          <w:lang w:val="en-US"/>
+        </w:rPr>
+        <w:t xml:space="preserve"> in pacem </w:t>
+      </w:r>
+      <w:proofErr w:type="spellStart"/>
+      <w:r>
+        <w:rPr>
+          <w:lang w:val="en-US"/>
+        </w:rPr>
         <w:t>ea</w:t>
       </w:r>
       <w:proofErr w:type="spellEnd"/>
       <w:r>
-        <w:t xml:space="preserve"> </w:t>
-      </w:r>
-      <w:proofErr w:type="spellStart"/>
-      <w:r>
-        <w:t>ratione</w:t>
-      </w:r>
-      <w:proofErr w:type="spellEnd"/>
-      <w:r>
-        <w:t xml:space="preserve"> maxime </w:t>
-      </w:r>
-      <w:proofErr w:type="spellStart"/>
-      <w:r>
+        <w:rPr>
+          <w:lang w:val="en-US"/>
+        </w:rPr>
+        <w:t xml:space="preserve"> ratione </w:t>
+      </w:r>
+      <w:proofErr w:type="spellStart"/>
+      <w:r>
+        <w:rPr>
+          <w:lang w:val="en-US"/>
+        </w:rPr>
+        <w:t>maxime</w:t>
+      </w:r>
+      <w:proofErr w:type="spellEnd"/>
+      <w:r>
+        <w:rPr>
+          <w:lang w:val="en-US"/>
+        </w:rPr>
+        <w:t xml:space="preserve"> </w:t>
+      </w:r>
+      <w:proofErr w:type="spellStart"/>
+      <w:r>
+        <w:rPr>
+          <w:lang w:val="en-US"/>
+        </w:rPr>
         <w:t>percita</w:t>
       </w:r>
       <w:proofErr w:type="spellEnd"/>
       <w:r>
-        <w:t xml:space="preserve">, quod </w:t>
-      </w:r>
-      <w:proofErr w:type="spellStart"/>
-      <w:r>
+        <w:rPr>
+          <w:lang w:val="en-US"/>
+        </w:rPr>
+        <w:t xml:space="preserve">, </w:t>
+      </w:r>
+      <w:proofErr w:type="spellStart"/>
+      <w:r>
+        <w:rPr>
+          <w:lang w:val="en-US"/>
+        </w:rPr>
+        <w:t>quod</w:t>
+      </w:r>
+      <w:proofErr w:type="spellEnd"/>
+      <w:r>
+        <w:rPr>
+          <w:lang w:val="en-US"/>
+        </w:rPr>
+        <w:t xml:space="preserve"> </w:t>
+      </w:r>
+      <w:proofErr w:type="spellStart"/>
+      <w:r>
+        <w:rPr>
+          <w:lang w:val="en-US"/>
+        </w:rPr>
         <w:t>norat</w:t>
       </w:r>
       <w:proofErr w:type="spellEnd"/>
       <w:r>
-        <w:t xml:space="preserve"> </w:t>
-      </w:r>
-      <w:proofErr w:type="spellStart"/>
-      <w:r>
+        <w:rPr>
+          <w:lang w:val="en-US"/>
+        </w:rPr>
+        <w:t xml:space="preserve"> </w:t>
+      </w:r>
+      <w:proofErr w:type="spellStart"/>
+      <w:r>
+        <w:rPr>
+          <w:lang w:val="en-US"/>
+        </w:rPr>
         <w:t>expeditionibus</w:t>
       </w:r>
       <w:proofErr w:type="spellEnd"/>
       <w:r>
-        <w:t xml:space="preserve"> </w:t>
-      </w:r>
-      <w:proofErr w:type="spellStart"/>
-      <w:r>
+        <w:rPr>
+          <w:lang w:val="en-US"/>
+        </w:rPr>
+        <w:t xml:space="preserve"> </w:t>
+      </w:r>
+      <w:proofErr w:type="spellStart"/>
+      <w:r>
+        <w:rPr>
+          <w:lang w:val="en-US"/>
+        </w:rPr>
         <w:t>crebris</w:t>
       </w:r>
       <w:proofErr w:type="spellEnd"/>
       <w:r>
-        <w:t xml:space="preserve"> </w:t>
-      </w:r>
-      <w:proofErr w:type="spellStart"/>
-      <w:r>
+        <w:rPr>
+          <w:lang w:val="en-US"/>
+        </w:rPr>
+        <w:t xml:space="preserve"> </w:t>
+      </w:r>
+      <w:proofErr w:type="spellStart"/>
+      <w:r>
+        <w:rPr>
+          <w:lang w:val="en-US"/>
+        </w:rPr>
         <w:t>fortunam</w:t>
       </w:r>
       <w:proofErr w:type="spellEnd"/>
       <w:r>
-        <w:t xml:space="preserve"> </w:t>
-      </w:r>
-      <w:proofErr w:type="spellStart"/>
-      <w:r>
-        <w:t>eius</w:t>
-      </w:r>
-      <w:proofErr w:type="spellEnd"/>
-      <w:r>
-        <w:t xml:space="preserve"> in malis </w:t>
-      </w:r>
-      <w:proofErr w:type="spellStart"/>
-      <w:r>
-        <w:t>tantum</w:t>
-      </w:r>
-      <w:proofErr w:type="spellEnd"/>
-      <w:r>
-        <w:t xml:space="preserve"> </w:t>
-      </w:r>
-      <w:proofErr w:type="spellStart"/>
-      <w:r>
+        <w:rPr>
+          <w:lang w:val="en-US"/>
+        </w:rPr>
+        <w:t xml:space="preserve"> eius in </w:t>
+      </w:r>
+      <w:proofErr w:type="spellStart"/>
+      <w:r>
+        <w:rPr>
+          <w:lang w:val="en-US"/>
+        </w:rPr>
+        <w:t>malis</w:t>
+      </w:r>
+      <w:proofErr w:type="spellEnd"/>
+      <w:r>
+        <w:rPr>
+          <w:lang w:val="en-US"/>
+        </w:rPr>
+        <w:t xml:space="preserve"> tantum </w:t>
+      </w:r>
+      <w:proofErr w:type="spellStart"/>
+      <w:r>
+        <w:rPr>
+          <w:lang w:val="en-US"/>
+        </w:rPr>
         <w:t>civilibus</w:t>
       </w:r>
       <w:proofErr w:type="spellEnd"/>
       <w:r>
-        <w:t xml:space="preserve"> vigilasse, cum </w:t>
-      </w:r>
-      <w:proofErr w:type="spellStart"/>
-      <w:r>
-        <w:t>autem</w:t>
-      </w:r>
-      <w:proofErr w:type="spellEnd"/>
-      <w:r>
-        <w:t xml:space="preserve"> </w:t>
-      </w:r>
-      <w:proofErr w:type="spellStart"/>
-      <w:r>
+        <w:rPr>
+          <w:lang w:val="en-US"/>
+        </w:rPr>
+        <w:t xml:space="preserve"> </w:t>
+      </w:r>
+      <w:proofErr w:type="spellStart"/>
+      <w:r>
+        <w:rPr>
+          <w:lang w:val="en-US"/>
+        </w:rPr>
+        <w:t>vigilasse</w:t>
+      </w:r>
+      <w:proofErr w:type="spellEnd"/>
+      <w:r>
+        <w:rPr>
+          <w:lang w:val="en-US"/>
+        </w:rPr>
+        <w:t xml:space="preserve">, cum autem </w:t>
+      </w:r>
+      <w:proofErr w:type="spellStart"/>
+      <w:r>
+        <w:rPr>
+          <w:lang w:val="en-US"/>
+        </w:rPr>
         <w:t>bella</w:t>
       </w:r>
       <w:proofErr w:type="spellEnd"/>
       <w:r>
-        <w:t xml:space="preserve"> </w:t>
-      </w:r>
-      <w:proofErr w:type="spellStart"/>
-      <w:r>
+        <w:rPr>
+          <w:lang w:val="en-US"/>
+        </w:rPr>
+        <w:t xml:space="preserve"> </w:t>
+      </w:r>
+      <w:proofErr w:type="spellStart"/>
+      <w:r>
+        <w:rPr>
+          <w:lang w:val="en-US"/>
+        </w:rPr>
         <w:t>moverentur</w:t>
       </w:r>
       <w:proofErr w:type="spellEnd"/>
       <w:r>
-        <w:t xml:space="preserve"> </w:t>
-      </w:r>
-      <w:proofErr w:type="spellStart"/>
-      <w:r>
-        <w:t>externa</w:t>
-      </w:r>
-      <w:proofErr w:type="spellEnd"/>
-      <w:r>
+        <w:rPr>
+          <w:lang w:val="en-US"/>
+        </w:rPr>
+        <w:t xml:space="preserve"> externa, </w:t>
+      </w:r>
+      <w:proofErr w:type="spellStart"/>
+      <w:r>
+        <w:rPr>
+          <w:lang w:val="en-US"/>
+        </w:rPr>
+        <w:t>accidisse</w:t>
+      </w:r>
+      <w:proofErr w:type="spellEnd"/>
+      <w:r>
+        <w:rPr>
+          <w:lang w:val="en-US"/>
+        </w:rPr>
+        <w:t xml:space="preserve"> </w:t>
+      </w:r>
+      <w:proofErr w:type="spellStart"/>
+      <w:r>
+        <w:rPr>
+          <w:lang w:val="en-US"/>
+        </w:rPr>
+        <w:t>plerumque</w:t>
+      </w:r>
+      <w:proofErr w:type="spellEnd"/>
+      <w:r>
+        <w:rPr>
+          <w:lang w:val="en-US"/>
+        </w:rPr>
+        <w:t xml:space="preserve"> </w:t>
+      </w:r>
+      <w:proofErr w:type="spellStart"/>
+      <w:r>
+        <w:rPr>
+          <w:lang w:val="en-US"/>
+        </w:rPr>
+        <w:t>luctuosa</w:t>
+      </w:r>
+      <w:proofErr w:type="spellEnd"/>
+      <w:r>
+        <w:rPr>
+          <w:lang w:val="en-US"/>
+        </w:rPr>
         <w:t xml:space="preserve">, </w:t>
       </w:r>
       <w:proofErr w:type="spellStart"/>
       <w:r>
-        <w:t>accidisse</w:t>
-      </w:r>
-      <w:proofErr w:type="spellEnd"/>
-      <w:r>
-        <w:t xml:space="preserve"> </w:t>
-      </w:r>
-      <w:proofErr w:type="spellStart"/>
-      <w:r>
-        <w:t>plerumque</w:t>
-      </w:r>
-      <w:proofErr w:type="spellEnd"/>
-      <w:r>
-        <w:t xml:space="preserve"> </w:t>
-      </w:r>
-      <w:proofErr w:type="spellStart"/>
-      <w:r>
-        <w:t>luctuosa</w:t>
-      </w:r>
-      <w:proofErr w:type="spellEnd"/>
-      <w:r>
-        <w:t xml:space="preserve">, </w:t>
-      </w:r>
-      <w:proofErr w:type="spellStart"/>
-      <w:r>
+        <w:rPr>
+          <w:lang w:val="en-US"/>
+        </w:rPr>
         <w:t>icto</w:t>
       </w:r>
       <w:proofErr w:type="spellEnd"/>
       <w:r>
-        <w:t xml:space="preserve"> post </w:t>
-      </w:r>
-      <w:proofErr w:type="spellStart"/>
-      <w:r>
-        <w:t>haec</w:t>
-      </w:r>
-      <w:proofErr w:type="spellEnd"/>
-      <w:r>
-        <w:t xml:space="preserve"> </w:t>
-      </w:r>
-      <w:proofErr w:type="spellStart"/>
-      <w:r>
+        <w:rPr>
+          <w:lang w:val="en-US"/>
+        </w:rPr>
+        <w:t xml:space="preserve"> post haec </w:t>
+      </w:r>
+      <w:proofErr w:type="spellStart"/>
+      <w:r>
+        <w:rPr>
+          <w:lang w:val="en-US"/>
+        </w:rPr>
         <w:t>foedere</w:t>
       </w:r>
       <w:proofErr w:type="spellEnd"/>
       <w:r>
-        <w:t xml:space="preserve"> </w:t>
-      </w:r>
-      <w:proofErr w:type="spellStart"/>
-      <w:r>
-        <w:t>gentium</w:t>
-      </w:r>
-      <w:proofErr w:type="spellEnd"/>
-      <w:r>
-        <w:t xml:space="preserve"> </w:t>
-      </w:r>
-      <w:proofErr w:type="spellStart"/>
-      <w:r>
+        <w:rPr>
+          <w:lang w:val="en-US"/>
+        </w:rPr>
+        <w:t xml:space="preserve"> gentium </w:t>
+      </w:r>
+      <w:proofErr w:type="spellStart"/>
+      <w:r>
+        <w:rPr>
+          <w:lang w:val="en-US"/>
+        </w:rPr>
         <w:t>ritu</w:t>
       </w:r>
       <w:proofErr w:type="spellEnd"/>
       <w:r>
-        <w:t xml:space="preserve"> </w:t>
-      </w:r>
-      <w:proofErr w:type="spellStart"/>
-      <w:r>
+        <w:rPr>
+          <w:lang w:val="en-US"/>
+        </w:rPr>
+        <w:t xml:space="preserve"> </w:t>
+      </w:r>
+      <w:proofErr w:type="spellStart"/>
+      <w:r>
+        <w:rPr>
+          <w:lang w:val="en-US"/>
+        </w:rPr>
         <w:t>perfectaque</w:t>
       </w:r>
       <w:proofErr w:type="spellEnd"/>
       <w:r>
-        <w:t xml:space="preserve"> </w:t>
-      </w:r>
-      <w:proofErr w:type="spellStart"/>
-      <w:r>
+        <w:rPr>
+          <w:lang w:val="en-US"/>
+        </w:rPr>
+        <w:t xml:space="preserve"> </w:t>
+      </w:r>
+      <w:proofErr w:type="spellStart"/>
+      <w:r>
+        <w:rPr>
+          <w:lang w:val="en-US"/>
+        </w:rPr>
         <w:t>sollemnitate</w:t>
       </w:r>
       <w:proofErr w:type="spellEnd"/>
       <w:r>
-        <w:t xml:space="preserve"> imperator </w:t>
-      </w:r>
-      <w:proofErr w:type="spellStart"/>
-      <w:r>
-        <w:t>Mediolanum</w:t>
-      </w:r>
-      <w:proofErr w:type="spellEnd"/>
-      <w:r>
-        <w:t xml:space="preserve"> ad hiberna </w:t>
-      </w:r>
-      <w:proofErr w:type="spellStart"/>
-      <w:r>
+        <w:rPr>
+          <w:lang w:val="en-US"/>
+        </w:rPr>
+        <w:t xml:space="preserve"> imperator Mediolanum ad </w:t>
+      </w:r>
+      <w:proofErr w:type="spellStart"/>
+      <w:r>
+        <w:rPr>
+          <w:lang w:val="en-US"/>
+        </w:rPr>
+        <w:t>hiberna</w:t>
+      </w:r>
+      <w:proofErr w:type="spellEnd"/>
+      <w:r>
+        <w:rPr>
+          <w:lang w:val="en-US"/>
+        </w:rPr>
+        <w:t xml:space="preserve"> </w:t>
+      </w:r>
+      <w:proofErr w:type="spellStart"/>
+      <w:r>
+        <w:rPr>
+          <w:lang w:val="en-US"/>
+        </w:rPr>
         <w:t>discessit</w:t>
       </w:r>
       <w:proofErr w:type="spellEnd"/>
       <w:r>
+        <w:rPr>
+          <w:lang w:val="en-US"/>
+        </w:rPr>
         <w:t xml:space="preserve">. </w:t>
       </w:r>
       <w:proofErr w:type="spellStart"/>
@@ -12761,7 +12687,7 @@
           <w:sz w:val="24"/>
         </w:rPr>
         <w:sectPr>
-          <w:footerReference w:type="default" r:id="rId12"/>
+          <w:footerReference w:type="default" r:id="rId11"/>
           <w:pgSz w:w="11906" w:h="16838"/>
           <w:pgMar w:top="1417" w:right="1417" w:bottom="1417" w:left="1417" w:header="708" w:footer="708" w:gutter="0"/>
           <w:cols w:space="708"/>
@@ -12928,6 +12854,7 @@
       <w:r>
         <w:rPr>
           <w:color w:val="000000" w:themeColor="text1"/>
+          <w:lang w:val="en-US"/>
         </w:rPr>
         <w:instrText xml:space="preserve"> ADDIN ZOTERO_BIBL {"uncited":[],"omitted":[],"custom":[]} CSL_BIBLIOGRAPHY </w:instrText>
       </w:r>
@@ -12936,19 +12863,13 @@
           <w:color w:val="000000" w:themeColor="text1"/>
         </w:rPr>
         <w:fldChar w:fldCharType="separate"/>
-      </w:r>
-      <w:r>
-        <w:rPr>
-          <w:color w:val="000000"/>
-        </w:rPr>
-        <w:t xml:space="preserve">Borg, S. (2003). </w:t>
       </w:r>
       <w:r>
         <w:rPr>
           <w:color w:val="000000"/>
           <w:lang w:val="en-GB"/>
         </w:rPr>
-        <w:t xml:space="preserve">Teacher cognition in language teaching: A review of research on what language teachers think, know, believe, and do. </w:t>
+        <w:t xml:space="preserve">Borg, S. (2003). Teacher cognition in language teaching: A review of research on what language teachers think, know, believe, and do. </w:t>
       </w:r>
       <w:r>
         <w:rPr>
@@ -12996,7 +12917,7 @@
           <w:color w:val="000000"/>
           <w:lang w:val="en-GB"/>
         </w:rPr>
-        <w:t xml:space="preserve">Pica, T. (2000). Tradition and transition in English language teaching methodology1. </w:t>
+        <w:t xml:space="preserve">Richards, J. C., &amp; Rodgers, T. S. (2014). </w:t>
       </w:r>
       <w:r>
         <w:rPr>
@@ -13005,14 +12926,62 @@
           <w:color w:val="000000"/>
           <w:lang w:val="en-GB"/>
         </w:rPr>
-        <w:t>System</w:t>
+        <w:t>Approaches and Methods in Language Teaching</w:t>
       </w:r>
       <w:r>
         <w:rPr>
           <w:color w:val="000000"/>
           <w:lang w:val="en-GB"/>
         </w:rPr>
-        <w:t xml:space="preserve">, </w:t>
+        <w:t>. Cambridge University Press.</w:t>
+      </w:r>
+    </w:p>
+    <w:p>
+      <w:pPr>
+        <w:pStyle w:val="Bibliography"/>
+        <w:rPr>
+          <w:color w:val="000000"/>
+          <w:lang w:val="en-GB"/>
+        </w:rPr>
+      </w:pPr>
+      <w:r>
+        <w:rPr>
+          <w:color w:val="000000"/>
+          <w:lang w:val="en-GB"/>
+        </w:rPr>
+        <w:t>Serin, H. (2018). A Comparison of Teacher-</w:t>
+      </w:r>
+      <w:proofErr w:type="spellStart"/>
+      <w:r>
+        <w:rPr>
+          <w:color w:val="000000"/>
+          <w:lang w:val="en-GB"/>
+        </w:rPr>
+        <w:t>Centered</w:t>
+      </w:r>
+      <w:proofErr w:type="spellEnd"/>
+      <w:r>
+        <w:rPr>
+          <w:color w:val="000000"/>
+          <w:lang w:val="en-GB"/>
+        </w:rPr>
+        <w:t xml:space="preserve"> and Student-</w:t>
+      </w:r>
+      <w:proofErr w:type="spellStart"/>
+      <w:r>
+        <w:rPr>
+          <w:color w:val="000000"/>
+          <w:lang w:val="en-GB"/>
+        </w:rPr>
+        <w:t>Centered</w:t>
+      </w:r>
+      <w:proofErr w:type="spellEnd"/>
+      <w:r>
+        <w:rPr>
+          <w:color w:val="000000"/>
+          <w:lang w:val="en-GB"/>
+        </w:rPr>
+        <w:t xml:space="preserve"> Approaches in Educational Settings. </w:t>
       </w:r>
       <w:r>
         <w:rPr>
@@ -13021,30 +12990,14 @@
           <w:color w:val="000000"/>
           <w:lang w:val="en-GB"/>
         </w:rPr>
-        <w:t>28</w:t>
+        <w:t>International Journal of Social Sciences &amp; Educational Studies</w:t>
       </w:r>
       <w:r>
         <w:rPr>
           <w:color w:val="000000"/>
           <w:lang w:val="en-GB"/>
         </w:rPr>
-        <w:t>(1), 1–18. https://doi.org/10.1016/S0346-251X(99)00057-3</w:t>
-      </w:r>
-    </w:p>
-    <w:p>
-      <w:pPr>
-        <w:pStyle w:val="Bibliography"/>
-        <w:rPr>
-          <w:color w:val="000000"/>
-          <w:lang w:val="en-GB"/>
-        </w:rPr>
-      </w:pPr>
-      <w:r>
-        <w:rPr>
-          <w:color w:val="000000"/>
-          <w:lang w:val="en-GB"/>
-        </w:rPr>
-        <w:t xml:space="preserve">Richards, J. C., &amp; Rodgers, T. S. (2014). </w:t>
+        <w:t xml:space="preserve">, </w:t>
       </w:r>
       <w:r>
         <w:rPr>
@@ -13053,87 +13006,14 @@
           <w:color w:val="000000"/>
           <w:lang w:val="en-GB"/>
         </w:rPr>
-        <w:t>Approaches and Methods in Language Teaching</w:t>
+        <w:t>5</w:t>
       </w:r>
       <w:r>
         <w:rPr>
           <w:color w:val="000000"/>
           <w:lang w:val="en-GB"/>
         </w:rPr>
-        <w:t>. Cambridge University Press.</w:t>
-      </w:r>
-    </w:p>
-    <w:p>
-      <w:pPr>
-        <w:pStyle w:val="Bibliography"/>
-        <w:rPr>
-          <w:color w:val="000000"/>
-          <w:lang w:val="en-GB"/>
-        </w:rPr>
-      </w:pPr>
-      <w:r>
-        <w:rPr>
-          <w:color w:val="000000"/>
-          <w:lang w:val="en-GB"/>
-        </w:rPr>
-        <w:t xml:space="preserve">Serin, H. (2018). A Comparison of Teacher-Centered and Student-Centered Approaches in Educational Settings. </w:t>
-      </w:r>
-      <w:r>
-        <w:rPr>
-          <w:i/>
-          <w:iCs/>
-          <w:color w:val="000000"/>
-          <w:lang w:val="en-GB"/>
-        </w:rPr>
-        <w:t>International Journal of Social Sciences &amp; Educational Studies</w:t>
-      </w:r>
-      <w:r>
-        <w:rPr>
-          <w:color w:val="000000"/>
-          <w:lang w:val="en-GB"/>
-        </w:rPr>
-        <w:t xml:space="preserve">, </w:t>
-      </w:r>
-      <w:r>
-        <w:rPr>
-          <w:i/>
-          <w:iCs/>
-          <w:color w:val="000000"/>
-          <w:lang w:val="en-GB"/>
-        </w:rPr>
-        <w:t>5</w:t>
-      </w:r>
-      <w:r>
-        <w:rPr>
-          <w:color w:val="000000"/>
-          <w:lang w:val="en-GB"/>
-        </w:rPr>
         <w:t>(1), 164–167. https://doi.org/10.23918//ijsses.v5i1p164</w:t>
-      </w:r>
-    </w:p>
-    <w:p>
-      <w:pPr>
-        <w:pStyle w:val="Bibliography"/>
-        <w:rPr>
-          <w:color w:val="000000"/>
-          <w:lang w:val="en-GB"/>
-        </w:rPr>
-      </w:pPr>
-      <w:r>
-        <w:rPr>
-          <w:i/>
-          <w:iCs/>
-          <w:color w:val="000000"/>
-          <w:lang w:val="en-GB"/>
-        </w:rPr>
-        <w:t>The Study of Teacher Thinking: Implications for Teacher Education</w:t>
-      </w:r>
-      <w:r>
-        <w:rPr>
-          <w:color w:val="000000"/>
-          <w:lang w:val="en-GB"/>
-        </w:rPr>
-        <w:t>. (n.d.). https://doi.org/10.1177/002248718603700506</w:t>
       </w:r>
     </w:p>
     <w:p>
@@ -13406,7 +13286,7 @@
     <w:p>
       <w:pPr>
         <w:sectPr>
-          <w:headerReference w:type="default" r:id="rId13"/>
+          <w:headerReference w:type="default" r:id="rId12"/>
           <w:pgSz w:w="11906" w:h="16838"/>
           <w:pgMar w:top="1417" w:right="1417" w:bottom="1417" w:left="1417" w:header="708" w:footer="708" w:gutter="0"/>
           <w:cols w:space="708"/>
@@ -13483,7 +13363,7 @@
           <w:sz w:val="24"/>
         </w:rPr>
         <w:sectPr>
-          <w:footerReference w:type="default" r:id="rId14"/>
+          <w:footerReference w:type="default" r:id="rId13"/>
           <w:pgSz w:w="11906" w:h="16838"/>
           <w:pgMar w:top="1417" w:right="1417" w:bottom="1417" w:left="1417" w:header="708" w:footer="708" w:gutter="0"/>
           <w:pgNumType w:start="1"/>
@@ -13562,8 +13442,8 @@
       </w:r>
     </w:p>
     <w:sectPr>
-      <w:headerReference w:type="default" r:id="rId15"/>
-      <w:footerReference w:type="default" r:id="rId16"/>
+      <w:headerReference w:type="default" r:id="rId14"/>
+      <w:footerReference w:type="default" r:id="rId15"/>
       <w:pgSz w:w="11906" w:h="16838"/>
       <w:pgMar w:top="1417" w:right="1417" w:bottom="1417" w:left="1417" w:header="708" w:footer="708" w:gutter="0"/>
       <w:cols w:space="708"/>
@@ -16325,11 +16205,11 @@
 </file>
 
 <file path=customXml/item1.xml><?xml version="1.0" encoding="utf-8"?>
-<b:Sources xmlns:b="http://schemas.openxmlformats.org/officeDocument/2006/bibliography" xmlns="http://schemas.openxmlformats.org/officeDocument/2006/bibliography" SelectedStyle="\APASixthEditionOfficeOnline.xsl" StyleName="APA" Version="6"/>
+<b:Sources xmlns:b="http://schemas.openxmlformats.org/officeDocument/2006/bibliography" xmlns="http://schemas.openxmlformats.org/officeDocument/2006/bibliography" SelectedStyle="/APASixthEditionOfficeOnline.xsl" StyleName="APA" Version="6"/>
 </file>
 
 <file path=customXml/itemProps1.xml><?xml version="1.0" encoding="utf-8"?>
-<ds:datastoreItem xmlns:ds="http://schemas.openxmlformats.org/officeDocument/2006/customXml" ds:itemID="{D73F34BF-FFA3-40E3-AC84-2DFF285F12B5}">
+<ds:datastoreItem xmlns:ds="http://schemas.openxmlformats.org/officeDocument/2006/customXml" ds:itemID="{77D7E83E-7592-794D-A859-9D250B7299E3}">
   <ds:schemaRefs>
     <ds:schemaRef ds:uri="http://schemas.openxmlformats.org/officeDocument/2006/bibliography"/>
   </ds:schemaRefs>

</xml_diff>

<commit_message>
Intro in english : changes and finalised
</commit_message>
<xml_diff>
--- a/my_report/Thesis_Report_English.docx
+++ b/my_report/Thesis_Report_English.docx
@@ -174,7 +174,7 @@
                                     <pic:cNvPicPr/>
                                   </pic:nvPicPr>
                                   <pic:blipFill>
-                                    <a:blip r:embed="rId8">
+                                    <a:blip r:embed="rId9">
                                       <a:extLst>
                                         <a:ext uri="{28A0092B-C50C-407E-A947-70E740481C1C}">
                                           <a14:useLocalDpi xmlns:a14="http://schemas.microsoft.com/office/drawing/2010/main" val="0"/>
@@ -238,7 +238,7 @@
                     <pic:cNvPicPr/>
                   </pic:nvPicPr>
                   <pic:blipFill>
-                    <a:blip r:embed="rId9" cstate="print">
+                    <a:blip r:embed="rId10" cstate="print">
                       <a:extLst>
                         <a:ext uri="{28A0092B-C50C-407E-A947-70E740481C1C}">
                           <a14:useLocalDpi xmlns:a14="http://schemas.microsoft.com/office/drawing/2010/main" val="0"/>
@@ -409,12 +409,21 @@
           <w:sz w:val="44"/>
         </w:rPr>
       </w:pPr>
+      <w:proofErr w:type="spellStart"/>
       <w:r>
         <w:rPr>
           <w:b/>
           <w:sz w:val="44"/>
         </w:rPr>
-        <w:t>L’intelligence artificielle au service de l’enseignement des langues vivantes</w:t>
+        <w:t>Integration</w:t>
+      </w:r>
+      <w:proofErr w:type="spellEnd"/>
+      <w:r>
+        <w:rPr>
+          <w:b/>
+          <w:sz w:val="44"/>
+        </w:rPr>
+        <w:t xml:space="preserve"> de l’IA générative dans la planification pédagogique : </w:t>
       </w:r>
     </w:p>
     <w:p>
@@ -432,7 +441,39 @@
           <w:i/>
           <w:sz w:val="36"/>
         </w:rPr>
-        <w:t>Analyse pratique et expérimentation pédagogique des outils numériques intelligents</w:t>
+        <w:t>Perceptions, pratiques et barri</w:t>
+      </w:r>
+      <w:r>
+        <w:rPr>
+          <w:b/>
+          <w:i/>
+          <w:sz w:val="36"/>
+        </w:rPr>
+        <w:t>è</w:t>
+      </w:r>
+      <w:r>
+        <w:rPr>
+          <w:b/>
+          <w:i/>
+          <w:sz w:val="36"/>
+        </w:rPr>
+        <w:t>r</w:t>
+      </w:r>
+      <w:r>
+        <w:rPr>
+          <w:b/>
+          <w:i/>
+          <w:sz w:val="36"/>
+        </w:rPr>
+        <w:t>e</w:t>
+      </w:r>
+      <w:r>
+        <w:rPr>
+          <w:b/>
+          <w:i/>
+          <w:sz w:val="36"/>
+        </w:rPr>
+        <w:t>s chez les enseignants de langues vivantes au collège français</w:t>
       </w:r>
     </w:p>
     <w:p>
@@ -567,7 +608,7 @@
           <w:b/>
         </w:rPr>
         <w:sectPr>
-          <w:headerReference w:type="default" r:id="rId10"/>
+          <w:headerReference w:type="default" r:id="rId11"/>
           <w:pgSz w:w="11906" w:h="16838"/>
           <w:pgMar w:top="1417" w:right="1417" w:bottom="1417" w:left="1417" w:header="708" w:footer="708" w:gutter="0"/>
           <w:cols w:space="708"/>
@@ -4860,7 +4901,23 @@
             <w:noProof/>
             <w:lang w:val="en-IN"/>
           </w:rPr>
-          <w:t>State-of-the-Art AI for TICE</w:t>
+          <w:t xml:space="preserve">State-of-the-Art AI </w:t>
+        </w:r>
+        <w:r>
+          <w:rPr>
+            <w:rStyle w:val="Hyperlink"/>
+            <w:noProof/>
+            <w:lang w:val="en-IN"/>
+          </w:rPr>
+          <w:t>f</w:t>
+        </w:r>
+        <w:r>
+          <w:rPr>
+            <w:rStyle w:val="Hyperlink"/>
+            <w:noProof/>
+            <w:lang w:val="en-IN"/>
+          </w:rPr>
+          <w:t>or TICE</w:t>
         </w:r>
         <w:r>
           <w:rPr>
@@ -5532,7 +5589,7 @@
           <w:szCs w:val="24"/>
           <w:lang w:val="en-US"/>
         </w:rPr>
-        <w:t xml:space="preserve">transitioned </w:t>
+        <w:t>transitioned</w:t>
       </w:r>
       <w:r>
         <w:rPr>
@@ -5541,7 +5598,7 @@
           <w:szCs w:val="24"/>
           <w:lang w:val="en-US"/>
         </w:rPr>
-        <w:t>from grammar-translation methods</w:t>
+        <w:t xml:space="preserve"> </w:t>
       </w:r>
       <w:r>
         <w:rPr>
@@ -5550,7 +5607,43 @@
           <w:szCs w:val="24"/>
           <w:lang w:val="en-US"/>
         </w:rPr>
-        <w:t xml:space="preserve"> focusing on </w:t>
+        <w:t>from grammar</w:t>
+      </w:r>
+      <w:r>
+        <w:rPr>
+          <w:rFonts w:ascii="Times New Roman" w:hAnsi="Times New Roman" w:cs="Times New Roman"/>
+          <w:sz w:val="24"/>
+          <w:szCs w:val="24"/>
+          <w:lang w:val="en-US"/>
+        </w:rPr>
+        <w:t xml:space="preserve"> </w:t>
+      </w:r>
+      <w:r>
+        <w:rPr>
+          <w:rFonts w:ascii="Times New Roman" w:hAnsi="Times New Roman" w:cs="Times New Roman"/>
+          <w:sz w:val="24"/>
+          <w:szCs w:val="24"/>
+          <w:lang w:val="en-US"/>
+        </w:rPr>
+        <w:t>translation methods</w:t>
+      </w:r>
+      <w:r>
+        <w:rPr>
+          <w:rFonts w:ascii="Times New Roman" w:hAnsi="Times New Roman" w:cs="Times New Roman"/>
+          <w:sz w:val="24"/>
+          <w:szCs w:val="24"/>
+          <w:lang w:val="en-US"/>
+        </w:rPr>
+        <w:t xml:space="preserve"> </w:t>
+      </w:r>
+      <w:r>
+        <w:rPr>
+          <w:rFonts w:ascii="Times New Roman" w:hAnsi="Times New Roman" w:cs="Times New Roman"/>
+          <w:sz w:val="24"/>
+          <w:szCs w:val="24"/>
+          <w:lang w:val="en-US"/>
+        </w:rPr>
+        <w:t xml:space="preserve">focusing on </w:t>
       </w:r>
       <w:r>
         <w:rPr>
@@ -5766,7 +5859,25 @@
           <w:szCs w:val="24"/>
           <w:lang w:val="en-US"/>
         </w:rPr>
-        <w:t xml:space="preserve">. Teachers had to translate the methodological principles into sensible instructional sequences, lesson plans and classroom activities. This process place considerable responsibility on the teachers, work they usually performed outside of their classroom time. </w:t>
+        <w:t>. Teachers had to translate the methodological principles into sensible instructional sequences, lesson plans and classroom activities. This process place</w:t>
+      </w:r>
+      <w:r>
+        <w:rPr>
+          <w:rFonts w:ascii="Times New Roman" w:hAnsi="Times New Roman" w:cs="Times New Roman"/>
+          <w:sz w:val="24"/>
+          <w:szCs w:val="24"/>
+          <w:lang w:val="en-US"/>
+        </w:rPr>
+        <w:t>s</w:t>
+      </w:r>
+      <w:r>
+        <w:rPr>
+          <w:rFonts w:ascii="Times New Roman" w:hAnsi="Times New Roman" w:cs="Times New Roman"/>
+          <w:sz w:val="24"/>
+          <w:szCs w:val="24"/>
+          <w:lang w:val="en-US"/>
+        </w:rPr>
+        <w:t xml:space="preserve"> considerable responsibility on the teachers, work they usually performed outside of their classroom time. </w:t>
       </w:r>
       <w:r>
         <w:rPr>
@@ -5853,17 +5964,10 @@
     </w:p>
     <w:p>
       <w:pPr>
-        <w:rPr>
-          <w:lang w:val="en-US"/>
-        </w:rPr>
-      </w:pPr>
-    </w:p>
-    <w:p>
-      <w:pPr>
         <w:pStyle w:val="Heading2"/>
       </w:pPr>
       <w:r>
-        <w:t>EdTech &amp; AI</w:t>
+        <w:t>Emergence of TICE in language learning</w:t>
       </w:r>
     </w:p>
     <w:p>
@@ -5882,9 +5986,8 @@
           <w:szCs w:val="24"/>
           <w:lang w:val="en-US"/>
         </w:rPr>
-        <w:t>More here</w:t>
-      </w:r>
-      <w:proofErr w:type="gramStart"/>
+        <w:t>Digital tools gradually entered language classrooms through Computer-Assisted Language Learning (CALL), requiring teachers to adapt their lesson planning practices to incorporate these technologies</w:t>
+      </w:r>
       <w:r>
         <w:rPr>
           <w:rFonts w:ascii="Times New Roman" w:hAnsi="Times New Roman" w:cs="Times New Roman"/>
@@ -5892,19 +5995,17 @@
           <w:szCs w:val="24"/>
           <w:lang w:val="en-US"/>
         </w:rPr>
-        <w:t>…..</w:t>
-      </w:r>
-      <w:proofErr w:type="gramEnd"/>
-    </w:p>
-    <w:p>
-      <w:pPr>
+        <w:t xml:space="preserve"> </w:t>
+      </w:r>
+      <w:r>
         <w:rPr>
           <w:rFonts w:ascii="Times New Roman" w:hAnsi="Times New Roman" w:cs="Times New Roman"/>
           <w:sz w:val="24"/>
           <w:szCs w:val="24"/>
           <w:lang w:val="en-US"/>
         </w:rPr>
-      </w:pPr>
+        <w:fldChar w:fldCharType="begin"/>
+      </w:r>
       <w:r>
         <w:rPr>
           <w:rFonts w:ascii="Times New Roman" w:hAnsi="Times New Roman" w:cs="Times New Roman"/>
@@ -5912,25 +6013,7 @@
           <w:szCs w:val="24"/>
           <w:lang w:val="en-US"/>
         </w:rPr>
-        <w:t xml:space="preserve">however, moder education transitioned towards a student-focused approach with the emergence of new technological tools to aide an overall learning environment. </w:t>
-      </w:r>
-      <w:r>
-        <w:rPr>
-          <w:rFonts w:ascii="Times New Roman" w:hAnsi="Times New Roman" w:cs="Times New Roman"/>
-          <w:sz w:val="24"/>
-          <w:szCs w:val="24"/>
-          <w:lang w:val="en-US"/>
-        </w:rPr>
-        <w:fldChar w:fldCharType="begin"/>
-      </w:r>
-      <w:r>
-        <w:rPr>
-          <w:rFonts w:ascii="Times New Roman" w:hAnsi="Times New Roman" w:cs="Times New Roman"/>
-          <w:sz w:val="24"/>
-          <w:szCs w:val="24"/>
-          <w:lang w:val="en-US"/>
-        </w:rPr>
-        <w:instrText xml:space="preserve"> ADDIN ZOTERO_ITEM CSL_CITATION {"citationID":"KnDigR7p","properties":{"unsorted":false,"formattedCitation":"(Serin, 2018)","plainCitation":"(Serin, 2018)","noteIndex":0},"citationItems":[{"id":145,"uris":["http://zotero.org/users/18489330/items/W68WEB3B"],"itemData":{"id":145,"type":"article-journal","abstract":"Student-centered instruction in the classroom has recently challenged teacher-centeredness for allowing students to construct their understandings using their experiences and actions. Student-centered pedagogy is based on constructivist and democratic principles. That students make sense of what they learn in a classroom environment in which they are stimulated to develop their reflective and critical thinking and sense of responsibility come to the fore in student-centered pedagogy. Teacher-centered instruction on the other hand relied heavily on the behaviorist theory which was based on the idea that behavior changes are caused by external stimuli. Compared with student-centered classroom, students in teacher-centered classroom are passive and respond to environmental stimuli. Teacher has the ultimate authority and is in charge of learning for that reason students do not have adequate opportunities to develop their critical thinking and problem solving skills. This article endeavors to compare student-centered and teachercentered approaches and documents their general features in the classroom.","container-title":"International Journal of Social Sciences &amp; Educational Studies","DOI":"10.23918//ijsses.v5i1p164","issue":"1","language":"en","license":"Copyright (c) 2024 International Journal of Social Sciences &amp; Educational Studies","page":"164-167","source":"ijsses.tiu.edu.iq","title":"A Comparison of Teacher-Centered and Student-Centered Approaches in Educational Settings","volume":"5","author":[{"family":"Serin","given":"Hamdi"}],"issued":{"date-parts":[["2018",9,1]]}}}],"schema":"https://github.com/citation-style-language/schema/raw/master/csl-citation.json"} </w:instrText>
+        <w:instrText xml:space="preserve"> ADDIN ZOTERO_ITEM CSL_CITATION {"citationID":"O0MCPcRA","properties":{"unsorted":false,"formattedCitation":"(Warschauer &amp; Healey, 1998)","plainCitation":"(Warschauer &amp; Healey, 1998)","noteIndex":0},"citationItems":[{"id":162,"uris":["http://zotero.org/users/18489330/items/XUXM9ST6"],"itemData":{"id":162,"type":"article-journal","container-title":"Language Teaching","DOI":"10.1017/S0261444800012970","ISSN":"0261-4448, 1475-3049","issue":"2","journalAbbreviation":"Lang. Teach.","language":"en","license":"https://www.cambridge.org/core/terms","page":"57-71","source":"DOI.org (Crossref)","title":"Computers and language learning: an overview","title-short":"Computers and language learning","volume":"31","author":[{"family":"Warschauer","given":"Mark"},{"family":"Healey","given":"Deborah"}],"issued":{"date-parts":[["1998",4]]}}}],"schema":"https://github.com/citation-style-language/schema/raw/master/csl-citation.json"} </w:instrText>
       </w:r>
       <w:r>
         <w:rPr>
@@ -5949,7 +6032,7 @@
           <w:szCs w:val="24"/>
           <w:lang w:val="en-US"/>
         </w:rPr>
-        <w:t>(Serin, 2018)</w:t>
+        <w:t>(Warschauer &amp; Healey, 1998)</w:t>
       </w:r>
       <w:r>
         <w:rPr>
@@ -5967,1918 +6050,1265 @@
           <w:szCs w:val="24"/>
           <w:lang w:val="en-US"/>
         </w:rPr>
-        <w:t xml:space="preserve">.  </w:t>
-      </w:r>
-    </w:p>
-    <w:p>
-      <w:pPr>
-        <w:rPr>
-          <w:lang w:val="en-US"/>
-        </w:rPr>
-      </w:pPr>
-    </w:p>
-    <w:p>
-      <w:pPr>
-        <w:rPr>
-          <w:lang w:val="en-US"/>
-        </w:rPr>
-      </w:pPr>
-      <w:r>
-        <w:rPr>
-          <w:lang w:val="en-US"/>
-        </w:rPr>
-        <w:t xml:space="preserve">Mox dicta </w:t>
-      </w:r>
-      <w:proofErr w:type="spellStart"/>
-      <w:r>
-        <w:rPr>
-          <w:lang w:val="en-US"/>
-        </w:rPr>
-        <w:t>finierat</w:t>
-      </w:r>
-      <w:proofErr w:type="spellEnd"/>
+        <w:t>.</w:t>
+      </w:r>
+      <w:r>
+        <w:rPr>
+          <w:rFonts w:ascii="Times New Roman" w:hAnsi="Times New Roman" w:cs="Times New Roman"/>
+          <w:sz w:val="24"/>
+          <w:szCs w:val="24"/>
+          <w:lang w:val="en-US"/>
+        </w:rPr>
+        <w:t xml:space="preserve"> </w:t>
+      </w:r>
+      <w:r>
+        <w:rPr>
+          <w:rFonts w:ascii="Times New Roman" w:hAnsi="Times New Roman" w:cs="Times New Roman"/>
+          <w:sz w:val="24"/>
+          <w:szCs w:val="24"/>
+          <w:lang w:val="en-US"/>
+        </w:rPr>
+        <w:t>Instead of relying only on textbooks and face-to-face instruction, teachers began integrating computers, language software, multimedia materials, and later internet-based resources into their classrooms. This adaptation required teachers to develop new technical skills, redesign classroom activities, and shift toward more learner-centered approaches. They also had to learn how to select appropriate digital tools that supported language skills such as listening, speaking, reading, and writing. These changes marked an important transition in language education, as technology became increasingly connected to both teaching practices and student engagement.</w:t>
+      </w:r>
+    </w:p>
+    <w:p>
+      <w:pPr>
+        <w:rPr>
+          <w:rFonts w:ascii="Times New Roman" w:hAnsi="Times New Roman" w:cs="Times New Roman"/>
+          <w:sz w:val="24"/>
+          <w:szCs w:val="24"/>
+          <w:lang w:val="en-US"/>
+        </w:rPr>
+      </w:pPr>
+      <w:r>
+        <w:rPr>
+          <w:rFonts w:ascii="Times New Roman" w:hAnsi="Times New Roman" w:cs="Times New Roman"/>
+          <w:sz w:val="24"/>
+          <w:szCs w:val="24"/>
+          <w:lang w:val="en-US"/>
+        </w:rPr>
+        <w:lastRenderedPageBreak/>
+        <w:t>Despite CALL integration, teachers remained the primary designers of instruction.</w:t>
+      </w:r>
+      <w:r>
+        <w:rPr>
+          <w:rFonts w:ascii="Times New Roman" w:hAnsi="Times New Roman" w:cs="Times New Roman"/>
+          <w:sz w:val="24"/>
+          <w:szCs w:val="24"/>
+          <w:lang w:val="en-US"/>
+        </w:rPr>
+        <w:t xml:space="preserve"> </w:t>
+      </w:r>
+      <w:r>
+        <w:rPr>
+          <w:rFonts w:ascii="Times New Roman" w:hAnsi="Times New Roman" w:cs="Times New Roman"/>
+          <w:sz w:val="24"/>
+          <w:szCs w:val="24"/>
+          <w:lang w:val="en-US"/>
+        </w:rPr>
+        <w:t>Digital tools supported lesson planning but did not generate</w:t>
+      </w:r>
+      <w:r>
+        <w:rPr>
+          <w:rFonts w:ascii="Times New Roman" w:hAnsi="Times New Roman" w:cs="Times New Roman"/>
+          <w:sz w:val="24"/>
+          <w:szCs w:val="24"/>
+          <w:lang w:val="en-US"/>
+        </w:rPr>
+        <w:t xml:space="preserve"> complete</w:t>
+      </w:r>
+      <w:r>
+        <w:rPr>
+          <w:rFonts w:ascii="Times New Roman" w:hAnsi="Times New Roman" w:cs="Times New Roman"/>
+          <w:sz w:val="24"/>
+          <w:szCs w:val="24"/>
+          <w:lang w:val="en-US"/>
+        </w:rPr>
+        <w:t xml:space="preserve"> </w:t>
+      </w:r>
+      <w:r>
+        <w:rPr>
+          <w:rFonts w:ascii="Times New Roman" w:hAnsi="Times New Roman" w:cs="Times New Roman"/>
+          <w:sz w:val="24"/>
+          <w:szCs w:val="24"/>
+          <w:lang w:val="en-US"/>
+        </w:rPr>
+        <w:t>lesson plans yet</w:t>
+      </w:r>
+      <w:r>
+        <w:rPr>
+          <w:rFonts w:ascii="Times New Roman" w:hAnsi="Times New Roman" w:cs="Times New Roman"/>
+          <w:sz w:val="24"/>
+          <w:szCs w:val="24"/>
+          <w:lang w:val="en-US"/>
+        </w:rPr>
+        <w:t>; teachers still created the core curriculum</w:t>
+      </w:r>
+      <w:r>
+        <w:rPr>
+          <w:rFonts w:ascii="Times New Roman" w:hAnsi="Times New Roman" w:cs="Times New Roman"/>
+          <w:sz w:val="24"/>
+          <w:szCs w:val="24"/>
+          <w:lang w:val="en-US"/>
+        </w:rPr>
+        <w:t xml:space="preserve"> </w:t>
+      </w:r>
+      <w:r>
+        <w:rPr>
+          <w:rFonts w:ascii="Times New Roman" w:hAnsi="Times New Roman" w:cs="Times New Roman"/>
+          <w:sz w:val="24"/>
+          <w:szCs w:val="24"/>
+          <w:lang w:val="en-US"/>
+        </w:rPr>
+        <w:fldChar w:fldCharType="begin"/>
+      </w:r>
+      <w:r>
+        <w:rPr>
+          <w:rFonts w:ascii="Times New Roman" w:hAnsi="Times New Roman" w:cs="Times New Roman"/>
+          <w:sz w:val="24"/>
+          <w:szCs w:val="24"/>
+          <w:lang w:val="en-US"/>
+        </w:rPr>
+        <w:instrText xml:space="preserve"> ADDIN ZOTERO_ITEM CSL_CITATION {"citationID":"hTjHASlM","properties":{"unsorted":false,"formattedCitation":"(Warschauer &amp; Healey, 1998)","plainCitation":"(Warschauer &amp; Healey, 1998)","noteIndex":0},"citationItems":[{"id":162,"uris":["http://zotero.org/users/18489330/items/XUXM9ST6"],"itemData":{"id":162,"type":"article-journal","container-title":"Language Teaching","DOI":"10.1017/S0261444800012970","ISSN":"0261-4448, 1475-3049","issue":"2","journalAbbreviation":"Lang. Teach.","language":"en","license":"https://www.cambridge.org/core/terms","page":"57-71","source":"DOI.org (Crossref)","title":"Computers and language learning: an overview","title-short":"Computers and language learning","volume":"31","author":[{"family":"Warschauer","given":"Mark"},{"family":"Healey","given":"Deborah"}],"issued":{"date-parts":[["1998",4]]}}}],"schema":"https://github.com/citation-style-language/schema/raw/master/csl-citation.json"} </w:instrText>
+      </w:r>
+      <w:r>
+        <w:rPr>
+          <w:rFonts w:ascii="Times New Roman" w:hAnsi="Times New Roman" w:cs="Times New Roman"/>
+          <w:sz w:val="24"/>
+          <w:szCs w:val="24"/>
+          <w:lang w:val="en-US"/>
+        </w:rPr>
+        <w:fldChar w:fldCharType="separate"/>
+      </w:r>
+      <w:r>
+        <w:rPr>
+          <w:rFonts w:ascii="Times New Roman" w:hAnsi="Times New Roman" w:cs="Times New Roman"/>
+          <w:noProof/>
+          <w:sz w:val="24"/>
+          <w:szCs w:val="24"/>
+          <w:lang w:val="en-US"/>
+        </w:rPr>
+        <w:t>(Warschauer &amp; Healey, 1998)</w:t>
+      </w:r>
+      <w:r>
+        <w:rPr>
+          <w:rFonts w:ascii="Times New Roman" w:hAnsi="Times New Roman" w:cs="Times New Roman"/>
+          <w:sz w:val="24"/>
+          <w:szCs w:val="24"/>
+          <w:lang w:val="en-US"/>
+        </w:rPr>
+        <w:fldChar w:fldCharType="end"/>
+      </w:r>
+      <w:r>
+        <w:rPr>
+          <w:rFonts w:ascii="Times New Roman" w:hAnsi="Times New Roman" w:cs="Times New Roman"/>
+          <w:sz w:val="24"/>
+          <w:szCs w:val="24"/>
+          <w:lang w:val="en-US"/>
+        </w:rPr>
+        <w:t>.</w:t>
+      </w:r>
+      <w:r>
+        <w:rPr>
+          <w:rFonts w:ascii="Times New Roman" w:hAnsi="Times New Roman" w:cs="Times New Roman"/>
+          <w:sz w:val="24"/>
+          <w:szCs w:val="24"/>
+          <w:lang w:val="en-US"/>
+        </w:rPr>
+        <w:t xml:space="preserve"> </w:t>
+      </w:r>
+      <w:r>
+        <w:rPr>
+          <w:rFonts w:ascii="Times New Roman" w:hAnsi="Times New Roman" w:cs="Times New Roman"/>
+          <w:sz w:val="24"/>
+          <w:szCs w:val="24"/>
+          <w:lang w:val="en-US"/>
+        </w:rPr>
+        <w:t>This distinction becomes important when considering generative AI, which fundamentally changes what teachers must do in lesson planning.</w:t>
+      </w:r>
+    </w:p>
+    <w:p>
+      <w:pPr>
+        <w:rPr>
+          <w:lang w:val="en-US"/>
+        </w:rPr>
+      </w:pPr>
+    </w:p>
+    <w:p>
+      <w:pPr>
+        <w:pStyle w:val="Heading2"/>
+      </w:pPr>
+      <w:r>
+        <w:t>Integration of generative AI in language learning</w:t>
+      </w:r>
+    </w:p>
+    <w:p>
+      <w:pPr>
+        <w:rPr>
+          <w:rFonts w:ascii="Times New Roman" w:hAnsi="Times New Roman" w:cs="Times New Roman"/>
+          <w:sz w:val="24"/>
+          <w:szCs w:val="24"/>
+          <w:lang w:val="en-US"/>
+        </w:rPr>
+      </w:pPr>
+      <w:r>
+        <w:rPr>
+          <w:rFonts w:ascii="Times New Roman" w:hAnsi="Times New Roman" w:cs="Times New Roman"/>
+          <w:sz w:val="24"/>
+          <w:szCs w:val="24"/>
+          <w:lang w:val="en-US"/>
+        </w:rPr>
+        <w:t>Generative</w:t>
+      </w:r>
+      <w:r>
+        <w:rPr>
+          <w:rFonts w:ascii="Times New Roman" w:hAnsi="Times New Roman" w:cs="Times New Roman"/>
+          <w:sz w:val="24"/>
+          <w:szCs w:val="24"/>
+          <w:lang w:val="en-US"/>
+        </w:rPr>
+        <w:t xml:space="preserve"> </w:t>
+      </w:r>
+      <w:r>
+        <w:rPr>
+          <w:rFonts w:ascii="Times New Roman" w:hAnsi="Times New Roman" w:cs="Times New Roman"/>
+          <w:sz w:val="24"/>
+          <w:szCs w:val="24"/>
+          <w:lang w:val="en-US"/>
+        </w:rPr>
+        <w:t>AI describes artificial intelligence systems that produce new material, including text, lesson plans, and exercises, when given a user prompt as input</w:t>
+      </w:r>
+      <w:r>
+        <w:rPr>
+          <w:rFonts w:ascii="Times New Roman" w:hAnsi="Times New Roman" w:cs="Times New Roman"/>
+          <w:sz w:val="24"/>
+          <w:szCs w:val="24"/>
+          <w:lang w:val="en-US"/>
+        </w:rPr>
+        <w:t xml:space="preserve"> </w:t>
+      </w:r>
+      <w:r>
+        <w:rPr>
+          <w:rFonts w:ascii="Times New Roman" w:hAnsi="Times New Roman" w:cs="Times New Roman"/>
+          <w:sz w:val="24"/>
+          <w:szCs w:val="24"/>
+          <w:lang w:val="en-US"/>
+        </w:rPr>
+        <w:fldChar w:fldCharType="begin"/>
+      </w:r>
+      <w:r>
+        <w:rPr>
+          <w:rFonts w:ascii="Times New Roman" w:hAnsi="Times New Roman" w:cs="Times New Roman"/>
+          <w:sz w:val="24"/>
+          <w:szCs w:val="24"/>
+          <w:lang w:val="en-US"/>
+        </w:rPr>
+        <w:instrText xml:space="preserve"> ADDIN ZOTERO_ITEM CSL_CITATION {"citationID":"ubaZquHB","properties":{"unsorted":false,"formattedCitation":"(Mishra et al., 2025)","plainCitation":"(Mishra et al., 2025)","noteIndex":0},"citationItems":[{"id":163,"uris":["http://zotero.org/users/18489330/items/4DG2IMP8"],"itemData":{"id":163,"type":"article-journal","container-title":"TechTrends","DOI":"10.1007/s11528-025-01064-2","ISSN":"8756-3894, 1559-7075","issue":"2","journalAbbreviation":"TechTrends","language":"en","page":"247-253","source":"DOI.org (Crossref)","title":"Control vs. Agency: Exploring the History of AI in Education","title-short":"Control vs. Agency","volume":"69","author":[{"family":"Mishra","given":"Punya"},{"family":"Henriksen","given":"Danah"},{"family":"Woo","given":"Lauren J."},{"family":"Oster","given":"Nicole"}],"issued":{"date-parts":[["2025",3]]}}}],"schema":"https://github.com/citation-style-language/schema/raw/master/csl-citation.json"} </w:instrText>
+      </w:r>
+      <w:r>
+        <w:rPr>
+          <w:rFonts w:ascii="Times New Roman" w:hAnsi="Times New Roman" w:cs="Times New Roman"/>
+          <w:sz w:val="24"/>
+          <w:szCs w:val="24"/>
+          <w:lang w:val="en-US"/>
+        </w:rPr>
+        <w:fldChar w:fldCharType="separate"/>
+      </w:r>
+      <w:r>
+        <w:rPr>
+          <w:rFonts w:ascii="Times New Roman" w:hAnsi="Times New Roman" w:cs="Times New Roman"/>
+          <w:noProof/>
+          <w:sz w:val="24"/>
+          <w:szCs w:val="24"/>
+          <w:lang w:val="en-US"/>
+        </w:rPr>
+        <w:t>(Mishra et al., 2025)</w:t>
+      </w:r>
+      <w:r>
+        <w:rPr>
+          <w:rFonts w:ascii="Times New Roman" w:hAnsi="Times New Roman" w:cs="Times New Roman"/>
+          <w:sz w:val="24"/>
+          <w:szCs w:val="24"/>
+          <w:lang w:val="en-US"/>
+        </w:rPr>
+        <w:fldChar w:fldCharType="end"/>
+      </w:r>
+      <w:r>
+        <w:rPr>
+          <w:rFonts w:ascii="Times New Roman" w:hAnsi="Times New Roman" w:cs="Times New Roman"/>
+          <w:sz w:val="24"/>
+          <w:szCs w:val="24"/>
+          <w:lang w:val="en-US"/>
+        </w:rPr>
+        <w:t>.</w:t>
+      </w:r>
+      <w:r>
+        <w:rPr>
+          <w:rFonts w:ascii="Times New Roman" w:hAnsi="Times New Roman" w:cs="Times New Roman"/>
+          <w:sz w:val="24"/>
+          <w:szCs w:val="24"/>
+          <w:lang w:val="en-US"/>
+        </w:rPr>
+        <w:t xml:space="preserve"> Contrary to</w:t>
+      </w:r>
+      <w:r>
+        <w:rPr>
+          <w:rFonts w:ascii="Times New Roman" w:hAnsi="Times New Roman" w:cs="Times New Roman"/>
+          <w:sz w:val="24"/>
+          <w:szCs w:val="24"/>
+          <w:lang w:val="en-US"/>
+        </w:rPr>
+        <w:t xml:space="preserve"> CALL tools that supported</w:t>
+      </w:r>
+      <w:r>
+        <w:rPr>
+          <w:rFonts w:ascii="Times New Roman" w:hAnsi="Times New Roman" w:cs="Times New Roman"/>
+          <w:sz w:val="24"/>
+          <w:szCs w:val="24"/>
+          <w:lang w:val="en-US"/>
+        </w:rPr>
+        <w:t xml:space="preserve"> </w:t>
+      </w:r>
+      <w:r>
+        <w:rPr>
+          <w:rFonts w:ascii="Times New Roman" w:hAnsi="Times New Roman" w:cs="Times New Roman"/>
+          <w:sz w:val="24"/>
+          <w:szCs w:val="24"/>
+          <w:lang w:val="en-US"/>
+        </w:rPr>
+        <w:t>instruction</w:t>
+      </w:r>
+      <w:r>
+        <w:rPr>
+          <w:rFonts w:ascii="Times New Roman" w:hAnsi="Times New Roman" w:cs="Times New Roman"/>
+          <w:sz w:val="24"/>
+          <w:szCs w:val="24"/>
+          <w:lang w:val="en-US"/>
+        </w:rPr>
+        <w:t xml:space="preserve"> designed by the teachers</w:t>
+      </w:r>
+      <w:r>
+        <w:rPr>
+          <w:rFonts w:ascii="Times New Roman" w:hAnsi="Times New Roman" w:cs="Times New Roman"/>
+          <w:sz w:val="24"/>
+          <w:szCs w:val="24"/>
+          <w:lang w:val="en-US"/>
+        </w:rPr>
+        <w:t>, generative AI actively produces instructional content that teachers must evaluate and adapt.</w:t>
+      </w:r>
+      <w:r>
+        <w:rPr>
+          <w:rFonts w:ascii="Times New Roman" w:hAnsi="Times New Roman" w:cs="Times New Roman"/>
+          <w:sz w:val="24"/>
+          <w:szCs w:val="24"/>
+          <w:lang w:val="en-US"/>
+        </w:rPr>
+        <w:t xml:space="preserve"> </w:t>
+      </w:r>
+      <w:r>
+        <w:rPr>
+          <w:rFonts w:ascii="Times New Roman" w:hAnsi="Times New Roman" w:cs="Times New Roman"/>
+          <w:sz w:val="24"/>
+          <w:szCs w:val="24"/>
+          <w:lang w:val="en-US"/>
+        </w:rPr>
+        <w:t>This shift requires teachers to exercise new forms of pedagogical judgment by assessing AI</w:t>
+      </w:r>
+      <w:r>
+        <w:rPr>
+          <w:rFonts w:ascii="Times New Roman" w:hAnsi="Times New Roman" w:cs="Times New Roman"/>
+          <w:sz w:val="24"/>
+          <w:szCs w:val="24"/>
+          <w:lang w:val="en-US"/>
+        </w:rPr>
+        <w:t xml:space="preserve"> - </w:t>
+      </w:r>
+      <w:r>
+        <w:rPr>
+          <w:rFonts w:ascii="Times New Roman" w:hAnsi="Times New Roman" w:cs="Times New Roman"/>
+          <w:sz w:val="24"/>
+          <w:szCs w:val="24"/>
+          <w:lang w:val="en-US"/>
+        </w:rPr>
+        <w:t>generated content for accuracy, alignment with curriculum, and pedagogical appropriatenes</w:t>
+      </w:r>
+      <w:r>
+        <w:rPr>
+          <w:rFonts w:ascii="Times New Roman" w:hAnsi="Times New Roman" w:cs="Times New Roman"/>
+          <w:sz w:val="24"/>
+          <w:szCs w:val="24"/>
+          <w:lang w:val="en-US"/>
+        </w:rPr>
+        <w:t>s</w:t>
+      </w:r>
+      <w:r>
+        <w:rPr>
+          <w:rFonts w:ascii="Times New Roman" w:hAnsi="Times New Roman" w:cs="Times New Roman"/>
+          <w:sz w:val="24"/>
+          <w:szCs w:val="24"/>
+          <w:lang w:val="en-US"/>
+        </w:rPr>
+        <w:t xml:space="preserve"> </w:t>
+      </w:r>
+      <w:r>
+        <w:rPr>
+          <w:rFonts w:ascii="Times New Roman" w:hAnsi="Times New Roman" w:cs="Times New Roman"/>
+          <w:sz w:val="24"/>
+          <w:szCs w:val="24"/>
+          <w:lang w:val="en-US"/>
+        </w:rPr>
+        <w:fldChar w:fldCharType="begin"/>
+      </w:r>
+      <w:r>
+        <w:rPr>
+          <w:rFonts w:ascii="Times New Roman" w:hAnsi="Times New Roman" w:cs="Times New Roman"/>
+          <w:sz w:val="24"/>
+          <w:szCs w:val="24"/>
+          <w:lang w:val="en-US"/>
+        </w:rPr>
+        <w:instrText xml:space="preserve"> ADDIN ZOTERO_ITEM CSL_CITATION {"citationID":"NVVlChKf","properties":{"unsorted":false,"formattedCitation":"(Morgan, 2025)","plainCitation":"(Morgan, 2025)","noteIndex":0},"citationItems":[{"id":177,"uris":["http://zotero.org/users/18489330/items/FBUV6X7X"],"itemData":{"id":177,"type":"article-journal","abstract":"Effective phonemic awareness instruction is essential for early literacy development, yet teachers often seek additional support in designing structured, engaging, and standards-aligned lesson plans. Generative AI (GenAI), such as ChatGPT Plus, is a promising tool for assisting educators with lesson creation. This study explores the effectiveness of ChatGPT Plus in generating phonemic awareness lesson plans that align with learning objectives, the Gradual Release of Responsibility (GRR) model, and the Science of Teaching Reading (STR) instructional practices. The study evaluated and refined three ChatGPT Plus-generated lesson plans using a design-based research methodology. The initial output lacked student engagement, formative strategies, and explicit teacher feedback and needed multiple refinements. The final output indicates that ChatGPT Plus successfully created lessons using the GRR model, incorporated STR instructional practices, and aligned them with lesson objectives. This study highlights the potential of GenAI in lesson planning but emphasizes the need for teacher experience in using detailed prompts and critical evaluation of AI-generated lesson plans. While ChatGPT Plus can streamline lesson planning, teacher oversight remains essential to ensure pedagogical and instructional effects.","container-title":"Texas Journal of Literacy Education","ISSN":"2374-7404","issue":"1","language":"en","source":"www.talejournal.com","title":"Phonemic Awareness and AI: Evaluating ChatGPT Plus for Structured Lesson Development","title-short":"Phonemic Awareness and AI","URL":"https://www.talejournal.com/index.php/TJLE/article/view/175","volume":"12","author":[{"family":"Morgan","given":"Kristin LaVelle Kristin"}],"accessed":{"date-parts":[["2026",5,17]]},"issued":{"date-parts":[["2025",8,22]]}}}],"schema":"https://github.com/citation-style-language/schema/raw/master/csl-citation.json"} </w:instrText>
+      </w:r>
+      <w:r>
+        <w:rPr>
+          <w:rFonts w:ascii="Times New Roman" w:hAnsi="Times New Roman" w:cs="Times New Roman"/>
+          <w:sz w:val="24"/>
+          <w:szCs w:val="24"/>
+          <w:lang w:val="en-US"/>
+        </w:rPr>
+        <w:fldChar w:fldCharType="separate"/>
+      </w:r>
+      <w:r>
+        <w:rPr>
+          <w:rFonts w:ascii="Times New Roman" w:hAnsi="Times New Roman" w:cs="Times New Roman"/>
+          <w:noProof/>
+          <w:sz w:val="24"/>
+          <w:szCs w:val="24"/>
+          <w:lang w:val="en-US"/>
+        </w:rPr>
+        <w:t>(Morgan, 2025)</w:t>
+      </w:r>
+      <w:r>
+        <w:rPr>
+          <w:rFonts w:ascii="Times New Roman" w:hAnsi="Times New Roman" w:cs="Times New Roman"/>
+          <w:sz w:val="24"/>
+          <w:szCs w:val="24"/>
+          <w:lang w:val="en-US"/>
+        </w:rPr>
+        <w:fldChar w:fldCharType="end"/>
+      </w:r>
+      <w:r>
+        <w:rPr>
+          <w:rFonts w:ascii="Times New Roman" w:hAnsi="Times New Roman" w:cs="Times New Roman"/>
+          <w:sz w:val="24"/>
+          <w:szCs w:val="24"/>
+          <w:lang w:val="en-US"/>
+        </w:rPr>
+        <w:t xml:space="preserve">. </w:t>
+      </w:r>
+      <w:r>
+        <w:rPr>
+          <w:rFonts w:ascii="Times New Roman" w:hAnsi="Times New Roman" w:cs="Times New Roman"/>
+          <w:sz w:val="24"/>
+          <w:szCs w:val="24"/>
+          <w:lang w:val="en-US"/>
+        </w:rPr>
+        <w:t>R</w:t>
+      </w:r>
+      <w:r>
+        <w:rPr>
+          <w:rFonts w:ascii="Times New Roman" w:hAnsi="Times New Roman" w:cs="Times New Roman"/>
+          <w:sz w:val="24"/>
+          <w:szCs w:val="24"/>
+          <w:lang w:val="en-US"/>
+        </w:rPr>
+        <w:t>esearch has begun to examine AI's potential in language education and teacher adoption of technology more broadly.</w:t>
+      </w:r>
+      <w:r>
+        <w:rPr>
+          <w:rFonts w:ascii="Times New Roman" w:hAnsi="Times New Roman" w:cs="Times New Roman"/>
+          <w:sz w:val="24"/>
+          <w:szCs w:val="24"/>
+          <w:lang w:val="en-US"/>
+        </w:rPr>
+        <w:t xml:space="preserve"> </w:t>
+      </w:r>
+      <w:r>
+        <w:rPr>
+          <w:rFonts w:ascii="Times New Roman" w:hAnsi="Times New Roman" w:cs="Times New Roman"/>
+          <w:sz w:val="24"/>
+          <w:szCs w:val="24"/>
+          <w:lang w:val="en-US"/>
+        </w:rPr>
+        <w:t>However, limited research has specifically examined how teachers evaluate, integrate, and make pedagogical decisions about generative AI in lesson planning, particularly in the French secondary education context.</w:t>
+      </w:r>
+      <w:r>
+        <w:rPr>
+          <w:rFonts w:ascii="Times New Roman" w:hAnsi="Times New Roman" w:cs="Times New Roman"/>
+          <w:sz w:val="24"/>
+          <w:szCs w:val="24"/>
+          <w:lang w:val="en-US"/>
+        </w:rPr>
+        <w:t xml:space="preserve"> </w:t>
+      </w:r>
+      <w:r>
+        <w:rPr>
+          <w:rFonts w:ascii="Times New Roman" w:hAnsi="Times New Roman" w:cs="Times New Roman"/>
+          <w:sz w:val="24"/>
+          <w:szCs w:val="24"/>
+          <w:lang w:val="en-US"/>
+        </w:rPr>
+        <w:t>Understanding these teacher perspectives and practices is essential given the rapid integration of AI tools and the need to support informed pedagogical adoption.</w:t>
+      </w:r>
+    </w:p>
+    <w:p>
+      <w:pPr>
+        <w:pStyle w:val="Heading2"/>
+      </w:pPr>
+    </w:p>
+    <w:p>
+      <w:pPr>
+        <w:pStyle w:val="Heading2"/>
+      </w:pPr>
+      <w:r>
+        <w:t>French Education System</w:t>
+      </w:r>
+      <w:r>
+        <w:t xml:space="preserve"> and AI</w:t>
+      </w:r>
+    </w:p>
+    <w:p>
+      <w:pPr>
+        <w:rPr>
+          <w:rFonts w:ascii="Times New Roman" w:hAnsi="Times New Roman" w:cs="Times New Roman"/>
+          <w:sz w:val="24"/>
+          <w:szCs w:val="24"/>
+          <w:lang w:val="en-US"/>
+        </w:rPr>
+      </w:pPr>
+      <w:r>
+        <w:rPr>
+          <w:rFonts w:ascii="Times New Roman" w:hAnsi="Times New Roman" w:cs="Times New Roman"/>
+          <w:sz w:val="24"/>
+          <w:szCs w:val="24"/>
+          <w:lang w:val="en-US"/>
+        </w:rPr>
+        <w:t>Generative AI usage is permitted secondary education, however the</w:t>
+      </w:r>
+      <w:r>
+        <w:rPr>
+          <w:rFonts w:ascii="Times New Roman" w:hAnsi="Times New Roman" w:cs="Times New Roman"/>
+          <w:sz w:val="24"/>
+          <w:szCs w:val="24"/>
+          <w:lang w:val="en-US"/>
+        </w:rPr>
+        <w:t xml:space="preserve"> beneficiaries have to abide by the regulations set by the French Ministry of education </w:t>
+      </w:r>
+      <w:r>
+        <w:rPr>
+          <w:rFonts w:ascii="Times New Roman" w:hAnsi="Times New Roman" w:cs="Times New Roman"/>
+          <w:sz w:val="24"/>
+          <w:szCs w:val="24"/>
+          <w:lang w:val="en-US"/>
+        </w:rPr>
+        <w:t xml:space="preserve"> </w:t>
+      </w:r>
+      <w:r>
+        <w:rPr>
+          <w:rFonts w:ascii="Times New Roman" w:hAnsi="Times New Roman" w:cs="Times New Roman"/>
+          <w:sz w:val="24"/>
+          <w:szCs w:val="24"/>
+        </w:rPr>
+        <w:fldChar w:fldCharType="begin"/>
+      </w:r>
+      <w:r>
+        <w:rPr>
+          <w:rFonts w:ascii="Times New Roman" w:hAnsi="Times New Roman" w:cs="Times New Roman"/>
+          <w:sz w:val="24"/>
+          <w:szCs w:val="24"/>
+          <w:lang w:val="en-US"/>
+        </w:rPr>
+        <w:instrText xml:space="preserve"> ADDIN ZOTERO_ITEM CSL_CITATION {"citationID":"83JbKdtu","properties":{"unsorted":false,"formattedCitation":"({\\i{}Cadre d\\uc0\\u8217{}usage de l\\uc0\\u8217{}IA en \\uc0\\u233{}ducation}, 2025)","plainCitation":"(Cadre d’usage de l’IA en éducation, 2025)","noteIndex":0},"citationItems":[{"id":171,"uris":["http://zotero.org/users/18489330/items/HRT5PKYW"],"itemData":{"id":171,"type":"webpage","abstract":"Le développement rapide de l’IA interroge le monde éducatif. Pour en encadrer l’usage à l’école, un cadre éthique et juridique est proposé à la communauté éducative. Découvrez ce cadre en détail.","container-title":"Ministère de l'Education nationale","language":"fr","title":"Cadre d'usage de l'IA en éducation","URL":"https://www.education.gouv.fr/cadre-d-usage-de-l-ia-en-education-450647","accessed":{"date-parts":[["2026",5,17]]},"issued":{"date-parts":[["2025",6,13]]}}}],"schema":"https://github.com/citation-style-language/schema/raw/master/csl-citation.json"} </w:instrText>
+      </w:r>
+      <w:r>
+        <w:rPr>
+          <w:rFonts w:ascii="Times New Roman" w:hAnsi="Times New Roman" w:cs="Times New Roman"/>
+          <w:sz w:val="24"/>
+          <w:szCs w:val="24"/>
+        </w:rPr>
+        <w:fldChar w:fldCharType="separate"/>
+      </w:r>
+      <w:r>
+        <w:rPr>
+          <w:rFonts w:ascii="Times New Roman" w:hAnsi="Times New Roman" w:cs="Times New Roman"/>
+          <w:sz w:val="24"/>
+          <w:szCs w:val="24"/>
+          <w:lang w:val="en-US"/>
+        </w:rPr>
+        <w:t xml:space="preserve">(Cadre </w:t>
+      </w:r>
+      <w:proofErr w:type="spellStart"/>
+      <w:r>
+        <w:rPr>
+          <w:rFonts w:ascii="Times New Roman" w:hAnsi="Times New Roman" w:cs="Times New Roman"/>
+          <w:sz w:val="24"/>
+          <w:szCs w:val="24"/>
+          <w:lang w:val="en-US"/>
+        </w:rPr>
+        <w:t>d’usage</w:t>
+      </w:r>
+      <w:proofErr w:type="spellEnd"/>
+      <w:r>
+        <w:rPr>
+          <w:rFonts w:ascii="Times New Roman" w:hAnsi="Times New Roman" w:cs="Times New Roman"/>
+          <w:sz w:val="24"/>
+          <w:szCs w:val="24"/>
+          <w:lang w:val="en-US"/>
+        </w:rPr>
+        <w:t xml:space="preserve"> de </w:t>
+      </w:r>
+      <w:proofErr w:type="spellStart"/>
+      <w:r>
+        <w:rPr>
+          <w:rFonts w:ascii="Times New Roman" w:hAnsi="Times New Roman" w:cs="Times New Roman"/>
+          <w:sz w:val="24"/>
+          <w:szCs w:val="24"/>
+          <w:lang w:val="en-US"/>
+        </w:rPr>
+        <w:t>l’IA</w:t>
+      </w:r>
+      <w:proofErr w:type="spellEnd"/>
+      <w:r>
+        <w:rPr>
+          <w:rFonts w:ascii="Times New Roman" w:hAnsi="Times New Roman" w:cs="Times New Roman"/>
+          <w:sz w:val="24"/>
+          <w:szCs w:val="24"/>
+          <w:lang w:val="en-US"/>
+        </w:rPr>
+        <w:t xml:space="preserve"> </w:t>
+      </w:r>
+      <w:proofErr w:type="spellStart"/>
+      <w:r>
+        <w:rPr>
+          <w:rFonts w:ascii="Times New Roman" w:hAnsi="Times New Roman" w:cs="Times New Roman"/>
+          <w:sz w:val="24"/>
+          <w:szCs w:val="24"/>
+          <w:lang w:val="en-US"/>
+        </w:rPr>
+        <w:t>en</w:t>
+      </w:r>
+      <w:proofErr w:type="spellEnd"/>
+      <w:r>
+        <w:rPr>
+          <w:rFonts w:ascii="Times New Roman" w:hAnsi="Times New Roman" w:cs="Times New Roman"/>
+          <w:sz w:val="24"/>
+          <w:szCs w:val="24"/>
+          <w:lang w:val="en-US"/>
+        </w:rPr>
+        <w:t xml:space="preserve"> </w:t>
+      </w:r>
+      <w:proofErr w:type="spellStart"/>
+      <w:r>
+        <w:rPr>
+          <w:rFonts w:ascii="Times New Roman" w:hAnsi="Times New Roman" w:cs="Times New Roman"/>
+          <w:sz w:val="24"/>
+          <w:szCs w:val="24"/>
+          <w:lang w:val="en-US"/>
+        </w:rPr>
+        <w:t>éducation</w:t>
+      </w:r>
+      <w:proofErr w:type="spellEnd"/>
+      <w:r>
+        <w:rPr>
+          <w:rFonts w:ascii="Times New Roman" w:hAnsi="Times New Roman" w:cs="Times New Roman"/>
+          <w:sz w:val="24"/>
+          <w:szCs w:val="24"/>
+          <w:lang w:val="en-US"/>
+        </w:rPr>
+        <w:t>, 2025)</w:t>
+      </w:r>
+      <w:r>
+        <w:rPr>
+          <w:rFonts w:ascii="Times New Roman" w:hAnsi="Times New Roman" w:cs="Times New Roman"/>
+          <w:sz w:val="24"/>
+          <w:szCs w:val="24"/>
+        </w:rPr>
+        <w:fldChar w:fldCharType="end"/>
+      </w:r>
+      <w:r>
+        <w:rPr>
+          <w:rFonts w:ascii="Times New Roman" w:hAnsi="Times New Roman" w:cs="Times New Roman"/>
+          <w:sz w:val="24"/>
+          <w:szCs w:val="24"/>
+          <w:lang w:val="en-US"/>
+        </w:rPr>
+        <w:t xml:space="preserve">. </w:t>
+      </w:r>
+      <w:r>
+        <w:rPr>
+          <w:rFonts w:ascii="Times New Roman" w:hAnsi="Times New Roman" w:cs="Times New Roman"/>
+          <w:sz w:val="24"/>
+          <w:szCs w:val="24"/>
+          <w:lang w:val="en-US"/>
+        </w:rPr>
+        <w:t xml:space="preserve">Its use is permitted </w:t>
+      </w:r>
+      <w:r>
+        <w:rPr>
+          <w:rFonts w:ascii="Times New Roman" w:hAnsi="Times New Roman" w:cs="Times New Roman"/>
+          <w:sz w:val="24"/>
+          <w:szCs w:val="24"/>
+          <w:lang w:val="en-US"/>
+        </w:rPr>
+        <w:t>keeping in mind that</w:t>
+      </w:r>
+      <w:r>
+        <w:rPr>
+          <w:rFonts w:ascii="Times New Roman" w:hAnsi="Times New Roman" w:cs="Times New Roman"/>
+          <w:sz w:val="24"/>
+          <w:szCs w:val="24"/>
+          <w:lang w:val="en-US"/>
+        </w:rPr>
+        <w:t xml:space="preserve"> it serves </w:t>
+      </w:r>
+      <w:r>
+        <w:rPr>
+          <w:rFonts w:ascii="Times New Roman" w:hAnsi="Times New Roman" w:cs="Times New Roman"/>
+          <w:sz w:val="24"/>
+          <w:szCs w:val="24"/>
+          <w:lang w:val="en-US"/>
+        </w:rPr>
+        <w:t>as a</w:t>
+      </w:r>
+      <w:r>
+        <w:rPr>
+          <w:rFonts w:ascii="Times New Roman" w:hAnsi="Times New Roman" w:cs="Times New Roman"/>
+          <w:sz w:val="24"/>
+          <w:szCs w:val="24"/>
+          <w:lang w:val="en-US"/>
+        </w:rPr>
+        <w:t xml:space="preserve"> pedagogical </w:t>
+      </w:r>
+      <w:r>
+        <w:rPr>
+          <w:rFonts w:ascii="Times New Roman" w:hAnsi="Times New Roman" w:cs="Times New Roman"/>
+          <w:sz w:val="24"/>
+          <w:szCs w:val="24"/>
+          <w:lang w:val="en-US"/>
+        </w:rPr>
+        <w:t xml:space="preserve">tool </w:t>
+      </w:r>
+      <w:r>
+        <w:rPr>
+          <w:rFonts w:ascii="Times New Roman" w:hAnsi="Times New Roman" w:cs="Times New Roman"/>
+          <w:sz w:val="24"/>
+          <w:szCs w:val="24"/>
+          <w:lang w:val="en-US"/>
+        </w:rPr>
+        <w:t xml:space="preserve">and does not involve the processing of personal, sensitive, or institutional data in public </w:t>
+      </w:r>
+      <w:r>
+        <w:rPr>
+          <w:rFonts w:ascii="Times New Roman" w:hAnsi="Times New Roman" w:cs="Times New Roman"/>
+          <w:sz w:val="24"/>
+          <w:szCs w:val="24"/>
+          <w:lang w:val="en-US"/>
+        </w:rPr>
+        <w:fldChar w:fldCharType="begin"/>
+      </w:r>
+      <w:r>
+        <w:rPr>
+          <w:rFonts w:ascii="Times New Roman" w:hAnsi="Times New Roman" w:cs="Times New Roman"/>
+          <w:sz w:val="24"/>
+          <w:szCs w:val="24"/>
+          <w:lang w:val="en-US"/>
+        </w:rPr>
+        <w:instrText xml:space="preserve"> ADDIN ZOTERO_ITEM CSL_CITATION {"citationID":"XYrXIJbL","properties":{"unsorted":false,"formattedCitation":"({\\i{}La protection des \\uc0\\u233{}l\\uc0\\u232{}ves et de leurs donn\\uc0\\u233{}es sur Internet}, 2019)","plainCitation":"(La protection des élèves et de leurs données sur Internet, 2019)","noteIndex":0},"citationItems":[{"id":173,"uris":["http://zotero.org/users/18489330/items/3576EAV2"],"itemData":{"id":173,"type":"webpage","abstract":"Le numérique à l’école et au collège implique des mesures pour un usage responsable et sécurisé d’internet. Des données personnelles, nécessaires à la scolarité, sont traitées conformément au règlement européen, dans un cadre sécurisé, transparent et respectueux des droits de chacun.","container-title":"Ministère de l'Education nationale","language":"fr","title":"La protection des élèves et de leurs données sur Internet","URL":"https://www.education.gouv.fr/la-protection-des-eleves-et-de-leurs-donnees-sur-internet-7073","accessed":{"date-parts":[["2026",5,17]]},"issued":{"date-parts":[["2019",11,7]]}}}],"schema":"https://github.com/citation-style-language/schema/raw/master/csl-citation.json"} </w:instrText>
+      </w:r>
+      <w:r>
+        <w:rPr>
+          <w:rFonts w:ascii="Times New Roman" w:hAnsi="Times New Roman" w:cs="Times New Roman"/>
+          <w:sz w:val="24"/>
+          <w:szCs w:val="24"/>
+          <w:lang w:val="en-US"/>
+        </w:rPr>
+        <w:fldChar w:fldCharType="separate"/>
+      </w:r>
+      <w:r>
+        <w:rPr>
+          <w:rFonts w:ascii="Times New Roman" w:hAnsi="Times New Roman" w:cs="Times New Roman"/>
+          <w:sz w:val="24"/>
+          <w:szCs w:val="24"/>
+          <w:lang w:val="en-GB"/>
+        </w:rPr>
+        <w:t xml:space="preserve">(La protection des </w:t>
+      </w:r>
+      <w:proofErr w:type="spellStart"/>
+      <w:r>
+        <w:rPr>
+          <w:rFonts w:ascii="Times New Roman" w:hAnsi="Times New Roman" w:cs="Times New Roman"/>
+          <w:sz w:val="24"/>
+          <w:szCs w:val="24"/>
+          <w:lang w:val="en-GB"/>
+        </w:rPr>
+        <w:t>élèves</w:t>
+      </w:r>
+      <w:proofErr w:type="spellEnd"/>
+      <w:r>
+        <w:rPr>
+          <w:rFonts w:ascii="Times New Roman" w:hAnsi="Times New Roman" w:cs="Times New Roman"/>
+          <w:sz w:val="24"/>
+          <w:szCs w:val="24"/>
+          <w:lang w:val="en-GB"/>
+        </w:rPr>
+        <w:t xml:space="preserve"> et de </w:t>
+      </w:r>
+      <w:proofErr w:type="spellStart"/>
+      <w:r>
+        <w:rPr>
+          <w:rFonts w:ascii="Times New Roman" w:hAnsi="Times New Roman" w:cs="Times New Roman"/>
+          <w:sz w:val="24"/>
+          <w:szCs w:val="24"/>
+          <w:lang w:val="en-GB"/>
+        </w:rPr>
+        <w:t>leurs</w:t>
+      </w:r>
+      <w:proofErr w:type="spellEnd"/>
+      <w:r>
+        <w:rPr>
+          <w:rFonts w:ascii="Times New Roman" w:hAnsi="Times New Roman" w:cs="Times New Roman"/>
+          <w:sz w:val="24"/>
+          <w:szCs w:val="24"/>
+          <w:lang w:val="en-GB"/>
+        </w:rPr>
+        <w:t xml:space="preserve"> données sur Internet, 2019)</w:t>
+      </w:r>
+      <w:r>
+        <w:rPr>
+          <w:rFonts w:ascii="Times New Roman" w:hAnsi="Times New Roman" w:cs="Times New Roman"/>
+          <w:sz w:val="24"/>
+          <w:szCs w:val="24"/>
+          <w:lang w:val="en-US"/>
+        </w:rPr>
+        <w:fldChar w:fldCharType="end"/>
+      </w:r>
+      <w:r>
+        <w:rPr>
+          <w:rFonts w:ascii="Times New Roman" w:hAnsi="Times New Roman" w:cs="Times New Roman"/>
+          <w:sz w:val="24"/>
+          <w:szCs w:val="24"/>
+          <w:lang w:val="en-US"/>
+        </w:rPr>
+        <w:t>.</w:t>
+      </w:r>
+      <w:r>
+        <w:rPr>
+          <w:rFonts w:ascii="Times New Roman" w:hAnsi="Times New Roman" w:cs="Times New Roman"/>
+          <w:sz w:val="24"/>
+          <w:szCs w:val="24"/>
+          <w:lang w:val="en-US"/>
+        </w:rPr>
+        <w:t xml:space="preserve"> </w:t>
+      </w:r>
+      <w:r>
+        <w:rPr>
+          <w:rFonts w:ascii="Times New Roman" w:hAnsi="Times New Roman" w:cs="Times New Roman"/>
+          <w:sz w:val="24"/>
+          <w:szCs w:val="24"/>
+          <w:lang w:val="en-US"/>
+        </w:rPr>
+        <w:t xml:space="preserve">Generative AI </w:t>
+      </w:r>
+      <w:r>
+        <w:rPr>
+          <w:rFonts w:ascii="Times New Roman" w:hAnsi="Times New Roman" w:cs="Times New Roman"/>
+          <w:sz w:val="24"/>
+          <w:szCs w:val="24"/>
+          <w:lang w:val="en-US"/>
+        </w:rPr>
+        <w:t>is considered a support tool</w:t>
+      </w:r>
+      <w:r>
+        <w:rPr>
+          <w:rFonts w:ascii="Times New Roman" w:hAnsi="Times New Roman" w:cs="Times New Roman"/>
+          <w:sz w:val="24"/>
+          <w:szCs w:val="24"/>
+          <w:lang w:val="en-US"/>
+        </w:rPr>
+        <w:t xml:space="preserve"> which</w:t>
+      </w:r>
+      <w:r>
+        <w:rPr>
+          <w:rFonts w:ascii="Times New Roman" w:hAnsi="Times New Roman" w:cs="Times New Roman"/>
+          <w:sz w:val="24"/>
+          <w:szCs w:val="24"/>
+          <w:lang w:val="en-US"/>
+        </w:rPr>
+        <w:t xml:space="preserve"> a substitute </w:t>
+      </w:r>
+      <w:r>
+        <w:rPr>
+          <w:rFonts w:ascii="Times New Roman" w:hAnsi="Times New Roman" w:cs="Times New Roman"/>
+          <w:sz w:val="24"/>
+          <w:szCs w:val="24"/>
+          <w:lang w:val="en-US"/>
+        </w:rPr>
+        <w:t>the teacher</w:t>
+      </w:r>
+      <w:r>
+        <w:rPr>
+          <w:rFonts w:ascii="Times New Roman" w:hAnsi="Times New Roman" w:cs="Times New Roman"/>
+          <w:sz w:val="24"/>
+          <w:szCs w:val="24"/>
+          <w:lang w:val="en-US"/>
+        </w:rPr>
+        <w:t>, and all outputs must be critically verified</w:t>
+      </w:r>
+      <w:r>
+        <w:rPr>
+          <w:rFonts w:ascii="Times New Roman" w:hAnsi="Times New Roman" w:cs="Times New Roman"/>
+          <w:sz w:val="24"/>
+          <w:szCs w:val="24"/>
+          <w:lang w:val="en-US"/>
+        </w:rPr>
+        <w:t xml:space="preserve">. </w:t>
+      </w:r>
+      <w:r>
+        <w:rPr>
+          <w:rFonts w:ascii="Times New Roman" w:hAnsi="Times New Roman" w:cs="Times New Roman"/>
+          <w:sz w:val="24"/>
+          <w:szCs w:val="24"/>
+          <w:lang w:val="en-US"/>
+        </w:rPr>
+        <w:t>Students may use AI only within teacher-defined boundaries</w:t>
+      </w:r>
+      <w:r>
+        <w:rPr>
+          <w:rFonts w:ascii="Times New Roman" w:hAnsi="Times New Roman" w:cs="Times New Roman"/>
+          <w:sz w:val="24"/>
+          <w:szCs w:val="24"/>
+          <w:lang w:val="en-US"/>
+        </w:rPr>
+        <w:t xml:space="preserve"> starting from 4e level, however, any una</w:t>
+      </w:r>
+      <w:r>
+        <w:rPr>
+          <w:rFonts w:ascii="Times New Roman" w:hAnsi="Times New Roman" w:cs="Times New Roman"/>
+          <w:sz w:val="24"/>
+          <w:szCs w:val="24"/>
+          <w:lang w:val="en-US"/>
+        </w:rPr>
+        <w:t>u</w:t>
+      </w:r>
+      <w:r>
+        <w:rPr>
+          <w:rFonts w:ascii="Times New Roman" w:hAnsi="Times New Roman" w:cs="Times New Roman"/>
+          <w:sz w:val="24"/>
+          <w:szCs w:val="24"/>
+          <w:lang w:val="en-US"/>
+        </w:rPr>
+        <w:t>thori</w:t>
+      </w:r>
+      <w:r>
+        <w:rPr>
+          <w:rFonts w:ascii="Times New Roman" w:hAnsi="Times New Roman" w:cs="Times New Roman"/>
+          <w:sz w:val="24"/>
+          <w:szCs w:val="24"/>
+          <w:lang w:val="en-US"/>
+        </w:rPr>
+        <w:t>z</w:t>
+      </w:r>
+      <w:r>
+        <w:rPr>
+          <w:rFonts w:ascii="Times New Roman" w:hAnsi="Times New Roman" w:cs="Times New Roman"/>
+          <w:sz w:val="24"/>
+          <w:szCs w:val="24"/>
+          <w:lang w:val="en-US"/>
+        </w:rPr>
+        <w:t xml:space="preserve">ed usage is to be considered misconduct. </w:t>
+      </w:r>
+      <w:r>
+        <w:rPr>
+          <w:rFonts w:ascii="Times New Roman" w:hAnsi="Times New Roman" w:cs="Times New Roman"/>
+          <w:sz w:val="24"/>
+          <w:szCs w:val="24"/>
+          <w:lang w:val="en-US"/>
+        </w:rPr>
+        <w:t>While French education policy permits generative AI use as a pedagogical support tool with specific safeguards, practical guidance on classroom implementation for teacher lesson planning remains limited.</w:t>
+      </w:r>
+    </w:p>
+    <w:p>
+      <w:pPr>
+        <w:pStyle w:val="Heading1"/>
+        <w:rPr>
+          <w:lang w:val="en-US"/>
+        </w:rPr>
+      </w:pPr>
+      <w:r>
+        <w:rPr>
+          <w:lang w:val="en-US"/>
+        </w:rPr>
+        <w:lastRenderedPageBreak/>
+        <w:t>Research gap</w:t>
+      </w:r>
+    </w:p>
+    <w:p>
+      <w:pPr>
+        <w:rPr>
+          <w:lang w:val="en-US"/>
+        </w:rPr>
+      </w:pPr>
+    </w:p>
+    <w:p>
+      <w:pPr>
+        <w:rPr>
+          <w:lang w:val="en-US"/>
+        </w:rPr>
+      </w:pPr>
+      <w:r>
+        <w:rPr>
+          <w:lang w:val="en-US"/>
+        </w:rPr>
+        <w:t>Generative AI is a relatively recent phenomenon</w:t>
+      </w:r>
+      <w:r>
+        <w:rPr>
+          <w:lang w:val="en-US"/>
+        </w:rPr>
+        <w:t xml:space="preserve"> and</w:t>
+      </w:r>
+      <w:r>
+        <w:rPr>
+          <w:lang w:val="en-US"/>
+        </w:rPr>
+        <w:t xml:space="preserve"> it quickly </w:t>
+      </w:r>
+      <w:r>
+        <w:rPr>
+          <w:lang w:val="en-US"/>
+        </w:rPr>
+        <w:t>rose to popularity</w:t>
+      </w:r>
+      <w:r>
+        <w:rPr>
+          <w:lang w:val="en-US"/>
+        </w:rPr>
+        <w:t xml:space="preserve"> among the users post the launch of Chat GPT In 2022 due to the flexibility offered user adapted outcomes </w:t>
+      </w:r>
+      <w:r>
+        <w:rPr>
+          <w:lang w:val="en-US"/>
+        </w:rPr>
+        <w:fldChar w:fldCharType="begin"/>
+      </w:r>
+      <w:r>
+        <w:rPr>
+          <w:lang w:val="en-US"/>
+        </w:rPr>
+        <w:instrText xml:space="preserve"> ADDIN ZOTERO_ITEM CSL_CITATION {"citationID":"17FHdKan","properties":{"unsorted":false,"formattedCitation":"(Liu &amp; Wang, 2024)","plainCitation":"(Liu &amp; Wang, 2024)","noteIndex":0},"citationItems":[{"id":176,"uris":["http://zotero.org/users/18489330/items/CEUV7NQ9"],"itemData":{"id":176,"type":"book","abstract":"This paper offers the first comprehensive, global analysis of generative AI adoption by individuals, using novel data sources including website traffic and Google Trends. The paper also examines country-level factors driving the uptake and early impacts of generative artificial intelligence on online activities. As of March 2024, the top 40 generative artificial intelligence tools attract nearly 3 billion visits per month from hundreds of millions of users. ChatGPT alone commands over 80 percent of the traffic, yet its reach remains less than two percent of Google’s. Generative artificial intelligence users skew young, highly educated, and male, particularly for video generation tools, with usage patterns strongly indicating productivity-related activities. Generative artificial intelligence has achieved unprecedentedly rapid global diffusion, reaching almost all economies worldwide within 16 months of ChatGPT’s release. Strikingly, middle-income economies account for over half of global generative AI traffic, a disproportionately high share relative to their economic size, while low-income economies contribute less than 1 percent. Country level adoption intensity is strongly correlated with the share of youth population, digital infrastructure, English fluency, foreign direct investment inflows, services’ share of GDP, and human capital. Finally, the paper also documents disruptions in online traffic patterns and emphasizes the need for targeted investments in digital infrastructure and skills development to fully realize the potential of artificial intelligence.","DOI":"10.1596/1813-9450-10870","language":"en","publisher":"Washington, DC: World Bank","source":"DOI.org (Crossref)","title":"Who on Earth Is Using Generative AI ?","URL":"https://hdl.handle.net/10986/42071","author":[{"family":"Liu","given":"Yan"},{"family":"Wang","given":"He"}],"accessed":{"date-parts":[["2026",5,17]]},"issued":{"date-parts":[["2024",8,22]]}}}],"schema":"https://github.com/citation-style-language/schema/raw/master/csl-citation.json"} </w:instrText>
+      </w:r>
+      <w:r>
+        <w:rPr>
+          <w:lang w:val="en-US"/>
+        </w:rPr>
+        <w:fldChar w:fldCharType="separate"/>
+      </w:r>
+      <w:r>
+        <w:rPr>
+          <w:noProof/>
+          <w:lang w:val="en-US"/>
+        </w:rPr>
+        <w:t>(Liu &amp; Wang, 2024)</w:t>
+      </w:r>
+      <w:r>
+        <w:rPr>
+          <w:lang w:val="en-US"/>
+        </w:rPr>
+        <w:fldChar w:fldCharType="end"/>
+      </w:r>
+      <w:r>
+        <w:rPr>
+          <w:lang w:val="en-US"/>
+        </w:rPr>
+        <w:t xml:space="preserve">. </w:t>
+      </w:r>
+      <w:r>
+        <w:rPr>
+          <w:lang w:val="en-US"/>
+        </w:rPr>
+        <w:t>However, when discussed in the French educational context</w:t>
+      </w:r>
+      <w:r>
+        <w:rPr>
+          <w:lang w:val="en-US"/>
+        </w:rPr>
+        <w:t xml:space="preserve"> the studies </w:t>
+      </w:r>
+      <w:r>
+        <w:rPr>
+          <w:lang w:val="en-US"/>
+        </w:rPr>
+        <w:t>predominantly</w:t>
+      </w:r>
+      <w:r>
+        <w:rPr>
+          <w:lang w:val="en-US"/>
+        </w:rPr>
+        <w:t xml:space="preserve"> </w:t>
+      </w:r>
+      <w:r>
+        <w:rPr>
+          <w:lang w:val="en-US"/>
+        </w:rPr>
+        <w:t>focus on learner application</w:t>
+      </w:r>
+      <w:r>
+        <w:rPr>
+          <w:lang w:val="en-US"/>
+        </w:rPr>
+        <w:t xml:space="preserve"> or provide </w:t>
+      </w:r>
+      <w:r>
+        <w:rPr>
+          <w:lang w:val="en-US"/>
+        </w:rPr>
+        <w:t>instructions on the available tools rather than an analysis of their classroom implementations</w:t>
+      </w:r>
+      <w:r>
+        <w:rPr>
+          <w:lang w:val="en-US"/>
+        </w:rPr>
+        <w:t xml:space="preserve">. Research is narrower when it comes to </w:t>
+      </w:r>
+      <w:proofErr w:type="spellStart"/>
+      <w:r>
+        <w:rPr>
+          <w:lang w:val="en-US"/>
+        </w:rPr>
+        <w:t>analyse</w:t>
+      </w:r>
+      <w:proofErr w:type="spellEnd"/>
+      <w:r>
+        <w:rPr>
+          <w:lang w:val="en-US"/>
+        </w:rPr>
+        <w:t xml:space="preserve"> the integration of generative AI in the classroom practices and lesson planning by the language professors, </w:t>
+      </w:r>
+      <w:r>
+        <w:rPr>
+          <w:lang w:val="en-US"/>
+        </w:rPr>
+        <w:t>particularly in secondary education, where curricular frameworks and pedagogical constraints complicate implementation</w:t>
+      </w:r>
+      <w:r>
+        <w:rPr>
+          <w:lang w:val="en-US"/>
+        </w:rPr>
+        <w:t>.</w:t>
+      </w:r>
+      <w:r>
+        <w:rPr>
+          <w:lang w:val="en-US"/>
+        </w:rPr>
+        <w:t xml:space="preserve"> </w:t>
+      </w:r>
+      <w:r>
+        <w:rPr>
+          <w:lang w:val="en-US"/>
+        </w:rPr>
+        <w:t>Therefore, it is imperative to understand how teachers evaluate, modify, and use generative AI as a professional tool for lesson planning to inform pedagogical practice and bridge the gap between policy permission and classroom reality.</w:t>
+      </w:r>
+      <w:r>
+        <w:rPr>
+          <w:lang w:val="en-US"/>
+        </w:rPr>
+        <w:t xml:space="preserve"> </w:t>
+      </w:r>
+      <w:r>
+        <w:rPr>
+          <w:lang w:val="en-US"/>
+        </w:rPr>
+        <w:t>To address this gap</w:t>
+      </w:r>
       <w:r>
         <w:rPr>
           <w:lang w:val="en-US"/>
         </w:rPr>
         <w:t xml:space="preserve">, </w:t>
       </w:r>
-      <w:proofErr w:type="spellStart"/>
-      <w:r>
-        <w:rPr>
-          <w:lang w:val="en-US"/>
-        </w:rPr>
-        <w:t>multitudo</w:t>
-      </w:r>
-      <w:proofErr w:type="spellEnd"/>
-      <w:r>
-        <w:rPr>
-          <w:lang w:val="en-US"/>
-        </w:rPr>
-        <w:t xml:space="preserve"> </w:t>
-      </w:r>
-      <w:proofErr w:type="spellStart"/>
-      <w:r>
-        <w:rPr>
-          <w:lang w:val="en-US"/>
-        </w:rPr>
-        <w:t>omnis</w:t>
-      </w:r>
-      <w:proofErr w:type="spellEnd"/>
-      <w:r>
-        <w:rPr>
-          <w:lang w:val="en-US"/>
-        </w:rPr>
-        <w:t xml:space="preserve"> ad, </w:t>
-      </w:r>
-      <w:proofErr w:type="spellStart"/>
-      <w:r>
-        <w:rPr>
-          <w:lang w:val="en-US"/>
-        </w:rPr>
-        <w:t>quae</w:t>
-      </w:r>
-      <w:proofErr w:type="spellEnd"/>
-      <w:r>
-        <w:rPr>
-          <w:lang w:val="en-US"/>
-        </w:rPr>
-        <w:t xml:space="preserve"> imperator </w:t>
-      </w:r>
-      <w:proofErr w:type="spellStart"/>
-      <w:r>
-        <w:rPr>
-          <w:lang w:val="en-US"/>
-        </w:rPr>
-        <w:t>voluit</w:t>
-      </w:r>
-      <w:proofErr w:type="spellEnd"/>
-      <w:r>
-        <w:rPr>
-          <w:lang w:val="en-US"/>
-        </w:rPr>
-        <w:t xml:space="preserve">, </w:t>
-      </w:r>
-      <w:proofErr w:type="spellStart"/>
-      <w:r>
-        <w:rPr>
-          <w:lang w:val="en-US"/>
-        </w:rPr>
-        <w:t>promptior</w:t>
-      </w:r>
-      <w:proofErr w:type="spellEnd"/>
-      <w:r>
-        <w:rPr>
-          <w:lang w:val="en-US"/>
-        </w:rPr>
-        <w:t xml:space="preserve"> </w:t>
-      </w:r>
-      <w:proofErr w:type="spellStart"/>
-      <w:r>
-        <w:rPr>
-          <w:lang w:val="en-US"/>
-        </w:rPr>
-        <w:t>laudato</w:t>
-      </w:r>
-      <w:proofErr w:type="spellEnd"/>
-      <w:r>
-        <w:rPr>
-          <w:lang w:val="en-US"/>
-        </w:rPr>
-        <w:t xml:space="preserve"> </w:t>
-      </w:r>
-      <w:proofErr w:type="spellStart"/>
-      <w:r>
-        <w:rPr>
-          <w:lang w:val="en-US"/>
-        </w:rPr>
-        <w:t>consilio</w:t>
-      </w:r>
-      <w:proofErr w:type="spellEnd"/>
-      <w:r>
-        <w:rPr>
-          <w:lang w:val="en-US"/>
-        </w:rPr>
-        <w:t xml:space="preserve"> </w:t>
-      </w:r>
-      <w:proofErr w:type="spellStart"/>
-      <w:r>
-        <w:rPr>
-          <w:lang w:val="en-US"/>
-        </w:rPr>
-        <w:t>consensit</w:t>
-      </w:r>
-      <w:proofErr w:type="spellEnd"/>
-      <w:r>
-        <w:rPr>
-          <w:lang w:val="en-US"/>
-        </w:rPr>
-        <w:t xml:space="preserve"> in pacem </w:t>
-      </w:r>
-      <w:proofErr w:type="spellStart"/>
-      <w:r>
-        <w:rPr>
-          <w:lang w:val="en-US"/>
-        </w:rPr>
-        <w:t>ea</w:t>
-      </w:r>
-      <w:proofErr w:type="spellEnd"/>
-      <w:r>
-        <w:rPr>
-          <w:lang w:val="en-US"/>
-        </w:rPr>
-        <w:t xml:space="preserve"> ratione </w:t>
-      </w:r>
-      <w:proofErr w:type="spellStart"/>
-      <w:r>
-        <w:rPr>
-          <w:lang w:val="en-US"/>
-        </w:rPr>
-        <w:t>maxime</w:t>
-      </w:r>
-      <w:proofErr w:type="spellEnd"/>
-      <w:r>
-        <w:rPr>
-          <w:lang w:val="en-US"/>
-        </w:rPr>
-        <w:t xml:space="preserve"> </w:t>
-      </w:r>
-      <w:proofErr w:type="spellStart"/>
-      <w:r>
-        <w:rPr>
-          <w:lang w:val="en-US"/>
-        </w:rPr>
-        <w:t>percita</w:t>
-      </w:r>
-      <w:proofErr w:type="spellEnd"/>
-      <w:r>
-        <w:rPr>
-          <w:lang w:val="en-US"/>
-        </w:rPr>
-        <w:t xml:space="preserve">, </w:t>
-      </w:r>
-      <w:proofErr w:type="spellStart"/>
-      <w:r>
-        <w:rPr>
-          <w:lang w:val="en-US"/>
-        </w:rPr>
-        <w:t>quod</w:t>
-      </w:r>
-      <w:proofErr w:type="spellEnd"/>
-      <w:r>
-        <w:rPr>
-          <w:lang w:val="en-US"/>
-        </w:rPr>
-        <w:t xml:space="preserve"> </w:t>
-      </w:r>
-      <w:proofErr w:type="spellStart"/>
-      <w:r>
-        <w:rPr>
-          <w:lang w:val="en-US"/>
-        </w:rPr>
-        <w:t>norat</w:t>
-      </w:r>
-      <w:proofErr w:type="spellEnd"/>
-      <w:r>
-        <w:rPr>
-          <w:lang w:val="en-US"/>
-        </w:rPr>
-        <w:t xml:space="preserve"> </w:t>
-      </w:r>
-      <w:proofErr w:type="spellStart"/>
-      <w:r>
-        <w:rPr>
-          <w:lang w:val="en-US"/>
-        </w:rPr>
-        <w:t>expeditionibus</w:t>
-      </w:r>
-      <w:proofErr w:type="spellEnd"/>
-      <w:r>
-        <w:rPr>
-          <w:lang w:val="en-US"/>
-        </w:rPr>
-        <w:t xml:space="preserve"> </w:t>
-      </w:r>
-      <w:proofErr w:type="spellStart"/>
-      <w:r>
-        <w:rPr>
-          <w:lang w:val="en-US"/>
-        </w:rPr>
-        <w:t>crebris</w:t>
-      </w:r>
-      <w:proofErr w:type="spellEnd"/>
-      <w:r>
-        <w:rPr>
-          <w:lang w:val="en-US"/>
-        </w:rPr>
-        <w:t xml:space="preserve"> </w:t>
-      </w:r>
-      <w:proofErr w:type="spellStart"/>
-      <w:r>
-        <w:rPr>
-          <w:lang w:val="en-US"/>
-        </w:rPr>
-        <w:t>fortunam</w:t>
-      </w:r>
-      <w:proofErr w:type="spellEnd"/>
-      <w:r>
-        <w:rPr>
-          <w:lang w:val="en-US"/>
-        </w:rPr>
-        <w:t xml:space="preserve"> eius in </w:t>
-      </w:r>
-      <w:proofErr w:type="spellStart"/>
-      <w:r>
-        <w:rPr>
-          <w:lang w:val="en-US"/>
-        </w:rPr>
-        <w:t>malis</w:t>
-      </w:r>
-      <w:proofErr w:type="spellEnd"/>
-      <w:r>
-        <w:rPr>
-          <w:lang w:val="en-US"/>
-        </w:rPr>
-        <w:t xml:space="preserve"> tantum </w:t>
-      </w:r>
-      <w:proofErr w:type="spellStart"/>
-      <w:r>
-        <w:rPr>
-          <w:lang w:val="en-US"/>
-        </w:rPr>
-        <w:t>civilibus</w:t>
-      </w:r>
-      <w:proofErr w:type="spellEnd"/>
-      <w:r>
-        <w:rPr>
-          <w:lang w:val="en-US"/>
-        </w:rPr>
-        <w:t xml:space="preserve"> </w:t>
-      </w:r>
-      <w:proofErr w:type="spellStart"/>
-      <w:r>
-        <w:rPr>
-          <w:lang w:val="en-US"/>
-        </w:rPr>
-        <w:t>vigilasse</w:t>
-      </w:r>
-      <w:proofErr w:type="spellEnd"/>
-      <w:r>
-        <w:rPr>
-          <w:lang w:val="en-US"/>
-        </w:rPr>
-        <w:t xml:space="preserve">, cum autem </w:t>
-      </w:r>
-      <w:proofErr w:type="spellStart"/>
-      <w:r>
-        <w:rPr>
-          <w:lang w:val="en-US"/>
-        </w:rPr>
-        <w:t>bella</w:t>
-      </w:r>
-      <w:proofErr w:type="spellEnd"/>
-      <w:r>
-        <w:rPr>
-          <w:lang w:val="en-US"/>
-        </w:rPr>
-        <w:t xml:space="preserve"> </w:t>
-      </w:r>
-      <w:proofErr w:type="spellStart"/>
-      <w:r>
-        <w:rPr>
-          <w:lang w:val="en-US"/>
-        </w:rPr>
-        <w:t>moverentur</w:t>
-      </w:r>
-      <w:proofErr w:type="spellEnd"/>
-      <w:r>
-        <w:rPr>
-          <w:lang w:val="en-US"/>
-        </w:rPr>
-        <w:t xml:space="preserve"> externa, </w:t>
-      </w:r>
-      <w:proofErr w:type="spellStart"/>
-      <w:r>
-        <w:rPr>
-          <w:lang w:val="en-US"/>
-        </w:rPr>
-        <w:t>accidisse</w:t>
-      </w:r>
-      <w:proofErr w:type="spellEnd"/>
-      <w:r>
-        <w:rPr>
-          <w:lang w:val="en-US"/>
-        </w:rPr>
-        <w:t xml:space="preserve"> </w:t>
-      </w:r>
-      <w:proofErr w:type="spellStart"/>
-      <w:r>
-        <w:rPr>
-          <w:lang w:val="en-US"/>
-        </w:rPr>
-        <w:t>plerumque</w:t>
-      </w:r>
-      <w:proofErr w:type="spellEnd"/>
-      <w:r>
-        <w:rPr>
-          <w:lang w:val="en-US"/>
-        </w:rPr>
-        <w:t xml:space="preserve"> </w:t>
-      </w:r>
-      <w:proofErr w:type="spellStart"/>
-      <w:r>
-        <w:rPr>
-          <w:lang w:val="en-US"/>
-        </w:rPr>
-        <w:t>luctuosa</w:t>
-      </w:r>
-      <w:proofErr w:type="spellEnd"/>
-      <w:r>
-        <w:rPr>
-          <w:lang w:val="en-US"/>
-        </w:rPr>
-        <w:t xml:space="preserve">, </w:t>
-      </w:r>
-      <w:proofErr w:type="spellStart"/>
-      <w:r>
-        <w:rPr>
-          <w:lang w:val="en-US"/>
-        </w:rPr>
-        <w:t>icto</w:t>
-      </w:r>
-      <w:proofErr w:type="spellEnd"/>
-      <w:r>
-        <w:rPr>
-          <w:lang w:val="en-US"/>
-        </w:rPr>
-        <w:t xml:space="preserve"> post haec </w:t>
-      </w:r>
-      <w:proofErr w:type="spellStart"/>
-      <w:r>
-        <w:rPr>
-          <w:lang w:val="en-US"/>
-        </w:rPr>
-        <w:t>foedere</w:t>
-      </w:r>
-      <w:proofErr w:type="spellEnd"/>
-      <w:r>
-        <w:rPr>
-          <w:lang w:val="en-US"/>
-        </w:rPr>
-        <w:t xml:space="preserve"> gentium </w:t>
-      </w:r>
-      <w:proofErr w:type="spellStart"/>
-      <w:r>
-        <w:rPr>
-          <w:lang w:val="en-US"/>
-        </w:rPr>
-        <w:t>ritu</w:t>
-      </w:r>
-      <w:proofErr w:type="spellEnd"/>
-      <w:r>
-        <w:rPr>
-          <w:lang w:val="en-US"/>
-        </w:rPr>
-        <w:t xml:space="preserve"> </w:t>
-      </w:r>
-      <w:proofErr w:type="spellStart"/>
-      <w:r>
-        <w:rPr>
-          <w:lang w:val="en-US"/>
-        </w:rPr>
-        <w:t>perfectaque</w:t>
-      </w:r>
-      <w:proofErr w:type="spellEnd"/>
-      <w:r>
-        <w:rPr>
-          <w:lang w:val="en-US"/>
-        </w:rPr>
-        <w:t xml:space="preserve"> </w:t>
-      </w:r>
-      <w:proofErr w:type="spellStart"/>
-      <w:r>
-        <w:rPr>
-          <w:lang w:val="en-US"/>
-        </w:rPr>
-        <w:t>sollemnitate</w:t>
-      </w:r>
-      <w:proofErr w:type="spellEnd"/>
-      <w:r>
-        <w:rPr>
-          <w:lang w:val="en-US"/>
-        </w:rPr>
-        <w:t xml:space="preserve"> imperator Mediolanum ad </w:t>
-      </w:r>
-      <w:proofErr w:type="spellStart"/>
-      <w:r>
-        <w:rPr>
-          <w:lang w:val="en-US"/>
-        </w:rPr>
-        <w:t>hiberna</w:t>
-      </w:r>
-      <w:proofErr w:type="spellEnd"/>
-      <w:r>
-        <w:rPr>
-          <w:lang w:val="en-US"/>
-        </w:rPr>
-        <w:t xml:space="preserve"> </w:t>
-      </w:r>
-      <w:proofErr w:type="spellStart"/>
-      <w:r>
-        <w:rPr>
-          <w:lang w:val="en-US"/>
-        </w:rPr>
-        <w:t>discessit</w:t>
-      </w:r>
-      <w:proofErr w:type="spellEnd"/>
-      <w:r>
-        <w:rPr>
-          <w:lang w:val="en-US"/>
-        </w:rPr>
-        <w:t>.</w:t>
-      </w:r>
-    </w:p>
-    <w:p>
-      <w:pPr>
-        <w:rPr>
-          <w:lang w:val="en-US"/>
-        </w:rPr>
-      </w:pPr>
-    </w:p>
-    <w:p>
-      <w:proofErr w:type="spellStart"/>
-      <w:r>
-        <w:t>Etenim</w:t>
-      </w:r>
-      <w:proofErr w:type="spellEnd"/>
-      <w:r>
-        <w:t xml:space="preserve"> si </w:t>
-      </w:r>
-      <w:proofErr w:type="spellStart"/>
-      <w:r>
-        <w:t>attendere</w:t>
-      </w:r>
-      <w:proofErr w:type="spellEnd"/>
-      <w:r>
-        <w:t xml:space="preserve"> diligenter, </w:t>
-      </w:r>
-      <w:proofErr w:type="spellStart"/>
-      <w:r>
-        <w:t>existimare</w:t>
-      </w:r>
-      <w:proofErr w:type="spellEnd"/>
-      <w:r>
-        <w:t xml:space="preserve"> </w:t>
-      </w:r>
-      <w:proofErr w:type="spellStart"/>
-      <w:r>
-        <w:t>vere</w:t>
-      </w:r>
-      <w:proofErr w:type="spellEnd"/>
-      <w:r>
-        <w:t xml:space="preserve"> de omni </w:t>
-      </w:r>
-      <w:proofErr w:type="spellStart"/>
-      <w:r>
-        <w:t>hac</w:t>
-      </w:r>
-      <w:proofErr w:type="spellEnd"/>
-      <w:r>
-        <w:t xml:space="preserve"> causa </w:t>
-      </w:r>
-      <w:proofErr w:type="spellStart"/>
-      <w:r>
-        <w:t>volueritis</w:t>
-      </w:r>
-      <w:proofErr w:type="spellEnd"/>
-      <w:r>
-        <w:t xml:space="preserve">, sic </w:t>
-      </w:r>
-      <w:proofErr w:type="spellStart"/>
-      <w:r>
-        <w:t>constituetis</w:t>
-      </w:r>
-      <w:proofErr w:type="spellEnd"/>
-      <w:r>
-        <w:t xml:space="preserve">, </w:t>
-      </w:r>
-      <w:proofErr w:type="spellStart"/>
-      <w:r>
-        <w:t>iudices</w:t>
-      </w:r>
-      <w:proofErr w:type="spellEnd"/>
-      <w:r>
-        <w:t xml:space="preserve">, nec </w:t>
-      </w:r>
-      <w:proofErr w:type="spellStart"/>
-      <w:r>
-        <w:t>descensurum</w:t>
-      </w:r>
-      <w:proofErr w:type="spellEnd"/>
-      <w:r>
-        <w:t xml:space="preserve"> </w:t>
-      </w:r>
-      <w:proofErr w:type="spellStart"/>
-      <w:r>
-        <w:t>quemquam</w:t>
-      </w:r>
-      <w:proofErr w:type="spellEnd"/>
-      <w:r>
-        <w:t xml:space="preserve"> ad </w:t>
-      </w:r>
-      <w:proofErr w:type="spellStart"/>
-      <w:r>
-        <w:t>hanc</w:t>
-      </w:r>
-      <w:proofErr w:type="spellEnd"/>
-      <w:r>
-        <w:t xml:space="preserve"> </w:t>
-      </w:r>
-      <w:proofErr w:type="spellStart"/>
-      <w:r>
-        <w:t>accusationem</w:t>
-      </w:r>
-      <w:proofErr w:type="spellEnd"/>
-      <w:r>
-        <w:t xml:space="preserve"> fuisse, </w:t>
-      </w:r>
-      <w:proofErr w:type="spellStart"/>
-      <w:r>
-        <w:t>cui</w:t>
-      </w:r>
-      <w:proofErr w:type="spellEnd"/>
-      <w:r>
-        <w:t xml:space="preserve">, </w:t>
-      </w:r>
-      <w:proofErr w:type="spellStart"/>
-      <w:r>
-        <w:t>utrum</w:t>
-      </w:r>
-      <w:proofErr w:type="spellEnd"/>
-      <w:r>
-        <w:t xml:space="preserve"> </w:t>
-      </w:r>
-      <w:proofErr w:type="spellStart"/>
-      <w:r>
-        <w:t>vellet</w:t>
-      </w:r>
-      <w:proofErr w:type="spellEnd"/>
-      <w:r>
-        <w:t xml:space="preserve">, </w:t>
-      </w:r>
-      <w:proofErr w:type="spellStart"/>
-      <w:r>
-        <w:t>liceret</w:t>
-      </w:r>
-      <w:proofErr w:type="spellEnd"/>
-      <w:r>
-        <w:t xml:space="preserve">, nec, cum </w:t>
-      </w:r>
-      <w:proofErr w:type="spellStart"/>
-      <w:r>
-        <w:t>descendisset</w:t>
-      </w:r>
-      <w:proofErr w:type="spellEnd"/>
-      <w:r>
-        <w:t xml:space="preserve">, </w:t>
-      </w:r>
-      <w:proofErr w:type="spellStart"/>
-      <w:r>
-        <w:t>quicquam</w:t>
-      </w:r>
-      <w:proofErr w:type="spellEnd"/>
-      <w:r>
-        <w:t xml:space="preserve"> </w:t>
-      </w:r>
-      <w:proofErr w:type="spellStart"/>
-      <w:r>
-        <w:t>habiturum</w:t>
-      </w:r>
-      <w:proofErr w:type="spellEnd"/>
-      <w:r>
-        <w:t xml:space="preserve"> </w:t>
-      </w:r>
-      <w:proofErr w:type="spellStart"/>
-      <w:r>
-        <w:t>spei</w:t>
-      </w:r>
-      <w:proofErr w:type="spellEnd"/>
-      <w:r>
-        <w:t xml:space="preserve"> fuisse, </w:t>
-      </w:r>
-      <w:proofErr w:type="spellStart"/>
-      <w:r>
-        <w:t>nisi</w:t>
-      </w:r>
-      <w:proofErr w:type="spellEnd"/>
-      <w:r>
-        <w:t xml:space="preserve"> </w:t>
-      </w:r>
-      <w:proofErr w:type="spellStart"/>
-      <w:r>
-        <w:t>alicuius</w:t>
-      </w:r>
-      <w:proofErr w:type="spellEnd"/>
-      <w:r>
-        <w:t xml:space="preserve"> </w:t>
-      </w:r>
-      <w:proofErr w:type="spellStart"/>
-      <w:r>
-        <w:t>intolerabili</w:t>
-      </w:r>
-      <w:proofErr w:type="spellEnd"/>
-      <w:r>
-        <w:t xml:space="preserve"> </w:t>
-      </w:r>
-      <w:proofErr w:type="spellStart"/>
-      <w:r>
-        <w:t>libidine</w:t>
-      </w:r>
-      <w:proofErr w:type="spellEnd"/>
-      <w:r>
-        <w:t xml:space="preserve"> et </w:t>
-      </w:r>
-      <w:proofErr w:type="spellStart"/>
-      <w:r>
-        <w:t>nimis</w:t>
-      </w:r>
-      <w:proofErr w:type="spellEnd"/>
-      <w:r>
-        <w:t xml:space="preserve"> </w:t>
-      </w:r>
-      <w:proofErr w:type="spellStart"/>
-      <w:r>
-        <w:t>acerbo</w:t>
-      </w:r>
-      <w:proofErr w:type="spellEnd"/>
-      <w:r>
-        <w:t xml:space="preserve"> </w:t>
-      </w:r>
-      <w:proofErr w:type="spellStart"/>
-      <w:r>
-        <w:t>odio</w:t>
-      </w:r>
-      <w:proofErr w:type="spellEnd"/>
-      <w:r>
-        <w:t xml:space="preserve"> </w:t>
-      </w:r>
-      <w:proofErr w:type="spellStart"/>
-      <w:r>
-        <w:t>niteretur</w:t>
-      </w:r>
-      <w:proofErr w:type="spellEnd"/>
-      <w:r>
-        <w:t xml:space="preserve">. Sed ego </w:t>
-      </w:r>
-      <w:proofErr w:type="spellStart"/>
-      <w:r>
-        <w:t>Atratino</w:t>
-      </w:r>
-      <w:proofErr w:type="spellEnd"/>
-      <w:r>
-        <w:t xml:space="preserve">, </w:t>
-      </w:r>
-      <w:proofErr w:type="spellStart"/>
-      <w:r>
-        <w:t>humanissimo</w:t>
-      </w:r>
-      <w:proofErr w:type="spellEnd"/>
-      <w:r>
-        <w:t xml:space="preserve"> </w:t>
-      </w:r>
-      <w:proofErr w:type="spellStart"/>
-      <w:r>
-        <w:t>atque</w:t>
-      </w:r>
-      <w:proofErr w:type="spellEnd"/>
-      <w:r>
-        <w:t xml:space="preserve"> </w:t>
-      </w:r>
-      <w:proofErr w:type="spellStart"/>
-      <w:r>
-        <w:t>optimo</w:t>
-      </w:r>
-      <w:proofErr w:type="spellEnd"/>
-      <w:r>
-        <w:t xml:space="preserve"> </w:t>
-      </w:r>
-      <w:proofErr w:type="spellStart"/>
-      <w:r>
-        <w:t>adulescenti</w:t>
-      </w:r>
-      <w:proofErr w:type="spellEnd"/>
-      <w:r>
-        <w:t xml:space="preserve"> </w:t>
-      </w:r>
-      <w:proofErr w:type="spellStart"/>
-      <w:r>
-        <w:t>meo</w:t>
-      </w:r>
-      <w:proofErr w:type="spellEnd"/>
-      <w:r>
-        <w:t xml:space="preserve"> </w:t>
-      </w:r>
-      <w:proofErr w:type="spellStart"/>
-      <w:r>
-        <w:t>necessario</w:t>
-      </w:r>
-      <w:proofErr w:type="spellEnd"/>
-      <w:r>
-        <w:t xml:space="preserve">, </w:t>
-      </w:r>
-      <w:proofErr w:type="spellStart"/>
-      <w:r>
-        <w:t>ignosco</w:t>
-      </w:r>
-      <w:proofErr w:type="spellEnd"/>
-      <w:r>
-        <w:t xml:space="preserve">, qui </w:t>
-      </w:r>
-      <w:proofErr w:type="spellStart"/>
-      <w:r>
-        <w:t>habet</w:t>
-      </w:r>
-      <w:proofErr w:type="spellEnd"/>
-      <w:r>
-        <w:t xml:space="preserve"> </w:t>
-      </w:r>
-      <w:proofErr w:type="spellStart"/>
-      <w:r>
-        <w:t>excusationem</w:t>
-      </w:r>
-      <w:proofErr w:type="spellEnd"/>
-      <w:r>
-        <w:t xml:space="preserve"> </w:t>
-      </w:r>
-      <w:proofErr w:type="spellStart"/>
-      <w:r>
-        <w:t>vel</w:t>
-      </w:r>
-      <w:proofErr w:type="spellEnd"/>
-      <w:r>
-        <w:t xml:space="preserve"> </w:t>
-      </w:r>
-      <w:proofErr w:type="spellStart"/>
-      <w:r>
-        <w:t>pietatis</w:t>
-      </w:r>
-      <w:proofErr w:type="spellEnd"/>
-      <w:r>
-        <w:t xml:space="preserve"> </w:t>
-      </w:r>
-      <w:proofErr w:type="spellStart"/>
-      <w:r>
-        <w:t>vel</w:t>
-      </w:r>
-      <w:proofErr w:type="spellEnd"/>
-      <w:r>
-        <w:t xml:space="preserve"> </w:t>
-      </w:r>
-      <w:proofErr w:type="spellStart"/>
-      <w:r>
-        <w:t>necessitatis</w:t>
-      </w:r>
-      <w:proofErr w:type="spellEnd"/>
-      <w:r>
-        <w:t xml:space="preserve"> </w:t>
-      </w:r>
-      <w:proofErr w:type="spellStart"/>
-      <w:r>
-        <w:t>vel</w:t>
-      </w:r>
-      <w:proofErr w:type="spellEnd"/>
-      <w:r>
-        <w:t xml:space="preserve"> </w:t>
-      </w:r>
-      <w:proofErr w:type="spellStart"/>
-      <w:r>
-        <w:t>aetatis</w:t>
-      </w:r>
-      <w:proofErr w:type="spellEnd"/>
-      <w:r>
-        <w:t xml:space="preserve">. Si </w:t>
-      </w:r>
-      <w:proofErr w:type="spellStart"/>
-      <w:r>
-        <w:t>voluit</w:t>
-      </w:r>
-      <w:proofErr w:type="spellEnd"/>
-      <w:r>
-        <w:t xml:space="preserve"> </w:t>
-      </w:r>
-      <w:proofErr w:type="spellStart"/>
-      <w:r>
-        <w:t>accusare</w:t>
-      </w:r>
-      <w:proofErr w:type="spellEnd"/>
-      <w:r>
-        <w:t xml:space="preserve">, </w:t>
-      </w:r>
-      <w:proofErr w:type="spellStart"/>
-      <w:r>
-        <w:t>pietati</w:t>
-      </w:r>
-      <w:proofErr w:type="spellEnd"/>
-      <w:r>
-        <w:t xml:space="preserve"> </w:t>
-      </w:r>
-      <w:proofErr w:type="spellStart"/>
-      <w:r>
-        <w:t>tribuo</w:t>
-      </w:r>
-      <w:proofErr w:type="spellEnd"/>
-      <w:r>
-        <w:t xml:space="preserve">, si </w:t>
-      </w:r>
-      <w:proofErr w:type="spellStart"/>
-      <w:r>
-        <w:t>iussus</w:t>
-      </w:r>
-      <w:proofErr w:type="spellEnd"/>
-      <w:r>
-        <w:t xml:space="preserve"> est, </w:t>
-      </w:r>
-      <w:proofErr w:type="spellStart"/>
-      <w:r>
-        <w:t>necessitati</w:t>
-      </w:r>
-      <w:proofErr w:type="spellEnd"/>
-      <w:r>
-        <w:t xml:space="preserve">, si </w:t>
-      </w:r>
-      <w:proofErr w:type="spellStart"/>
-      <w:r>
-        <w:t>speravit</w:t>
-      </w:r>
-      <w:proofErr w:type="spellEnd"/>
-      <w:r>
-        <w:t xml:space="preserve"> </w:t>
-      </w:r>
-      <w:proofErr w:type="spellStart"/>
-      <w:r>
-        <w:t>aliquid</w:t>
-      </w:r>
-      <w:proofErr w:type="spellEnd"/>
-      <w:r>
-        <w:t xml:space="preserve">, </w:t>
-      </w:r>
-      <w:proofErr w:type="spellStart"/>
-      <w:r>
-        <w:t>pueritiae</w:t>
-      </w:r>
-      <w:proofErr w:type="spellEnd"/>
-      <w:r>
-        <w:t xml:space="preserve">. </w:t>
-      </w:r>
-      <w:proofErr w:type="spellStart"/>
-      <w:r>
-        <w:t>Ceteris</w:t>
-      </w:r>
-      <w:proofErr w:type="spellEnd"/>
-      <w:r>
-        <w:t xml:space="preserve"> non modo nihil </w:t>
-      </w:r>
-      <w:proofErr w:type="spellStart"/>
-      <w:r>
-        <w:t>ignoscendum</w:t>
-      </w:r>
-      <w:proofErr w:type="spellEnd"/>
-      <w:r>
-        <w:t xml:space="preserve">, </w:t>
-      </w:r>
-      <w:proofErr w:type="spellStart"/>
-      <w:r>
-        <w:t>sed</w:t>
-      </w:r>
-      <w:proofErr w:type="spellEnd"/>
-      <w:r>
-        <w:t xml:space="preserve"> </w:t>
-      </w:r>
-      <w:proofErr w:type="spellStart"/>
-      <w:r>
-        <w:t>etiam</w:t>
-      </w:r>
-      <w:proofErr w:type="spellEnd"/>
-      <w:r>
-        <w:t xml:space="preserve"> </w:t>
-      </w:r>
-      <w:proofErr w:type="spellStart"/>
-      <w:r>
-        <w:t>acriter</w:t>
-      </w:r>
-      <w:proofErr w:type="spellEnd"/>
-      <w:r>
-        <w:t xml:space="preserve"> est </w:t>
-      </w:r>
-      <w:proofErr w:type="spellStart"/>
-      <w:r>
-        <w:t>resistendum</w:t>
-      </w:r>
-      <w:proofErr w:type="spellEnd"/>
-      <w:r>
-        <w:t>.</w:t>
-      </w:r>
-    </w:p>
-    <w:p/>
-    <w:p>
-      <w:pPr>
-        <w:pStyle w:val="Heading2"/>
-      </w:pPr>
-      <w:r>
-        <w:t>French Education System</w:t>
-      </w:r>
-    </w:p>
-    <w:p>
-      <w:pPr>
-        <w:rPr>
-          <w:lang w:val="en-US"/>
-        </w:rPr>
-      </w:pPr>
-    </w:p>
-    <w:p>
-      <w:pPr>
-        <w:rPr>
-          <w:lang w:val="en-US"/>
-        </w:rPr>
-      </w:pPr>
-      <w:r>
-        <w:rPr>
-          <w:lang w:val="en-US"/>
-        </w:rPr>
-        <w:t xml:space="preserve">Mox dicta </w:t>
-      </w:r>
-      <w:proofErr w:type="spellStart"/>
-      <w:r>
-        <w:rPr>
-          <w:lang w:val="en-US"/>
-        </w:rPr>
-        <w:t>finierat</w:t>
-      </w:r>
-      <w:proofErr w:type="spellEnd"/>
-      <w:r>
-        <w:rPr>
-          <w:lang w:val="en-US"/>
-        </w:rPr>
-        <w:t xml:space="preserve">, </w:t>
-      </w:r>
-      <w:proofErr w:type="spellStart"/>
-      <w:r>
-        <w:rPr>
-          <w:lang w:val="en-US"/>
-        </w:rPr>
-        <w:t>multitudo</w:t>
-      </w:r>
-      <w:proofErr w:type="spellEnd"/>
-      <w:r>
-        <w:rPr>
-          <w:lang w:val="en-US"/>
-        </w:rPr>
-        <w:t xml:space="preserve"> </w:t>
-      </w:r>
-      <w:proofErr w:type="spellStart"/>
-      <w:r>
-        <w:rPr>
-          <w:lang w:val="en-US"/>
-        </w:rPr>
-        <w:t>omnis</w:t>
-      </w:r>
-      <w:proofErr w:type="spellEnd"/>
-      <w:r>
-        <w:rPr>
-          <w:lang w:val="en-US"/>
-        </w:rPr>
-        <w:t xml:space="preserve"> ad, </w:t>
-      </w:r>
-      <w:proofErr w:type="spellStart"/>
-      <w:r>
-        <w:rPr>
-          <w:lang w:val="en-US"/>
-        </w:rPr>
-        <w:t>quae</w:t>
-      </w:r>
-      <w:proofErr w:type="spellEnd"/>
-      <w:r>
-        <w:rPr>
-          <w:lang w:val="en-US"/>
-        </w:rPr>
-        <w:t xml:space="preserve"> imperator </w:t>
-      </w:r>
-      <w:proofErr w:type="spellStart"/>
-      <w:r>
-        <w:rPr>
-          <w:lang w:val="en-US"/>
-        </w:rPr>
-        <w:t>voluit</w:t>
-      </w:r>
-      <w:proofErr w:type="spellEnd"/>
-      <w:r>
-        <w:rPr>
-          <w:lang w:val="en-US"/>
-        </w:rPr>
-        <w:t xml:space="preserve">, </w:t>
-      </w:r>
-      <w:proofErr w:type="spellStart"/>
-      <w:r>
-        <w:rPr>
-          <w:lang w:val="en-US"/>
-        </w:rPr>
-        <w:t>promptior</w:t>
-      </w:r>
-      <w:proofErr w:type="spellEnd"/>
-      <w:r>
-        <w:rPr>
-          <w:lang w:val="en-US"/>
-        </w:rPr>
-        <w:t xml:space="preserve"> </w:t>
-      </w:r>
-      <w:proofErr w:type="spellStart"/>
-      <w:r>
-        <w:rPr>
-          <w:lang w:val="en-US"/>
-        </w:rPr>
-        <w:t>laudato</w:t>
-      </w:r>
-      <w:proofErr w:type="spellEnd"/>
-      <w:r>
-        <w:rPr>
-          <w:lang w:val="en-US"/>
-        </w:rPr>
-        <w:t xml:space="preserve"> </w:t>
-      </w:r>
-      <w:proofErr w:type="spellStart"/>
-      <w:r>
-        <w:rPr>
-          <w:lang w:val="en-US"/>
-        </w:rPr>
-        <w:t>consilio</w:t>
-      </w:r>
-      <w:proofErr w:type="spellEnd"/>
-      <w:r>
-        <w:rPr>
-          <w:lang w:val="en-US"/>
-        </w:rPr>
-        <w:t xml:space="preserve"> </w:t>
-      </w:r>
-      <w:proofErr w:type="spellStart"/>
-      <w:r>
-        <w:rPr>
-          <w:lang w:val="en-US"/>
-        </w:rPr>
-        <w:t>consensit</w:t>
-      </w:r>
-      <w:proofErr w:type="spellEnd"/>
-      <w:r>
-        <w:rPr>
-          <w:lang w:val="en-US"/>
-        </w:rPr>
-        <w:t xml:space="preserve"> in pacem </w:t>
-      </w:r>
-      <w:proofErr w:type="spellStart"/>
-      <w:r>
-        <w:rPr>
-          <w:lang w:val="en-US"/>
-        </w:rPr>
-        <w:t>ea</w:t>
-      </w:r>
-      <w:proofErr w:type="spellEnd"/>
-      <w:r>
-        <w:rPr>
-          <w:lang w:val="en-US"/>
-        </w:rPr>
-        <w:t xml:space="preserve"> ratione </w:t>
-      </w:r>
-      <w:proofErr w:type="spellStart"/>
-      <w:r>
-        <w:rPr>
-          <w:lang w:val="en-US"/>
-        </w:rPr>
-        <w:t>maxime</w:t>
-      </w:r>
-      <w:proofErr w:type="spellEnd"/>
-      <w:r>
-        <w:rPr>
-          <w:lang w:val="en-US"/>
-        </w:rPr>
-        <w:t xml:space="preserve"> </w:t>
-      </w:r>
-      <w:proofErr w:type="spellStart"/>
-      <w:r>
-        <w:rPr>
-          <w:lang w:val="en-US"/>
-        </w:rPr>
-        <w:t>percita</w:t>
-      </w:r>
-      <w:proofErr w:type="spellEnd"/>
-      <w:r>
-        <w:rPr>
-          <w:lang w:val="en-US"/>
-        </w:rPr>
-        <w:t xml:space="preserve">, </w:t>
-      </w:r>
-      <w:proofErr w:type="spellStart"/>
-      <w:r>
-        <w:rPr>
-          <w:lang w:val="en-US"/>
-        </w:rPr>
-        <w:t>quod</w:t>
-      </w:r>
-      <w:proofErr w:type="spellEnd"/>
-      <w:r>
-        <w:rPr>
-          <w:lang w:val="en-US"/>
-        </w:rPr>
-        <w:t xml:space="preserve"> </w:t>
-      </w:r>
-      <w:proofErr w:type="spellStart"/>
-      <w:r>
-        <w:rPr>
-          <w:lang w:val="en-US"/>
-        </w:rPr>
-        <w:t>norat</w:t>
-      </w:r>
-      <w:proofErr w:type="spellEnd"/>
-      <w:r>
-        <w:rPr>
-          <w:lang w:val="en-US"/>
-        </w:rPr>
-        <w:t xml:space="preserve"> </w:t>
-      </w:r>
-      <w:proofErr w:type="spellStart"/>
-      <w:r>
-        <w:rPr>
-          <w:lang w:val="en-US"/>
-        </w:rPr>
-        <w:t>expeditionibus</w:t>
-      </w:r>
-      <w:proofErr w:type="spellEnd"/>
-      <w:r>
-        <w:rPr>
-          <w:lang w:val="en-US"/>
-        </w:rPr>
-        <w:t xml:space="preserve"> </w:t>
-      </w:r>
-      <w:proofErr w:type="spellStart"/>
-      <w:r>
-        <w:rPr>
-          <w:lang w:val="en-US"/>
-        </w:rPr>
-        <w:t>crebris</w:t>
-      </w:r>
-      <w:proofErr w:type="spellEnd"/>
-      <w:r>
-        <w:rPr>
-          <w:lang w:val="en-US"/>
-        </w:rPr>
-        <w:t xml:space="preserve"> </w:t>
-      </w:r>
-      <w:proofErr w:type="spellStart"/>
-      <w:r>
-        <w:rPr>
-          <w:lang w:val="en-US"/>
-        </w:rPr>
-        <w:t>fortunam</w:t>
-      </w:r>
-      <w:proofErr w:type="spellEnd"/>
-      <w:r>
-        <w:rPr>
-          <w:lang w:val="en-US"/>
-        </w:rPr>
-        <w:t xml:space="preserve"> eius in </w:t>
-      </w:r>
-      <w:proofErr w:type="spellStart"/>
-      <w:r>
-        <w:rPr>
-          <w:lang w:val="en-US"/>
-        </w:rPr>
-        <w:t>malis</w:t>
-      </w:r>
-      <w:proofErr w:type="spellEnd"/>
-      <w:r>
-        <w:rPr>
-          <w:lang w:val="en-US"/>
-        </w:rPr>
-        <w:t xml:space="preserve"> tantum </w:t>
-      </w:r>
-      <w:proofErr w:type="spellStart"/>
-      <w:r>
-        <w:rPr>
-          <w:lang w:val="en-US"/>
-        </w:rPr>
-        <w:t>civilibus</w:t>
-      </w:r>
-      <w:proofErr w:type="spellEnd"/>
-      <w:r>
-        <w:rPr>
-          <w:lang w:val="en-US"/>
-        </w:rPr>
-        <w:t xml:space="preserve"> </w:t>
-      </w:r>
-      <w:proofErr w:type="spellStart"/>
-      <w:r>
-        <w:rPr>
-          <w:lang w:val="en-US"/>
-        </w:rPr>
-        <w:t>vigilasse</w:t>
-      </w:r>
-      <w:proofErr w:type="spellEnd"/>
-      <w:r>
-        <w:rPr>
-          <w:lang w:val="en-US"/>
-        </w:rPr>
-        <w:t xml:space="preserve">, cum autem </w:t>
-      </w:r>
-      <w:proofErr w:type="spellStart"/>
-      <w:r>
-        <w:rPr>
-          <w:lang w:val="en-US"/>
-        </w:rPr>
-        <w:t>bella</w:t>
-      </w:r>
-      <w:proofErr w:type="spellEnd"/>
-      <w:r>
-        <w:rPr>
-          <w:lang w:val="en-US"/>
-        </w:rPr>
-        <w:t xml:space="preserve"> </w:t>
-      </w:r>
-      <w:proofErr w:type="spellStart"/>
-      <w:r>
-        <w:rPr>
-          <w:lang w:val="en-US"/>
-        </w:rPr>
-        <w:t>moverentur</w:t>
-      </w:r>
-      <w:proofErr w:type="spellEnd"/>
-      <w:r>
-        <w:rPr>
-          <w:lang w:val="en-US"/>
-        </w:rPr>
-        <w:t xml:space="preserve"> externa, </w:t>
-      </w:r>
-      <w:proofErr w:type="spellStart"/>
-      <w:r>
-        <w:rPr>
-          <w:lang w:val="en-US"/>
-        </w:rPr>
-        <w:t>accidisse</w:t>
-      </w:r>
-      <w:proofErr w:type="spellEnd"/>
-      <w:r>
-        <w:rPr>
-          <w:lang w:val="en-US"/>
-        </w:rPr>
-        <w:t xml:space="preserve"> </w:t>
-      </w:r>
-      <w:proofErr w:type="spellStart"/>
-      <w:r>
-        <w:rPr>
-          <w:lang w:val="en-US"/>
-        </w:rPr>
-        <w:t>plerumque</w:t>
-      </w:r>
-      <w:proofErr w:type="spellEnd"/>
-      <w:r>
-        <w:rPr>
-          <w:lang w:val="en-US"/>
-        </w:rPr>
-        <w:t xml:space="preserve"> </w:t>
-      </w:r>
-      <w:proofErr w:type="spellStart"/>
-      <w:r>
-        <w:rPr>
-          <w:lang w:val="en-US"/>
-        </w:rPr>
-        <w:t>luctuosa</w:t>
-      </w:r>
-      <w:proofErr w:type="spellEnd"/>
-      <w:r>
-        <w:rPr>
-          <w:lang w:val="en-US"/>
-        </w:rPr>
-        <w:t xml:space="preserve">, </w:t>
-      </w:r>
-      <w:proofErr w:type="spellStart"/>
-      <w:r>
-        <w:rPr>
-          <w:lang w:val="en-US"/>
-        </w:rPr>
-        <w:t>icto</w:t>
-      </w:r>
-      <w:proofErr w:type="spellEnd"/>
-      <w:r>
-        <w:rPr>
-          <w:lang w:val="en-US"/>
-        </w:rPr>
-        <w:t xml:space="preserve"> post haec </w:t>
-      </w:r>
-      <w:proofErr w:type="spellStart"/>
-      <w:r>
-        <w:rPr>
-          <w:lang w:val="en-US"/>
-        </w:rPr>
-        <w:t>foedere</w:t>
-      </w:r>
-      <w:proofErr w:type="spellEnd"/>
-      <w:r>
-        <w:rPr>
-          <w:lang w:val="en-US"/>
-        </w:rPr>
-        <w:t xml:space="preserve"> gentium </w:t>
-      </w:r>
-      <w:proofErr w:type="spellStart"/>
-      <w:r>
-        <w:rPr>
-          <w:lang w:val="en-US"/>
-        </w:rPr>
-        <w:t>ritu</w:t>
-      </w:r>
-      <w:proofErr w:type="spellEnd"/>
-      <w:r>
-        <w:rPr>
-          <w:lang w:val="en-US"/>
-        </w:rPr>
-        <w:t xml:space="preserve"> </w:t>
-      </w:r>
-      <w:proofErr w:type="spellStart"/>
-      <w:r>
-        <w:rPr>
-          <w:lang w:val="en-US"/>
-        </w:rPr>
-        <w:t>perfectaque</w:t>
-      </w:r>
-      <w:proofErr w:type="spellEnd"/>
-      <w:r>
-        <w:rPr>
-          <w:lang w:val="en-US"/>
-        </w:rPr>
-        <w:t xml:space="preserve"> </w:t>
-      </w:r>
-      <w:proofErr w:type="spellStart"/>
-      <w:r>
-        <w:rPr>
-          <w:lang w:val="en-US"/>
-        </w:rPr>
-        <w:t>sollemnitate</w:t>
-      </w:r>
-      <w:proofErr w:type="spellEnd"/>
-      <w:r>
-        <w:rPr>
-          <w:lang w:val="en-US"/>
-        </w:rPr>
-        <w:t xml:space="preserve"> imperator Mediolanum ad </w:t>
-      </w:r>
-      <w:proofErr w:type="spellStart"/>
-      <w:r>
-        <w:rPr>
-          <w:lang w:val="en-US"/>
-        </w:rPr>
-        <w:t>hiberna</w:t>
-      </w:r>
-      <w:proofErr w:type="spellEnd"/>
-      <w:r>
-        <w:rPr>
-          <w:lang w:val="en-US"/>
-        </w:rPr>
-        <w:t xml:space="preserve"> </w:t>
-      </w:r>
-      <w:proofErr w:type="spellStart"/>
-      <w:r>
-        <w:rPr>
-          <w:lang w:val="en-US"/>
-        </w:rPr>
-        <w:t>discessit</w:t>
-      </w:r>
-      <w:proofErr w:type="spellEnd"/>
-      <w:r>
-        <w:rPr>
-          <w:lang w:val="en-US"/>
-        </w:rPr>
-        <w:t>.</w:t>
-      </w:r>
-    </w:p>
-    <w:p>
-      <w:pPr>
-        <w:rPr>
-          <w:lang w:val="en-US"/>
-        </w:rPr>
-      </w:pPr>
-      <w:r>
-        <w:rPr>
-          <w:lang w:val="en-US"/>
-        </w:rPr>
-        <w:t xml:space="preserve">Mox dicta </w:t>
-      </w:r>
-      <w:proofErr w:type="spellStart"/>
-      <w:r>
-        <w:rPr>
-          <w:lang w:val="en-US"/>
-        </w:rPr>
-        <w:t>finierat</w:t>
-      </w:r>
-      <w:proofErr w:type="spellEnd"/>
-      <w:r>
-        <w:rPr>
-          <w:lang w:val="en-US"/>
-        </w:rPr>
-        <w:t xml:space="preserve">, </w:t>
-      </w:r>
-      <w:proofErr w:type="spellStart"/>
-      <w:r>
-        <w:rPr>
-          <w:lang w:val="en-US"/>
-        </w:rPr>
-        <w:t>multitudo</w:t>
-      </w:r>
-      <w:proofErr w:type="spellEnd"/>
-      <w:r>
-        <w:rPr>
-          <w:lang w:val="en-US"/>
-        </w:rPr>
-        <w:t xml:space="preserve"> </w:t>
-      </w:r>
-      <w:proofErr w:type="spellStart"/>
-      <w:r>
-        <w:rPr>
-          <w:lang w:val="en-US"/>
-        </w:rPr>
-        <w:t>omnis</w:t>
-      </w:r>
-      <w:proofErr w:type="spellEnd"/>
-      <w:r>
-        <w:rPr>
-          <w:lang w:val="en-US"/>
-        </w:rPr>
-        <w:t xml:space="preserve"> ad, </w:t>
-      </w:r>
-      <w:proofErr w:type="spellStart"/>
-      <w:r>
-        <w:rPr>
-          <w:lang w:val="en-US"/>
-        </w:rPr>
-        <w:t>quae</w:t>
-      </w:r>
-      <w:proofErr w:type="spellEnd"/>
-      <w:r>
-        <w:rPr>
-          <w:lang w:val="en-US"/>
-        </w:rPr>
-        <w:t xml:space="preserve"> imperator </w:t>
-      </w:r>
-      <w:proofErr w:type="spellStart"/>
-      <w:r>
-        <w:rPr>
-          <w:lang w:val="en-US"/>
-        </w:rPr>
-        <w:t>voluit</w:t>
-      </w:r>
-      <w:proofErr w:type="spellEnd"/>
-      <w:r>
-        <w:rPr>
-          <w:lang w:val="en-US"/>
-        </w:rPr>
-        <w:t xml:space="preserve">, </w:t>
-      </w:r>
-      <w:proofErr w:type="spellStart"/>
-      <w:r>
-        <w:rPr>
-          <w:lang w:val="en-US"/>
-        </w:rPr>
-        <w:t>promptior</w:t>
-      </w:r>
-      <w:proofErr w:type="spellEnd"/>
-      <w:r>
-        <w:rPr>
-          <w:lang w:val="en-US"/>
-        </w:rPr>
-        <w:t xml:space="preserve"> </w:t>
-      </w:r>
-      <w:proofErr w:type="spellStart"/>
-      <w:r>
-        <w:rPr>
-          <w:lang w:val="en-US"/>
-        </w:rPr>
-        <w:t>laudato</w:t>
-      </w:r>
-      <w:proofErr w:type="spellEnd"/>
-      <w:r>
-        <w:rPr>
-          <w:lang w:val="en-US"/>
-        </w:rPr>
-        <w:t xml:space="preserve"> </w:t>
-      </w:r>
-      <w:proofErr w:type="spellStart"/>
-      <w:r>
-        <w:rPr>
-          <w:lang w:val="en-US"/>
-        </w:rPr>
-        <w:t>consilio</w:t>
-      </w:r>
-      <w:proofErr w:type="spellEnd"/>
-      <w:r>
-        <w:rPr>
-          <w:lang w:val="en-US"/>
-        </w:rPr>
-        <w:t xml:space="preserve"> </w:t>
-      </w:r>
-      <w:proofErr w:type="spellStart"/>
-      <w:r>
-        <w:rPr>
-          <w:lang w:val="en-US"/>
-        </w:rPr>
-        <w:t>consensit</w:t>
-      </w:r>
-      <w:proofErr w:type="spellEnd"/>
-      <w:r>
-        <w:rPr>
-          <w:lang w:val="en-US"/>
-        </w:rPr>
-        <w:t xml:space="preserve"> in pacem </w:t>
-      </w:r>
-      <w:proofErr w:type="spellStart"/>
-      <w:r>
-        <w:rPr>
-          <w:lang w:val="en-US"/>
-        </w:rPr>
-        <w:t>ea</w:t>
-      </w:r>
-      <w:proofErr w:type="spellEnd"/>
-      <w:r>
-        <w:rPr>
-          <w:lang w:val="en-US"/>
-        </w:rPr>
-        <w:t xml:space="preserve"> ratione </w:t>
-      </w:r>
-      <w:proofErr w:type="spellStart"/>
-      <w:r>
-        <w:rPr>
-          <w:lang w:val="en-US"/>
-        </w:rPr>
-        <w:t>maxime</w:t>
-      </w:r>
-      <w:proofErr w:type="spellEnd"/>
-      <w:r>
-        <w:rPr>
-          <w:lang w:val="en-US"/>
-        </w:rPr>
-        <w:t xml:space="preserve"> </w:t>
-      </w:r>
-      <w:proofErr w:type="spellStart"/>
-      <w:r>
-        <w:rPr>
-          <w:lang w:val="en-US"/>
-        </w:rPr>
-        <w:t>percita</w:t>
-      </w:r>
-      <w:proofErr w:type="spellEnd"/>
-      <w:r>
-        <w:rPr>
-          <w:lang w:val="en-US"/>
-        </w:rPr>
-        <w:t xml:space="preserve">, </w:t>
-      </w:r>
-      <w:proofErr w:type="spellStart"/>
-      <w:r>
-        <w:rPr>
-          <w:lang w:val="en-US"/>
-        </w:rPr>
-        <w:t>quod</w:t>
-      </w:r>
-      <w:proofErr w:type="spellEnd"/>
-      <w:r>
-        <w:rPr>
-          <w:lang w:val="en-US"/>
-        </w:rPr>
-        <w:t xml:space="preserve"> </w:t>
-      </w:r>
-      <w:proofErr w:type="spellStart"/>
-      <w:r>
-        <w:rPr>
-          <w:lang w:val="en-US"/>
-        </w:rPr>
-        <w:t>norat</w:t>
-      </w:r>
-      <w:proofErr w:type="spellEnd"/>
-      <w:r>
-        <w:rPr>
-          <w:lang w:val="en-US"/>
-        </w:rPr>
-        <w:t xml:space="preserve"> </w:t>
-      </w:r>
-      <w:proofErr w:type="spellStart"/>
-      <w:r>
-        <w:rPr>
-          <w:lang w:val="en-US"/>
-        </w:rPr>
-        <w:t>expeditionibus</w:t>
-      </w:r>
-      <w:proofErr w:type="spellEnd"/>
-      <w:r>
-        <w:rPr>
-          <w:lang w:val="en-US"/>
-        </w:rPr>
-        <w:t xml:space="preserve"> </w:t>
-      </w:r>
-      <w:proofErr w:type="spellStart"/>
-      <w:r>
-        <w:rPr>
-          <w:lang w:val="en-US"/>
-        </w:rPr>
-        <w:t>crebris</w:t>
-      </w:r>
-      <w:proofErr w:type="spellEnd"/>
-      <w:r>
-        <w:rPr>
-          <w:lang w:val="en-US"/>
-        </w:rPr>
-        <w:t xml:space="preserve"> </w:t>
-      </w:r>
-      <w:proofErr w:type="spellStart"/>
-      <w:r>
-        <w:rPr>
-          <w:lang w:val="en-US"/>
-        </w:rPr>
-        <w:t>fortunam</w:t>
-      </w:r>
-      <w:proofErr w:type="spellEnd"/>
-      <w:r>
-        <w:rPr>
-          <w:lang w:val="en-US"/>
-        </w:rPr>
-        <w:t xml:space="preserve"> eius in </w:t>
-      </w:r>
-      <w:proofErr w:type="spellStart"/>
-      <w:r>
-        <w:rPr>
-          <w:lang w:val="en-US"/>
-        </w:rPr>
-        <w:t>malis</w:t>
-      </w:r>
-      <w:proofErr w:type="spellEnd"/>
-      <w:r>
-        <w:rPr>
-          <w:lang w:val="en-US"/>
-        </w:rPr>
-        <w:t xml:space="preserve"> tantum </w:t>
-      </w:r>
-      <w:proofErr w:type="spellStart"/>
-      <w:r>
-        <w:rPr>
-          <w:lang w:val="en-US"/>
-        </w:rPr>
-        <w:t>civilibus</w:t>
-      </w:r>
-      <w:proofErr w:type="spellEnd"/>
-      <w:r>
-        <w:rPr>
-          <w:lang w:val="en-US"/>
-        </w:rPr>
-        <w:t xml:space="preserve"> </w:t>
-      </w:r>
-      <w:proofErr w:type="spellStart"/>
-      <w:r>
-        <w:rPr>
-          <w:lang w:val="en-US"/>
-        </w:rPr>
-        <w:t>vigilasse</w:t>
-      </w:r>
-      <w:proofErr w:type="spellEnd"/>
-      <w:r>
-        <w:rPr>
-          <w:lang w:val="en-US"/>
-        </w:rPr>
-        <w:t xml:space="preserve">, cum autem </w:t>
-      </w:r>
-      <w:proofErr w:type="spellStart"/>
-      <w:r>
-        <w:rPr>
-          <w:lang w:val="en-US"/>
-        </w:rPr>
-        <w:t>bella</w:t>
-      </w:r>
-      <w:proofErr w:type="spellEnd"/>
-      <w:r>
-        <w:rPr>
-          <w:lang w:val="en-US"/>
-        </w:rPr>
-        <w:t xml:space="preserve"> </w:t>
-      </w:r>
-      <w:proofErr w:type="spellStart"/>
-      <w:r>
-        <w:rPr>
-          <w:lang w:val="en-US"/>
-        </w:rPr>
-        <w:t>moverentur</w:t>
-      </w:r>
-      <w:proofErr w:type="spellEnd"/>
-      <w:r>
-        <w:rPr>
-          <w:lang w:val="en-US"/>
-        </w:rPr>
-        <w:t xml:space="preserve"> externa, </w:t>
-      </w:r>
-      <w:proofErr w:type="spellStart"/>
-      <w:r>
-        <w:rPr>
-          <w:lang w:val="en-US"/>
-        </w:rPr>
-        <w:t>accidisse</w:t>
-      </w:r>
-      <w:proofErr w:type="spellEnd"/>
-      <w:r>
-        <w:rPr>
-          <w:lang w:val="en-US"/>
-        </w:rPr>
-        <w:t xml:space="preserve"> </w:t>
-      </w:r>
-      <w:proofErr w:type="spellStart"/>
-      <w:r>
-        <w:rPr>
-          <w:lang w:val="en-US"/>
-        </w:rPr>
-        <w:t>plerumque</w:t>
-      </w:r>
-      <w:proofErr w:type="spellEnd"/>
-      <w:r>
-        <w:rPr>
-          <w:lang w:val="en-US"/>
-        </w:rPr>
-        <w:t xml:space="preserve"> </w:t>
-      </w:r>
-      <w:proofErr w:type="spellStart"/>
-      <w:r>
-        <w:rPr>
-          <w:lang w:val="en-US"/>
-        </w:rPr>
-        <w:t>luctuosa</w:t>
-      </w:r>
-      <w:proofErr w:type="spellEnd"/>
-      <w:r>
-        <w:rPr>
-          <w:lang w:val="en-US"/>
-        </w:rPr>
-        <w:t xml:space="preserve">, </w:t>
-      </w:r>
-      <w:proofErr w:type="spellStart"/>
-      <w:r>
-        <w:rPr>
-          <w:lang w:val="en-US"/>
-        </w:rPr>
-        <w:t>icto</w:t>
-      </w:r>
-      <w:proofErr w:type="spellEnd"/>
-      <w:r>
-        <w:rPr>
-          <w:lang w:val="en-US"/>
-        </w:rPr>
-        <w:t xml:space="preserve"> post haec </w:t>
-      </w:r>
-      <w:proofErr w:type="spellStart"/>
-      <w:r>
-        <w:rPr>
-          <w:lang w:val="en-US"/>
-        </w:rPr>
-        <w:t>foedere</w:t>
-      </w:r>
-      <w:proofErr w:type="spellEnd"/>
-      <w:r>
-        <w:rPr>
-          <w:lang w:val="en-US"/>
-        </w:rPr>
-        <w:t xml:space="preserve"> gentium </w:t>
-      </w:r>
-      <w:proofErr w:type="spellStart"/>
-      <w:r>
-        <w:rPr>
-          <w:lang w:val="en-US"/>
-        </w:rPr>
-        <w:t>ritu</w:t>
-      </w:r>
-      <w:proofErr w:type="spellEnd"/>
-      <w:r>
-        <w:rPr>
-          <w:lang w:val="en-US"/>
-        </w:rPr>
-        <w:t xml:space="preserve"> </w:t>
-      </w:r>
-      <w:proofErr w:type="spellStart"/>
-      <w:r>
-        <w:rPr>
-          <w:lang w:val="en-US"/>
-        </w:rPr>
-        <w:t>perfectaque</w:t>
-      </w:r>
-      <w:proofErr w:type="spellEnd"/>
-      <w:r>
-        <w:rPr>
-          <w:lang w:val="en-US"/>
-        </w:rPr>
-        <w:t xml:space="preserve"> </w:t>
-      </w:r>
-      <w:proofErr w:type="spellStart"/>
-      <w:r>
-        <w:rPr>
-          <w:lang w:val="en-US"/>
-        </w:rPr>
-        <w:t>sollemnitate</w:t>
-      </w:r>
-      <w:proofErr w:type="spellEnd"/>
-      <w:r>
-        <w:rPr>
-          <w:lang w:val="en-US"/>
-        </w:rPr>
-        <w:t xml:space="preserve"> imperator Mediolanum ad </w:t>
-      </w:r>
-      <w:proofErr w:type="spellStart"/>
-      <w:r>
-        <w:rPr>
-          <w:lang w:val="en-US"/>
-        </w:rPr>
-        <w:t>hiberna</w:t>
-      </w:r>
-      <w:proofErr w:type="spellEnd"/>
-      <w:r>
-        <w:rPr>
-          <w:lang w:val="en-US"/>
-        </w:rPr>
-        <w:t xml:space="preserve"> </w:t>
-      </w:r>
-      <w:proofErr w:type="spellStart"/>
-      <w:r>
-        <w:rPr>
-          <w:lang w:val="en-US"/>
-        </w:rPr>
-        <w:t>discessit</w:t>
-      </w:r>
-      <w:proofErr w:type="spellEnd"/>
-      <w:r>
-        <w:rPr>
-          <w:lang w:val="en-US"/>
-        </w:rPr>
-        <w:t>.</w:t>
-      </w:r>
-    </w:p>
-    <w:p>
-      <w:pPr>
-        <w:rPr>
-          <w:lang w:val="en-US"/>
-        </w:rPr>
-      </w:pPr>
-    </w:p>
-    <w:p>
-      <w:pPr>
-        <w:rPr>
-          <w:lang w:val="en-US"/>
-        </w:rPr>
-      </w:pPr>
-    </w:p>
-    <w:p>
-      <w:pPr>
-        <w:rPr>
-          <w:i/>
-          <w:sz w:val="24"/>
-          <w:lang w:val="en-US"/>
-        </w:rPr>
-      </w:pPr>
+      <w:r>
+        <w:rPr>
+          <w:lang w:val="en-US"/>
+        </w:rPr>
+        <w:t xml:space="preserve">this thesis </w:t>
+      </w:r>
+      <w:r>
+        <w:rPr>
+          <w:lang w:val="en-US"/>
+        </w:rPr>
+        <w:t>aims</w:t>
+      </w:r>
+      <w:r>
+        <w:rPr>
+          <w:lang w:val="en-US"/>
+        </w:rPr>
+        <w:t xml:space="preserve"> </w:t>
+      </w:r>
+      <w:r>
+        <w:rPr>
+          <w:lang w:val="en-US"/>
+        </w:rPr>
+        <w:t xml:space="preserve">to </w:t>
+      </w:r>
+      <w:proofErr w:type="spellStart"/>
+      <w:r>
+        <w:rPr>
+          <w:lang w:val="en-US"/>
+        </w:rPr>
+        <w:t>analyse</w:t>
+      </w:r>
+      <w:proofErr w:type="spellEnd"/>
+      <w:r>
+        <w:rPr>
+          <w:lang w:val="en-US"/>
+        </w:rPr>
+        <w:t xml:space="preserve"> </w:t>
+      </w:r>
+      <w:r>
+        <w:rPr>
+          <w:lang w:val="en-US"/>
+        </w:rPr>
+        <w:t>How do French middle school language teachers evaluate and integrate generative AI tools into their lesson planning practices, and what factors influence</w:t>
+      </w:r>
+      <w:r>
+        <w:rPr>
+          <w:lang w:val="en-US"/>
+        </w:rPr>
+        <w:t xml:space="preserve"> </w:t>
+      </w:r>
+      <w:r>
+        <w:rPr>
+          <w:lang w:val="en-US"/>
+        </w:rPr>
+        <w:t>their adoption</w:t>
+      </w:r>
+      <w:r>
+        <w:rPr>
+          <w:lang w:val="en-US"/>
+        </w:rPr>
+        <w:t xml:space="preserve"> </w:t>
+      </w:r>
+      <w:r>
+        <w:rPr>
+          <w:lang w:val="en-US"/>
+        </w:rPr>
+        <w:t>decisions?</w:t>
+      </w:r>
+      <w:r>
+        <w:rPr>
+          <w:lang w:val="en-US"/>
+        </w:rPr>
+        <w:t xml:space="preserve"> </w:t>
+      </w:r>
       <w:r>
         <w:rPr>
           <w:lang w:val="en-US"/>
@@ -10658,134 +10088,19 @@
         <w:br w:type="page"/>
       </w:r>
     </w:p>
-    <w:p>
-      <w:pPr>
-        <w:pStyle w:val="Heading1"/>
-        <w:rPr>
-          <w:lang w:val="en-US"/>
-        </w:rPr>
-      </w:pPr>
-      <w:bookmarkStart w:id="41" w:name="_Toc229755641"/>
-      <w:bookmarkEnd w:id="40"/>
+    <w:bookmarkEnd w:id="40"/>
+    <w:p>
+      <w:pPr>
+        <w:jc w:val="left"/>
+        <w:rPr>
+          <w:lang w:val="en-US"/>
+        </w:rPr>
+      </w:pPr>
       <w:r>
         <w:rPr>
           <w:lang w:val="en-US"/>
         </w:rPr>
         <w:lastRenderedPageBreak/>
-        <w:t>Problem Statement</w:t>
-      </w:r>
-      <w:bookmarkEnd w:id="41"/>
-    </w:p>
-    <w:p>
-      <w:pPr>
-        <w:rPr>
-          <w:lang w:val="en-US"/>
-        </w:rPr>
-      </w:pPr>
-    </w:p>
-    <w:p>
-      <w:pPr>
-        <w:jc w:val="left"/>
-        <w:rPr>
-          <w:lang w:val="en-US"/>
-        </w:rPr>
-      </w:pPr>
-      <w:r>
-        <w:rPr>
-          <w:lang w:val="en-US"/>
-        </w:rPr>
-        <w:t xml:space="preserve">Use of AI in teaching is </w:t>
-      </w:r>
-      <w:r>
-        <w:rPr>
-          <w:lang w:val="en-US"/>
-        </w:rPr>
-        <w:t>becoming popular</w:t>
-      </w:r>
-      <w:r>
-        <w:rPr>
-          <w:lang w:val="en-US"/>
-        </w:rPr>
-        <w:t xml:space="preserve"> to be in-line and take advantage of the advancement of technology, to provide </w:t>
-      </w:r>
-      <w:r>
-        <w:rPr>
-          <w:lang w:val="en-US"/>
-        </w:rPr>
-        <w:t xml:space="preserve">dynamic and more adapted </w:t>
-      </w:r>
-      <w:r>
-        <w:rPr>
-          <w:lang w:val="en-US"/>
-        </w:rPr>
-        <w:t xml:space="preserve">education to the new generation of students. However, identifying and choosing the best and easy-to-learn/easy-to-use tools are not trivial. Therefore, the goal of this thesis is </w:t>
-      </w:r>
-      <w:r>
-        <w:rPr>
-          <w:lang w:val="en-US"/>
-        </w:rPr>
-        <w:t xml:space="preserve">to </w:t>
-      </w:r>
-      <w:proofErr w:type="spellStart"/>
-      <w:r>
-        <w:rPr>
-          <w:lang w:val="en-US"/>
-        </w:rPr>
-        <w:t>analyse</w:t>
-      </w:r>
-      <w:proofErr w:type="spellEnd"/>
-      <w:r>
-        <w:rPr>
-          <w:lang w:val="en-US"/>
-        </w:rPr>
-        <w:t xml:space="preserve"> </w:t>
-      </w:r>
-      <w:r>
-        <w:rPr>
-          <w:lang w:val="en-US"/>
-        </w:rPr>
-        <w:t xml:space="preserve">How </w:t>
-      </w:r>
-      <w:r>
-        <w:rPr>
-          <w:lang w:val="en-US"/>
-        </w:rPr>
-        <w:t xml:space="preserve">English and French </w:t>
-      </w:r>
-      <w:r>
-        <w:rPr>
-          <w:lang w:val="en-US"/>
-        </w:rPr>
-        <w:t xml:space="preserve">language teachers </w:t>
-      </w:r>
-      <w:r>
-        <w:rPr>
-          <w:lang w:val="en-US"/>
-        </w:rPr>
-        <w:t xml:space="preserve">in French middle school </w:t>
-      </w:r>
-      <w:r>
-        <w:rPr>
-          <w:lang w:val="en-US"/>
-        </w:rPr>
-        <w:t>experience and evaluate generative AI tools for lesson planning: A mixed-methods analysis of practice change and adoption barriers.</w:t>
-      </w:r>
-      <w:r>
-        <w:rPr>
-          <w:lang w:val="en-US"/>
-        </w:rPr>
-        <w:t xml:space="preserve"> </w:t>
-      </w:r>
-      <w:r>
-        <w:rPr>
-          <w:lang w:val="en-US"/>
-        </w:rPr>
-        <w:br/>
-      </w:r>
-      <w:r>
-        <w:rPr>
-          <w:lang w:val="en-US"/>
-        </w:rPr>
         <w:br/>
       </w:r>
     </w:p>
@@ -10857,9 +10172,9 @@
           <w:lang w:val="en-US"/>
         </w:rPr>
       </w:pPr>
-      <w:bookmarkStart w:id="42" w:name="_Toc229755642"/>
-      <w:bookmarkStart w:id="43" w:name="_Toc89960513"/>
-      <w:bookmarkStart w:id="44" w:name="_Toc105689043"/>
+      <w:bookmarkStart w:id="41" w:name="_Toc229755642"/>
+      <w:bookmarkStart w:id="42" w:name="_Toc89960513"/>
+      <w:bookmarkStart w:id="43" w:name="_Toc105689043"/>
       <w:r>
         <w:rPr>
           <w:rFonts w:eastAsia="Times New Roman"/>
@@ -10868,7 +10183,7 @@
         <w:lastRenderedPageBreak/>
         <w:t>Experiment</w:t>
       </w:r>
-      <w:bookmarkEnd w:id="42"/>
+      <w:bookmarkEnd w:id="41"/>
     </w:p>
     <w:p>
       <w:pPr>
@@ -10934,7 +10249,7 @@
           <w:lang w:val="en-US" w:eastAsia="en-IN"/>
         </w:rPr>
       </w:pPr>
-      <w:bookmarkStart w:id="45" w:name="_Toc229755643"/>
+      <w:bookmarkStart w:id="44" w:name="_Toc229755643"/>
       <w:r>
         <w:rPr>
           <w:rFonts w:eastAsia="Times New Roman"/>
@@ -10943,7 +10258,7 @@
         <w:lastRenderedPageBreak/>
         <w:t>Inferences</w:t>
       </w:r>
-      <w:bookmarkEnd w:id="45"/>
+      <w:bookmarkEnd w:id="44"/>
     </w:p>
     <w:p>
       <w:pPr>
@@ -11898,7 +11213,7 @@
           <w:lang w:eastAsia="en-IN"/>
         </w:rPr>
       </w:pPr>
-      <w:bookmarkStart w:id="46" w:name="_Toc229755644"/>
+      <w:bookmarkStart w:id="45" w:name="_Toc229755644"/>
       <w:r>
         <w:rPr>
           <w:rFonts w:eastAsia="Times New Roman"/>
@@ -11907,7 +11222,7 @@
         <w:lastRenderedPageBreak/>
         <w:t>Conclusion</w:t>
       </w:r>
-      <w:bookmarkEnd w:id="46"/>
+      <w:bookmarkEnd w:id="45"/>
     </w:p>
     <w:p/>
     <w:p>
@@ -12677,8 +11992,8 @@
     </w:p>
     <w:p/>
     <w:p/>
+    <w:bookmarkEnd w:id="42"/>
     <w:bookmarkEnd w:id="43"/>
-    <w:bookmarkEnd w:id="44"/>
     <w:p/>
     <w:p/>
     <w:p>
@@ -12687,7 +12002,7 @@
           <w:sz w:val="24"/>
         </w:rPr>
         <w:sectPr>
-          <w:footerReference w:type="default" r:id="rId11"/>
+          <w:footerReference w:type="default" r:id="rId12"/>
           <w:pgSz w:w="11906" w:h="16838"/>
           <w:pgMar w:top="1417" w:right="1417" w:bottom="1417" w:left="1417" w:header="708" w:footer="708" w:gutter="0"/>
           <w:cols w:space="708"/>
@@ -12815,18 +12130,19 @@
       <w:pPr>
         <w:pStyle w:val="Title"/>
       </w:pPr>
-      <w:bookmarkStart w:id="47" w:name="_Toc105689047"/>
-      <w:bookmarkStart w:id="48" w:name="_Toc107222887"/>
-      <w:bookmarkStart w:id="49" w:name="_Toc158131119"/>
-      <w:bookmarkStart w:id="50" w:name="_Toc158131244"/>
-      <w:bookmarkStart w:id="51" w:name="_Toc169622416"/>
-      <w:bookmarkStart w:id="52" w:name="_Toc169622624"/>
-      <w:bookmarkStart w:id="53" w:name="_Toc218677530"/>
-      <w:bookmarkStart w:id="54" w:name="_Toc229755645"/>
+      <w:bookmarkStart w:id="46" w:name="_Toc105689047"/>
+      <w:bookmarkStart w:id="47" w:name="_Toc107222887"/>
+      <w:bookmarkStart w:id="48" w:name="_Toc158131119"/>
+      <w:bookmarkStart w:id="49" w:name="_Toc158131244"/>
+      <w:bookmarkStart w:id="50" w:name="_Toc169622416"/>
+      <w:bookmarkStart w:id="51" w:name="_Toc169622624"/>
+      <w:bookmarkStart w:id="52" w:name="_Toc218677530"/>
+      <w:bookmarkStart w:id="53" w:name="_Toc229755645"/>
       <w:r>
         <w:lastRenderedPageBreak/>
         <w:t>Bibliographie</w:t>
       </w:r>
+      <w:bookmarkEnd w:id="46"/>
       <w:bookmarkEnd w:id="47"/>
       <w:bookmarkEnd w:id="48"/>
       <w:bookmarkEnd w:id="49"/>
@@ -12834,42 +12150,190 @@
       <w:bookmarkEnd w:id="51"/>
       <w:bookmarkEnd w:id="52"/>
       <w:bookmarkEnd w:id="53"/>
-      <w:bookmarkEnd w:id="54"/>
     </w:p>
     <w:p/>
     <w:p>
       <w:pPr>
         <w:pStyle w:val="Bibliography"/>
+        <w:rPr>
+          <w:color w:val="000000"/>
+        </w:rPr>
+      </w:pPr>
+      <w:r>
+        <w:rPr>
+          <w:color w:val="000000" w:themeColor="text1"/>
+        </w:rPr>
+        <w:fldChar w:fldCharType="begin"/>
+      </w:r>
+      <w:r>
+        <w:rPr>
+          <w:color w:val="000000" w:themeColor="text1"/>
+          <w:lang w:val="en-US"/>
+        </w:rPr>
+        <w:instrText xml:space="preserve"> ADDIN ZOTERO_BIBL {"uncited":[],"omitted":[],"custom":[]} CSL_BIBLIOGRAPHY </w:instrText>
+      </w:r>
+      <w:r>
+        <w:rPr>
+          <w:color w:val="000000" w:themeColor="text1"/>
+        </w:rPr>
+        <w:fldChar w:fldCharType="separate"/>
+      </w:r>
+      <w:r>
         <w:rPr>
           <w:color w:val="000000"/>
           <w:lang w:val="en-GB"/>
         </w:rPr>
-      </w:pPr>
-      <w:r>
-        <w:rPr>
-          <w:color w:val="000000" w:themeColor="text1"/>
-        </w:rPr>
-        <w:fldChar w:fldCharType="begin"/>
-      </w:r>
-      <w:r>
-        <w:rPr>
-          <w:color w:val="000000" w:themeColor="text1"/>
-          <w:lang w:val="en-US"/>
-        </w:rPr>
-        <w:instrText xml:space="preserve"> ADDIN ZOTERO_BIBL {"uncited":[],"omitted":[],"custom":[]} CSL_BIBLIOGRAPHY </w:instrText>
-      </w:r>
-      <w:r>
-        <w:rPr>
-          <w:color w:val="000000" w:themeColor="text1"/>
-        </w:rPr>
-        <w:fldChar w:fldCharType="separate"/>
-      </w:r>
-      <w:r>
+        <w:t xml:space="preserve">Borg, S. (2003). Teacher cognition in language teaching: A review of research on what language teachers think, know, believe, and do. </w:t>
+      </w:r>
+      <w:proofErr w:type="spellStart"/>
+      <w:r>
+        <w:rPr>
+          <w:i/>
+          <w:iCs/>
+          <w:color w:val="000000"/>
+        </w:rPr>
+        <w:t>Language</w:t>
+      </w:r>
+      <w:proofErr w:type="spellEnd"/>
+      <w:r>
+        <w:rPr>
+          <w:i/>
+          <w:iCs/>
+          <w:color w:val="000000"/>
+        </w:rPr>
+        <w:t xml:space="preserve"> </w:t>
+      </w:r>
+      <w:proofErr w:type="spellStart"/>
+      <w:r>
+        <w:rPr>
+          <w:i/>
+          <w:iCs/>
+          <w:color w:val="000000"/>
+        </w:rPr>
+        <w:t>Teaching</w:t>
+      </w:r>
+      <w:proofErr w:type="spellEnd"/>
+      <w:r>
+        <w:rPr>
+          <w:color w:val="000000"/>
+        </w:rPr>
+        <w:t xml:space="preserve">, </w:t>
+      </w:r>
+      <w:r>
+        <w:rPr>
+          <w:i/>
+          <w:iCs/>
+          <w:color w:val="000000"/>
+        </w:rPr>
+        <w:t>36</w:t>
+      </w:r>
+      <w:r>
+        <w:rPr>
+          <w:color w:val="000000"/>
+        </w:rPr>
+        <w:t>(2), 81–109. https://doi.org/10.1017/S0261444803001903</w:t>
+      </w:r>
+    </w:p>
+    <w:p>
+      <w:pPr>
+        <w:pStyle w:val="Bibliography"/>
+        <w:rPr>
+          <w:color w:val="000000"/>
+        </w:rPr>
+      </w:pPr>
+      <w:r>
+        <w:rPr>
+          <w:i/>
+          <w:iCs/>
+          <w:color w:val="000000"/>
+        </w:rPr>
+        <w:t>Cadre d’usage de l’IA en éducation</w:t>
+      </w:r>
+      <w:r>
+        <w:rPr>
+          <w:color w:val="000000"/>
+        </w:rPr>
+        <w:t>. (2025, June 13). Ministère de l’</w:t>
+      </w:r>
+      <w:proofErr w:type="spellStart"/>
+      <w:r>
+        <w:rPr>
+          <w:color w:val="000000"/>
+        </w:rPr>
+        <w:t>Education</w:t>
+      </w:r>
+      <w:proofErr w:type="spellEnd"/>
+      <w:r>
+        <w:rPr>
+          <w:color w:val="000000"/>
+        </w:rPr>
+        <w:t xml:space="preserve"> nationale. https://www.education.gouv.fr/cadre-d-usage-de-l-ia-en-education-450647</w:t>
+      </w:r>
+    </w:p>
+    <w:p>
+      <w:pPr>
+        <w:pStyle w:val="Bibliography"/>
+        <w:rPr>
+          <w:color w:val="000000"/>
+        </w:rPr>
+      </w:pPr>
+      <w:r>
+        <w:rPr>
+          <w:i/>
+          <w:iCs/>
+          <w:color w:val="000000"/>
+        </w:rPr>
+        <w:t>La protection des élèves et de leurs données sur Internet</w:t>
+      </w:r>
+      <w:r>
+        <w:rPr>
+          <w:color w:val="000000"/>
+        </w:rPr>
+        <w:t xml:space="preserve">. (2019, </w:t>
+      </w:r>
+      <w:proofErr w:type="spellStart"/>
+      <w:r>
+        <w:rPr>
+          <w:color w:val="000000"/>
+        </w:rPr>
+        <w:t>November</w:t>
+      </w:r>
+      <w:proofErr w:type="spellEnd"/>
+      <w:r>
+        <w:rPr>
+          <w:color w:val="000000"/>
+        </w:rPr>
+        <w:t xml:space="preserve"> 7). Ministère de l’</w:t>
+      </w:r>
+      <w:proofErr w:type="spellStart"/>
+      <w:r>
+        <w:rPr>
+          <w:color w:val="000000"/>
+        </w:rPr>
+        <w:t>Education</w:t>
+      </w:r>
+      <w:proofErr w:type="spellEnd"/>
+      <w:r>
+        <w:rPr>
+          <w:color w:val="000000"/>
+        </w:rPr>
+        <w:t xml:space="preserve"> nationale. https://www.education.gouv.fr/la-protection-des-eleves-et-de-leurs-donnees-sur-internet-7073</w:t>
+      </w:r>
+    </w:p>
+    <w:p>
+      <w:pPr>
+        <w:pStyle w:val="Bibliography"/>
         <w:rPr>
           <w:color w:val="000000"/>
           <w:lang w:val="en-GB"/>
         </w:rPr>
-        <w:t xml:space="preserve">Borg, S. (2003). Teacher cognition in language teaching: A review of research on what language teachers think, know, believe, and do. </w:t>
+      </w:pPr>
+      <w:r>
+        <w:rPr>
+          <w:color w:val="000000"/>
+          <w:lang w:val="en-GB"/>
+        </w:rPr>
+        <w:t xml:space="preserve">Liu, Y., &amp; Wang, H. (2024). </w:t>
       </w:r>
       <w:r>
         <w:rPr>
@@ -12878,15 +12342,9 @@
           <w:color w:val="000000"/>
           <w:lang w:val="en-GB"/>
         </w:rPr>
-        <w:t>Language Teaching</w:t>
-      </w:r>
-      <w:r>
-        <w:rPr>
-          <w:color w:val="000000"/>
-          <w:lang w:val="en-GB"/>
-        </w:rPr>
-        <w:t xml:space="preserve">, </w:t>
-      </w:r>
+        <w:t xml:space="preserve">Who on Earth Is Using Generative </w:t>
+      </w:r>
+      <w:proofErr w:type="gramStart"/>
       <w:r>
         <w:rPr>
           <w:i/>
@@ -12894,14 +12352,15 @@
           <w:color w:val="000000"/>
           <w:lang w:val="en-GB"/>
         </w:rPr>
-        <w:t>36</w:t>
-      </w:r>
+        <w:t>AI ?</w:t>
+      </w:r>
+      <w:proofErr w:type="gramEnd"/>
       <w:r>
         <w:rPr>
           <w:color w:val="000000"/>
           <w:lang w:val="en-GB"/>
         </w:rPr>
-        <w:t>(2), 81–109. https://doi.org/10.1017/S0261444803001903</w:t>
+        <w:t xml:space="preserve"> Washington, DC: World Bank. https://doi.org/10.1596/1813-9450-10870</w:t>
       </w:r>
     </w:p>
     <w:p>
@@ -12917,8 +12376,9 @@
           <w:color w:val="000000"/>
           <w:lang w:val="en-GB"/>
         </w:rPr>
-        <w:t xml:space="preserve">Richards, J. C., &amp; Rodgers, T. S. (2014). </w:t>
-      </w:r>
+        <w:t xml:space="preserve">Mishra, P., Henriksen, D., Woo, L. J., &amp; Oster, N. (2025). Control vs. Agency: Exploring the History of AI in Education. </w:t>
+      </w:r>
+      <w:proofErr w:type="spellStart"/>
       <w:r>
         <w:rPr>
           <w:i/>
@@ -12926,62 +12386,15 @@
           <w:color w:val="000000"/>
           <w:lang w:val="en-GB"/>
         </w:rPr>
-        <w:t>Approaches and Methods in Language Teaching</w:t>
-      </w:r>
+        <w:t>TechTrends</w:t>
+      </w:r>
+      <w:proofErr w:type="spellEnd"/>
       <w:r>
         <w:rPr>
           <w:color w:val="000000"/>
           <w:lang w:val="en-GB"/>
         </w:rPr>
-        <w:t>. Cambridge University Press.</w:t>
-      </w:r>
-    </w:p>
-    <w:p>
-      <w:pPr>
-        <w:pStyle w:val="Bibliography"/>
-        <w:rPr>
-          <w:color w:val="000000"/>
-          <w:lang w:val="en-GB"/>
-        </w:rPr>
-      </w:pPr>
-      <w:r>
-        <w:rPr>
-          <w:color w:val="000000"/>
-          <w:lang w:val="en-GB"/>
-        </w:rPr>
-        <w:t>Serin, H. (2018). A Comparison of Teacher-</w:t>
-      </w:r>
-      <w:proofErr w:type="spellStart"/>
-      <w:r>
-        <w:rPr>
-          <w:color w:val="000000"/>
-          <w:lang w:val="en-GB"/>
-        </w:rPr>
-        <w:t>Centered</w:t>
-      </w:r>
-      <w:proofErr w:type="spellEnd"/>
-      <w:r>
-        <w:rPr>
-          <w:color w:val="000000"/>
-          <w:lang w:val="en-GB"/>
-        </w:rPr>
-        <w:t xml:space="preserve"> and Student-</w:t>
-      </w:r>
-      <w:proofErr w:type="spellStart"/>
-      <w:r>
-        <w:rPr>
-          <w:color w:val="000000"/>
-          <w:lang w:val="en-GB"/>
-        </w:rPr>
-        <w:t>Centered</w:t>
-      </w:r>
-      <w:proofErr w:type="spellEnd"/>
-      <w:r>
-        <w:rPr>
-          <w:color w:val="000000"/>
-          <w:lang w:val="en-GB"/>
-        </w:rPr>
-        <w:t xml:space="preserve"> Approaches in Educational Settings. </w:t>
+        <w:t xml:space="preserve">, </w:t>
       </w:r>
       <w:r>
         <w:rPr>
@@ -12990,14 +12403,30 @@
           <w:color w:val="000000"/>
           <w:lang w:val="en-GB"/>
         </w:rPr>
-        <w:t>International Journal of Social Sciences &amp; Educational Studies</w:t>
+        <w:t>69</w:t>
       </w:r>
       <w:r>
         <w:rPr>
           <w:color w:val="000000"/>
           <w:lang w:val="en-GB"/>
         </w:rPr>
-        <w:t xml:space="preserve">, </w:t>
+        <w:t>(2), 247–253. https://doi.org/10.1007/s11528-025-01064-2</w:t>
+      </w:r>
+    </w:p>
+    <w:p>
+      <w:pPr>
+        <w:pStyle w:val="Bibliography"/>
+        <w:rPr>
+          <w:color w:val="000000"/>
+          <w:lang w:val="en-GB"/>
+        </w:rPr>
+      </w:pPr>
+      <w:r>
+        <w:rPr>
+          <w:color w:val="000000"/>
+          <w:lang w:val="en-GB"/>
+        </w:rPr>
+        <w:t xml:space="preserve">Morgan, K. L. K. (2025). Phonemic Awareness and AI: Evaluating ChatGPT Plus for Structured Lesson Development. </w:t>
       </w:r>
       <w:r>
         <w:rPr>
@@ -13006,14 +12435,110 @@
           <w:color w:val="000000"/>
           <w:lang w:val="en-GB"/>
         </w:rPr>
-        <w:t>5</w:t>
+        <w:t>Texas Journal of Literacy Education</w:t>
       </w:r>
       <w:r>
         <w:rPr>
           <w:color w:val="000000"/>
           <w:lang w:val="en-GB"/>
         </w:rPr>
-        <w:t>(1), 164–167. https://doi.org/10.23918//ijsses.v5i1p164</w:t>
+        <w:t xml:space="preserve">, </w:t>
+      </w:r>
+      <w:r>
+        <w:rPr>
+          <w:i/>
+          <w:iCs/>
+          <w:color w:val="000000"/>
+          <w:lang w:val="en-GB"/>
+        </w:rPr>
+        <w:t>12</w:t>
+      </w:r>
+      <w:r>
+        <w:rPr>
+          <w:color w:val="000000"/>
+          <w:lang w:val="en-GB"/>
+        </w:rPr>
+        <w:t>(1). https://www.talejournal.com/index.php/TJLE/article/view/175</w:t>
+      </w:r>
+    </w:p>
+    <w:p>
+      <w:pPr>
+        <w:pStyle w:val="Bibliography"/>
+        <w:rPr>
+          <w:color w:val="000000"/>
+          <w:lang w:val="en-GB"/>
+        </w:rPr>
+      </w:pPr>
+      <w:r>
+        <w:rPr>
+          <w:color w:val="000000"/>
+          <w:lang w:val="en-GB"/>
+        </w:rPr>
+        <w:t xml:space="preserve">Richards, J. C., &amp; Rodgers, T. S. (2014). </w:t>
+      </w:r>
+      <w:r>
+        <w:rPr>
+          <w:i/>
+          <w:iCs/>
+          <w:color w:val="000000"/>
+          <w:lang w:val="en-GB"/>
+        </w:rPr>
+        <w:t>Approaches and Methods in Language Teaching</w:t>
+      </w:r>
+      <w:r>
+        <w:rPr>
+          <w:color w:val="000000"/>
+          <w:lang w:val="en-GB"/>
+        </w:rPr>
+        <w:t>. Cambridge University Press.</w:t>
+      </w:r>
+    </w:p>
+    <w:p>
+      <w:pPr>
+        <w:pStyle w:val="Bibliography"/>
+        <w:rPr>
+          <w:color w:val="000000"/>
+          <w:lang w:val="en-GB"/>
+        </w:rPr>
+      </w:pPr>
+      <w:r>
+        <w:rPr>
+          <w:color w:val="000000"/>
+          <w:lang w:val="en-GB"/>
+        </w:rPr>
+        <w:t xml:space="preserve">Warschauer, M., &amp; Healey, D. (1998). Computers and language learning: An overview. </w:t>
+      </w:r>
+      <w:r>
+        <w:rPr>
+          <w:i/>
+          <w:iCs/>
+          <w:color w:val="000000"/>
+          <w:lang w:val="en-GB"/>
+        </w:rPr>
+        <w:t>Language Teaching</w:t>
+      </w:r>
+      <w:r>
+        <w:rPr>
+          <w:color w:val="000000"/>
+          <w:lang w:val="en-GB"/>
+        </w:rPr>
+        <w:t xml:space="preserve">, </w:t>
+      </w:r>
+      <w:r>
+        <w:rPr>
+          <w:i/>
+          <w:iCs/>
+          <w:color w:val="000000"/>
+          <w:lang w:val="en-GB"/>
+        </w:rPr>
+        <w:t>31</w:t>
+      </w:r>
+      <w:r>
+        <w:rPr>
+          <w:color w:val="000000"/>
+          <w:lang w:val="en-GB"/>
+        </w:rPr>
+        <w:t>(2), 57–71. https://doi.org/10.1017/S0261444800012970</w:t>
       </w:r>
     </w:p>
     <w:p>
@@ -13064,14 +12589,14 @@
           <w:lang w:val="en-US"/>
         </w:rPr>
       </w:pPr>
-      <w:bookmarkStart w:id="55" w:name="_Toc169622417"/>
-      <w:bookmarkStart w:id="56" w:name="_Toc169622625"/>
-      <w:bookmarkStart w:id="57" w:name="_Toc218677531"/>
-      <w:bookmarkStart w:id="58" w:name="_Toc229755646"/>
-      <w:bookmarkStart w:id="59" w:name="_Toc105689048"/>
-      <w:bookmarkStart w:id="60" w:name="_Toc107222888"/>
-      <w:bookmarkStart w:id="61" w:name="_Toc158131120"/>
-      <w:bookmarkStart w:id="62" w:name="_Toc158131245"/>
+      <w:bookmarkStart w:id="54" w:name="_Toc169622417"/>
+      <w:bookmarkStart w:id="55" w:name="_Toc169622625"/>
+      <w:bookmarkStart w:id="56" w:name="_Toc218677531"/>
+      <w:bookmarkStart w:id="57" w:name="_Toc229755646"/>
+      <w:bookmarkStart w:id="58" w:name="_Toc105689048"/>
+      <w:bookmarkStart w:id="59" w:name="_Toc107222888"/>
+      <w:bookmarkStart w:id="60" w:name="_Toc158131120"/>
+      <w:bookmarkStart w:id="61" w:name="_Toc158131245"/>
       <w:r>
         <w:rPr>
           <w:lang w:val="en-US"/>
@@ -13079,10 +12604,10 @@
         <w:lastRenderedPageBreak/>
         <w:t>Index</w:t>
       </w:r>
+      <w:bookmarkEnd w:id="54"/>
       <w:bookmarkEnd w:id="55"/>
       <w:bookmarkEnd w:id="56"/>
       <w:bookmarkEnd w:id="57"/>
-      <w:bookmarkEnd w:id="58"/>
     </w:p>
     <w:p>
       <w:pPr>
@@ -13245,14 +12770,15 @@
       <w:pPr>
         <w:pStyle w:val="Title"/>
       </w:pPr>
-      <w:bookmarkStart w:id="63" w:name="_Toc169622418"/>
-      <w:bookmarkStart w:id="64" w:name="_Toc169622626"/>
-      <w:bookmarkStart w:id="65" w:name="_Toc218677532"/>
-      <w:bookmarkStart w:id="66" w:name="_Toc229755647"/>
+      <w:bookmarkStart w:id="62" w:name="_Toc169622418"/>
+      <w:bookmarkStart w:id="63" w:name="_Toc169622626"/>
+      <w:bookmarkStart w:id="64" w:name="_Toc218677532"/>
+      <w:bookmarkStart w:id="65" w:name="_Toc229755647"/>
       <w:r>
         <w:lastRenderedPageBreak/>
         <w:t>Table des illustrations</w:t>
       </w:r>
+      <w:bookmarkEnd w:id="58"/>
       <w:bookmarkEnd w:id="59"/>
       <w:bookmarkEnd w:id="60"/>
       <w:bookmarkEnd w:id="61"/>
@@ -13260,7 +12786,6 @@
       <w:bookmarkEnd w:id="63"/>
       <w:bookmarkEnd w:id="64"/>
       <w:bookmarkEnd w:id="65"/>
-      <w:bookmarkEnd w:id="66"/>
     </w:p>
     <w:p/>
     <w:p>
@@ -13286,7 +12811,7 @@
     <w:p>
       <w:pPr>
         <w:sectPr>
-          <w:headerReference w:type="default" r:id="rId12"/>
+          <w:headerReference w:type="default" r:id="rId13"/>
           <w:pgSz w:w="11906" w:h="16838"/>
           <w:pgMar w:top="1417" w:right="1417" w:bottom="1417" w:left="1417" w:header="708" w:footer="708" w:gutter="0"/>
           <w:cols w:space="708"/>
@@ -13363,7 +12888,7 @@
           <w:sz w:val="24"/>
         </w:rPr>
         <w:sectPr>
-          <w:footerReference w:type="default" r:id="rId13"/>
+          <w:footerReference w:type="default" r:id="rId14"/>
           <w:pgSz w:w="11906" w:h="16838"/>
           <w:pgMar w:top="1417" w:right="1417" w:bottom="1417" w:left="1417" w:header="708" w:footer="708" w:gutter="0"/>
           <w:pgNumType w:start="1"/>
@@ -13442,8 +12967,8 @@
       </w:r>
     </w:p>
     <w:sectPr>
-      <w:headerReference w:type="default" r:id="rId14"/>
-      <w:footerReference w:type="default" r:id="rId15"/>
+      <w:headerReference w:type="default" r:id="rId15"/>
+      <w:footerReference w:type="default" r:id="rId16"/>
       <w:pgSz w:w="11906" w:h="16838"/>
       <w:pgMar w:top="1417" w:right="1417" w:bottom="1417" w:left="1417" w:header="708" w:footer="708" w:gutter="0"/>
       <w:cols w:space="708"/>
@@ -15005,7 +14530,7 @@
   <w:style w:type="paragraph" w:default="1" w:styleId="Normal">
     <w:name w:val="Normal"/>
     <w:qFormat/>
-    <w:rsid w:val="00CA5E07"/>
+    <w:rsid w:val="0019289D"/>
     <w:pPr>
       <w:spacing w:line="360" w:lineRule="auto"/>
       <w:jc w:val="both"/>

</xml_diff>

<commit_message>
literature R P1 done ✅
</commit_message>
<xml_diff>
--- a/my_report/Thesis_Report_English.docx
+++ b/my_report/Thesis_Report_English.docx
@@ -174,7 +174,7 @@
                                     <pic:cNvPicPr/>
                                   </pic:nvPicPr>
                                   <pic:blipFill>
-                                    <a:blip r:embed="rId8">
+                                    <a:blip r:embed="rId9">
                                       <a:extLst>
                                         <a:ext uri="{28A0092B-C50C-407E-A947-70E740481C1C}">
                                           <a14:useLocalDpi xmlns:a14="http://schemas.microsoft.com/office/drawing/2010/main" val="0"/>
@@ -238,7 +238,7 @@
                     <pic:cNvPicPr/>
                   </pic:nvPicPr>
                   <pic:blipFill>
-                    <a:blip r:embed="rId9" cstate="print">
+                    <a:blip r:embed="rId10" cstate="print">
                       <a:extLst>
                         <a:ext uri="{28A0092B-C50C-407E-A947-70E740481C1C}">
                           <a14:useLocalDpi xmlns:a14="http://schemas.microsoft.com/office/drawing/2010/main" val="0"/>
@@ -608,7 +608,7 @@
           <w:b/>
         </w:rPr>
         <w:sectPr>
-          <w:headerReference w:type="default" r:id="rId10"/>
+          <w:headerReference w:type="default" r:id="rId11"/>
           <w:pgSz w:w="11906" w:h="16838"/>
           <w:pgMar w:top="1417" w:right="1417" w:bottom="1417" w:left="1417" w:header="708" w:footer="708" w:gutter="0"/>
           <w:cols w:space="708"/>
@@ -11983,60 +11983,491 @@
     </w:p>
     <w:p>
       <w:pPr>
-        <w:pStyle w:val="NormalWeb"/>
-        <w:numPr>
-          <w:ilvl w:val="0"/>
-          <w:numId w:val="18"/>
-        </w:numPr>
-        <w:spacing w:before="240" w:beforeAutospacing="0" w:after="240" w:afterAutospacing="0"/>
-        <w:textAlignment w:val="baseline"/>
-        <w:rPr>
-          <w:rFonts w:ascii="Arial" w:hAnsi="Arial" w:cs="Arial"/>
+        <w:spacing w:after="0"/>
+        <w:rPr>
+          <w:rFonts w:ascii="Times New Roman" w:eastAsia="Times New Roman" w:hAnsi="Times New Roman" w:cs="Times New Roman"/>
+          <w:sz w:val="24"/>
+          <w:szCs w:val="24"/>
+          <w:lang w:val="en-FR" w:eastAsia="en-GB"/>
+        </w:rPr>
+      </w:pPr>
+      <w:r>
+        <w:rPr>
+          <w:rFonts w:ascii="Times New Roman" w:eastAsia="Times New Roman" w:hAnsi="Times New Roman" w:cs="Times New Roman"/>
           <w:color w:val="000000"/>
-          <w:sz w:val="22"/>
-          <w:szCs w:val="22"/>
-        </w:rPr>
-      </w:pPr>
-      <w:r>
-        <w:rPr>
-          <w:rFonts w:ascii="Arial" w:hAnsi="Arial" w:cs="Arial"/>
+          <w:sz w:val="24"/>
+          <w:szCs w:val="24"/>
+          <w:lang w:val="en-FR" w:eastAsia="en-GB"/>
+        </w:rPr>
+        <w:t>Teachers rarely implement lessons exactly as planned. Rather than treating curriculum materials as rigid scripts, educators adapt them to align with their specific classroom context. This flexibility is essential because no two student groups are identical, and learning objectives must remain fluid to match the actual needs of each group.</w:t>
+      </w:r>
+    </w:p>
+    <w:p>
+      <w:pPr>
+        <w:spacing w:after="0"/>
+        <w:rPr>
+          <w:rFonts w:ascii="Times New Roman" w:eastAsia="Times New Roman" w:hAnsi="Times New Roman" w:cs="Times New Roman"/>
+          <w:sz w:val="24"/>
+          <w:szCs w:val="24"/>
+          <w:lang w:val="en-FR" w:eastAsia="en-GB"/>
+        </w:rPr>
+      </w:pPr>
+    </w:p>
+    <w:p>
+      <w:pPr>
+        <w:spacing w:after="0"/>
+        <w:rPr>
+          <w:rFonts w:ascii="Times New Roman" w:eastAsia="Times New Roman" w:hAnsi="Times New Roman" w:cs="Times New Roman"/>
+          <w:sz w:val="24"/>
+          <w:szCs w:val="24"/>
+          <w:lang w:val="en-FR" w:eastAsia="en-GB"/>
+        </w:rPr>
+      </w:pPr>
+      <w:r>
+        <w:rPr>
+          <w:rFonts w:ascii="Times New Roman" w:eastAsia="Times New Roman" w:hAnsi="Times New Roman" w:cs="Times New Roman"/>
           <w:color w:val="000000"/>
-          <w:sz w:val="22"/>
-          <w:szCs w:val="22"/>
-        </w:rPr>
-        <w:t>Sources: Richards (1998), ? (possibly Breen et al. if they discuss adaptation)</w:t>
-      </w:r>
-    </w:p>
-    <w:p>
-      <w:pPr>
-        <w:pStyle w:val="NormalWeb"/>
-        <w:numPr>
-          <w:ilvl w:val="0"/>
-          <w:numId w:val="18"/>
-        </w:numPr>
-        <w:spacing w:before="240" w:beforeAutospacing="0" w:after="0" w:afterAutospacing="0"/>
-        <w:textAlignment w:val="baseline"/>
-        <w:rPr>
-          <w:rFonts w:ascii="Arial" w:hAnsi="Arial" w:cs="Arial"/>
+          <w:sz w:val="24"/>
+          <w:szCs w:val="24"/>
+          <w:lang w:val="en-FR" w:eastAsia="en-GB"/>
+        </w:rPr>
+        <w:t xml:space="preserve">Research demonstrates that this adaptation is systematically driven by student proficiency levels (Richards, 1998). To bridge the gap between standardized curriculum and classroom </w:t>
+      </w:r>
+      <w:r>
+        <w:rPr>
+          <w:rFonts w:ascii="Times New Roman" w:eastAsia="Times New Roman" w:hAnsi="Times New Roman" w:cs="Times New Roman"/>
           <w:color w:val="000000"/>
-          <w:sz w:val="22"/>
-          <w:szCs w:val="22"/>
-        </w:rPr>
-      </w:pPr>
-      <w:r>
-        <w:rPr>
-          <w:rFonts w:ascii="Arial" w:hAnsi="Arial" w:cs="Arial"/>
+          <w:sz w:val="24"/>
+          <w:szCs w:val="24"/>
+          <w:lang w:val="en-FR" w:eastAsia="en-GB"/>
+        </w:rPr>
+        <w:lastRenderedPageBreak/>
+        <w:t>realities, teachers modify lesson objectives and content, whether by simplifying vocabulary, adding targeted practice, or redesigning activities to address learning gaps. This iterative process of material adaptation is a deliberate intellectual exercise, guided by teacher reasoning and professional experience (Breen et al., 2001).</w:t>
+      </w:r>
+    </w:p>
+    <w:p>
+      <w:pPr>
+        <w:spacing w:after="0" w:line="240" w:lineRule="auto"/>
+        <w:jc w:val="left"/>
+        <w:rPr>
+          <w:rFonts w:ascii="Times New Roman" w:eastAsia="Times New Roman" w:hAnsi="Times New Roman" w:cs="Times New Roman"/>
+          <w:sz w:val="24"/>
+          <w:szCs w:val="24"/>
+          <w:lang w:val="en-FR" w:eastAsia="en-GB"/>
+        </w:rPr>
+      </w:pPr>
+    </w:p>
+    <w:p>
+      <w:pPr>
+        <w:spacing w:after="0" w:line="240" w:lineRule="auto"/>
+        <w:jc w:val="left"/>
+        <w:rPr>
+          <w:rFonts w:ascii="Times New Roman" w:eastAsia="Times New Roman" w:hAnsi="Times New Roman" w:cs="Times New Roman"/>
+          <w:sz w:val="24"/>
+          <w:szCs w:val="24"/>
+          <w:lang w:val="en-FR" w:eastAsia="en-GB"/>
+        </w:rPr>
+      </w:pPr>
+      <w:r>
+        <w:rPr>
+          <w:rFonts w:ascii="Times New Roman" w:eastAsia="Times New Roman" w:hAnsi="Times New Roman" w:cs="Times New Roman"/>
+          <w:noProof/>
+          <w:sz w:val="24"/>
+          <w:szCs w:val="24"/>
+          <w:bdr w:val="none" w:sz="0" w:space="0" w:color="auto" w:frame="1"/>
+          <w:lang w:val="en-FR" w:eastAsia="en-GB"/>
+        </w:rPr>
+        <w:drawing>
+          <wp:anchor distT="0" distB="0" distL="114300" distR="114300" simplePos="0" relativeHeight="251659265" behindDoc="0" locked="0" layoutInCell="1" allowOverlap="1" wp14:anchorId="213EBA2A" wp14:editId="2F620DEC">
+            <wp:simplePos x="0" y="0"/>
+            <wp:positionH relativeFrom="column">
+              <wp:posOffset>1379220</wp:posOffset>
+            </wp:positionH>
+            <wp:positionV relativeFrom="paragraph">
+              <wp:posOffset>66344</wp:posOffset>
+            </wp:positionV>
+            <wp:extent cx="3233420" cy="3405505"/>
+            <wp:effectExtent l="0" t="0" r="5080" b="0"/>
+            <wp:wrapNone/>
+            <wp:docPr id="1070306525" name="Picture 4"/>
+            <wp:cNvGraphicFramePr>
+              <a:graphicFrameLocks xmlns:a="http://schemas.openxmlformats.org/drawingml/2006/main" noChangeAspect="1"/>
+            </wp:cNvGraphicFramePr>
+            <a:graphic xmlns:a="http://schemas.openxmlformats.org/drawingml/2006/main">
+              <a:graphicData uri="http://schemas.openxmlformats.org/drawingml/2006/picture">
+                <pic:pic xmlns:pic="http://schemas.openxmlformats.org/drawingml/2006/picture">
+                  <pic:nvPicPr>
+                    <pic:cNvPr id="1070306525" name="Picture 4"/>
+                    <pic:cNvPicPr>
+                      <a:picLocks noChangeAspect="1" noChangeArrowheads="1"/>
+                    </pic:cNvPicPr>
+                  </pic:nvPicPr>
+                  <pic:blipFill>
+                    <a:blip r:embed="rId12" cstate="print">
+                      <a:extLst>
+                        <a:ext uri="{28A0092B-C50C-407E-A947-70E740481C1C}">
+                          <a14:useLocalDpi xmlns:a14="http://schemas.microsoft.com/office/drawing/2010/main" val="0"/>
+                        </a:ext>
+                      </a:extLst>
+                    </a:blip>
+                    <a:srcRect/>
+                    <a:stretch>
+                      <a:fillRect/>
+                    </a:stretch>
+                  </pic:blipFill>
+                  <pic:spPr bwMode="auto">
+                    <a:xfrm>
+                      <a:off x="0" y="0"/>
+                      <a:ext cx="3233420" cy="3405505"/>
+                    </a:xfrm>
+                    <a:prstGeom prst="rect">
+                      <a:avLst/>
+                    </a:prstGeom>
+                    <a:noFill/>
+                    <a:ln>
+                      <a:noFill/>
+                    </a:ln>
+                  </pic:spPr>
+                </pic:pic>
+              </a:graphicData>
+            </a:graphic>
+            <wp14:sizeRelH relativeFrom="page">
+              <wp14:pctWidth>0</wp14:pctWidth>
+            </wp14:sizeRelH>
+            <wp14:sizeRelV relativeFrom="page">
+              <wp14:pctHeight>0</wp14:pctHeight>
+            </wp14:sizeRelV>
+          </wp:anchor>
+        </w:drawing>
+      </w:r>
+    </w:p>
+    <w:p>
+      <w:pPr>
+        <w:spacing w:after="0" w:line="240" w:lineRule="auto"/>
+        <w:jc w:val="left"/>
+        <w:rPr>
+          <w:rFonts w:ascii="Times New Roman" w:eastAsia="Times New Roman" w:hAnsi="Times New Roman" w:cs="Times New Roman"/>
+          <w:sz w:val="24"/>
+          <w:szCs w:val="24"/>
+          <w:lang w:val="en-FR" w:eastAsia="en-GB"/>
+        </w:rPr>
+      </w:pPr>
+    </w:p>
+    <w:p>
+      <w:pPr>
+        <w:spacing w:after="0" w:line="240" w:lineRule="auto"/>
+        <w:jc w:val="left"/>
+        <w:rPr>
+          <w:rFonts w:ascii="Times New Roman" w:eastAsia="Times New Roman" w:hAnsi="Times New Roman" w:cs="Times New Roman"/>
+          <w:sz w:val="24"/>
+          <w:szCs w:val="24"/>
+          <w:lang w:val="en-FR" w:eastAsia="en-GB"/>
+        </w:rPr>
+      </w:pPr>
+    </w:p>
+    <w:p>
+      <w:pPr>
+        <w:spacing w:after="0" w:line="240" w:lineRule="auto"/>
+        <w:jc w:val="left"/>
+        <w:rPr>
+          <w:rFonts w:ascii="Times New Roman" w:eastAsia="Times New Roman" w:hAnsi="Times New Roman" w:cs="Times New Roman"/>
+          <w:sz w:val="24"/>
+          <w:szCs w:val="24"/>
+          <w:lang w:val="en-FR" w:eastAsia="en-GB"/>
+        </w:rPr>
+      </w:pPr>
+    </w:p>
+    <w:p>
+      <w:pPr>
+        <w:spacing w:after="0" w:line="240" w:lineRule="auto"/>
+        <w:jc w:val="left"/>
+        <w:rPr>
+          <w:rFonts w:ascii="Times New Roman" w:eastAsia="Times New Roman" w:hAnsi="Times New Roman" w:cs="Times New Roman"/>
+          <w:sz w:val="24"/>
+          <w:szCs w:val="24"/>
+          <w:lang w:val="en-FR" w:eastAsia="en-GB"/>
+        </w:rPr>
+      </w:pPr>
+    </w:p>
+    <w:p>
+      <w:pPr>
+        <w:spacing w:after="0" w:line="240" w:lineRule="auto"/>
+        <w:jc w:val="left"/>
+        <w:rPr>
+          <w:rFonts w:ascii="Times New Roman" w:eastAsia="Times New Roman" w:hAnsi="Times New Roman" w:cs="Times New Roman"/>
+          <w:sz w:val="24"/>
+          <w:szCs w:val="24"/>
+          <w:lang w:val="en-FR" w:eastAsia="en-GB"/>
+        </w:rPr>
+      </w:pPr>
+    </w:p>
+    <w:p>
+      <w:pPr>
+        <w:spacing w:after="0" w:line="240" w:lineRule="auto"/>
+        <w:jc w:val="left"/>
+        <w:rPr>
+          <w:rFonts w:ascii="Times New Roman" w:eastAsia="Times New Roman" w:hAnsi="Times New Roman" w:cs="Times New Roman"/>
+          <w:sz w:val="24"/>
+          <w:szCs w:val="24"/>
+          <w:lang w:val="en-FR" w:eastAsia="en-GB"/>
+        </w:rPr>
+      </w:pPr>
+    </w:p>
+    <w:p>
+      <w:pPr>
+        <w:spacing w:after="0" w:line="240" w:lineRule="auto"/>
+        <w:jc w:val="left"/>
+        <w:rPr>
+          <w:rFonts w:ascii="Times New Roman" w:eastAsia="Times New Roman" w:hAnsi="Times New Roman" w:cs="Times New Roman"/>
+          <w:sz w:val="24"/>
+          <w:szCs w:val="24"/>
+          <w:lang w:val="en-FR" w:eastAsia="en-GB"/>
+        </w:rPr>
+      </w:pPr>
+    </w:p>
+    <w:p>
+      <w:pPr>
+        <w:spacing w:after="0" w:line="240" w:lineRule="auto"/>
+        <w:jc w:val="left"/>
+        <w:rPr>
+          <w:rFonts w:ascii="Times New Roman" w:eastAsia="Times New Roman" w:hAnsi="Times New Roman" w:cs="Times New Roman"/>
+          <w:sz w:val="24"/>
+          <w:szCs w:val="24"/>
+          <w:lang w:val="en-FR" w:eastAsia="en-GB"/>
+        </w:rPr>
+      </w:pPr>
+    </w:p>
+    <w:p>
+      <w:pPr>
+        <w:spacing w:after="0" w:line="240" w:lineRule="auto"/>
+        <w:jc w:val="left"/>
+        <w:rPr>
+          <w:rFonts w:ascii="Times New Roman" w:eastAsia="Times New Roman" w:hAnsi="Times New Roman" w:cs="Times New Roman"/>
+          <w:sz w:val="24"/>
+          <w:szCs w:val="24"/>
+          <w:lang w:val="en-FR" w:eastAsia="en-GB"/>
+        </w:rPr>
+      </w:pPr>
+    </w:p>
+    <w:p>
+      <w:pPr>
+        <w:spacing w:after="0" w:line="240" w:lineRule="auto"/>
+        <w:jc w:val="left"/>
+        <w:rPr>
+          <w:rFonts w:ascii="Times New Roman" w:eastAsia="Times New Roman" w:hAnsi="Times New Roman" w:cs="Times New Roman"/>
+          <w:sz w:val="24"/>
+          <w:szCs w:val="24"/>
+          <w:lang w:val="en-FR" w:eastAsia="en-GB"/>
+        </w:rPr>
+      </w:pPr>
+      <w:r>
+        <w:rPr>
+          <w:rFonts w:ascii="Times New Roman" w:eastAsia="Times New Roman" w:hAnsi="Times New Roman" w:cs="Times New Roman"/>
+          <w:sz w:val="24"/>
+          <w:szCs w:val="24"/>
+          <w:lang w:val="en-FR" w:eastAsia="en-GB"/>
+        </w:rPr>
+        <w:br/>
+      </w:r>
+    </w:p>
+    <w:p>
+      <w:pPr>
+        <w:spacing w:after="0" w:line="240" w:lineRule="auto"/>
+        <w:jc w:val="left"/>
+        <w:rPr>
+          <w:rFonts w:ascii="Times New Roman" w:eastAsia="Times New Roman" w:hAnsi="Times New Roman" w:cs="Times New Roman"/>
+          <w:sz w:val="24"/>
+          <w:szCs w:val="24"/>
+          <w:lang w:val="en-FR" w:eastAsia="en-GB"/>
+        </w:rPr>
+      </w:pPr>
+    </w:p>
+    <w:p>
+      <w:pPr>
+        <w:spacing w:after="0" w:line="240" w:lineRule="auto"/>
+        <w:jc w:val="left"/>
+        <w:rPr>
+          <w:rFonts w:ascii="Times New Roman" w:eastAsia="Times New Roman" w:hAnsi="Times New Roman" w:cs="Times New Roman"/>
+          <w:sz w:val="24"/>
+          <w:szCs w:val="24"/>
+          <w:lang w:val="en-FR" w:eastAsia="en-GB"/>
+        </w:rPr>
+      </w:pPr>
+    </w:p>
+    <w:p>
+      <w:pPr>
+        <w:spacing w:after="0" w:line="240" w:lineRule="auto"/>
+        <w:jc w:val="left"/>
+        <w:rPr>
+          <w:rFonts w:ascii="Times New Roman" w:eastAsia="Times New Roman" w:hAnsi="Times New Roman" w:cs="Times New Roman"/>
+          <w:sz w:val="24"/>
+          <w:szCs w:val="24"/>
+          <w:lang w:val="en-FR" w:eastAsia="en-GB"/>
+        </w:rPr>
+      </w:pPr>
+    </w:p>
+    <w:p>
+      <w:pPr>
+        <w:spacing w:after="0" w:line="240" w:lineRule="auto"/>
+        <w:jc w:val="left"/>
+        <w:rPr>
+          <w:rFonts w:ascii="Times New Roman" w:eastAsia="Times New Roman" w:hAnsi="Times New Roman" w:cs="Times New Roman"/>
+          <w:sz w:val="24"/>
+          <w:szCs w:val="24"/>
+          <w:lang w:val="en-FR" w:eastAsia="en-GB"/>
+        </w:rPr>
+      </w:pPr>
+    </w:p>
+    <w:p>
+      <w:pPr>
+        <w:spacing w:after="0" w:line="240" w:lineRule="auto"/>
+        <w:jc w:val="left"/>
+        <w:rPr>
+          <w:rFonts w:ascii="Times New Roman" w:eastAsia="Times New Roman" w:hAnsi="Times New Roman" w:cs="Times New Roman"/>
+          <w:sz w:val="24"/>
+          <w:szCs w:val="24"/>
+          <w:lang w:val="en-FR" w:eastAsia="en-GB"/>
+        </w:rPr>
+      </w:pPr>
+    </w:p>
+    <w:p>
+      <w:pPr>
+        <w:spacing w:after="0" w:line="240" w:lineRule="auto"/>
+        <w:jc w:val="left"/>
+        <w:rPr>
+          <w:rFonts w:ascii="Times New Roman" w:eastAsia="Times New Roman" w:hAnsi="Times New Roman" w:cs="Times New Roman"/>
+          <w:sz w:val="24"/>
+          <w:szCs w:val="24"/>
+          <w:lang w:val="en-FR" w:eastAsia="en-GB"/>
+        </w:rPr>
+      </w:pPr>
+    </w:p>
+    <w:p>
+      <w:pPr>
+        <w:spacing w:after="0" w:line="240" w:lineRule="auto"/>
+        <w:jc w:val="left"/>
+        <w:rPr>
+          <w:rFonts w:ascii="Times New Roman" w:eastAsia="Times New Roman" w:hAnsi="Times New Roman" w:cs="Times New Roman"/>
+          <w:sz w:val="24"/>
+          <w:szCs w:val="24"/>
+          <w:lang w:val="en-FR" w:eastAsia="en-GB"/>
+        </w:rPr>
+      </w:pPr>
+    </w:p>
+    <w:p>
+      <w:pPr>
+        <w:spacing w:after="0" w:line="240" w:lineRule="auto"/>
+        <w:jc w:val="left"/>
+        <w:rPr>
+          <w:rFonts w:ascii="Times New Roman" w:eastAsia="Times New Roman" w:hAnsi="Times New Roman" w:cs="Times New Roman"/>
+          <w:sz w:val="24"/>
+          <w:szCs w:val="24"/>
+          <w:lang w:val="en-FR" w:eastAsia="en-GB"/>
+        </w:rPr>
+      </w:pPr>
+    </w:p>
+    <w:p>
+      <w:pPr>
+        <w:spacing w:after="0" w:line="240" w:lineRule="auto"/>
+        <w:jc w:val="left"/>
+        <w:rPr>
+          <w:rFonts w:ascii="Times New Roman" w:eastAsia="Times New Roman" w:hAnsi="Times New Roman" w:cs="Times New Roman"/>
+          <w:sz w:val="24"/>
+          <w:szCs w:val="24"/>
+          <w:lang w:val="en-FR" w:eastAsia="en-GB"/>
+        </w:rPr>
+      </w:pPr>
+    </w:p>
+    <w:p>
+      <w:pPr>
+        <w:pStyle w:val="Caption"/>
+        <w:rPr>
+          <w:rFonts w:ascii="Times New Roman" w:eastAsia="Times New Roman" w:hAnsi="Times New Roman" w:cs="Times New Roman"/>
+          <w:sz w:val="24"/>
+          <w:szCs w:val="24"/>
+          <w:lang w:val="en-FR" w:eastAsia="en-GB"/>
+        </w:rPr>
+      </w:pPr>
+      <w:r>
+        <w:rPr>
+          <w:lang w:val="en-US"/>
+        </w:rPr>
+        <w:t xml:space="preserve">Figure </w:t>
+      </w:r>
+      <w:r>
+        <w:fldChar w:fldCharType="begin"/>
+      </w:r>
+      <w:r>
+        <w:rPr>
+          <w:lang w:val="en-US"/>
+        </w:rPr>
+        <w:instrText xml:space="preserve"> SEQ Figure \* ARABIC </w:instrText>
+      </w:r>
+      <w:r>
+        <w:fldChar w:fldCharType="separate"/>
+      </w:r>
+      <w:r>
+        <w:rPr>
+          <w:noProof/>
+          <w:lang w:val="en-US"/>
+        </w:rPr>
+        <w:t>1</w:t>
+      </w:r>
+      <w:r>
+        <w:fldChar w:fldCharType="end"/>
+      </w:r>
+      <w:r>
+        <w:rPr>
+          <w:rFonts w:ascii="Times New Roman" w:eastAsia="Times New Roman" w:hAnsi="Times New Roman" w:cs="Times New Roman"/>
           <w:color w:val="000000"/>
-          <w:sz w:val="22"/>
-          <w:szCs w:val="22"/>
-        </w:rPr>
-        <w:t>Argument: Teachers adapt materials and designs to fit their context; planning is flexible, not rigid</w:t>
-      </w:r>
-    </w:p>
-    <w:p>
-      <w:pPr>
-        <w:rPr>
-          <w:lang w:val="en-FR"/>
+          <w:sz w:val="24"/>
+          <w:szCs w:val="24"/>
+          <w:lang w:val="en-FR" w:eastAsia="en-GB"/>
+        </w:rPr>
+        <w:t>A model of language classroom pedagogy showing the relationship between classroom activities, student needs, students' contributions, and teacher responsibilities. Source: Breen et al. (2001, p. 483).</w:t>
+      </w:r>
+    </w:p>
+    <w:p>
+      <w:pPr>
+        <w:spacing w:after="0"/>
+        <w:rPr>
+          <w:rFonts w:ascii="Times New Roman" w:eastAsia="Times New Roman" w:hAnsi="Times New Roman" w:cs="Times New Roman"/>
+          <w:sz w:val="24"/>
+          <w:szCs w:val="24"/>
+          <w:lang w:val="en-FR" w:eastAsia="en-GB"/>
+        </w:rPr>
+      </w:pPr>
+    </w:p>
+    <w:p>
+      <w:pPr>
+        <w:spacing w:after="0"/>
+        <w:rPr>
+          <w:rFonts w:ascii="Times New Roman" w:eastAsia="Times New Roman" w:hAnsi="Times New Roman" w:cs="Times New Roman"/>
+          <w:sz w:val="24"/>
+          <w:szCs w:val="24"/>
+          <w:lang w:val="en-FR" w:eastAsia="en-GB"/>
+        </w:rPr>
+      </w:pPr>
+      <w:r>
+        <w:rPr>
+          <w:rFonts w:ascii="Times New Roman" w:eastAsia="Times New Roman" w:hAnsi="Times New Roman" w:cs="Times New Roman"/>
+          <w:color w:val="000000"/>
+          <w:sz w:val="24"/>
+          <w:szCs w:val="24"/>
+          <w:lang w:val="en-FR" w:eastAsia="en-GB"/>
+        </w:rPr>
+        <w:t>Ultimately, this capacity for flexibility has significant implications for lesson quality. When teachers actively adapt materials to fit their specific learners, they can anticipate learning obstacles and design relevant experiences that address individual needs. This responsiveness improves learning outcomes, proving that material adaptation is not optional, but central to responsive teaching.</w:t>
+      </w:r>
+    </w:p>
+    <w:p>
+      <w:pPr>
+        <w:spacing w:after="0" w:line="240" w:lineRule="auto"/>
+        <w:jc w:val="left"/>
+        <w:rPr>
+          <w:rFonts w:ascii="Times New Roman" w:eastAsia="Times New Roman" w:hAnsi="Times New Roman" w:cs="Times New Roman"/>
+          <w:sz w:val="24"/>
+          <w:szCs w:val="24"/>
+          <w:lang w:val="en-FR" w:eastAsia="en-GB"/>
         </w:rPr>
       </w:pPr>
     </w:p>
@@ -12047,7 +12478,7 @@
         <w:rPr>
           <w:i/>
           <w:sz w:val="24"/>
-          <w:lang w:val="en-US"/>
+          <w:lang w:val="en-FR"/>
         </w:rPr>
       </w:pPr>
     </w:p>
@@ -13935,7 +14366,7 @@
           <w:sz w:val="24"/>
         </w:rPr>
         <w:sectPr>
-          <w:footerReference w:type="default" r:id="rId11"/>
+          <w:footerReference w:type="default" r:id="rId13"/>
           <w:pgSz w:w="11906" w:h="16838"/>
           <w:pgMar w:top="1417" w:right="1417" w:bottom="1417" w:left="1417" w:header="708" w:footer="708" w:gutter="0"/>
           <w:cols w:space="708"/>
@@ -14117,33 +14548,11 @@
         </w:rPr>
         <w:fldChar w:fldCharType="separate"/>
       </w:r>
-      <w:proofErr w:type="spellStart"/>
       <w:r>
         <w:rPr>
           <w:color w:val="000000"/>
         </w:rPr>
-        <w:t>Afdal</w:t>
-      </w:r>
-      <w:proofErr w:type="spellEnd"/>
-      <w:r>
-        <w:rPr>
-          <w:color w:val="000000"/>
-        </w:rPr>
-        <w:t xml:space="preserve">, H. W., &amp; </w:t>
-      </w:r>
-      <w:proofErr w:type="spellStart"/>
-      <w:r>
-        <w:rPr>
-          <w:color w:val="000000"/>
-        </w:rPr>
-        <w:t>Maaranen</w:t>
-      </w:r>
-      <w:proofErr w:type="spellEnd"/>
-      <w:r>
-        <w:rPr>
-          <w:color w:val="000000"/>
-        </w:rPr>
-        <w:t xml:space="preserve">, K. (2023). </w:t>
+        <w:t xml:space="preserve">Afdal, H. W., &amp; Maaranen, K. (2023). </w:t>
       </w:r>
       <w:r>
         <w:rPr>
@@ -14866,7 +15275,7 @@
     <w:p>
       <w:pPr>
         <w:sectPr>
-          <w:headerReference w:type="default" r:id="rId12"/>
+          <w:headerReference w:type="default" r:id="rId14"/>
           <w:pgSz w:w="11906" w:h="16838"/>
           <w:pgMar w:top="1417" w:right="1417" w:bottom="1417" w:left="1417" w:header="708" w:footer="708" w:gutter="0"/>
           <w:cols w:space="708"/>
@@ -14877,14 +15286,23 @@
     <w:p>
       <w:pPr>
         <w:pStyle w:val="Heading1"/>
+        <w:rPr>
+          <w:lang w:val="fr-FR"/>
+        </w:rPr>
       </w:pPr>
       <w:bookmarkStart w:id="79" w:name="_Toc230973451"/>
       <w:r>
+        <w:rPr>
+          <w:lang w:val="fr-FR"/>
+        </w:rPr>
         <w:lastRenderedPageBreak/>
         <w:t>Annexes</w:t>
       </w:r>
       <w:bookmarkEnd w:id="79"/>
       <w:r>
+        <w:rPr>
+          <w:lang w:val="fr-FR"/>
+        </w:rPr>
         <w:t xml:space="preserve"> </w:t>
       </w:r>
     </w:p>
@@ -14956,7 +15374,7 @@
           <w:sz w:val="24"/>
         </w:rPr>
         <w:sectPr>
-          <w:footerReference w:type="default" r:id="rId13"/>
+          <w:footerReference w:type="default" r:id="rId15"/>
           <w:pgSz w:w="11906" w:h="16838"/>
           <w:pgMar w:top="1417" w:right="1417" w:bottom="1417" w:left="1417" w:header="708" w:footer="708" w:gutter="0"/>
           <w:pgNumType w:start="1"/>
@@ -15035,8 +15453,8 @@
       </w:r>
     </w:p>
     <w:sectPr>
-      <w:headerReference w:type="default" r:id="rId14"/>
-      <w:footerReference w:type="default" r:id="rId15"/>
+      <w:headerReference w:type="default" r:id="rId16"/>
+      <w:footerReference w:type="default" r:id="rId17"/>
       <w:pgSz w:w="11906" w:h="16838"/>
       <w:pgMar w:top="1417" w:right="1417" w:bottom="1417" w:left="1417" w:header="708" w:footer="708" w:gutter="0"/>
       <w:cols w:space="708"/>
@@ -18286,6 +18704,25 @@
       <w:color w:val="2F5496" w:themeColor="accent1" w:themeShade="BF"/>
     </w:rPr>
   </w:style>
+  <w:style w:type="paragraph" w:styleId="Caption">
+    <w:name w:val="caption"/>
+    <w:basedOn w:val="Normal"/>
+    <w:next w:val="Normal"/>
+    <w:uiPriority w:val="35"/>
+    <w:unhideWhenUsed/>
+    <w:qFormat/>
+    <w:rsid w:val="00B7234F"/>
+    <w:pPr>
+      <w:spacing w:after="200" w:line="240" w:lineRule="auto"/>
+    </w:pPr>
+    <w:rPr>
+      <w:i/>
+      <w:iCs/>
+      <w:color w:val="44546A" w:themeColor="text2"/>
+      <w:sz w:val="18"/>
+      <w:szCs w:val="18"/>
+    </w:rPr>
+  </w:style>
 </w:styles>
 </file>
 

</xml_diff>

<commit_message>
update : Section 3 literature review:
</commit_message>
<xml_diff>
--- a/my_report/Thesis_Report_English.docx
+++ b/my_report/Thesis_Report_English.docx
@@ -174,7 +174,7 @@
                                     <pic:cNvPicPr/>
                                   </pic:nvPicPr>
                                   <pic:blipFill>
-                                    <a:blip r:embed="rId9">
+                                    <a:blip r:embed="rId8">
                                       <a:extLst>
                                         <a:ext uri="{28A0092B-C50C-407E-A947-70E740481C1C}">
                                           <a14:useLocalDpi xmlns:a14="http://schemas.microsoft.com/office/drawing/2010/main" val="0"/>
@@ -238,7 +238,7 @@
                     <pic:cNvPicPr/>
                   </pic:nvPicPr>
                   <pic:blipFill>
-                    <a:blip r:embed="rId10" cstate="print">
+                    <a:blip r:embed="rId9" cstate="print">
                       <a:extLst>
                         <a:ext uri="{28A0092B-C50C-407E-A947-70E740481C1C}">
                           <a14:useLocalDpi xmlns:a14="http://schemas.microsoft.com/office/drawing/2010/main" val="0"/>
@@ -557,11 +557,19 @@
         </w:rPr>
         <w:t xml:space="preserve">Prénom NOM, Prénom NOM, </w:t>
       </w:r>
-      <w:r>
-        <w:rPr>
-          <w:sz w:val="24"/>
-        </w:rPr>
-        <w:t>Soumik SARKAR</w:t>
+      <w:proofErr w:type="spellStart"/>
+      <w:r>
+        <w:rPr>
+          <w:sz w:val="24"/>
+        </w:rPr>
+        <w:t>Soumik</w:t>
+      </w:r>
+      <w:proofErr w:type="spellEnd"/>
+      <w:r>
+        <w:rPr>
+          <w:sz w:val="24"/>
+        </w:rPr>
+        <w:t xml:space="preserve"> SARKAR</w:t>
       </w:r>
     </w:p>
     <w:p>
@@ -608,7 +616,7 @@
           <w:b/>
         </w:rPr>
         <w:sectPr>
-          <w:headerReference w:type="default" r:id="rId11"/>
+          <w:headerReference w:type="default" r:id="rId10"/>
           <w:pgSz w:w="11906" w:h="16838"/>
           <w:pgMar w:top="1417" w:right="1417" w:bottom="1417" w:left="1417" w:header="708" w:footer="708" w:gutter="0"/>
           <w:cols w:space="708"/>
@@ -4265,6 +4273,7 @@
       <w:bookmarkStart w:id="35" w:name="_Toc169622578"/>
       <w:bookmarkStart w:id="36" w:name="_Toc218677506"/>
       <w:bookmarkStart w:id="37" w:name="_Toc230973428"/>
+      <w:proofErr w:type="spellStart"/>
       <w:r>
         <w:lastRenderedPageBreak/>
         <w:t>Sommaire</w:t>
@@ -4275,6 +4284,7 @@
       <w:bookmarkEnd w:id="35"/>
       <w:bookmarkEnd w:id="36"/>
       <w:bookmarkEnd w:id="37"/>
+      <w:proofErr w:type="spellEnd"/>
     </w:p>
     <w:p>
       <w:pPr>
@@ -11104,6 +11114,708 @@
           <w:sz w:val="24"/>
           <w:szCs w:val="24"/>
           <w:lang w:val="en-US"/>
+        </w:rPr>
+      </w:pPr>
+    </w:p>
+    <w:p>
+      <w:pPr>
+        <w:rPr>
+          <w:rFonts w:ascii="Times New Roman" w:hAnsi="Times New Roman" w:cs="Times New Roman"/>
+          <w:sz w:val="24"/>
+          <w:szCs w:val="24"/>
+        </w:rPr>
+      </w:pPr>
+      <w:r>
+        <w:rPr>
+          <w:rFonts w:ascii="Times New Roman" w:hAnsi="Times New Roman" w:cs="Times New Roman"/>
+          <w:sz w:val="24"/>
+          <w:szCs w:val="24"/>
+        </w:rPr>
+        <w:t>L'enseignement des langues a évolué des méthodes de traduction grammaticale, centrées sur la mémorisation et la précision, vers des approches communicatives privilégiant l'interaction authentique (Richards &amp; Rodgers, 2014).</w:t>
+      </w:r>
+    </w:p>
+    <w:p>
+      <w:pPr>
+        <w:rPr>
+          <w:rFonts w:ascii="Times New Roman" w:hAnsi="Times New Roman" w:cs="Times New Roman"/>
+          <w:sz w:val="24"/>
+          <w:szCs w:val="24"/>
+        </w:rPr>
+      </w:pPr>
+      <w:r>
+        <w:rPr>
+          <w:rFonts w:ascii="Times New Roman" w:hAnsi="Times New Roman" w:cs="Times New Roman"/>
+          <w:sz w:val="24"/>
+          <w:szCs w:val="24"/>
+        </w:rPr>
+        <w:t>Cependant, quelle que soit l'approche pédagogique adoptée, une constante demeure : les enseignants doivent traduire ces principes méthodologiques en pratique concrète de classe à travers la planification de cours.</w:t>
+      </w:r>
+    </w:p>
+    <w:p>
+      <w:pPr>
+        <w:rPr>
+          <w:rFonts w:ascii="Times New Roman" w:hAnsi="Times New Roman" w:cs="Times New Roman"/>
+          <w:sz w:val="24"/>
+          <w:szCs w:val="24"/>
+        </w:rPr>
+      </w:pPr>
+    </w:p>
+    <w:p>
+      <w:pPr>
+        <w:rPr>
+          <w:rFonts w:ascii="Times New Roman" w:hAnsi="Times New Roman" w:cs="Times New Roman"/>
+          <w:sz w:val="24"/>
+          <w:szCs w:val="24"/>
+        </w:rPr>
+      </w:pPr>
+      <w:r>
+        <w:rPr>
+          <w:rFonts w:ascii="Times New Roman" w:hAnsi="Times New Roman" w:cs="Times New Roman"/>
+          <w:sz w:val="24"/>
+          <w:szCs w:val="24"/>
+        </w:rPr>
+        <w:t>1)</w:t>
+      </w:r>
+      <w:r>
+        <w:rPr>
+          <w:rFonts w:ascii="Times New Roman" w:hAnsi="Times New Roman" w:cs="Times New Roman"/>
+          <w:sz w:val="24"/>
+          <w:szCs w:val="24"/>
+        </w:rPr>
+        <w:tab/>
+        <w:t>L'évolution technologique et la planification des cours en enseignement des langues</w:t>
+      </w:r>
+    </w:p>
+    <w:p>
+      <w:pPr>
+        <w:rPr>
+          <w:rFonts w:ascii="Times New Roman" w:hAnsi="Times New Roman" w:cs="Times New Roman"/>
+          <w:sz w:val="24"/>
+          <w:szCs w:val="24"/>
+        </w:rPr>
+      </w:pPr>
+    </w:p>
+    <w:p>
+      <w:pPr>
+        <w:rPr>
+          <w:rFonts w:ascii="Times New Roman" w:hAnsi="Times New Roman" w:cs="Times New Roman"/>
+          <w:sz w:val="24"/>
+          <w:szCs w:val="24"/>
+        </w:rPr>
+      </w:pPr>
+      <w:r>
+        <w:rPr>
+          <w:rFonts w:ascii="Times New Roman" w:hAnsi="Times New Roman" w:cs="Times New Roman"/>
+          <w:sz w:val="24"/>
+          <w:szCs w:val="24"/>
+        </w:rPr>
+        <w:t>Il est intéressant de revenir sur ses origines éducatives et technologiques afin de comprendre la position des professeurs de langues en France concernant l’intégration et l’utilisation de l’IA générative dans le cadre de l’évaluation. La planification des cours a beaucoup évolué au cours des dernières décennies. Auparavant, le travail était principalement assumé par les professeurs qui mettaient en œuvre les principes éducatifs sous la forme de parcours d'apprentissage organisés, choisissaient les ressources et les adaptaient aux exigences spécifiques de leurs élèves (Borg, 2003).</w:t>
+      </w:r>
+    </w:p>
+    <w:p>
+      <w:pPr>
+        <w:rPr>
+          <w:rFonts w:ascii="Times New Roman" w:hAnsi="Times New Roman" w:cs="Times New Roman"/>
+          <w:sz w:val="24"/>
+          <w:szCs w:val="24"/>
+        </w:rPr>
+      </w:pPr>
+    </w:p>
+    <w:p>
+      <w:pPr>
+        <w:rPr>
+          <w:rFonts w:ascii="Times New Roman" w:hAnsi="Times New Roman" w:cs="Times New Roman"/>
+          <w:sz w:val="24"/>
+          <w:szCs w:val="24"/>
+        </w:rPr>
+      </w:pPr>
+      <w:r>
+        <w:rPr>
+          <w:rFonts w:ascii="Times New Roman" w:hAnsi="Times New Roman" w:cs="Times New Roman"/>
+          <w:sz w:val="24"/>
+          <w:szCs w:val="24"/>
+        </w:rPr>
+        <w:lastRenderedPageBreak/>
+        <w:t>Avec le tournant numérique dans les années 1980 et 1990, de nouveaux outils comme le CALL et les TICE ont fait leur entrée dans les classes. Ces technologies ont obligé les enseignants à acquérir des compétences techniques inédites, tout en repensant leur rôle d’enseignant (</w:t>
+      </w:r>
+      <w:proofErr w:type="spellStart"/>
+      <w:r>
+        <w:rPr>
+          <w:rFonts w:ascii="Times New Roman" w:hAnsi="Times New Roman" w:cs="Times New Roman"/>
+          <w:sz w:val="24"/>
+          <w:szCs w:val="24"/>
+        </w:rPr>
+        <w:t>Warschauer</w:t>
+      </w:r>
+      <w:proofErr w:type="spellEnd"/>
+      <w:r>
+        <w:rPr>
+          <w:rFonts w:ascii="Times New Roman" w:hAnsi="Times New Roman" w:cs="Times New Roman"/>
+          <w:sz w:val="24"/>
+          <w:szCs w:val="24"/>
+        </w:rPr>
+        <w:t xml:space="preserve"> et Healey,1998). </w:t>
+      </w:r>
+      <w:r>
+        <w:rPr>
+          <w:rFonts w:ascii="Times New Roman" w:hAnsi="Times New Roman" w:cs="Times New Roman"/>
+          <w:sz w:val="24"/>
+          <w:szCs w:val="24"/>
+        </w:rPr>
+        <w:t xml:space="preserve">Malgré la présence de ces outils numériques, c’étaient toujours les enseignants qui imaginaient l’organisation de l’enseignement. Les logiciels n’étaient là qu’en </w:t>
+      </w:r>
+      <w:proofErr w:type="gramStart"/>
+      <w:r>
+        <w:rPr>
+          <w:rFonts w:ascii="Times New Roman" w:hAnsi="Times New Roman" w:cs="Times New Roman"/>
+          <w:sz w:val="24"/>
+          <w:szCs w:val="24"/>
+        </w:rPr>
+        <w:t>appui;</w:t>
+      </w:r>
+      <w:proofErr w:type="gramEnd"/>
+      <w:r>
+        <w:rPr>
+          <w:rFonts w:ascii="Times New Roman" w:hAnsi="Times New Roman" w:cs="Times New Roman"/>
+          <w:sz w:val="24"/>
+          <w:szCs w:val="24"/>
+        </w:rPr>
+        <w:t xml:space="preserve"> ils ne concevaient pas le contenu pédagogique eux-mêmes.</w:t>
+      </w:r>
+    </w:p>
+    <w:p>
+      <w:pPr>
+        <w:rPr>
+          <w:rFonts w:ascii="Times New Roman" w:hAnsi="Times New Roman" w:cs="Times New Roman"/>
+          <w:sz w:val="24"/>
+          <w:szCs w:val="24"/>
+        </w:rPr>
+      </w:pPr>
+    </w:p>
+    <w:p>
+      <w:pPr>
+        <w:rPr>
+          <w:rFonts w:ascii="Times New Roman" w:hAnsi="Times New Roman" w:cs="Times New Roman"/>
+          <w:sz w:val="24"/>
+          <w:szCs w:val="24"/>
+        </w:rPr>
+      </w:pPr>
+      <w:r>
+        <w:rPr>
+          <w:rFonts w:ascii="Times New Roman" w:hAnsi="Times New Roman" w:cs="Times New Roman"/>
+          <w:sz w:val="24"/>
+          <w:szCs w:val="24"/>
+        </w:rPr>
+        <w:t xml:space="preserve">Aujourd’hui, l’IA générative change la donne. Avec des interfaces comme </w:t>
+      </w:r>
+      <w:proofErr w:type="spellStart"/>
+      <w:r>
+        <w:rPr>
+          <w:rFonts w:ascii="Times New Roman" w:hAnsi="Times New Roman" w:cs="Times New Roman"/>
+          <w:sz w:val="24"/>
+          <w:szCs w:val="24"/>
+        </w:rPr>
+        <w:t>ChatGPT</w:t>
+      </w:r>
+      <w:proofErr w:type="spellEnd"/>
+      <w:r>
+        <w:rPr>
+          <w:rFonts w:ascii="Times New Roman" w:hAnsi="Times New Roman" w:cs="Times New Roman"/>
+          <w:sz w:val="24"/>
+          <w:szCs w:val="24"/>
+        </w:rPr>
+        <w:t xml:space="preserve">, il suffit de rédiger une consigne pour générer instantanément un plan de cours, des exercices ou des explications (Mishra et al., 2025). Cette mutation oblige les enseignants à développer un autre type de discernement </w:t>
+      </w:r>
+      <w:proofErr w:type="gramStart"/>
+      <w:r>
+        <w:rPr>
+          <w:rFonts w:ascii="Times New Roman" w:hAnsi="Times New Roman" w:cs="Times New Roman"/>
+          <w:sz w:val="24"/>
+          <w:szCs w:val="24"/>
+        </w:rPr>
+        <w:t>pédagogique:</w:t>
+      </w:r>
+      <w:proofErr w:type="gramEnd"/>
+      <w:r>
+        <w:rPr>
+          <w:rFonts w:ascii="Times New Roman" w:hAnsi="Times New Roman" w:cs="Times New Roman"/>
+          <w:sz w:val="24"/>
+          <w:szCs w:val="24"/>
+        </w:rPr>
+        <w:t xml:space="preserve"> désormais, il s’agit moins de créer le contenu de toutes pièces et plus d’évaluer, d’ajuster et de contrôler la qualité de ce que produit la machine. Mais l’intégration de ces technologies ne dépend pas uniquement de la volonté individuelle : un cadre institutionnel et réglementaire très précis en France encadre ces usages (Cadre d’usage de l’IA en éducation, 2025).</w:t>
+      </w:r>
+    </w:p>
+    <w:p>
+      <w:pPr>
+        <w:rPr>
+          <w:rFonts w:ascii="Times New Roman" w:hAnsi="Times New Roman" w:cs="Times New Roman"/>
+          <w:sz w:val="24"/>
+          <w:szCs w:val="24"/>
+        </w:rPr>
+      </w:pPr>
+    </w:p>
+    <w:p>
+      <w:pPr>
+        <w:rPr>
+          <w:rFonts w:ascii="Times New Roman" w:hAnsi="Times New Roman" w:cs="Times New Roman"/>
+          <w:sz w:val="24"/>
+          <w:szCs w:val="24"/>
+        </w:rPr>
+      </w:pPr>
+      <w:r>
+        <w:rPr>
+          <w:rFonts w:ascii="Times New Roman" w:hAnsi="Times New Roman" w:cs="Times New Roman"/>
+          <w:sz w:val="24"/>
+          <w:szCs w:val="24"/>
+        </w:rPr>
+        <w:t>Cette section retrace donc comment la planification des cours en enseignement des langues a évolué, et montre comment chaque vague technologique a modifié le métier d’enseignant. Tout cela éclaire les choix auxquels font face aujourd’hui les enseignants français, alors qu’ils rencontrent l’IA générative dans leur environnement professionnel.</w:t>
+      </w:r>
+    </w:p>
+    <w:p>
+      <w:pPr>
+        <w:rPr>
+          <w:rFonts w:ascii="Times New Roman" w:hAnsi="Times New Roman" w:cs="Times New Roman"/>
+          <w:sz w:val="24"/>
+          <w:szCs w:val="24"/>
+        </w:rPr>
+      </w:pPr>
+    </w:p>
+    <w:p>
+      <w:pPr>
+        <w:rPr>
+          <w:rFonts w:ascii="Times New Roman" w:hAnsi="Times New Roman" w:cs="Times New Roman"/>
+          <w:sz w:val="24"/>
+          <w:szCs w:val="24"/>
+        </w:rPr>
+      </w:pPr>
+      <w:r>
+        <w:rPr>
+          <w:rFonts w:ascii="Times New Roman" w:hAnsi="Times New Roman" w:cs="Times New Roman"/>
+          <w:sz w:val="24"/>
+          <w:szCs w:val="24"/>
+        </w:rPr>
+        <w:t>(a)</w:t>
+      </w:r>
+      <w:r>
+        <w:rPr>
+          <w:rFonts w:ascii="Times New Roman" w:hAnsi="Times New Roman" w:cs="Times New Roman"/>
+          <w:sz w:val="24"/>
+          <w:szCs w:val="24"/>
+        </w:rPr>
+        <w:tab/>
+        <w:t>La planification des cours dans l'enseignement des langues avant l'IA</w:t>
+      </w:r>
+    </w:p>
+    <w:p>
+      <w:pPr>
+        <w:rPr>
+          <w:rFonts w:ascii="Times New Roman" w:hAnsi="Times New Roman" w:cs="Times New Roman"/>
+          <w:sz w:val="24"/>
+          <w:szCs w:val="24"/>
+        </w:rPr>
+      </w:pPr>
+    </w:p>
+    <w:p>
+      <w:pPr>
+        <w:rPr>
+          <w:rFonts w:ascii="Times New Roman" w:hAnsi="Times New Roman" w:cs="Times New Roman"/>
+          <w:sz w:val="24"/>
+          <w:szCs w:val="24"/>
+        </w:rPr>
+      </w:pPr>
+      <w:r>
+        <w:rPr>
+          <w:rFonts w:ascii="Times New Roman" w:hAnsi="Times New Roman" w:cs="Times New Roman"/>
+          <w:sz w:val="24"/>
+          <w:szCs w:val="24"/>
+        </w:rPr>
+        <w:t xml:space="preserve">Quelle que soit l'approche pédagogique adoptée, traduction grammaticale, communication ou autre, les méthodes ne s'appliquaient pas d'elles-mêmes. Les enseignants devaient traduire les principes méthodologiques en séquences d'enseignement cohérentes, en plans de cours et en activités de classe. Ce processus faisait peser une responsabilité considérable sur les enseignants, un travail qu'ils effectuaient généralement en dehors de leur temps de classe. La préparation des cours est ainsi devenue un processus à la fois cognitif et chronophage, façonné par les croyances, l'expérience et l'interprétation du contexte de classe propres à chaque enseignant (Borg, 2003). Cette base, fondée sur une planification des cours menée par les </w:t>
+      </w:r>
+      <w:r>
+        <w:rPr>
+          <w:rFonts w:ascii="Times New Roman" w:hAnsi="Times New Roman" w:cs="Times New Roman"/>
+          <w:sz w:val="24"/>
+          <w:szCs w:val="24"/>
+        </w:rPr>
+        <w:lastRenderedPageBreak/>
+        <w:t>enseignants eux-mêmes, devient essentielle pour comprendre comment ces derniers se sont ensuite adaptés à de nouveaux outils, notamment l'IA générative.</w:t>
+      </w:r>
+    </w:p>
+    <w:p>
+      <w:pPr>
+        <w:rPr>
+          <w:rFonts w:ascii="Times New Roman" w:hAnsi="Times New Roman" w:cs="Times New Roman"/>
+          <w:sz w:val="24"/>
+          <w:szCs w:val="24"/>
+        </w:rPr>
+      </w:pPr>
+    </w:p>
+    <w:p>
+      <w:pPr>
+        <w:rPr>
+          <w:rFonts w:ascii="Times New Roman" w:hAnsi="Times New Roman" w:cs="Times New Roman"/>
+          <w:sz w:val="24"/>
+          <w:szCs w:val="24"/>
+        </w:rPr>
+      </w:pPr>
+      <w:r>
+        <w:rPr>
+          <w:rFonts w:ascii="Times New Roman" w:hAnsi="Times New Roman" w:cs="Times New Roman"/>
+          <w:sz w:val="24"/>
+          <w:szCs w:val="24"/>
+        </w:rPr>
+        <w:t>(b)</w:t>
+      </w:r>
+      <w:r>
+        <w:rPr>
+          <w:rFonts w:ascii="Times New Roman" w:hAnsi="Times New Roman" w:cs="Times New Roman"/>
+          <w:sz w:val="24"/>
+          <w:szCs w:val="24"/>
+        </w:rPr>
+        <w:tab/>
+        <w:t>L'émergence des TICE dans l'apprentissage des langues</w:t>
+      </w:r>
+    </w:p>
+    <w:p>
+      <w:pPr>
+        <w:rPr>
+          <w:rFonts w:ascii="Times New Roman" w:hAnsi="Times New Roman" w:cs="Times New Roman"/>
+          <w:sz w:val="24"/>
+          <w:szCs w:val="24"/>
+        </w:rPr>
+      </w:pPr>
+    </w:p>
+    <w:p>
+      <w:pPr>
+        <w:rPr>
+          <w:rFonts w:ascii="Times New Roman" w:hAnsi="Times New Roman" w:cs="Times New Roman"/>
+          <w:sz w:val="24"/>
+          <w:szCs w:val="24"/>
+        </w:rPr>
+      </w:pPr>
+      <w:r>
+        <w:rPr>
+          <w:rFonts w:ascii="Times New Roman" w:hAnsi="Times New Roman" w:cs="Times New Roman"/>
+          <w:sz w:val="24"/>
+          <w:szCs w:val="24"/>
+        </w:rPr>
+        <w:t>Les outils numériques ont progressivement fait leur entrée dans les classes de langues par le biais de l'Apprentissage des Langues Assisté par Ordinateur (ALAO) où « Computer-</w:t>
+      </w:r>
+      <w:proofErr w:type="spellStart"/>
+      <w:r>
+        <w:rPr>
+          <w:rFonts w:ascii="Times New Roman" w:hAnsi="Times New Roman" w:cs="Times New Roman"/>
+          <w:sz w:val="24"/>
+          <w:szCs w:val="24"/>
+        </w:rPr>
+        <w:t>Assisted</w:t>
+      </w:r>
+      <w:proofErr w:type="spellEnd"/>
+      <w:r>
+        <w:rPr>
+          <w:rFonts w:ascii="Times New Roman" w:hAnsi="Times New Roman" w:cs="Times New Roman"/>
+          <w:sz w:val="24"/>
+          <w:szCs w:val="24"/>
+        </w:rPr>
+        <w:t xml:space="preserve"> </w:t>
+      </w:r>
+      <w:proofErr w:type="spellStart"/>
+      <w:r>
+        <w:rPr>
+          <w:rFonts w:ascii="Times New Roman" w:hAnsi="Times New Roman" w:cs="Times New Roman"/>
+          <w:sz w:val="24"/>
+          <w:szCs w:val="24"/>
+        </w:rPr>
+        <w:t>Language</w:t>
+      </w:r>
+      <w:proofErr w:type="spellEnd"/>
+      <w:r>
+        <w:rPr>
+          <w:rFonts w:ascii="Times New Roman" w:hAnsi="Times New Roman" w:cs="Times New Roman"/>
+          <w:sz w:val="24"/>
+          <w:szCs w:val="24"/>
+        </w:rPr>
+        <w:t xml:space="preserve"> Learning (CALL) », obligeant les enseignants à adapter leurs pratiques de planification pour intégrer ces technologies (</w:t>
+      </w:r>
+      <w:proofErr w:type="spellStart"/>
+      <w:r>
+        <w:rPr>
+          <w:rFonts w:ascii="Times New Roman" w:hAnsi="Times New Roman" w:cs="Times New Roman"/>
+          <w:sz w:val="24"/>
+          <w:szCs w:val="24"/>
+        </w:rPr>
+        <w:t>Warschauer</w:t>
+      </w:r>
+      <w:proofErr w:type="spellEnd"/>
+      <w:r>
+        <w:rPr>
+          <w:rFonts w:ascii="Times New Roman" w:hAnsi="Times New Roman" w:cs="Times New Roman"/>
+          <w:sz w:val="24"/>
+          <w:szCs w:val="24"/>
+        </w:rPr>
+        <w:t xml:space="preserve"> &amp; Healey, 1998). Au lieu de s'appuyer uniquement sur les manuels scolaires et l'enseignement en présentiel, les enseignants ont commencé à intégrer dans leurs classes des ordinateurs, des logiciels linguistiques, des supports multimédias, puis des ressources internet. Cette adaptation a exigé des enseignants qu'ils développent de nouvelles compétences techniques, repensent les activités de classe et s'orientent vers des approches davantage centrées sur l'apprenant. Ils ont également dû apprendre à sélectionner les outils numériques appropriés pour soutenir les compétences langagières telles que l'écoute, l'expression orale, la lecture et l'écriture. Ces changements ont marqué une transition importante dans l'enseignement des langues, la technologie devenant de plus en plus liée aux pratiques pédagogiques et à l'engagement des élèves.</w:t>
+      </w:r>
+    </w:p>
+    <w:p>
+      <w:pPr>
+        <w:rPr>
+          <w:rFonts w:ascii="Times New Roman" w:hAnsi="Times New Roman" w:cs="Times New Roman"/>
+          <w:sz w:val="24"/>
+          <w:szCs w:val="24"/>
+        </w:rPr>
+      </w:pPr>
+    </w:p>
+    <w:p>
+      <w:pPr>
+        <w:rPr>
+          <w:rFonts w:ascii="Times New Roman" w:hAnsi="Times New Roman" w:cs="Times New Roman"/>
+          <w:sz w:val="24"/>
+          <w:szCs w:val="24"/>
+        </w:rPr>
+      </w:pPr>
+      <w:r>
+        <w:rPr>
+          <w:rFonts w:ascii="Times New Roman" w:hAnsi="Times New Roman" w:cs="Times New Roman"/>
+          <w:sz w:val="24"/>
+          <w:szCs w:val="24"/>
+        </w:rPr>
+        <w:t>Malgré l'intégration des TICE, les enseignants sont restés les concepteurs principaux de l'enseignement. Les outils numériques soutenaient la planification des cours sans pour autant générer des plans complets ; les enseignants continuaient de créer le contenu central du programme (</w:t>
+      </w:r>
+      <w:proofErr w:type="spellStart"/>
+      <w:r>
+        <w:rPr>
+          <w:rFonts w:ascii="Times New Roman" w:hAnsi="Times New Roman" w:cs="Times New Roman"/>
+          <w:sz w:val="24"/>
+          <w:szCs w:val="24"/>
+        </w:rPr>
+        <w:t>Warschauer</w:t>
+      </w:r>
+      <w:proofErr w:type="spellEnd"/>
+      <w:r>
+        <w:rPr>
+          <w:rFonts w:ascii="Times New Roman" w:hAnsi="Times New Roman" w:cs="Times New Roman"/>
+          <w:sz w:val="24"/>
+          <w:szCs w:val="24"/>
+        </w:rPr>
+        <w:t xml:space="preserve"> &amp; Healey, 1998). Cette distinction devient déterminante lorsqu'on considère l'IA générative, qui modifie fondamentalement ce que les enseignants doivent faire dans la planification des cours.</w:t>
+      </w:r>
+    </w:p>
+    <w:p>
+      <w:pPr>
+        <w:rPr>
+          <w:rFonts w:ascii="Times New Roman" w:hAnsi="Times New Roman" w:cs="Times New Roman"/>
+          <w:sz w:val="24"/>
+          <w:szCs w:val="24"/>
+        </w:rPr>
+      </w:pPr>
+    </w:p>
+    <w:p>
+      <w:pPr>
+        <w:rPr>
+          <w:rFonts w:ascii="Times New Roman" w:hAnsi="Times New Roman" w:cs="Times New Roman"/>
+          <w:sz w:val="24"/>
+          <w:szCs w:val="24"/>
+        </w:rPr>
+      </w:pPr>
+      <w:r>
+        <w:rPr>
+          <w:rFonts w:ascii="Times New Roman" w:hAnsi="Times New Roman" w:cs="Times New Roman"/>
+          <w:sz w:val="24"/>
+          <w:szCs w:val="24"/>
+        </w:rPr>
+        <w:t>(c)</w:t>
+      </w:r>
+      <w:r>
+        <w:rPr>
+          <w:rFonts w:ascii="Times New Roman" w:hAnsi="Times New Roman" w:cs="Times New Roman"/>
+          <w:sz w:val="24"/>
+          <w:szCs w:val="24"/>
+        </w:rPr>
+        <w:tab/>
+        <w:t>L'intégration de l'IA générative dans l'apprentissage des langues</w:t>
+      </w:r>
+    </w:p>
+    <w:p>
+      <w:pPr>
+        <w:rPr>
+          <w:rFonts w:ascii="Times New Roman" w:hAnsi="Times New Roman" w:cs="Times New Roman"/>
+          <w:sz w:val="24"/>
+          <w:szCs w:val="24"/>
+        </w:rPr>
+      </w:pPr>
+    </w:p>
+    <w:p>
+      <w:pPr>
+        <w:rPr>
+          <w:rFonts w:ascii="Times New Roman" w:hAnsi="Times New Roman" w:cs="Times New Roman"/>
+          <w:sz w:val="24"/>
+          <w:szCs w:val="24"/>
+        </w:rPr>
+      </w:pPr>
+      <w:r>
+        <w:rPr>
+          <w:rFonts w:ascii="Times New Roman" w:hAnsi="Times New Roman" w:cs="Times New Roman"/>
+          <w:sz w:val="24"/>
+          <w:szCs w:val="24"/>
+        </w:rPr>
+        <w:t xml:space="preserve">L'IA générative désigne les systèmes d'intelligence artificielle capables de produire de nouveaux contenus tels que textes, plans de cours, exercices, à partir d'une instruction fournie </w:t>
+      </w:r>
+      <w:r>
+        <w:rPr>
+          <w:rFonts w:ascii="Times New Roman" w:hAnsi="Times New Roman" w:cs="Times New Roman"/>
+          <w:sz w:val="24"/>
+          <w:szCs w:val="24"/>
+        </w:rPr>
+        <w:lastRenderedPageBreak/>
+        <w:t>par l'utilisateur (Mishra et al., 2025). Contrairement aux outils TICE qui soutenaient un enseignement conçu par les enseignants, l'IA générative produit activement des contenus pédagogiques que les enseignants doivent évaluer et adapter. Ce changement exige des enseignants qu'ils exercent de nouvelles formes de jugement pédagogique, en évaluant les contenus générés par l'IA sous l'angle de leur exactitude, de leur conformité au programme et de leur pertinence pédagogique (Morgan, 2025). La recherche a commencé à examiner le potentiel de l'IA dans l'enseignement des langues et l'adoption des technologies par les enseignants de manière plus large. Cependant, peu de travaux ont spécifiquement étudié la façon dont les enseignants évaluent, intègrent et prennent des décisions pédagogiques concernant l'IA générative dans la planification des cours, notamment dans le contexte de l'enseignement secondaire français. Comprendre ces perspectives et pratiques enseignantes est essentiel compte tenu de l'intégration rapide des outils d'IA et de la nécessité de soutenir une adoption pédagogique éclairée.</w:t>
+      </w:r>
+    </w:p>
+    <w:p>
+      <w:pPr>
+        <w:rPr>
+          <w:rFonts w:ascii="Times New Roman" w:hAnsi="Times New Roman" w:cs="Times New Roman"/>
+          <w:sz w:val="24"/>
+          <w:szCs w:val="24"/>
+        </w:rPr>
+      </w:pPr>
+      <w:r>
+        <w:rPr>
+          <w:rFonts w:ascii="Times New Roman" w:hAnsi="Times New Roman" w:cs="Times New Roman"/>
+          <w:sz w:val="24"/>
+          <w:szCs w:val="24"/>
+        </w:rPr>
+        <w:t>(d)</w:t>
+      </w:r>
+      <w:r>
+        <w:rPr>
+          <w:rFonts w:ascii="Times New Roman" w:hAnsi="Times New Roman" w:cs="Times New Roman"/>
+          <w:sz w:val="24"/>
+          <w:szCs w:val="24"/>
+        </w:rPr>
+        <w:tab/>
+        <w:t>Le système éducatif français et l'IA</w:t>
+      </w:r>
+    </w:p>
+    <w:p>
+      <w:pPr>
+        <w:rPr>
+          <w:rFonts w:ascii="Times New Roman" w:hAnsi="Times New Roman" w:cs="Times New Roman"/>
+          <w:sz w:val="24"/>
+          <w:szCs w:val="24"/>
+        </w:rPr>
+      </w:pPr>
+    </w:p>
+    <w:p>
+      <w:pPr>
+        <w:rPr>
+          <w:rFonts w:ascii="Times New Roman" w:hAnsi="Times New Roman" w:cs="Times New Roman"/>
+          <w:sz w:val="24"/>
+          <w:szCs w:val="24"/>
+        </w:rPr>
+      </w:pPr>
+      <w:r>
+        <w:rPr>
+          <w:rFonts w:ascii="Times New Roman" w:hAnsi="Times New Roman" w:cs="Times New Roman"/>
+          <w:sz w:val="24"/>
+          <w:szCs w:val="24"/>
+        </w:rPr>
+        <w:t>L'utilisation de l'IA générative est autorisée dans l'enseignement secondaire, à condition que les utilisateurs respectent les réglementations fixées par le ministère de l'Éducation nationale (Cadre d’usage de l’IA en éducation, 2025). Son usage est permis dans la mesure où elle constitue un outil pédagogique et n'implique pas le traitement de données personnelles, sensibles ou institutionnelles dans un cadre public (La protection des élèves et de leurs données sur Internet, 2019). L'IA générative est considérée comme un outil d'appui et non comme un substitut à l'enseignant, et tous les contenus produits doivent faire l'objet d'une vérification critique. Les élèves ne peuvent utiliser l'IA que dans les limites définies par l'enseignant, à partir du niveau de la 4e, et tout usage non autorisé est considéré comme un manquement aux règles. Si la politique éducative française autorise l'usage de l'IA générative comme outil de soutien pédagogique sous conditions spécifiques, les orientations pratiques concernant sa mise en œuvre en classe pour la planification des cours par les enseignants restent limitées.</w:t>
+      </w:r>
+    </w:p>
+    <w:p>
+      <w:pPr>
+        <w:rPr>
+          <w:rFonts w:ascii="Times New Roman" w:hAnsi="Times New Roman" w:cs="Times New Roman"/>
+          <w:sz w:val="24"/>
+          <w:szCs w:val="24"/>
+        </w:rPr>
+      </w:pPr>
+    </w:p>
+    <w:p>
+      <w:pPr>
+        <w:rPr>
+          <w:rFonts w:ascii="Times New Roman" w:hAnsi="Times New Roman" w:cs="Times New Roman"/>
+          <w:sz w:val="24"/>
+          <w:szCs w:val="24"/>
+        </w:rPr>
+      </w:pPr>
+      <w:r>
+        <w:rPr>
+          <w:rFonts w:ascii="Times New Roman" w:hAnsi="Times New Roman" w:cs="Times New Roman"/>
+          <w:sz w:val="24"/>
+          <w:szCs w:val="24"/>
+        </w:rPr>
+        <w:t xml:space="preserve">L'IA générative est un phénomène relativement récent qui a rapidement gagné en popularité après le lancement de </w:t>
+      </w:r>
+      <w:proofErr w:type="spellStart"/>
+      <w:r>
+        <w:rPr>
+          <w:rFonts w:ascii="Times New Roman" w:hAnsi="Times New Roman" w:cs="Times New Roman"/>
+          <w:sz w:val="24"/>
+          <w:szCs w:val="24"/>
+        </w:rPr>
+        <w:t>ChatGPT</w:t>
+      </w:r>
+      <w:proofErr w:type="spellEnd"/>
+      <w:r>
+        <w:rPr>
+          <w:rFonts w:ascii="Times New Roman" w:hAnsi="Times New Roman" w:cs="Times New Roman"/>
+          <w:sz w:val="24"/>
+          <w:szCs w:val="24"/>
+        </w:rPr>
+        <w:t xml:space="preserve"> en 2022, grâce à la flexibilité qu'il offre et à des résultats adaptés à chaque </w:t>
+      </w:r>
+      <w:proofErr w:type="gramStart"/>
+      <w:r>
+        <w:rPr>
+          <w:rFonts w:ascii="Times New Roman" w:hAnsi="Times New Roman" w:cs="Times New Roman"/>
+          <w:sz w:val="24"/>
+          <w:szCs w:val="24"/>
+        </w:rPr>
+        <w:t>utilisateur(</w:t>
+      </w:r>
+      <w:proofErr w:type="gramEnd"/>
+      <w:r>
+        <w:rPr>
+          <w:rFonts w:ascii="Times New Roman" w:hAnsi="Times New Roman" w:cs="Times New Roman"/>
+          <w:sz w:val="24"/>
+          <w:szCs w:val="24"/>
+        </w:rPr>
+        <w:t xml:space="preserve">Liu &amp; Wang, 2024). Cependant, dans le contexte éducatif français, les études se concentrent majoritairement sur les usages par les apprenants ou proposent des guides </w:t>
+      </w:r>
+      <w:r>
+        <w:rPr>
+          <w:rFonts w:ascii="Times New Roman" w:hAnsi="Times New Roman" w:cs="Times New Roman"/>
+          <w:sz w:val="24"/>
+          <w:szCs w:val="24"/>
+        </w:rPr>
+        <w:lastRenderedPageBreak/>
+        <w:t xml:space="preserve">sur les outils disponibles, plutôt qu'une analyse de leur mise en œuvre en classe. La recherche se rétrécit davantage lorsqu'il s'agit d'analyser l'intégration de l'IA générative dans les pratiques de classe et la planification des cours par les professeurs de langues, notamment dans l'enseignement secondaire, où les cadres curriculaires et les contraintes pédagogiques compliquent la mise en œuvre. Il est donc impératif de comprendre comment les enseignants évaluent, modifient et utilisent l'IA générative comme outil professionnel pour la planification des cours, afin d'éclairer la pratique pédagogique et de combler le fossé entre la permission réglementaire et la réalité de la classe. </w:t>
+      </w:r>
+    </w:p>
+    <w:p>
+      <w:pPr>
+        <w:rPr>
+          <w:rFonts w:ascii="Times New Roman" w:hAnsi="Times New Roman" w:cs="Times New Roman"/>
+          <w:sz w:val="24"/>
+          <w:szCs w:val="24"/>
+        </w:rPr>
+      </w:pPr>
+      <w:r>
+        <w:rPr>
+          <w:rFonts w:ascii="Times New Roman" w:hAnsi="Times New Roman" w:cs="Times New Roman"/>
+          <w:sz w:val="24"/>
+          <w:szCs w:val="24"/>
+        </w:rPr>
+        <w:t>Pour répondre à ce manque, cette thèse vise à analyser la question suivante : comment les professeurs de langues des collèges français évaluent-ils et intègrent-ils les outils d'IA générative dans leurs pratiques de planification des cours, et quels facteurs influencent leurs décisions d'adoption ?</w:t>
+      </w:r>
+    </w:p>
+    <w:p>
+      <w:pPr>
+        <w:rPr>
+          <w:rFonts w:ascii="Times New Roman" w:hAnsi="Times New Roman" w:cs="Times New Roman"/>
+          <w:sz w:val="24"/>
+          <w:szCs w:val="24"/>
         </w:rPr>
       </w:pPr>
     </w:p>
@@ -12103,7 +12815,7 @@
                     </pic:cNvPicPr>
                   </pic:nvPicPr>
                   <pic:blipFill>
-                    <a:blip r:embed="rId12" cstate="print">
+                    <a:blip r:embed="rId11" cstate="print">
                       <a:extLst>
                         <a:ext uri="{28A0092B-C50C-407E-A947-70E740481C1C}">
                           <a14:useLocalDpi xmlns:a14="http://schemas.microsoft.com/office/drawing/2010/main" val="0"/>
@@ -12461,26 +13173,472 @@
     </w:p>
     <w:p>
       <w:pPr>
-        <w:spacing w:after="0" w:line="240" w:lineRule="auto"/>
-        <w:jc w:val="left"/>
-        <w:rPr>
-          <w:rFonts w:ascii="Times New Roman" w:eastAsia="Times New Roman" w:hAnsi="Times New Roman" w:cs="Times New Roman"/>
-          <w:sz w:val="24"/>
-          <w:szCs w:val="24"/>
-          <w:lang w:val="en-FR" w:eastAsia="en-GB"/>
-        </w:rPr>
-      </w:pPr>
-    </w:p>
-    <w:p>
-      <w:pPr>
         <w:spacing w:line="259" w:lineRule="auto"/>
         <w:jc w:val="left"/>
         <w:rPr>
-          <w:i/>
-          <w:sz w:val="24"/>
+          <w:rFonts w:ascii="Times New Roman" w:eastAsia="Times New Roman" w:hAnsi="Times New Roman" w:cs="Times New Roman"/>
+          <w:sz w:val="24"/>
+          <w:szCs w:val="24"/>
+          <w:lang w:val="en-FR" w:eastAsia="en-GB"/>
+        </w:rPr>
+      </w:pPr>
+    </w:p>
+    <w:p>
+      <w:pPr>
+        <w:pStyle w:val="Heading2"/>
+        <w:rPr>
+          <w:b/>
+          <w:bCs/>
           <w:lang w:val="en-FR"/>
         </w:rPr>
       </w:pPr>
+      <w:r>
+        <w:rPr>
+          <w:rStyle w:val="Strong"/>
+          <w:b w:val="0"/>
+          <w:bCs w:val="0"/>
+        </w:rPr>
+        <w:t>Technology Adoption in Education</w:t>
+      </w:r>
+    </w:p>
+    <w:p>
+      <w:pPr>
+        <w:pStyle w:val="font-claude-response-body"/>
+      </w:pPr>
+      <w:r>
+        <w:t xml:space="preserve">Technology adoption in education is not automatic. While new tools become available, teachers decide whether and how to integrate them based on complex psychological, institutional, and pedagogical factors. Understanding these adoption processes is essential for understanding how teachers will evaluate generative AI. This section examines what technology adoption is, key theoretical frameworks explaining adoption decisions, barriers </w:t>
+      </w:r>
+      <w:r>
+        <w:lastRenderedPageBreak/>
+        <w:t>teachers face, and how these apply specifically to language teachers using AI for lesson planning.</w:t>
+      </w:r>
+    </w:p>
+    <w:p>
+      <w:r>
+        <w:rPr>
+          <w:noProof/>
+        </w:rPr>
+        <w:pict w14:anchorId="67A396DC">
+          <v:rect id="_x0000_i1025" alt="" style="width:451.3pt;height:.05pt;mso-width-percent:0;mso-height-percent:0;mso-width-percent:0;mso-height-percent:0" o:hralign="center" o:hrstd="t" o:hr="t" fillcolor="#a0a0a0" stroked="f"/>
+        </w:pict>
+      </w:r>
+    </w:p>
+    <w:p>
+      <w:pPr>
+        <w:pStyle w:val="Heading3"/>
+      </w:pPr>
+      <w:r>
+        <w:rPr>
+          <w:rStyle w:val="Strong"/>
+          <w:b/>
+          <w:bCs w:val="0"/>
+        </w:rPr>
+        <w:t xml:space="preserve">3.1 </w:t>
+      </w:r>
+      <w:proofErr w:type="spellStart"/>
+      <w:r>
+        <w:rPr>
+          <w:rStyle w:val="Strong"/>
+          <w:b/>
+          <w:bCs w:val="0"/>
+        </w:rPr>
+        <w:t>Defining</w:t>
+      </w:r>
+      <w:proofErr w:type="spellEnd"/>
+      <w:r>
+        <w:rPr>
+          <w:rStyle w:val="Strong"/>
+          <w:b/>
+          <w:bCs w:val="0"/>
+        </w:rPr>
+        <w:t xml:space="preserve"> </w:t>
+      </w:r>
+      <w:proofErr w:type="spellStart"/>
+      <w:r>
+        <w:rPr>
+          <w:rStyle w:val="Strong"/>
+          <w:b/>
+          <w:bCs w:val="0"/>
+        </w:rPr>
+        <w:t>Technology</w:t>
+      </w:r>
+      <w:proofErr w:type="spellEnd"/>
+      <w:r>
+        <w:rPr>
+          <w:rStyle w:val="Strong"/>
+          <w:b/>
+          <w:bCs w:val="0"/>
+        </w:rPr>
+        <w:t xml:space="preserve"> Adoption</w:t>
+      </w:r>
+      <w:r>
+        <w:t xml:space="preserve"> </w:t>
+      </w:r>
+    </w:p>
+    <w:p>
+      <w:pPr>
+        <w:pStyle w:val="font-claude-response-body"/>
+      </w:pPr>
+      <w:r>
+        <w:rPr>
+          <w:rStyle w:val="Strong"/>
+          <w:rFonts w:eastAsiaTheme="majorEastAsia"/>
+        </w:rPr>
+        <w:t>Sources:</w:t>
+      </w:r>
+      <w:r>
+        <w:t xml:space="preserve"> Straub (2009)</w:t>
+      </w:r>
+      <w:r>
+        <w:rPr>
+          <w:rStyle w:val="Strong"/>
+          <w:rFonts w:eastAsiaTheme="majorEastAsia"/>
+        </w:rPr>
+        <w:t>:</w:t>
+      </w:r>
+    </w:p>
+    <w:p>
+      <w:pPr>
+        <w:pStyle w:val="font-claude-response-body"/>
+        <w:numPr>
+          <w:ilvl w:val="0"/>
+          <w:numId w:val="19"/>
+        </w:numPr>
+      </w:pPr>
+      <w:r>
+        <w:t>What is technology adoption? (Not just buying a tool, but integrating it into practice)</w:t>
+      </w:r>
+    </w:p>
+    <w:p>
+      <w:pPr>
+        <w:pStyle w:val="font-claude-response-body"/>
+        <w:numPr>
+          <w:ilvl w:val="0"/>
+          <w:numId w:val="19"/>
+        </w:numPr>
+      </w:pPr>
+      <w:r>
+        <w:t>Why does it matter for understanding teacher practice?</w:t>
+      </w:r>
+    </w:p>
+    <w:p>
+      <w:pPr>
+        <w:pStyle w:val="font-claude-response-body"/>
+        <w:numPr>
+          <w:ilvl w:val="0"/>
+          <w:numId w:val="19"/>
+        </w:numPr>
+      </w:pPr>
+      <w:r>
+        <w:t>Brief mention of adoption as a process, not an event</w:t>
+      </w:r>
+    </w:p>
+    <w:p>
+      <w:pPr>
+        <w:pStyle w:val="Heading3"/>
+        <w:rPr>
+          <w:lang w:val="en-US"/>
+        </w:rPr>
+      </w:pPr>
+      <w:r>
+        <w:rPr>
+          <w:rStyle w:val="Strong"/>
+          <w:b/>
+          <w:bCs w:val="0"/>
+          <w:lang w:val="en-US"/>
+        </w:rPr>
+        <w:t>3.2 Theoretical Frameworks for Understanding Adoption</w:t>
+      </w:r>
+      <w:r>
+        <w:rPr>
+          <w:lang w:val="en-US"/>
+        </w:rPr>
+        <w:t xml:space="preserve"> </w:t>
+      </w:r>
+    </w:p>
+    <w:p>
+      <w:pPr>
+        <w:pStyle w:val="font-claude-response-body"/>
+      </w:pPr>
+      <w:r>
+        <w:rPr>
+          <w:rStyle w:val="Strong"/>
+          <w:rFonts w:eastAsiaTheme="majorEastAsia"/>
+        </w:rPr>
+        <w:t>Sources:</w:t>
+      </w:r>
+      <w:r>
+        <w:t xml:space="preserve"> Davis (1989), Rogers (2003), Straub (2009) </w:t>
+      </w:r>
+      <w:r>
+        <w:rPr>
+          <w:rStyle w:val="Strong"/>
+          <w:rFonts w:eastAsiaTheme="majorEastAsia"/>
+        </w:rPr>
+        <w:t>Content:</w:t>
+      </w:r>
+    </w:p>
+    <w:p>
+      <w:pPr>
+        <w:pStyle w:val="font-claude-response-body"/>
+        <w:numPr>
+          <w:ilvl w:val="0"/>
+          <w:numId w:val="20"/>
+        </w:numPr>
+      </w:pPr>
+      <w:r>
+        <w:t>TAM (Technology Acceptance Model): Perceived Usefulness + Perceived Ease of Use</w:t>
+      </w:r>
+    </w:p>
+    <w:p>
+      <w:pPr>
+        <w:pStyle w:val="font-claude-response-body"/>
+        <w:numPr>
+          <w:ilvl w:val="0"/>
+          <w:numId w:val="20"/>
+        </w:numPr>
+      </w:pPr>
+      <w:r>
+        <w:t>Rogers' Diffusion of Innovations: Relative advantage, compatibility, complexity, trialability, observability</w:t>
+      </w:r>
+    </w:p>
+    <w:p>
+      <w:pPr>
+        <w:pStyle w:val="font-claude-response-body"/>
+        <w:numPr>
+          <w:ilvl w:val="0"/>
+          <w:numId w:val="20"/>
+        </w:numPr>
+      </w:pPr>
+      <w:r>
+        <w:t>How these frameworks apply to teacher decision-making</w:t>
+      </w:r>
+    </w:p>
+    <w:p>
+      <w:pPr>
+        <w:pStyle w:val="Heading3"/>
+      </w:pPr>
+      <w:r>
+        <w:rPr>
+          <w:rStyle w:val="Strong"/>
+          <w:b/>
+          <w:bCs w:val="0"/>
+        </w:rPr>
+        <w:t xml:space="preserve">3.3 </w:t>
+      </w:r>
+      <w:proofErr w:type="spellStart"/>
+      <w:r>
+        <w:rPr>
+          <w:rStyle w:val="Strong"/>
+          <w:b/>
+          <w:bCs w:val="0"/>
+        </w:rPr>
+        <w:t>Barriers</w:t>
+      </w:r>
+      <w:proofErr w:type="spellEnd"/>
+      <w:r>
+        <w:rPr>
+          <w:rStyle w:val="Strong"/>
+          <w:b/>
+          <w:bCs w:val="0"/>
+        </w:rPr>
+        <w:t xml:space="preserve"> and </w:t>
+      </w:r>
+      <w:proofErr w:type="spellStart"/>
+      <w:r>
+        <w:rPr>
+          <w:rStyle w:val="Strong"/>
+          <w:b/>
+          <w:bCs w:val="0"/>
+        </w:rPr>
+        <w:t>Factors</w:t>
+      </w:r>
+      <w:proofErr w:type="spellEnd"/>
+      <w:r>
+        <w:rPr>
+          <w:rStyle w:val="Strong"/>
+          <w:b/>
+          <w:bCs w:val="0"/>
+        </w:rPr>
+        <w:t xml:space="preserve"> </w:t>
+      </w:r>
+      <w:proofErr w:type="spellStart"/>
+      <w:r>
+        <w:rPr>
+          <w:rStyle w:val="Strong"/>
+          <w:b/>
+          <w:bCs w:val="0"/>
+        </w:rPr>
+        <w:t>Influencing</w:t>
+      </w:r>
+      <w:proofErr w:type="spellEnd"/>
+      <w:r>
+        <w:rPr>
+          <w:rStyle w:val="Strong"/>
+          <w:b/>
+          <w:bCs w:val="0"/>
+        </w:rPr>
+        <w:t xml:space="preserve"> Adoption</w:t>
+      </w:r>
+      <w:r>
+        <w:t xml:space="preserve"> </w:t>
+      </w:r>
+    </w:p>
+    <w:p>
+      <w:pPr>
+        <w:pStyle w:val="font-claude-response-body"/>
+      </w:pPr>
+      <w:r>
+        <w:rPr>
+          <w:rStyle w:val="Strong"/>
+          <w:rFonts w:eastAsiaTheme="majorEastAsia"/>
+        </w:rPr>
+        <w:t>Sources:</w:t>
+      </w:r>
+      <w:r>
+        <w:t xml:space="preserve"> Ertmer (2009/2010), Kohnke et al. (2023) </w:t>
+      </w:r>
+      <w:r>
+        <w:rPr>
+          <w:rStyle w:val="Strong"/>
+          <w:rFonts w:eastAsiaTheme="majorEastAsia"/>
+        </w:rPr>
+        <w:t>Content:</w:t>
+      </w:r>
+    </w:p>
+    <w:p>
+      <w:pPr>
+        <w:pStyle w:val="font-claude-response-body"/>
+        <w:numPr>
+          <w:ilvl w:val="0"/>
+          <w:numId w:val="21"/>
+        </w:numPr>
+      </w:pPr>
+      <w:r>
+        <w:t>First-order barriers (external: time, resources, curriculum constraints)</w:t>
+      </w:r>
+    </w:p>
+    <w:p>
+      <w:pPr>
+        <w:pStyle w:val="font-claude-response-body"/>
+        <w:numPr>
+          <w:ilvl w:val="0"/>
+          <w:numId w:val="21"/>
+        </w:numPr>
+      </w:pPr>
+      <w:r>
+        <w:t>Second-order barriers (internal: beliefs, anxiety, professional identity)</w:t>
+      </w:r>
+    </w:p>
+    <w:p>
+      <w:pPr>
+        <w:pStyle w:val="font-claude-response-body"/>
+        <w:numPr>
+          <w:ilvl w:val="0"/>
+          <w:numId w:val="21"/>
+        </w:numPr>
+      </w:pPr>
+      <w:r>
+        <w:t>Why second-order barriers are often the real obstacle</w:t>
+      </w:r>
+    </w:p>
+    <w:p>
+      <w:pPr>
+        <w:pStyle w:val="font-claude-response-body"/>
+        <w:numPr>
+          <w:ilvl w:val="0"/>
+          <w:numId w:val="21"/>
+        </w:numPr>
+      </w:pPr>
+      <w:r>
+        <w:t>Specific to language teaching context</w:t>
+      </w:r>
+    </w:p>
+    <w:p>
+      <w:pPr>
+        <w:pStyle w:val="Heading4"/>
+      </w:pPr>
+      <w:r>
+        <w:rPr>
+          <w:rStyle w:val="Strong"/>
+          <w:b/>
+          <w:bCs w:val="0"/>
+        </w:rPr>
+        <w:t>3.4 Application to Language Teachers and Generative AI</w:t>
+      </w:r>
+      <w:r>
+        <w:t xml:space="preserve"> </w:t>
+      </w:r>
+    </w:p>
+    <w:p>
+      <w:pPr>
+        <w:pStyle w:val="font-claude-response-body"/>
+      </w:pPr>
+      <w:r>
+        <w:rPr>
+          <w:rStyle w:val="Strong"/>
+          <w:rFonts w:eastAsiaTheme="majorEastAsia"/>
+        </w:rPr>
+        <w:t>Sources:</w:t>
+      </w:r>
+      <w:r>
+        <w:t xml:space="preserve"> Kohnke et al. (2023), Celik (2023), Lee &amp; Jeon, Decauchelle </w:t>
+      </w:r>
+      <w:r>
+        <w:rPr>
+          <w:rStyle w:val="Strong"/>
+          <w:rFonts w:eastAsiaTheme="majorEastAsia"/>
+        </w:rPr>
+        <w:t>Content:</w:t>
+      </w:r>
+    </w:p>
+    <w:p>
+      <w:pPr>
+        <w:pStyle w:val="font-claude-response-body"/>
+        <w:numPr>
+          <w:ilvl w:val="0"/>
+          <w:numId w:val="22"/>
+        </w:numPr>
+      </w:pPr>
+      <w:r>
+        <w:t>How language teachers uniquely evaluate AI (linguistic competence, authentic materials)</w:t>
+      </w:r>
+    </w:p>
+    <w:p>
+      <w:pPr>
+        <w:pStyle w:val="font-claude-response-body"/>
+        <w:numPr>
+          <w:ilvl w:val="0"/>
+          <w:numId w:val="22"/>
+        </w:numPr>
+      </w:pPr>
+      <w:r>
+        <w:t>TPACK framework applied to AI tools</w:t>
+      </w:r>
+    </w:p>
+    <w:p>
+      <w:pPr>
+        <w:pStyle w:val="font-claude-response-body"/>
+        <w:numPr>
+          <w:ilvl w:val="0"/>
+          <w:numId w:val="22"/>
+        </w:numPr>
+      </w:pPr>
+      <w:r>
+        <w:t>French institutional context and adoption (Decauchelle)</w:t>
+      </w:r>
+    </w:p>
+    <w:p>
+      <w:pPr>
+        <w:pStyle w:val="font-claude-response-body"/>
+        <w:numPr>
+          <w:ilvl w:val="0"/>
+          <w:numId w:val="22"/>
+        </w:numPr>
+      </w:pPr>
+      <w:r>
+        <w:t>Transition to why your research matters</w:t>
+      </w:r>
     </w:p>
     <w:p>
       <w:pPr>
@@ -12489,7 +13647,7 @@
         <w:rPr>
           <w:i/>
           <w:sz w:val="24"/>
-          <w:lang w:val="en-US"/>
+          <w:lang w:val="en-FR"/>
         </w:rPr>
       </w:pPr>
     </w:p>
@@ -12594,14 +13752,8 @@
     <w:p>
       <w:pPr>
         <w:pStyle w:val="Heading4"/>
-        <w:rPr>
-          <w:lang w:val="en-US"/>
-        </w:rPr>
-      </w:pPr>
-      <w:r>
-        <w:rPr>
-          <w:lang w:val="en-US"/>
-        </w:rPr>
+      </w:pPr>
+      <w:r>
         <w:br w:type="page"/>
       </w:r>
     </w:p>
@@ -14366,7 +15518,7 @@
           <w:sz w:val="24"/>
         </w:rPr>
         <w:sectPr>
-          <w:footerReference w:type="default" r:id="rId13"/>
+          <w:footerReference w:type="default" r:id="rId12"/>
           <w:pgSz w:w="11906" w:h="16838"/>
           <w:pgMar w:top="1417" w:right="1417" w:bottom="1417" w:left="1417" w:header="708" w:footer="708" w:gutter="0"/>
           <w:cols w:space="708"/>
@@ -15163,12 +16315,14 @@
           <w:lang w:val="en-US"/>
         </w:rPr>
       </w:pPr>
+      <w:proofErr w:type="spellStart"/>
       <w:r>
         <w:rPr>
           <w:lang w:val="en-US"/>
         </w:rPr>
         <w:t>Attolluntur</w:t>
       </w:r>
+      <w:proofErr w:type="spellEnd"/>
     </w:p>
     <w:p>
       <w:pPr>
@@ -15275,7 +16429,7 @@
     <w:p>
       <w:pPr>
         <w:sectPr>
-          <w:headerReference w:type="default" r:id="rId14"/>
+          <w:headerReference w:type="default" r:id="rId13"/>
           <w:pgSz w:w="11906" w:h="16838"/>
           <w:pgMar w:top="1417" w:right="1417" w:bottom="1417" w:left="1417" w:header="708" w:footer="708" w:gutter="0"/>
           <w:cols w:space="708"/>
@@ -15374,7 +16528,7 @@
           <w:sz w:val="24"/>
         </w:rPr>
         <w:sectPr>
-          <w:footerReference w:type="default" r:id="rId15"/>
+          <w:footerReference w:type="default" r:id="rId14"/>
           <w:pgSz w:w="11906" w:h="16838"/>
           <w:pgMar w:top="1417" w:right="1417" w:bottom="1417" w:left="1417" w:header="708" w:footer="708" w:gutter="0"/>
           <w:pgNumType w:start="1"/>
@@ -15453,8 +16607,8 @@
       </w:r>
     </w:p>
     <w:sectPr>
-      <w:headerReference w:type="default" r:id="rId16"/>
-      <w:footerReference w:type="default" r:id="rId17"/>
+      <w:headerReference w:type="default" r:id="rId15"/>
+      <w:footerReference w:type="default" r:id="rId16"/>
       <w:pgSz w:w="11906" w:h="16838"/>
       <w:pgMar w:top="1417" w:right="1417" w:bottom="1417" w:left="1417" w:header="708" w:footer="708" w:gutter="0"/>
       <w:cols w:space="708"/>
@@ -16164,212 +17318,9 @@
     </w:lvl>
   </w:abstractNum>
   <w:abstractNum w:abstractNumId="1" w15:restartNumberingAfterBreak="0">
-    <w:nsid w:val="09CF0D22"/>
+    <w:nsid w:val="03DD5ACF"/>
     <w:multiLevelType w:val="multilevel"/>
-    <w:tmpl w:val="2A30CF80"/>
-    <w:lvl w:ilvl="0">
-      <w:start w:val="1"/>
-      <w:numFmt w:val="decimal"/>
-      <w:lvlText w:val="%1."/>
-      <w:lvlJc w:val="left"/>
-      <w:pPr>
-        <w:tabs>
-          <w:tab w:val="num" w:pos="720"/>
-        </w:tabs>
-        <w:ind w:left="720" w:hanging="720"/>
-      </w:pPr>
-    </w:lvl>
-    <w:lvl w:ilvl="1">
-      <w:start w:val="1"/>
-      <w:numFmt w:val="decimal"/>
-      <w:lvlText w:val="%2."/>
-      <w:lvlJc w:val="left"/>
-      <w:pPr>
-        <w:tabs>
-          <w:tab w:val="num" w:pos="1440"/>
-        </w:tabs>
-        <w:ind w:left="1440" w:hanging="720"/>
-      </w:pPr>
-    </w:lvl>
-    <w:lvl w:ilvl="2">
-      <w:start w:val="1"/>
-      <w:numFmt w:val="decimal"/>
-      <w:pStyle w:val="Style3"/>
-      <w:lvlText w:val="%3."/>
-      <w:lvlJc w:val="left"/>
-      <w:pPr>
-        <w:tabs>
-          <w:tab w:val="num" w:pos="2160"/>
-        </w:tabs>
-        <w:ind w:left="2160" w:hanging="720"/>
-      </w:pPr>
-    </w:lvl>
-    <w:lvl w:ilvl="3">
-      <w:start w:val="1"/>
-      <w:numFmt w:val="decimal"/>
-      <w:lvlText w:val="%4."/>
-      <w:lvlJc w:val="left"/>
-      <w:pPr>
-        <w:tabs>
-          <w:tab w:val="num" w:pos="2880"/>
-        </w:tabs>
-        <w:ind w:left="2880" w:hanging="720"/>
-      </w:pPr>
-    </w:lvl>
-    <w:lvl w:ilvl="4">
-      <w:start w:val="1"/>
-      <w:numFmt w:val="decimal"/>
-      <w:lvlText w:val="%5."/>
-      <w:lvlJc w:val="left"/>
-      <w:pPr>
-        <w:tabs>
-          <w:tab w:val="num" w:pos="3600"/>
-        </w:tabs>
-        <w:ind w:left="3600" w:hanging="720"/>
-      </w:pPr>
-    </w:lvl>
-    <w:lvl w:ilvl="5">
-      <w:start w:val="1"/>
-      <w:numFmt w:val="decimal"/>
-      <w:lvlText w:val="%6."/>
-      <w:lvlJc w:val="left"/>
-      <w:pPr>
-        <w:tabs>
-          <w:tab w:val="num" w:pos="4320"/>
-        </w:tabs>
-        <w:ind w:left="4320" w:hanging="720"/>
-      </w:pPr>
-    </w:lvl>
-    <w:lvl w:ilvl="6">
-      <w:start w:val="1"/>
-      <w:numFmt w:val="decimal"/>
-      <w:lvlText w:val="%7."/>
-      <w:lvlJc w:val="left"/>
-      <w:pPr>
-        <w:tabs>
-          <w:tab w:val="num" w:pos="5040"/>
-        </w:tabs>
-        <w:ind w:left="5040" w:hanging="720"/>
-      </w:pPr>
-    </w:lvl>
-    <w:lvl w:ilvl="7">
-      <w:start w:val="1"/>
-      <w:numFmt w:val="decimal"/>
-      <w:lvlText w:val="%8."/>
-      <w:lvlJc w:val="left"/>
-      <w:pPr>
-        <w:tabs>
-          <w:tab w:val="num" w:pos="5760"/>
-        </w:tabs>
-        <w:ind w:left="5760" w:hanging="720"/>
-      </w:pPr>
-    </w:lvl>
-    <w:lvl w:ilvl="8">
-      <w:start w:val="1"/>
-      <w:numFmt w:val="decimal"/>
-      <w:lvlText w:val="%9."/>
-      <w:lvlJc w:val="left"/>
-      <w:pPr>
-        <w:tabs>
-          <w:tab w:val="num" w:pos="6480"/>
-        </w:tabs>
-        <w:ind w:left="6480" w:hanging="720"/>
-      </w:pPr>
-    </w:lvl>
-  </w:abstractNum>
-  <w:abstractNum w:abstractNumId="2" w15:restartNumberingAfterBreak="0">
-    <w:nsid w:val="24883C9E"/>
-    <w:multiLevelType w:val="hybridMultilevel"/>
-    <w:tmpl w:val="4E5C84B2"/>
-    <w:lvl w:ilvl="0" w:tplc="E7867D66">
-      <w:start w:val="1"/>
-      <w:numFmt w:val="upperRoman"/>
-      <w:lvlText w:val="%1."/>
-      <w:lvlJc w:val="left"/>
-      <w:pPr>
-        <w:ind w:left="1080" w:hanging="720"/>
-      </w:pPr>
-      <w:rPr>
-        <w:rFonts w:hint="default"/>
-      </w:rPr>
-    </w:lvl>
-    <w:lvl w:ilvl="1" w:tplc="040C0019" w:tentative="1">
-      <w:start w:val="1"/>
-      <w:numFmt w:val="lowerLetter"/>
-      <w:lvlText w:val="%2."/>
-      <w:lvlJc w:val="left"/>
-      <w:pPr>
-        <w:ind w:left="1440" w:hanging="360"/>
-      </w:pPr>
-    </w:lvl>
-    <w:lvl w:ilvl="2" w:tplc="040C001B" w:tentative="1">
-      <w:start w:val="1"/>
-      <w:numFmt w:val="lowerRoman"/>
-      <w:lvlText w:val="%3."/>
-      <w:lvlJc w:val="right"/>
-      <w:pPr>
-        <w:ind w:left="2160" w:hanging="180"/>
-      </w:pPr>
-    </w:lvl>
-    <w:lvl w:ilvl="3" w:tplc="040C000F" w:tentative="1">
-      <w:start w:val="1"/>
-      <w:numFmt w:val="decimal"/>
-      <w:lvlText w:val="%4."/>
-      <w:lvlJc w:val="left"/>
-      <w:pPr>
-        <w:ind w:left="2880" w:hanging="360"/>
-      </w:pPr>
-    </w:lvl>
-    <w:lvl w:ilvl="4" w:tplc="040C0019" w:tentative="1">
-      <w:start w:val="1"/>
-      <w:numFmt w:val="lowerLetter"/>
-      <w:lvlText w:val="%5."/>
-      <w:lvlJc w:val="left"/>
-      <w:pPr>
-        <w:ind w:left="3600" w:hanging="360"/>
-      </w:pPr>
-    </w:lvl>
-    <w:lvl w:ilvl="5" w:tplc="040C001B" w:tentative="1">
-      <w:start w:val="1"/>
-      <w:numFmt w:val="lowerRoman"/>
-      <w:lvlText w:val="%6."/>
-      <w:lvlJc w:val="right"/>
-      <w:pPr>
-        <w:ind w:left="4320" w:hanging="180"/>
-      </w:pPr>
-    </w:lvl>
-    <w:lvl w:ilvl="6" w:tplc="040C000F" w:tentative="1">
-      <w:start w:val="1"/>
-      <w:numFmt w:val="decimal"/>
-      <w:lvlText w:val="%7."/>
-      <w:lvlJc w:val="left"/>
-      <w:pPr>
-        <w:ind w:left="5040" w:hanging="360"/>
-      </w:pPr>
-    </w:lvl>
-    <w:lvl w:ilvl="7" w:tplc="040C0019" w:tentative="1">
-      <w:start w:val="1"/>
-      <w:numFmt w:val="lowerLetter"/>
-      <w:lvlText w:val="%8."/>
-      <w:lvlJc w:val="left"/>
-      <w:pPr>
-        <w:ind w:left="5760" w:hanging="360"/>
-      </w:pPr>
-    </w:lvl>
-    <w:lvl w:ilvl="8" w:tplc="040C001B" w:tentative="1">
-      <w:start w:val="1"/>
-      <w:numFmt w:val="lowerRoman"/>
-      <w:lvlText w:val="%9."/>
-      <w:lvlJc w:val="right"/>
-      <w:pPr>
-        <w:ind w:left="6480" w:hanging="180"/>
-      </w:pPr>
-    </w:lvl>
-  </w:abstractNum>
-  <w:abstractNum w:abstractNumId="3" w15:restartNumberingAfterBreak="0">
-    <w:nsid w:val="2A414C28"/>
-    <w:multiLevelType w:val="multilevel"/>
-    <w:tmpl w:val="9B6627B0"/>
+    <w:tmpl w:val="081ECB4A"/>
     <w:lvl w:ilvl="0">
       <w:start w:val="1"/>
       <w:numFmt w:val="bullet"/>
@@ -16515,7 +17466,657 @@
       </w:rPr>
     </w:lvl>
   </w:abstractNum>
+  <w:abstractNum w:abstractNumId="2" w15:restartNumberingAfterBreak="0">
+    <w:nsid w:val="09CF0D22"/>
+    <w:multiLevelType w:val="multilevel"/>
+    <w:tmpl w:val="2A30CF80"/>
+    <w:lvl w:ilvl="0">
+      <w:start w:val="1"/>
+      <w:numFmt w:val="decimal"/>
+      <w:lvlText w:val="%1."/>
+      <w:lvlJc w:val="left"/>
+      <w:pPr>
+        <w:tabs>
+          <w:tab w:val="num" w:pos="720"/>
+        </w:tabs>
+        <w:ind w:left="720" w:hanging="720"/>
+      </w:pPr>
+    </w:lvl>
+    <w:lvl w:ilvl="1">
+      <w:start w:val="1"/>
+      <w:numFmt w:val="decimal"/>
+      <w:lvlText w:val="%2."/>
+      <w:lvlJc w:val="left"/>
+      <w:pPr>
+        <w:tabs>
+          <w:tab w:val="num" w:pos="1440"/>
+        </w:tabs>
+        <w:ind w:left="1440" w:hanging="720"/>
+      </w:pPr>
+    </w:lvl>
+    <w:lvl w:ilvl="2">
+      <w:start w:val="1"/>
+      <w:numFmt w:val="decimal"/>
+      <w:pStyle w:val="Style3"/>
+      <w:lvlText w:val="%3."/>
+      <w:lvlJc w:val="left"/>
+      <w:pPr>
+        <w:tabs>
+          <w:tab w:val="num" w:pos="2160"/>
+        </w:tabs>
+        <w:ind w:left="2160" w:hanging="720"/>
+      </w:pPr>
+    </w:lvl>
+    <w:lvl w:ilvl="3">
+      <w:start w:val="1"/>
+      <w:numFmt w:val="decimal"/>
+      <w:lvlText w:val="%4."/>
+      <w:lvlJc w:val="left"/>
+      <w:pPr>
+        <w:tabs>
+          <w:tab w:val="num" w:pos="2880"/>
+        </w:tabs>
+        <w:ind w:left="2880" w:hanging="720"/>
+      </w:pPr>
+    </w:lvl>
+    <w:lvl w:ilvl="4">
+      <w:start w:val="1"/>
+      <w:numFmt w:val="decimal"/>
+      <w:lvlText w:val="%5."/>
+      <w:lvlJc w:val="left"/>
+      <w:pPr>
+        <w:tabs>
+          <w:tab w:val="num" w:pos="3600"/>
+        </w:tabs>
+        <w:ind w:left="3600" w:hanging="720"/>
+      </w:pPr>
+    </w:lvl>
+    <w:lvl w:ilvl="5">
+      <w:start w:val="1"/>
+      <w:numFmt w:val="decimal"/>
+      <w:lvlText w:val="%6."/>
+      <w:lvlJc w:val="left"/>
+      <w:pPr>
+        <w:tabs>
+          <w:tab w:val="num" w:pos="4320"/>
+        </w:tabs>
+        <w:ind w:left="4320" w:hanging="720"/>
+      </w:pPr>
+    </w:lvl>
+    <w:lvl w:ilvl="6">
+      <w:start w:val="1"/>
+      <w:numFmt w:val="decimal"/>
+      <w:lvlText w:val="%7."/>
+      <w:lvlJc w:val="left"/>
+      <w:pPr>
+        <w:tabs>
+          <w:tab w:val="num" w:pos="5040"/>
+        </w:tabs>
+        <w:ind w:left="5040" w:hanging="720"/>
+      </w:pPr>
+    </w:lvl>
+    <w:lvl w:ilvl="7">
+      <w:start w:val="1"/>
+      <w:numFmt w:val="decimal"/>
+      <w:lvlText w:val="%8."/>
+      <w:lvlJc w:val="left"/>
+      <w:pPr>
+        <w:tabs>
+          <w:tab w:val="num" w:pos="5760"/>
+        </w:tabs>
+        <w:ind w:left="5760" w:hanging="720"/>
+      </w:pPr>
+    </w:lvl>
+    <w:lvl w:ilvl="8">
+      <w:start w:val="1"/>
+      <w:numFmt w:val="decimal"/>
+      <w:lvlText w:val="%9."/>
+      <w:lvlJc w:val="left"/>
+      <w:pPr>
+        <w:tabs>
+          <w:tab w:val="num" w:pos="6480"/>
+        </w:tabs>
+        <w:ind w:left="6480" w:hanging="720"/>
+      </w:pPr>
+    </w:lvl>
+  </w:abstractNum>
+  <w:abstractNum w:abstractNumId="3" w15:restartNumberingAfterBreak="0">
+    <w:nsid w:val="0A2D0C7F"/>
+    <w:multiLevelType w:val="multilevel"/>
+    <w:tmpl w:val="11240C02"/>
+    <w:lvl w:ilvl="0">
+      <w:start w:val="1"/>
+      <w:numFmt w:val="bullet"/>
+      <w:lvlText w:val=""/>
+      <w:lvlJc w:val="left"/>
+      <w:pPr>
+        <w:tabs>
+          <w:tab w:val="num" w:pos="720"/>
+        </w:tabs>
+        <w:ind w:left="720" w:hanging="360"/>
+      </w:pPr>
+      <w:rPr>
+        <w:rFonts w:ascii="Symbol" w:hAnsi="Symbol" w:hint="default"/>
+        <w:sz w:val="20"/>
+      </w:rPr>
+    </w:lvl>
+    <w:lvl w:ilvl="1" w:tentative="1">
+      <w:start w:val="1"/>
+      <w:numFmt w:val="bullet"/>
+      <w:lvlText w:val="o"/>
+      <w:lvlJc w:val="left"/>
+      <w:pPr>
+        <w:tabs>
+          <w:tab w:val="num" w:pos="1440"/>
+        </w:tabs>
+        <w:ind w:left="1440" w:hanging="360"/>
+      </w:pPr>
+      <w:rPr>
+        <w:rFonts w:ascii="Courier New" w:hAnsi="Courier New" w:hint="default"/>
+        <w:sz w:val="20"/>
+      </w:rPr>
+    </w:lvl>
+    <w:lvl w:ilvl="2" w:tentative="1">
+      <w:start w:val="1"/>
+      <w:numFmt w:val="bullet"/>
+      <w:lvlText w:val=""/>
+      <w:lvlJc w:val="left"/>
+      <w:pPr>
+        <w:tabs>
+          <w:tab w:val="num" w:pos="2160"/>
+        </w:tabs>
+        <w:ind w:left="2160" w:hanging="360"/>
+      </w:pPr>
+      <w:rPr>
+        <w:rFonts w:ascii="Wingdings" w:hAnsi="Wingdings" w:hint="default"/>
+        <w:sz w:val="20"/>
+      </w:rPr>
+    </w:lvl>
+    <w:lvl w:ilvl="3" w:tentative="1">
+      <w:start w:val="1"/>
+      <w:numFmt w:val="bullet"/>
+      <w:lvlText w:val=""/>
+      <w:lvlJc w:val="left"/>
+      <w:pPr>
+        <w:tabs>
+          <w:tab w:val="num" w:pos="2880"/>
+        </w:tabs>
+        <w:ind w:left="2880" w:hanging="360"/>
+      </w:pPr>
+      <w:rPr>
+        <w:rFonts w:ascii="Wingdings" w:hAnsi="Wingdings" w:hint="default"/>
+        <w:sz w:val="20"/>
+      </w:rPr>
+    </w:lvl>
+    <w:lvl w:ilvl="4" w:tentative="1">
+      <w:start w:val="1"/>
+      <w:numFmt w:val="bullet"/>
+      <w:lvlText w:val=""/>
+      <w:lvlJc w:val="left"/>
+      <w:pPr>
+        <w:tabs>
+          <w:tab w:val="num" w:pos="3600"/>
+        </w:tabs>
+        <w:ind w:left="3600" w:hanging="360"/>
+      </w:pPr>
+      <w:rPr>
+        <w:rFonts w:ascii="Wingdings" w:hAnsi="Wingdings" w:hint="default"/>
+        <w:sz w:val="20"/>
+      </w:rPr>
+    </w:lvl>
+    <w:lvl w:ilvl="5" w:tentative="1">
+      <w:start w:val="1"/>
+      <w:numFmt w:val="bullet"/>
+      <w:lvlText w:val=""/>
+      <w:lvlJc w:val="left"/>
+      <w:pPr>
+        <w:tabs>
+          <w:tab w:val="num" w:pos="4320"/>
+        </w:tabs>
+        <w:ind w:left="4320" w:hanging="360"/>
+      </w:pPr>
+      <w:rPr>
+        <w:rFonts w:ascii="Wingdings" w:hAnsi="Wingdings" w:hint="default"/>
+        <w:sz w:val="20"/>
+      </w:rPr>
+    </w:lvl>
+    <w:lvl w:ilvl="6" w:tentative="1">
+      <w:start w:val="1"/>
+      <w:numFmt w:val="bullet"/>
+      <w:lvlText w:val=""/>
+      <w:lvlJc w:val="left"/>
+      <w:pPr>
+        <w:tabs>
+          <w:tab w:val="num" w:pos="5040"/>
+        </w:tabs>
+        <w:ind w:left="5040" w:hanging="360"/>
+      </w:pPr>
+      <w:rPr>
+        <w:rFonts w:ascii="Wingdings" w:hAnsi="Wingdings" w:hint="default"/>
+        <w:sz w:val="20"/>
+      </w:rPr>
+    </w:lvl>
+    <w:lvl w:ilvl="7" w:tentative="1">
+      <w:start w:val="1"/>
+      <w:numFmt w:val="bullet"/>
+      <w:lvlText w:val=""/>
+      <w:lvlJc w:val="left"/>
+      <w:pPr>
+        <w:tabs>
+          <w:tab w:val="num" w:pos="5760"/>
+        </w:tabs>
+        <w:ind w:left="5760" w:hanging="360"/>
+      </w:pPr>
+      <w:rPr>
+        <w:rFonts w:ascii="Wingdings" w:hAnsi="Wingdings" w:hint="default"/>
+        <w:sz w:val="20"/>
+      </w:rPr>
+    </w:lvl>
+    <w:lvl w:ilvl="8" w:tentative="1">
+      <w:start w:val="1"/>
+      <w:numFmt w:val="bullet"/>
+      <w:lvlText w:val=""/>
+      <w:lvlJc w:val="left"/>
+      <w:pPr>
+        <w:tabs>
+          <w:tab w:val="num" w:pos="6480"/>
+        </w:tabs>
+        <w:ind w:left="6480" w:hanging="360"/>
+      </w:pPr>
+      <w:rPr>
+        <w:rFonts w:ascii="Wingdings" w:hAnsi="Wingdings" w:hint="default"/>
+        <w:sz w:val="20"/>
+      </w:rPr>
+    </w:lvl>
+  </w:abstractNum>
   <w:abstractNum w:abstractNumId="4" w15:restartNumberingAfterBreak="0">
+    <w:nsid w:val="1E3E63C6"/>
+    <w:multiLevelType w:val="multilevel"/>
+    <w:tmpl w:val="F7CAA2BE"/>
+    <w:lvl w:ilvl="0">
+      <w:start w:val="1"/>
+      <w:numFmt w:val="bullet"/>
+      <w:lvlText w:val=""/>
+      <w:lvlJc w:val="left"/>
+      <w:pPr>
+        <w:tabs>
+          <w:tab w:val="num" w:pos="720"/>
+        </w:tabs>
+        <w:ind w:left="720" w:hanging="360"/>
+      </w:pPr>
+      <w:rPr>
+        <w:rFonts w:ascii="Symbol" w:hAnsi="Symbol" w:hint="default"/>
+        <w:sz w:val="20"/>
+      </w:rPr>
+    </w:lvl>
+    <w:lvl w:ilvl="1" w:tentative="1">
+      <w:start w:val="1"/>
+      <w:numFmt w:val="bullet"/>
+      <w:lvlText w:val="o"/>
+      <w:lvlJc w:val="left"/>
+      <w:pPr>
+        <w:tabs>
+          <w:tab w:val="num" w:pos="1440"/>
+        </w:tabs>
+        <w:ind w:left="1440" w:hanging="360"/>
+      </w:pPr>
+      <w:rPr>
+        <w:rFonts w:ascii="Courier New" w:hAnsi="Courier New" w:hint="default"/>
+        <w:sz w:val="20"/>
+      </w:rPr>
+    </w:lvl>
+    <w:lvl w:ilvl="2" w:tentative="1">
+      <w:start w:val="1"/>
+      <w:numFmt w:val="bullet"/>
+      <w:lvlText w:val=""/>
+      <w:lvlJc w:val="left"/>
+      <w:pPr>
+        <w:tabs>
+          <w:tab w:val="num" w:pos="2160"/>
+        </w:tabs>
+        <w:ind w:left="2160" w:hanging="360"/>
+      </w:pPr>
+      <w:rPr>
+        <w:rFonts w:ascii="Wingdings" w:hAnsi="Wingdings" w:hint="default"/>
+        <w:sz w:val="20"/>
+      </w:rPr>
+    </w:lvl>
+    <w:lvl w:ilvl="3" w:tentative="1">
+      <w:start w:val="1"/>
+      <w:numFmt w:val="bullet"/>
+      <w:lvlText w:val=""/>
+      <w:lvlJc w:val="left"/>
+      <w:pPr>
+        <w:tabs>
+          <w:tab w:val="num" w:pos="2880"/>
+        </w:tabs>
+        <w:ind w:left="2880" w:hanging="360"/>
+      </w:pPr>
+      <w:rPr>
+        <w:rFonts w:ascii="Wingdings" w:hAnsi="Wingdings" w:hint="default"/>
+        <w:sz w:val="20"/>
+      </w:rPr>
+    </w:lvl>
+    <w:lvl w:ilvl="4" w:tentative="1">
+      <w:start w:val="1"/>
+      <w:numFmt w:val="bullet"/>
+      <w:lvlText w:val=""/>
+      <w:lvlJc w:val="left"/>
+      <w:pPr>
+        <w:tabs>
+          <w:tab w:val="num" w:pos="3600"/>
+        </w:tabs>
+        <w:ind w:left="3600" w:hanging="360"/>
+      </w:pPr>
+      <w:rPr>
+        <w:rFonts w:ascii="Wingdings" w:hAnsi="Wingdings" w:hint="default"/>
+        <w:sz w:val="20"/>
+      </w:rPr>
+    </w:lvl>
+    <w:lvl w:ilvl="5" w:tentative="1">
+      <w:start w:val="1"/>
+      <w:numFmt w:val="bullet"/>
+      <w:lvlText w:val=""/>
+      <w:lvlJc w:val="left"/>
+      <w:pPr>
+        <w:tabs>
+          <w:tab w:val="num" w:pos="4320"/>
+        </w:tabs>
+        <w:ind w:left="4320" w:hanging="360"/>
+      </w:pPr>
+      <w:rPr>
+        <w:rFonts w:ascii="Wingdings" w:hAnsi="Wingdings" w:hint="default"/>
+        <w:sz w:val="20"/>
+      </w:rPr>
+    </w:lvl>
+    <w:lvl w:ilvl="6" w:tentative="1">
+      <w:start w:val="1"/>
+      <w:numFmt w:val="bullet"/>
+      <w:lvlText w:val=""/>
+      <w:lvlJc w:val="left"/>
+      <w:pPr>
+        <w:tabs>
+          <w:tab w:val="num" w:pos="5040"/>
+        </w:tabs>
+        <w:ind w:left="5040" w:hanging="360"/>
+      </w:pPr>
+      <w:rPr>
+        <w:rFonts w:ascii="Wingdings" w:hAnsi="Wingdings" w:hint="default"/>
+        <w:sz w:val="20"/>
+      </w:rPr>
+    </w:lvl>
+    <w:lvl w:ilvl="7" w:tentative="1">
+      <w:start w:val="1"/>
+      <w:numFmt w:val="bullet"/>
+      <w:lvlText w:val=""/>
+      <w:lvlJc w:val="left"/>
+      <w:pPr>
+        <w:tabs>
+          <w:tab w:val="num" w:pos="5760"/>
+        </w:tabs>
+        <w:ind w:left="5760" w:hanging="360"/>
+      </w:pPr>
+      <w:rPr>
+        <w:rFonts w:ascii="Wingdings" w:hAnsi="Wingdings" w:hint="default"/>
+        <w:sz w:val="20"/>
+      </w:rPr>
+    </w:lvl>
+    <w:lvl w:ilvl="8" w:tentative="1">
+      <w:start w:val="1"/>
+      <w:numFmt w:val="bullet"/>
+      <w:lvlText w:val=""/>
+      <w:lvlJc w:val="left"/>
+      <w:pPr>
+        <w:tabs>
+          <w:tab w:val="num" w:pos="6480"/>
+        </w:tabs>
+        <w:ind w:left="6480" w:hanging="360"/>
+      </w:pPr>
+      <w:rPr>
+        <w:rFonts w:ascii="Wingdings" w:hAnsi="Wingdings" w:hint="default"/>
+        <w:sz w:val="20"/>
+      </w:rPr>
+    </w:lvl>
+  </w:abstractNum>
+  <w:abstractNum w:abstractNumId="5" w15:restartNumberingAfterBreak="0">
+    <w:nsid w:val="24883C9E"/>
+    <w:multiLevelType w:val="hybridMultilevel"/>
+    <w:tmpl w:val="4E5C84B2"/>
+    <w:lvl w:ilvl="0" w:tplc="E7867D66">
+      <w:start w:val="1"/>
+      <w:numFmt w:val="upperRoman"/>
+      <w:lvlText w:val="%1."/>
+      <w:lvlJc w:val="left"/>
+      <w:pPr>
+        <w:ind w:left="1080" w:hanging="720"/>
+      </w:pPr>
+      <w:rPr>
+        <w:rFonts w:hint="default"/>
+      </w:rPr>
+    </w:lvl>
+    <w:lvl w:ilvl="1" w:tplc="040C0019" w:tentative="1">
+      <w:start w:val="1"/>
+      <w:numFmt w:val="lowerLetter"/>
+      <w:lvlText w:val="%2."/>
+      <w:lvlJc w:val="left"/>
+      <w:pPr>
+        <w:ind w:left="1440" w:hanging="360"/>
+      </w:pPr>
+    </w:lvl>
+    <w:lvl w:ilvl="2" w:tplc="040C001B" w:tentative="1">
+      <w:start w:val="1"/>
+      <w:numFmt w:val="lowerRoman"/>
+      <w:lvlText w:val="%3."/>
+      <w:lvlJc w:val="right"/>
+      <w:pPr>
+        <w:ind w:left="2160" w:hanging="180"/>
+      </w:pPr>
+    </w:lvl>
+    <w:lvl w:ilvl="3" w:tplc="040C000F" w:tentative="1">
+      <w:start w:val="1"/>
+      <w:numFmt w:val="decimal"/>
+      <w:lvlText w:val="%4."/>
+      <w:lvlJc w:val="left"/>
+      <w:pPr>
+        <w:ind w:left="2880" w:hanging="360"/>
+      </w:pPr>
+    </w:lvl>
+    <w:lvl w:ilvl="4" w:tplc="040C0019" w:tentative="1">
+      <w:start w:val="1"/>
+      <w:numFmt w:val="lowerLetter"/>
+      <w:lvlText w:val="%5."/>
+      <w:lvlJc w:val="left"/>
+      <w:pPr>
+        <w:ind w:left="3600" w:hanging="360"/>
+      </w:pPr>
+    </w:lvl>
+    <w:lvl w:ilvl="5" w:tplc="040C001B" w:tentative="1">
+      <w:start w:val="1"/>
+      <w:numFmt w:val="lowerRoman"/>
+      <w:lvlText w:val="%6."/>
+      <w:lvlJc w:val="right"/>
+      <w:pPr>
+        <w:ind w:left="4320" w:hanging="180"/>
+      </w:pPr>
+    </w:lvl>
+    <w:lvl w:ilvl="6" w:tplc="040C000F" w:tentative="1">
+      <w:start w:val="1"/>
+      <w:numFmt w:val="decimal"/>
+      <w:lvlText w:val="%7."/>
+      <w:lvlJc w:val="left"/>
+      <w:pPr>
+        <w:ind w:left="5040" w:hanging="360"/>
+      </w:pPr>
+    </w:lvl>
+    <w:lvl w:ilvl="7" w:tplc="040C0019" w:tentative="1">
+      <w:start w:val="1"/>
+      <w:numFmt w:val="lowerLetter"/>
+      <w:lvlText w:val="%8."/>
+      <w:lvlJc w:val="left"/>
+      <w:pPr>
+        <w:ind w:left="5760" w:hanging="360"/>
+      </w:pPr>
+    </w:lvl>
+    <w:lvl w:ilvl="8" w:tplc="040C001B" w:tentative="1">
+      <w:start w:val="1"/>
+      <w:numFmt w:val="lowerRoman"/>
+      <w:lvlText w:val="%9."/>
+      <w:lvlJc w:val="right"/>
+      <w:pPr>
+        <w:ind w:left="6480" w:hanging="180"/>
+      </w:pPr>
+    </w:lvl>
+  </w:abstractNum>
+  <w:abstractNum w:abstractNumId="6" w15:restartNumberingAfterBreak="0">
+    <w:nsid w:val="2A414C28"/>
+    <w:multiLevelType w:val="multilevel"/>
+    <w:tmpl w:val="9B6627B0"/>
+    <w:lvl w:ilvl="0">
+      <w:start w:val="1"/>
+      <w:numFmt w:val="bullet"/>
+      <w:lvlText w:val=""/>
+      <w:lvlJc w:val="left"/>
+      <w:pPr>
+        <w:tabs>
+          <w:tab w:val="num" w:pos="720"/>
+        </w:tabs>
+        <w:ind w:left="720" w:hanging="360"/>
+      </w:pPr>
+      <w:rPr>
+        <w:rFonts w:ascii="Symbol" w:hAnsi="Symbol" w:hint="default"/>
+        <w:sz w:val="20"/>
+      </w:rPr>
+    </w:lvl>
+    <w:lvl w:ilvl="1" w:tentative="1">
+      <w:start w:val="1"/>
+      <w:numFmt w:val="bullet"/>
+      <w:lvlText w:val="o"/>
+      <w:lvlJc w:val="left"/>
+      <w:pPr>
+        <w:tabs>
+          <w:tab w:val="num" w:pos="1440"/>
+        </w:tabs>
+        <w:ind w:left="1440" w:hanging="360"/>
+      </w:pPr>
+      <w:rPr>
+        <w:rFonts w:ascii="Courier New" w:hAnsi="Courier New" w:hint="default"/>
+        <w:sz w:val="20"/>
+      </w:rPr>
+    </w:lvl>
+    <w:lvl w:ilvl="2" w:tentative="1">
+      <w:start w:val="1"/>
+      <w:numFmt w:val="bullet"/>
+      <w:lvlText w:val=""/>
+      <w:lvlJc w:val="left"/>
+      <w:pPr>
+        <w:tabs>
+          <w:tab w:val="num" w:pos="2160"/>
+        </w:tabs>
+        <w:ind w:left="2160" w:hanging="360"/>
+      </w:pPr>
+      <w:rPr>
+        <w:rFonts w:ascii="Wingdings" w:hAnsi="Wingdings" w:hint="default"/>
+        <w:sz w:val="20"/>
+      </w:rPr>
+    </w:lvl>
+    <w:lvl w:ilvl="3" w:tentative="1">
+      <w:start w:val="1"/>
+      <w:numFmt w:val="bullet"/>
+      <w:lvlText w:val=""/>
+      <w:lvlJc w:val="left"/>
+      <w:pPr>
+        <w:tabs>
+          <w:tab w:val="num" w:pos="2880"/>
+        </w:tabs>
+        <w:ind w:left="2880" w:hanging="360"/>
+      </w:pPr>
+      <w:rPr>
+        <w:rFonts w:ascii="Wingdings" w:hAnsi="Wingdings" w:hint="default"/>
+        <w:sz w:val="20"/>
+      </w:rPr>
+    </w:lvl>
+    <w:lvl w:ilvl="4" w:tentative="1">
+      <w:start w:val="1"/>
+      <w:numFmt w:val="bullet"/>
+      <w:lvlText w:val=""/>
+      <w:lvlJc w:val="left"/>
+      <w:pPr>
+        <w:tabs>
+          <w:tab w:val="num" w:pos="3600"/>
+        </w:tabs>
+        <w:ind w:left="3600" w:hanging="360"/>
+      </w:pPr>
+      <w:rPr>
+        <w:rFonts w:ascii="Wingdings" w:hAnsi="Wingdings" w:hint="default"/>
+        <w:sz w:val="20"/>
+      </w:rPr>
+    </w:lvl>
+    <w:lvl w:ilvl="5" w:tentative="1">
+      <w:start w:val="1"/>
+      <w:numFmt w:val="bullet"/>
+      <w:lvlText w:val=""/>
+      <w:lvlJc w:val="left"/>
+      <w:pPr>
+        <w:tabs>
+          <w:tab w:val="num" w:pos="4320"/>
+        </w:tabs>
+        <w:ind w:left="4320" w:hanging="360"/>
+      </w:pPr>
+      <w:rPr>
+        <w:rFonts w:ascii="Wingdings" w:hAnsi="Wingdings" w:hint="default"/>
+        <w:sz w:val="20"/>
+      </w:rPr>
+    </w:lvl>
+    <w:lvl w:ilvl="6" w:tentative="1">
+      <w:start w:val="1"/>
+      <w:numFmt w:val="bullet"/>
+      <w:lvlText w:val=""/>
+      <w:lvlJc w:val="left"/>
+      <w:pPr>
+        <w:tabs>
+          <w:tab w:val="num" w:pos="5040"/>
+        </w:tabs>
+        <w:ind w:left="5040" w:hanging="360"/>
+      </w:pPr>
+      <w:rPr>
+        <w:rFonts w:ascii="Wingdings" w:hAnsi="Wingdings" w:hint="default"/>
+        <w:sz w:val="20"/>
+      </w:rPr>
+    </w:lvl>
+    <w:lvl w:ilvl="7" w:tentative="1">
+      <w:start w:val="1"/>
+      <w:numFmt w:val="bullet"/>
+      <w:lvlText w:val=""/>
+      <w:lvlJc w:val="left"/>
+      <w:pPr>
+        <w:tabs>
+          <w:tab w:val="num" w:pos="5760"/>
+        </w:tabs>
+        <w:ind w:left="5760" w:hanging="360"/>
+      </w:pPr>
+      <w:rPr>
+        <w:rFonts w:ascii="Wingdings" w:hAnsi="Wingdings" w:hint="default"/>
+        <w:sz w:val="20"/>
+      </w:rPr>
+    </w:lvl>
+    <w:lvl w:ilvl="8" w:tentative="1">
+      <w:start w:val="1"/>
+      <w:numFmt w:val="bullet"/>
+      <w:lvlText w:val=""/>
+      <w:lvlJc w:val="left"/>
+      <w:pPr>
+        <w:tabs>
+          <w:tab w:val="num" w:pos="6480"/>
+        </w:tabs>
+        <w:ind w:left="6480" w:hanging="360"/>
+      </w:pPr>
+      <w:rPr>
+        <w:rFonts w:ascii="Wingdings" w:hAnsi="Wingdings" w:hint="default"/>
+        <w:sz w:val="20"/>
+      </w:rPr>
+    </w:lvl>
+  </w:abstractNum>
+  <w:abstractNum w:abstractNumId="7" w15:restartNumberingAfterBreak="0">
     <w:nsid w:val="2D723CA5"/>
     <w:multiLevelType w:val="multilevel"/>
     <w:tmpl w:val="D918213C"/>
@@ -16637,7 +18238,7 @@
       </w:rPr>
     </w:lvl>
   </w:abstractNum>
-  <w:abstractNum w:abstractNumId="5" w15:restartNumberingAfterBreak="0">
+  <w:abstractNum w:abstractNumId="8" w15:restartNumberingAfterBreak="0">
     <w:nsid w:val="46A607E6"/>
     <w:multiLevelType w:val="hybridMultilevel"/>
     <w:tmpl w:val="135059C2"/>
@@ -16727,7 +18328,7 @@
       </w:pPr>
     </w:lvl>
   </w:abstractNum>
-  <w:abstractNum w:abstractNumId="6" w15:restartNumberingAfterBreak="0">
+  <w:abstractNum w:abstractNumId="9" w15:restartNumberingAfterBreak="0">
     <w:nsid w:val="60893A48"/>
     <w:multiLevelType w:val="multilevel"/>
     <w:tmpl w:val="5C942294"/>
@@ -16840,10 +18441,10 @@
       </w:pPr>
     </w:lvl>
   </w:abstractNum>
-  <w:abstractNum w:abstractNumId="7" w15:restartNumberingAfterBreak="0">
-    <w:nsid w:val="79C13CBB"/>
+  <w:abstractNum w:abstractNumId="10" w15:restartNumberingAfterBreak="0">
+    <w:nsid w:val="78C322A2"/>
     <w:multiLevelType w:val="multilevel"/>
-    <w:tmpl w:val="2CBA604A"/>
+    <w:tmpl w:val="B81455C0"/>
     <w:lvl w:ilvl="0">
       <w:start w:val="1"/>
       <w:numFmt w:val="bullet"/>
@@ -16989,10 +18590,10 @@
       </w:rPr>
     </w:lvl>
   </w:abstractNum>
-  <w:abstractNum w:abstractNumId="8" w15:restartNumberingAfterBreak="0">
-    <w:nsid w:val="7CB03DF9"/>
+  <w:abstractNum w:abstractNumId="11" w15:restartNumberingAfterBreak="0">
+    <w:nsid w:val="79C13CBB"/>
     <w:multiLevelType w:val="multilevel"/>
-    <w:tmpl w:val="72386C7E"/>
+    <w:tmpl w:val="2CBA604A"/>
     <w:lvl w:ilvl="0">
       <w:start w:val="1"/>
       <w:numFmt w:val="bullet"/>
@@ -17138,7 +18739,156 @@
       </w:rPr>
     </w:lvl>
   </w:abstractNum>
-  <w:abstractNum w:abstractNumId="9" w15:restartNumberingAfterBreak="0">
+  <w:abstractNum w:abstractNumId="12" w15:restartNumberingAfterBreak="0">
+    <w:nsid w:val="7CB03DF9"/>
+    <w:multiLevelType w:val="multilevel"/>
+    <w:tmpl w:val="72386C7E"/>
+    <w:lvl w:ilvl="0">
+      <w:start w:val="1"/>
+      <w:numFmt w:val="bullet"/>
+      <w:lvlText w:val=""/>
+      <w:lvlJc w:val="left"/>
+      <w:pPr>
+        <w:tabs>
+          <w:tab w:val="num" w:pos="720"/>
+        </w:tabs>
+        <w:ind w:left="720" w:hanging="360"/>
+      </w:pPr>
+      <w:rPr>
+        <w:rFonts w:ascii="Symbol" w:hAnsi="Symbol" w:hint="default"/>
+        <w:sz w:val="20"/>
+      </w:rPr>
+    </w:lvl>
+    <w:lvl w:ilvl="1" w:tentative="1">
+      <w:start w:val="1"/>
+      <w:numFmt w:val="bullet"/>
+      <w:lvlText w:val="o"/>
+      <w:lvlJc w:val="left"/>
+      <w:pPr>
+        <w:tabs>
+          <w:tab w:val="num" w:pos="1440"/>
+        </w:tabs>
+        <w:ind w:left="1440" w:hanging="360"/>
+      </w:pPr>
+      <w:rPr>
+        <w:rFonts w:ascii="Courier New" w:hAnsi="Courier New" w:hint="default"/>
+        <w:sz w:val="20"/>
+      </w:rPr>
+    </w:lvl>
+    <w:lvl w:ilvl="2" w:tentative="1">
+      <w:start w:val="1"/>
+      <w:numFmt w:val="bullet"/>
+      <w:lvlText w:val=""/>
+      <w:lvlJc w:val="left"/>
+      <w:pPr>
+        <w:tabs>
+          <w:tab w:val="num" w:pos="2160"/>
+        </w:tabs>
+        <w:ind w:left="2160" w:hanging="360"/>
+      </w:pPr>
+      <w:rPr>
+        <w:rFonts w:ascii="Wingdings" w:hAnsi="Wingdings" w:hint="default"/>
+        <w:sz w:val="20"/>
+      </w:rPr>
+    </w:lvl>
+    <w:lvl w:ilvl="3" w:tentative="1">
+      <w:start w:val="1"/>
+      <w:numFmt w:val="bullet"/>
+      <w:lvlText w:val=""/>
+      <w:lvlJc w:val="left"/>
+      <w:pPr>
+        <w:tabs>
+          <w:tab w:val="num" w:pos="2880"/>
+        </w:tabs>
+        <w:ind w:left="2880" w:hanging="360"/>
+      </w:pPr>
+      <w:rPr>
+        <w:rFonts w:ascii="Wingdings" w:hAnsi="Wingdings" w:hint="default"/>
+        <w:sz w:val="20"/>
+      </w:rPr>
+    </w:lvl>
+    <w:lvl w:ilvl="4" w:tentative="1">
+      <w:start w:val="1"/>
+      <w:numFmt w:val="bullet"/>
+      <w:lvlText w:val=""/>
+      <w:lvlJc w:val="left"/>
+      <w:pPr>
+        <w:tabs>
+          <w:tab w:val="num" w:pos="3600"/>
+        </w:tabs>
+        <w:ind w:left="3600" w:hanging="360"/>
+      </w:pPr>
+      <w:rPr>
+        <w:rFonts w:ascii="Wingdings" w:hAnsi="Wingdings" w:hint="default"/>
+        <w:sz w:val="20"/>
+      </w:rPr>
+    </w:lvl>
+    <w:lvl w:ilvl="5" w:tentative="1">
+      <w:start w:val="1"/>
+      <w:numFmt w:val="bullet"/>
+      <w:lvlText w:val=""/>
+      <w:lvlJc w:val="left"/>
+      <w:pPr>
+        <w:tabs>
+          <w:tab w:val="num" w:pos="4320"/>
+        </w:tabs>
+        <w:ind w:left="4320" w:hanging="360"/>
+      </w:pPr>
+      <w:rPr>
+        <w:rFonts w:ascii="Wingdings" w:hAnsi="Wingdings" w:hint="default"/>
+        <w:sz w:val="20"/>
+      </w:rPr>
+    </w:lvl>
+    <w:lvl w:ilvl="6" w:tentative="1">
+      <w:start w:val="1"/>
+      <w:numFmt w:val="bullet"/>
+      <w:lvlText w:val=""/>
+      <w:lvlJc w:val="left"/>
+      <w:pPr>
+        <w:tabs>
+          <w:tab w:val="num" w:pos="5040"/>
+        </w:tabs>
+        <w:ind w:left="5040" w:hanging="360"/>
+      </w:pPr>
+      <w:rPr>
+        <w:rFonts w:ascii="Wingdings" w:hAnsi="Wingdings" w:hint="default"/>
+        <w:sz w:val="20"/>
+      </w:rPr>
+    </w:lvl>
+    <w:lvl w:ilvl="7" w:tentative="1">
+      <w:start w:val="1"/>
+      <w:numFmt w:val="bullet"/>
+      <w:lvlText w:val=""/>
+      <w:lvlJc w:val="left"/>
+      <w:pPr>
+        <w:tabs>
+          <w:tab w:val="num" w:pos="5760"/>
+        </w:tabs>
+        <w:ind w:left="5760" w:hanging="360"/>
+      </w:pPr>
+      <w:rPr>
+        <w:rFonts w:ascii="Wingdings" w:hAnsi="Wingdings" w:hint="default"/>
+        <w:sz w:val="20"/>
+      </w:rPr>
+    </w:lvl>
+    <w:lvl w:ilvl="8" w:tentative="1">
+      <w:start w:val="1"/>
+      <w:numFmt w:val="bullet"/>
+      <w:lvlText w:val=""/>
+      <w:lvlJc w:val="left"/>
+      <w:pPr>
+        <w:tabs>
+          <w:tab w:val="num" w:pos="6480"/>
+        </w:tabs>
+        <w:ind w:left="6480" w:hanging="360"/>
+      </w:pPr>
+      <w:rPr>
+        <w:rFonts w:ascii="Wingdings" w:hAnsi="Wingdings" w:hint="default"/>
+        <w:sz w:val="20"/>
+      </w:rPr>
+    </w:lvl>
+  </w:abstractNum>
+  <w:abstractNum w:abstractNumId="13" w15:restartNumberingAfterBreak="0">
     <w:nsid w:val="7DC300AF"/>
     <w:multiLevelType w:val="multilevel"/>
     <w:tmpl w:val="BF605950"/>
@@ -17294,22 +19044,22 @@
     <w:abstractNumId w:val="0"/>
   </w:num>
   <w:num w:numId="3" w16cid:durableId="179272190">
-    <w:abstractNumId w:val="5"/>
+    <w:abstractNumId w:val="8"/>
   </w:num>
   <w:num w:numId="4" w16cid:durableId="1726951559">
     <w:abstractNumId w:val="0"/>
   </w:num>
   <w:num w:numId="5" w16cid:durableId="222564225">
-    <w:abstractNumId w:val="5"/>
+    <w:abstractNumId w:val="8"/>
   </w:num>
   <w:num w:numId="6" w16cid:durableId="1607932179">
-    <w:abstractNumId w:val="5"/>
+    <w:abstractNumId w:val="8"/>
   </w:num>
   <w:num w:numId="7" w16cid:durableId="1342976328">
     <w:abstractNumId w:val="0"/>
   </w:num>
   <w:num w:numId="8" w16cid:durableId="1238787394">
-    <w:abstractNumId w:val="5"/>
+    <w:abstractNumId w:val="8"/>
   </w:num>
   <w:num w:numId="9" w16cid:durableId="42946975">
     <w:abstractNumId w:val="0"/>
@@ -17318,13 +19068,13 @@
     <w:abstractNumId w:val="0"/>
   </w:num>
   <w:num w:numId="11" w16cid:durableId="1925989633">
-    <w:abstractNumId w:val="1"/>
+    <w:abstractNumId w:val="2"/>
   </w:num>
   <w:num w:numId="12" w16cid:durableId="1641106551">
-    <w:abstractNumId w:val="2"/>
+    <w:abstractNumId w:val="5"/>
   </w:num>
   <w:num w:numId="13" w16cid:durableId="667098620">
-    <w:abstractNumId w:val="6"/>
+    <w:abstractNumId w:val="9"/>
     <w:lvlOverride w:ilvl="0">
       <w:lvl w:ilvl="0">
         <w:numFmt w:val="decimal"/>
@@ -17334,19 +19084,31 @@
     </w:lvlOverride>
   </w:num>
   <w:num w:numId="14" w16cid:durableId="823549384">
+    <w:abstractNumId w:val="7"/>
+  </w:num>
+  <w:num w:numId="15" w16cid:durableId="1621296706">
+    <w:abstractNumId w:val="13"/>
+  </w:num>
+  <w:num w:numId="16" w16cid:durableId="69473505">
+    <w:abstractNumId w:val="6"/>
+  </w:num>
+  <w:num w:numId="17" w16cid:durableId="1101879510">
+    <w:abstractNumId w:val="11"/>
+  </w:num>
+  <w:num w:numId="18" w16cid:durableId="1151560571">
+    <w:abstractNumId w:val="12"/>
+  </w:num>
+  <w:num w:numId="19" w16cid:durableId="2052270099">
     <w:abstractNumId w:val="4"/>
   </w:num>
-  <w:num w:numId="15" w16cid:durableId="1621296706">
-    <w:abstractNumId w:val="9"/>
-  </w:num>
-  <w:num w:numId="16" w16cid:durableId="69473505">
+  <w:num w:numId="20" w16cid:durableId="201983089">
     <w:abstractNumId w:val="3"/>
   </w:num>
-  <w:num w:numId="17" w16cid:durableId="1101879510">
-    <w:abstractNumId w:val="7"/>
+  <w:num w:numId="21" w16cid:durableId="843974525">
+    <w:abstractNumId w:val="1"/>
   </w:num>
-  <w:num w:numId="18" w16cid:durableId="1151560571">
-    <w:abstractNumId w:val="8"/>
+  <w:num w:numId="22" w16cid:durableId="490949750">
+    <w:abstractNumId w:val="10"/>
   </w:num>
 </w:numbering>
 </file>
@@ -17796,7 +19558,7 @@
     <w:uiPriority w:val="9"/>
     <w:unhideWhenUsed/>
     <w:qFormat/>
-    <w:rsid w:val="00CE54E1"/>
+    <w:rsid w:val="007B21E7"/>
     <w:pPr>
       <w:keepNext/>
       <w:keepLines/>
@@ -17844,7 +19606,7 @@
     <w:uiPriority w:val="9"/>
     <w:unhideWhenUsed/>
     <w:qFormat/>
-    <w:rsid w:val="00685639"/>
+    <w:rsid w:val="007B21E7"/>
     <w:pPr>
       <w:keepNext/>
       <w:keepLines/>
@@ -17857,6 +19619,7 @@
       <w:i/>
       <w:iCs/>
       <w:sz w:val="28"/>
+      <w:lang w:val="en-US"/>
     </w:rPr>
   </w:style>
   <w:style w:type="paragraph" w:styleId="Heading5">
@@ -17949,7 +19712,7 @@
     <w:basedOn w:val="DefaultParagraphFont"/>
     <w:link w:val="Heading2"/>
     <w:uiPriority w:val="9"/>
-    <w:rsid w:val="00CE54E1"/>
+    <w:rsid w:val="007B21E7"/>
     <w:rPr>
       <w:rFonts w:ascii="Neutra Text" w:eastAsiaTheme="majorEastAsia" w:hAnsi="Neutra Text" w:cstheme="majorBidi"/>
       <w:smallCaps/>
@@ -18431,13 +20194,14 @@
     <w:basedOn w:val="DefaultParagraphFont"/>
     <w:link w:val="Heading4"/>
     <w:uiPriority w:val="9"/>
-    <w:rsid w:val="00685639"/>
+    <w:rsid w:val="007B21E7"/>
     <w:rPr>
       <w:rFonts w:ascii="Neutra Text" w:eastAsiaTheme="majorEastAsia" w:hAnsi="Neutra Text" w:cstheme="majorBidi"/>
       <w:b/>
       <w:i/>
       <w:iCs/>
       <w:sz w:val="28"/>
+      <w:lang w:val="en-US"/>
     </w:rPr>
   </w:style>
   <w:style w:type="character" w:customStyle="1" w:styleId="Style4Car">
@@ -18721,6 +20485,32 @@
       <w:color w:val="44546A" w:themeColor="text2"/>
       <w:sz w:val="18"/>
       <w:szCs w:val="18"/>
+    </w:rPr>
+  </w:style>
+  <w:style w:type="paragraph" w:customStyle="1" w:styleId="font-claude-response-body">
+    <w:name w:val="font-claude-response-body"/>
+    <w:basedOn w:val="Normal"/>
+    <w:rsid w:val="007B21E7"/>
+    <w:pPr>
+      <w:spacing w:before="100" w:beforeAutospacing="1" w:after="100" w:afterAutospacing="1" w:line="240" w:lineRule="auto"/>
+      <w:jc w:val="left"/>
+    </w:pPr>
+    <w:rPr>
+      <w:rFonts w:ascii="Times New Roman" w:eastAsia="Times New Roman" w:hAnsi="Times New Roman" w:cs="Times New Roman"/>
+      <w:sz w:val="24"/>
+      <w:szCs w:val="24"/>
+      <w:lang w:val="en-FR" w:eastAsia="en-GB"/>
+    </w:rPr>
+  </w:style>
+  <w:style w:type="character" w:styleId="Strong">
+    <w:name w:val="Strong"/>
+    <w:basedOn w:val="DefaultParagraphFont"/>
+    <w:uiPriority w:val="22"/>
+    <w:qFormat/>
+    <w:rsid w:val="007B21E7"/>
+    <w:rPr>
+      <w:b/>
+      <w:bCs/>
     </w:rPr>
   </w:style>
 </w:styles>

</xml_diff>

<commit_message>
Methodo and results complete
</commit_message>
<xml_diff>
--- a/my_report/Thesis_Report_English.docx
+++ b/my_report/Thesis_Report_English.docx
@@ -13219,7 +13219,7 @@
           <w:noProof/>
         </w:rPr>
         <w:pict w14:anchorId="31D40C4A">
-          <v:rect id="_x0000_i1025" alt="" style="width:451.3pt;height:.05pt;mso-width-percent:0;mso-height-percent:0;mso-width-percent:0;mso-height-percent:0" o:hralign="center" o:hrstd="t" o:hr="t" fillcolor="#a0a0a0" stroked="f"/>
+          <v:rect id="_x0000_i1029" alt="" style="width:451.3pt;height:.05pt;mso-width-percent:0;mso-height-percent:0;mso-width-percent:0;mso-height-percent:0" o:hralign="center" o:hrstd="t" o:hr="t" fillcolor="#a0a0a0" stroked="f"/>
         </w:pict>
       </w:r>
     </w:p>
@@ -16088,21 +16088,2525 @@
       </w:r>
     </w:p>
     <w:p/>
+    <w:p>
+      <w:pPr>
+        <w:pStyle w:val="Heading3"/>
+        <w:rPr>
+          <w:rFonts w:ascii="Times New Roman" w:hAnsi="Times New Roman"/>
+        </w:rPr>
+      </w:pPr>
+      <w:r>
+        <w:rPr>
+          <w:rStyle w:val="Strong"/>
+          <w:b/>
+          <w:bCs/>
+        </w:rPr>
+        <w:lastRenderedPageBreak/>
+        <w:t>5.1 L'Expertise Antérieure comme Prédicteur Principal de l'Intégration</w:t>
+      </w:r>
+    </w:p>
+    <w:p>
+      <w:pPr>
+        <w:pStyle w:val="font-claude-response-body"/>
+      </w:pPr>
+      <w:r>
+        <w:t xml:space="preserve">L'analyse comparative des trois groupes d'expertise révèle un pattern dominante : </w:t>
+      </w:r>
+      <w:r>
+        <w:rPr>
+          <w:rStyle w:val="Strong"/>
+          <w:rFonts w:eastAsiaTheme="majorEastAsia"/>
+        </w:rPr>
+        <w:t>le niveau d'expertise technologique antérieure prédit fortement comment les enseignants évaluent et intègrent l'IA générative</w:t>
+      </w:r>
+      <w:r>
+        <w:t>. Plutôt que d'être une simple question d'aisance technique, l'expertise transforme la capacité fondamentale à formuler des attentes claires, à évaluer rapidement les outputs, et à négocier intentionnellement entre suggestions et besoins pédagogiques.</w:t>
+      </w:r>
+    </w:p>
+    <w:p>
+      <w:pPr>
+        <w:pStyle w:val="font-claude-response-body"/>
+      </w:pPr>
+      <w:r>
+        <w:rPr>
+          <w:rStyle w:val="Strong"/>
+          <w:rFonts w:eastAsiaTheme="majorEastAsia"/>
+        </w:rPr>
+        <w:t>Tableau 1 : Stratégie d'Intégration par Niveau d'Expertise</w:t>
+      </w:r>
+    </w:p>
+    <w:tbl>
+      <w:tblPr>
+        <w:tblW w:w="0" w:type="auto"/>
+        <w:tblCellSpacing w:w="15" w:type="dxa"/>
+        <w:tblCellMar>
+          <w:top w:w="15" w:type="dxa"/>
+          <w:left w:w="15" w:type="dxa"/>
+          <w:bottom w:w="15" w:type="dxa"/>
+          <w:right w:w="15" w:type="dxa"/>
+        </w:tblCellMar>
+        <w:tblLook w:val="04A0" w:firstRow="1" w:lastRow="0" w:firstColumn="1" w:lastColumn="0" w:noHBand="0" w:noVBand="1"/>
+      </w:tblPr>
+      <w:tblGrid>
+        <w:gridCol w:w="1599"/>
+        <w:gridCol w:w="2557"/>
+        <w:gridCol w:w="1594"/>
+        <w:gridCol w:w="3322"/>
+      </w:tblGrid>
+      <w:tr>
+        <w:trPr>
+          <w:tblHeader/>
+          <w:tblCellSpacing w:w="15" w:type="dxa"/>
+        </w:trPr>
+        <w:tc>
+          <w:tcPr>
+            <w:tcW w:w="0" w:type="auto"/>
+            <w:vAlign w:val="center"/>
+            <w:hideMark/>
+          </w:tcPr>
+          <w:p>
+            <w:pPr>
+              <w:jc w:val="center"/>
+              <w:rPr>
+                <w:b/>
+                <w:bCs/>
+              </w:rPr>
+            </w:pPr>
+            <w:r>
+              <w:rPr>
+                <w:b/>
+                <w:bCs/>
+              </w:rPr>
+              <w:t>Niveau d'Expertise</w:t>
+            </w:r>
+          </w:p>
+        </w:tc>
+        <w:tc>
+          <w:tcPr>
+            <w:tcW w:w="0" w:type="auto"/>
+            <w:vAlign w:val="center"/>
+            <w:hideMark/>
+          </w:tcPr>
+          <w:p>
+            <w:pPr>
+              <w:jc w:val="center"/>
+              <w:rPr>
+                <w:b/>
+                <w:bCs/>
+              </w:rPr>
+            </w:pPr>
+            <w:r>
+              <w:rPr>
+                <w:b/>
+                <w:bCs/>
+              </w:rPr>
+              <w:t>Acceptance/Rejection</w:t>
+            </w:r>
+          </w:p>
+        </w:tc>
+        <w:tc>
+          <w:tcPr>
+            <w:tcW w:w="0" w:type="auto"/>
+            <w:vAlign w:val="center"/>
+            <w:hideMark/>
+          </w:tcPr>
+          <w:p>
+            <w:pPr>
+              <w:jc w:val="center"/>
+              <w:rPr>
+                <w:b/>
+                <w:bCs/>
+              </w:rPr>
+            </w:pPr>
+            <w:r>
+              <w:rPr>
+                <w:b/>
+                <w:bCs/>
+              </w:rPr>
+              <w:t>Stratégie Observée</w:t>
+            </w:r>
+          </w:p>
+        </w:tc>
+        <w:tc>
+          <w:tcPr>
+            <w:tcW w:w="0" w:type="auto"/>
+            <w:vAlign w:val="center"/>
+            <w:hideMark/>
+          </w:tcPr>
+          <w:p>
+            <w:pPr>
+              <w:jc w:val="center"/>
+              <w:rPr>
+                <w:b/>
+                <w:bCs/>
+              </w:rPr>
+            </w:pPr>
+            <w:r>
+              <w:rPr>
+                <w:b/>
+                <w:bCs/>
+              </w:rPr>
+              <w:t>Caractéristique Clé</w:t>
+            </w:r>
+          </w:p>
+        </w:tc>
+      </w:tr>
+      <w:tr>
+        <w:trPr>
+          <w:tblCellSpacing w:w="15" w:type="dxa"/>
+        </w:trPr>
+        <w:tc>
+          <w:tcPr>
+            <w:tcW w:w="0" w:type="auto"/>
+            <w:vAlign w:val="center"/>
+            <w:hideMark/>
+          </w:tcPr>
+          <w:p>
+            <w:pPr>
+              <w:jc w:val="left"/>
+            </w:pPr>
+            <w:r>
+              <w:rPr>
+                <w:rStyle w:val="Strong"/>
+              </w:rPr>
+              <w:t>Novices (2)</w:t>
+            </w:r>
+          </w:p>
+        </w:tc>
+        <w:tc>
+          <w:tcPr>
+            <w:tcW w:w="0" w:type="auto"/>
+            <w:vAlign w:val="center"/>
+            <w:hideMark/>
+          </w:tcPr>
+          <w:p>
+            <w:r>
+              <w:t>50% accepte / 50% rejette</w:t>
+            </w:r>
+          </w:p>
+        </w:tc>
+        <w:tc>
+          <w:tcPr>
+            <w:tcW w:w="0" w:type="auto"/>
+            <w:vAlign w:val="center"/>
+            <w:hideMark/>
+          </w:tcPr>
+          <w:p>
+            <w:r>
+              <w:t>Polarisation binaire</w:t>
+            </w:r>
+          </w:p>
+        </w:tc>
+        <w:tc>
+          <w:tcPr>
+            <w:tcW w:w="0" w:type="auto"/>
+            <w:vAlign w:val="center"/>
+            <w:hideMark/>
+          </w:tcPr>
+          <w:p>
+            <w:r>
+              <w:t>Incertitude sur capacités de l'IA</w:t>
+            </w:r>
+          </w:p>
+        </w:tc>
+      </w:tr>
+      <w:tr>
+        <w:trPr>
+          <w:tblCellSpacing w:w="15" w:type="dxa"/>
+        </w:trPr>
+        <w:tc>
+          <w:tcPr>
+            <w:tcW w:w="0" w:type="auto"/>
+            <w:vAlign w:val="center"/>
+            <w:hideMark/>
+          </w:tcPr>
+          <w:p>
+            <w:r>
+              <w:rPr>
+                <w:rStyle w:val="Strong"/>
+              </w:rPr>
+              <w:t>Intermédiaires (4)</w:t>
+            </w:r>
+          </w:p>
+        </w:tc>
+        <w:tc>
+          <w:tcPr>
+            <w:tcW w:w="0" w:type="auto"/>
+            <w:vAlign w:val="center"/>
+            <w:hideMark/>
+          </w:tcPr>
+          <w:p>
+            <w:r>
+              <w:t xml:space="preserve">25% accepte </w:t>
+            </w:r>
+            <w:proofErr w:type="gramStart"/>
+            <w:r>
+              <w:t>partiel;</w:t>
+            </w:r>
+            <w:proofErr w:type="gramEnd"/>
+            <w:r>
+              <w:t xml:space="preserve"> 75% modifie</w:t>
+            </w:r>
+          </w:p>
+        </w:tc>
+        <w:tc>
+          <w:tcPr>
+            <w:tcW w:w="0" w:type="auto"/>
+            <w:vAlign w:val="center"/>
+            <w:hideMark/>
+          </w:tcPr>
+          <w:p>
+            <w:r>
+              <w:t>Négociation sélective</w:t>
+            </w:r>
+          </w:p>
+        </w:tc>
+        <w:tc>
+          <w:tcPr>
+            <w:tcW w:w="0" w:type="auto"/>
+            <w:vAlign w:val="center"/>
+            <w:hideMark/>
+          </w:tcPr>
+          <w:p>
+            <w:r>
+              <w:t>Évaluation critique + tri d'éléments</w:t>
+            </w:r>
+          </w:p>
+        </w:tc>
+      </w:tr>
+      <w:tr>
+        <w:trPr>
+          <w:tblCellSpacing w:w="15" w:type="dxa"/>
+        </w:trPr>
+        <w:tc>
+          <w:tcPr>
+            <w:tcW w:w="0" w:type="auto"/>
+            <w:vAlign w:val="center"/>
+            <w:hideMark/>
+          </w:tcPr>
+          <w:p>
+            <w:r>
+              <w:rPr>
+                <w:rStyle w:val="Strong"/>
+              </w:rPr>
+              <w:t>Expert (1)</w:t>
+            </w:r>
+          </w:p>
+        </w:tc>
+        <w:tc>
+          <w:tcPr>
+            <w:tcW w:w="0" w:type="auto"/>
+            <w:vAlign w:val="center"/>
+            <w:hideMark/>
+          </w:tcPr>
+          <w:p>
+            <w:r>
+              <w:t>100% accepte intégralement</w:t>
+            </w:r>
+          </w:p>
+        </w:tc>
+        <w:tc>
+          <w:tcPr>
+            <w:tcW w:w="0" w:type="auto"/>
+            <w:vAlign w:val="center"/>
+            <w:hideMark/>
+          </w:tcPr>
+          <w:p>
+            <w:r>
+              <w:t>Optimisation directe</w:t>
+            </w:r>
+          </w:p>
+        </w:tc>
+        <w:tc>
+          <w:tcPr>
+            <w:tcW w:w="0" w:type="auto"/>
+            <w:vAlign w:val="center"/>
+            <w:hideMark/>
+          </w:tcPr>
+          <w:p>
+            <w:r>
+              <w:t>Formulation précise → output immédiatement utilisable</w:t>
+            </w:r>
+          </w:p>
+        </w:tc>
+      </w:tr>
+    </w:tbl>
+    <w:p>
+      <w:pPr>
+        <w:pStyle w:val="font-claude-response-body"/>
+      </w:pPr>
+      <w:r>
+        <w:t xml:space="preserve">Les novices (PE01, PE06) montrent une </w:t>
+      </w:r>
+      <w:r>
+        <w:rPr>
+          <w:rStyle w:val="Strong"/>
+          <w:rFonts w:eastAsiaTheme="majorEastAsia"/>
+        </w:rPr>
+        <w:t>polarisation binaire</w:t>
+      </w:r>
+      <w:r>
+        <w:t xml:space="preserve"> : acceptation complète ou rejet complet, sans middle ground. PE01 a explicité cette confusion : </w:t>
+      </w:r>
+      <w:r>
+        <w:rPr>
+          <w:rStyle w:val="Emphasis"/>
+          <w:rFonts w:eastAsiaTheme="majorEastAsia"/>
+        </w:rPr>
+        <w:t>"Je suis ouvert à comprendre mieux l'utilisation de cette technologie, mais ce qui m'a confus c'est que je pensais que l'IA générative était surtout pour générer des images. Je ne savais pas qu'il y avait d'autres fonctionnalités."</w:t>
+      </w:r>
+      <w:r>
+        <w:t xml:space="preserve"> Cette incertitude sur les capacités mêmes de l'outil révèle que pour les novices, le problème n'est pas tactique (comment utiliser) mais fondamental (que peut faire cet outil?).</w:t>
+      </w:r>
+    </w:p>
+    <w:p>
+      <w:pPr>
+        <w:pStyle w:val="font-claude-response-body"/>
+      </w:pPr>
+      <w:r>
+        <w:t xml:space="preserve">En contraste, les quatre participants intermédiaires (PE02, PE03, PE04, PE05) montrent une </w:t>
+      </w:r>
+      <w:r>
+        <w:rPr>
+          <w:rStyle w:val="Strong"/>
+          <w:rFonts w:eastAsiaTheme="majorEastAsia"/>
+        </w:rPr>
+        <w:t>stratégie de négociation sophistiquée</w:t>
+      </w:r>
+      <w:r>
+        <w:t xml:space="preserve">. PE02 a articulé ce processus : </w:t>
+      </w:r>
+      <w:r>
+        <w:rPr>
+          <w:rStyle w:val="Emphasis"/>
+          <w:rFonts w:eastAsiaTheme="majorEastAsia"/>
+        </w:rPr>
+        <w:t>"Les suggestions de ChatGPT étaient plus cohérentes à mes pratiques, mais elles avaient des erreurs grammaticales. Claude était plus complet et bien structuré, mais pas adapté à tous les besoins de mes élèves. J'ai pris les meilleures idées de chacun et les ai intégrées à ce que j'avais déjà."</w:t>
+      </w:r>
+      <w:r>
+        <w:t xml:space="preserve"> Ce tri sélectif révèle une </w:t>
+      </w:r>
+      <w:r>
+        <w:rPr>
+          <w:rStyle w:val="Strong"/>
+          <w:rFonts w:eastAsiaTheme="majorEastAsia"/>
+        </w:rPr>
+        <w:t>capacité à évaluer critique</w:t>
+      </w:r>
+      <w:r>
+        <w:t>—chaque suggestion est jugée non sur un critère binaire, mais sur son alignement pédagogique spécifique.</w:t>
+      </w:r>
+    </w:p>
+    <w:p>
+      <w:pPr>
+        <w:pStyle w:val="font-claude-response-body"/>
+      </w:pPr>
+      <w:r>
+        <w:t xml:space="preserve">L'expert (PE07) opère dans un mode entièrement différent : </w:t>
+      </w:r>
+      <w:r>
+        <w:rPr>
+          <w:rStyle w:val="Strong"/>
+          <w:rFonts w:eastAsiaTheme="majorEastAsia"/>
+        </w:rPr>
+        <w:t>intégration intégrale sans modification</w:t>
+      </w:r>
+      <w:r>
+        <w:t xml:space="preserve">. L'enregistrement d'écran montre une formulation de prompts précis et complets dès la première tentative, suivi d'une réception immédiate d'un plan structuré avec timing et exercices. PE07 a rapporté : </w:t>
+      </w:r>
+      <w:r>
+        <w:rPr>
+          <w:rStyle w:val="Emphasis"/>
+          <w:rFonts w:eastAsiaTheme="majorEastAsia"/>
+        </w:rPr>
+        <w:t>"Le plan était déjà très bien pensé, avec les activités, les timing, et même les exercices. J'ai eu exactement ce que j'avais demandé."</w:t>
+      </w:r>
+      <w:r>
+        <w:t xml:space="preserve"> Cette absence totale de </w:t>
+      </w:r>
+      <w:r>
+        <w:lastRenderedPageBreak/>
+        <w:t>friction—cognitif, technique, pédagogique—révèle que l'expertise élimine les couches d'incertitude que les novices et intermédiaires traversent.</w:t>
+      </w:r>
+    </w:p>
+    <w:p>
+      <w:r>
+        <w:rPr>
+          <w:noProof/>
+        </w:rPr>
+        <w:pict w14:anchorId="4C68D4C8">
+          <v:rect id="_x0000_i1028" alt="" style="width:451.3pt;height:.05pt;mso-width-percent:0;mso-height-percent:0;mso-width-percent:0;mso-height-percent:0" o:hralign="center" o:hrstd="t" o:hr="t" fillcolor="#a0a0a0" stroked="f"/>
+        </w:pict>
+      </w:r>
+    </w:p>
+    <w:p>
+      <w:pPr>
+        <w:pStyle w:val="Heading3"/>
+      </w:pPr>
+      <w:r>
+        <w:rPr>
+          <w:rStyle w:val="Strong"/>
+          <w:b/>
+          <w:bCs/>
+        </w:rPr>
+        <w:t>5.2 Les Défis Disciplinaires : Variance par Langue</w:t>
+      </w:r>
+    </w:p>
+    <w:p>
+      <w:pPr>
+        <w:pStyle w:val="font-claude-response-body"/>
+      </w:pPr>
+      <w:r>
+        <w:t xml:space="preserve">L'analyse par discipline révèle une vérité contre-intuitive : </w:t>
+      </w:r>
+      <w:r>
+        <w:rPr>
+          <w:rStyle w:val="Strong"/>
+          <w:rFonts w:eastAsiaTheme="majorEastAsia"/>
+        </w:rPr>
+        <w:t>l'IA ne produit pas des erreurs génériques, mais des erreurs spécifiques à la langue</w:t>
+      </w:r>
+      <w:r>
+        <w:t>. Ces erreurs varient systématiquement, produisant des barrières pédagogiques distinctes par discipline.</w:t>
+      </w:r>
+    </w:p>
+    <w:p>
+      <w:pPr>
+        <w:pStyle w:val="font-claude-response-body"/>
+      </w:pPr>
+      <w:r>
+        <w:rPr>
+          <w:rStyle w:val="Strong"/>
+          <w:rFonts w:eastAsiaTheme="majorEastAsia"/>
+        </w:rPr>
+        <w:t>Tableau 2 : Barrières Pédagogiques et Spécificités Disciplinaires</w:t>
+      </w:r>
+    </w:p>
+    <w:tbl>
+      <w:tblPr>
+        <w:tblW w:w="0" w:type="auto"/>
+        <w:tblCellSpacing w:w="15" w:type="dxa"/>
+        <w:tblCellMar>
+          <w:top w:w="15" w:type="dxa"/>
+          <w:left w:w="15" w:type="dxa"/>
+          <w:bottom w:w="15" w:type="dxa"/>
+          <w:right w:w="15" w:type="dxa"/>
+        </w:tblCellMar>
+        <w:tblLook w:val="04A0" w:firstRow="1" w:lastRow="0" w:firstColumn="1" w:lastColumn="0" w:noHBand="0" w:noVBand="1"/>
+      </w:tblPr>
+      <w:tblGrid>
+        <w:gridCol w:w="1073"/>
+        <w:gridCol w:w="2485"/>
+        <w:gridCol w:w="4212"/>
+        <w:gridCol w:w="1302"/>
+      </w:tblGrid>
+      <w:tr>
+        <w:trPr>
+          <w:tblHeader/>
+          <w:tblCellSpacing w:w="15" w:type="dxa"/>
+        </w:trPr>
+        <w:tc>
+          <w:tcPr>
+            <w:tcW w:w="0" w:type="auto"/>
+            <w:vAlign w:val="center"/>
+            <w:hideMark/>
+          </w:tcPr>
+          <w:p>
+            <w:pPr>
+              <w:jc w:val="center"/>
+              <w:rPr>
+                <w:b/>
+                <w:bCs/>
+              </w:rPr>
+            </w:pPr>
+            <w:r>
+              <w:rPr>
+                <w:b/>
+                <w:bCs/>
+              </w:rPr>
+              <w:t>Discipline</w:t>
+            </w:r>
+          </w:p>
+        </w:tc>
+        <w:tc>
+          <w:tcPr>
+            <w:tcW w:w="0" w:type="auto"/>
+            <w:vAlign w:val="center"/>
+            <w:hideMark/>
+          </w:tcPr>
+          <w:p>
+            <w:pPr>
+              <w:jc w:val="center"/>
+              <w:rPr>
+                <w:b/>
+                <w:bCs/>
+              </w:rPr>
+            </w:pPr>
+            <w:r>
+              <w:rPr>
+                <w:b/>
+                <w:bCs/>
+              </w:rPr>
+              <w:t>Barrière Principale</w:t>
+            </w:r>
+          </w:p>
+        </w:tc>
+        <w:tc>
+          <w:tcPr>
+            <w:tcW w:w="0" w:type="auto"/>
+            <w:vAlign w:val="center"/>
+            <w:hideMark/>
+          </w:tcPr>
+          <w:p>
+            <w:pPr>
+              <w:jc w:val="center"/>
+              <w:rPr>
+                <w:b/>
+                <w:bCs/>
+              </w:rPr>
+            </w:pPr>
+            <w:r>
+              <w:rPr>
+                <w:b/>
+                <w:bCs/>
+              </w:rPr>
+              <w:t>Manifestation Spécifique</w:t>
+            </w:r>
+          </w:p>
+        </w:tc>
+        <w:tc>
+          <w:tcPr>
+            <w:tcW w:w="0" w:type="auto"/>
+            <w:vAlign w:val="center"/>
+            <w:hideMark/>
+          </w:tcPr>
+          <w:p>
+            <w:pPr>
+              <w:jc w:val="center"/>
+              <w:rPr>
+                <w:b/>
+                <w:bCs/>
+              </w:rPr>
+            </w:pPr>
+            <w:r>
+              <w:rPr>
+                <w:b/>
+                <w:bCs/>
+              </w:rPr>
+              <w:t>Participant(s)</w:t>
+            </w:r>
+          </w:p>
+        </w:tc>
+      </w:tr>
+      <w:tr>
+        <w:trPr>
+          <w:tblCellSpacing w:w="15" w:type="dxa"/>
+        </w:trPr>
+        <w:tc>
+          <w:tcPr>
+            <w:tcW w:w="0" w:type="auto"/>
+            <w:vAlign w:val="center"/>
+            <w:hideMark/>
+          </w:tcPr>
+          <w:p>
+            <w:pPr>
+              <w:jc w:val="left"/>
+            </w:pPr>
+            <w:r>
+              <w:rPr>
+                <w:rStyle w:val="Strong"/>
+              </w:rPr>
+              <w:t>Anglais (4)</w:t>
+            </w:r>
+          </w:p>
+        </w:tc>
+        <w:tc>
+          <w:tcPr>
+            <w:tcW w:w="0" w:type="auto"/>
+            <w:vAlign w:val="center"/>
+            <w:hideMark/>
+          </w:tcPr>
+          <w:p>
+            <w:r>
+              <w:t>Manque de différenciation</w:t>
+            </w:r>
+          </w:p>
+        </w:tc>
+        <w:tc>
+          <w:tcPr>
+            <w:tcW w:w="0" w:type="auto"/>
+            <w:vAlign w:val="center"/>
+            <w:hideMark/>
+          </w:tcPr>
+          <w:p>
+            <w:r>
+              <w:t>Exercices génériques au même niveau, non-adaptés aux élèves en difficulté</w:t>
+            </w:r>
+          </w:p>
+        </w:tc>
+        <w:tc>
+          <w:tcPr>
+            <w:tcW w:w="0" w:type="auto"/>
+            <w:vAlign w:val="center"/>
+            <w:hideMark/>
+          </w:tcPr>
+          <w:p>
+            <w:r>
+              <w:t>PE03, PE05</w:t>
+            </w:r>
+          </w:p>
+        </w:tc>
+      </w:tr>
+      <w:tr>
+        <w:trPr>
+          <w:tblCellSpacing w:w="15" w:type="dxa"/>
+        </w:trPr>
+        <w:tc>
+          <w:tcPr>
+            <w:tcW w:w="0" w:type="auto"/>
+            <w:vAlign w:val="center"/>
+            <w:hideMark/>
+          </w:tcPr>
+          <w:p>
+            <w:r>
+              <w:rPr>
+                <w:rStyle w:val="Strong"/>
+              </w:rPr>
+              <w:t>Français (2)</w:t>
+            </w:r>
+          </w:p>
+        </w:tc>
+        <w:tc>
+          <w:tcPr>
+            <w:tcW w:w="0" w:type="auto"/>
+            <w:vAlign w:val="center"/>
+            <w:hideMark/>
+          </w:tcPr>
+          <w:p>
+            <w:r>
+              <w:t>Erreurs linguistiques + incohérence</w:t>
+            </w:r>
+          </w:p>
+        </w:tc>
+        <w:tc>
+          <w:tcPr>
+            <w:tcW w:w="0" w:type="auto"/>
+            <w:vAlign w:val="center"/>
+            <w:hideMark/>
+          </w:tcPr>
+          <w:p>
+            <w:r>
+              <w:t xml:space="preserve">Fautes </w:t>
+            </w:r>
+            <w:proofErr w:type="gramStart"/>
+            <w:r>
+              <w:t>grammaticales;</w:t>
+            </w:r>
+            <w:proofErr w:type="gramEnd"/>
+            <w:r>
+              <w:t xml:space="preserve"> contenu non-adapté aux niveaux CECRL français</w:t>
+            </w:r>
+          </w:p>
+        </w:tc>
+        <w:tc>
+          <w:tcPr>
+            <w:tcW w:w="0" w:type="auto"/>
+            <w:vAlign w:val="center"/>
+            <w:hideMark/>
+          </w:tcPr>
+          <w:p>
+            <w:r>
+              <w:t>PE02, PE04</w:t>
+            </w:r>
+          </w:p>
+        </w:tc>
+      </w:tr>
+      <w:tr>
+        <w:trPr>
+          <w:tblCellSpacing w:w="15" w:type="dxa"/>
+        </w:trPr>
+        <w:tc>
+          <w:tcPr>
+            <w:tcW w:w="0" w:type="auto"/>
+            <w:vAlign w:val="center"/>
+            <w:hideMark/>
+          </w:tcPr>
+          <w:p>
+            <w:r>
+              <w:rPr>
+                <w:rStyle w:val="Strong"/>
+              </w:rPr>
+              <w:t>Espagnol (1)</w:t>
+            </w:r>
+          </w:p>
+        </w:tc>
+        <w:tc>
+          <w:tcPr>
+            <w:tcW w:w="0" w:type="auto"/>
+            <w:vAlign w:val="center"/>
+            <w:hideMark/>
+          </w:tcPr>
+          <w:p>
+            <w:r>
+              <w:t>Aucune barrière pédagogique identifiée</w:t>
+            </w:r>
+          </w:p>
+        </w:tc>
+        <w:tc>
+          <w:tcPr>
+            <w:tcW w:w="0" w:type="auto"/>
+            <w:vAlign w:val="center"/>
+            <w:hideMark/>
+          </w:tcPr>
+          <w:p>
+            <w:r>
+              <w:t>Plan complet, structuré, pédagogiquement cohérent</w:t>
+            </w:r>
+          </w:p>
+        </w:tc>
+        <w:tc>
+          <w:tcPr>
+            <w:tcW w:w="0" w:type="auto"/>
+            <w:vAlign w:val="center"/>
+            <w:hideMark/>
+          </w:tcPr>
+          <w:p>
+            <w:r>
+              <w:t>PE07</w:t>
+            </w:r>
+          </w:p>
+        </w:tc>
+      </w:tr>
+    </w:tbl>
+    <w:p>
+      <w:pPr>
+        <w:pStyle w:val="font-claude-response-body"/>
+      </w:pPr>
+      <w:r>
+        <w:rPr>
+          <w:rStyle w:val="Strong"/>
+          <w:rFonts w:eastAsiaTheme="majorEastAsia"/>
+        </w:rPr>
+        <w:t>Groupe Anglais :</w:t>
+      </w:r>
+      <w:r>
+        <w:t xml:space="preserve"> Le problème identifié était le manque de différenciation pédagogique. PE03 a observé : </w:t>
+      </w:r>
+      <w:r>
+        <w:rPr>
+          <w:rStyle w:val="Emphasis"/>
+          <w:rFonts w:eastAsiaTheme="majorEastAsia"/>
+        </w:rPr>
+        <w:t>"L'IA a généré des exercices, mais ils étaient tous au même niveau. Mes élèves ont différents niveaux de difficulté. Je suis restée impressionnée par l'idée du 'exit ticket'—faire une phrase en BE+ING avant de quitter la classe—c'est validant. Mais je vais devoir adapter les exercices pour mes élèves en difficulté."</w:t>
+      </w:r>
+      <w:r>
+        <w:t xml:space="preserve"> PE05 a exprimé une satisfaction similaire mais tempérée : </w:t>
+      </w:r>
+      <w:r>
+        <w:rPr>
+          <w:rStyle w:val="Emphasis"/>
+          <w:rFonts w:eastAsiaTheme="majorEastAsia"/>
+        </w:rPr>
+        <w:t>"C'est rassurant de voir que les propositions de l'IA correspondent à ce que je ferais. C'est comme une validation que mes approches sont bonnes. Mais je passerais probablement plus de temps à adapter qu'à planner avec l'IA."</w:t>
+      </w:r>
+    </w:p>
+    <w:p>
+      <w:pPr>
+        <w:pStyle w:val="font-claude-response-body"/>
+      </w:pPr>
+      <w:r>
+        <w:t xml:space="preserve">Le pattern suggère que </w:t>
+      </w:r>
+      <w:r>
+        <w:rPr>
+          <w:rStyle w:val="Strong"/>
+          <w:rFonts w:eastAsiaTheme="majorEastAsia"/>
+        </w:rPr>
+        <w:t>l'IA générative produit du contenu "moyen"</w:t>
+      </w:r>
+      <w:r>
+        <w:t xml:space="preserve">—bien-structuré, cohérent, pédagogiquement sensé, mais non-différencié. Cela force l'enseignant d'anglais à investir du </w:t>
+      </w:r>
+      <w:r>
+        <w:rPr>
+          <w:rStyle w:val="Strong"/>
+          <w:rFonts w:eastAsiaTheme="majorEastAsia"/>
+        </w:rPr>
+        <w:t>travail d'adaptation supplémentaire</w:t>
+      </w:r>
+      <w:r>
+        <w:t xml:space="preserve"> pour répondre à la diversité réelle de la classe.</w:t>
+      </w:r>
+    </w:p>
+    <w:p>
+      <w:pPr>
+        <w:pStyle w:val="font-claude-response-body"/>
+      </w:pPr>
+      <w:r>
+        <w:rPr>
+          <w:rStyle w:val="Strong"/>
+          <w:rFonts w:eastAsiaTheme="majorEastAsia"/>
+        </w:rPr>
+        <w:t>Groupe Français :</w:t>
+      </w:r>
+      <w:r>
+        <w:t xml:space="preserve"> Le problème identifié était la </w:t>
+      </w:r>
+      <w:r>
+        <w:rPr>
+          <w:rStyle w:val="Strong"/>
+          <w:rFonts w:eastAsiaTheme="majorEastAsia"/>
+        </w:rPr>
+        <w:t>qualité linguistique</w:t>
+      </w:r>
+      <w:r>
+        <w:t xml:space="preserve">. PE02 a rapporté une tension claire : </w:t>
+      </w:r>
+      <w:r>
+        <w:rPr>
+          <w:rStyle w:val="Emphasis"/>
+          <w:rFonts w:eastAsiaTheme="majorEastAsia"/>
+        </w:rPr>
+        <w:t>"ChatGPT était plus cohérent à mes pratiques mais avait des erreurs grammaticales—comment puis-je enseigner si l'outil génère des erreurs? Claude était plus complet avec des exercices bien structurés, mais pas adapté aux niveaux CECRL de mes élèves."</w:t>
+      </w:r>
+      <w:r>
+        <w:t xml:space="preserve"> PE04 a poussé plus loin, identifiant une cause structurelle : </w:t>
+      </w:r>
+      <w:r>
+        <w:rPr>
+          <w:rStyle w:val="Emphasis"/>
+          <w:rFonts w:eastAsiaTheme="majorEastAsia"/>
+        </w:rPr>
+        <w:t>"Je pense que les outils sont développés aux États-Unis, donc ils comprennent mieux le contexte anglophone. Le français a des nuances que ces outils ne capturent pas."</w:t>
+      </w:r>
+    </w:p>
+    <w:p>
+      <w:pPr>
+        <w:pStyle w:val="font-claude-response-body"/>
+      </w:pPr>
+      <w:r>
+        <w:lastRenderedPageBreak/>
+        <w:t xml:space="preserve">Cette observation révèle une </w:t>
+      </w:r>
+      <w:r>
+        <w:rPr>
+          <w:rStyle w:val="Strong"/>
+          <w:rFonts w:eastAsiaTheme="majorEastAsia"/>
+        </w:rPr>
+        <w:t>asymétrie fondamentale dans les données d'entraînement</w:t>
+      </w:r>
+      <w:r>
+        <w:t xml:space="preserve"> : les modèles IA sont dominés par l'anglais et les contextes pédagogiques anglophone. Le français, avec ses spécificités grammaticales et pédagogiques (CECRL, programmes nationaux), est mal représenté. Aucun intermédiaire n'a pu compenser cette limitation par son expertise; seul PE07 (expert) l'a surmontée, et uniquement pour l'espagnol.</w:t>
+      </w:r>
+    </w:p>
+    <w:p>
+      <w:r>
+        <w:rPr>
+          <w:noProof/>
+        </w:rPr>
+        <w:pict w14:anchorId="6CB7DC30">
+          <v:rect id="_x0000_i1027" alt="" style="width:451.3pt;height:.05pt;mso-width-percent:0;mso-height-percent:0;mso-width-percent:0;mso-height-percent:0" o:hralign="center" o:hrstd="t" o:hr="t" fillcolor="#a0a0a0" stroked="f"/>
+        </w:pict>
+      </w:r>
+    </w:p>
+    <w:p>
+      <w:pPr>
+        <w:pStyle w:val="Heading3"/>
+      </w:pPr>
+      <w:r>
+        <w:rPr>
+          <w:rStyle w:val="Strong"/>
+          <w:b/>
+          <w:bCs/>
+        </w:rPr>
+        <w:t>5.3 Barrières : Hiérarchie de l'Impact Pédagogique vs Éthique/Environnemental</w:t>
+      </w:r>
+    </w:p>
+    <w:p>
+      <w:pPr>
+        <w:pStyle w:val="font-claude-response-body"/>
+      </w:pPr>
+      <w:r>
+        <w:t xml:space="preserve">L'analyse du feedback post-test révèle une </w:t>
+      </w:r>
+      <w:r>
+        <w:rPr>
+          <w:rStyle w:val="Strong"/>
+          <w:rFonts w:eastAsiaTheme="majorEastAsia"/>
+        </w:rPr>
+        <w:t>hiérarchie claire et révélatrice</w:t>
+      </w:r>
+      <w:r>
+        <w:t xml:space="preserve"> des barrières. Les barrières pédagogiques dominent le discours et causent l'obstacle initial; les barrières éthiques/environnementales jouent un rôle de </w:t>
+      </w:r>
+      <w:r>
+        <w:rPr>
+          <w:rStyle w:val="Strong"/>
+          <w:rFonts w:eastAsiaTheme="majorEastAsia"/>
+        </w:rPr>
+        <w:t>renforçateur</w:t>
+      </w:r>
+      <w:r>
+        <w:t xml:space="preserve"> pour ceux déjà réticents.</w:t>
+      </w:r>
+    </w:p>
+    <w:p>
+      <w:pPr>
+        <w:pStyle w:val="font-claude-response-body"/>
+      </w:pPr>
+      <w:r>
+        <w:rPr>
+          <w:rStyle w:val="Strong"/>
+          <w:rFonts w:eastAsiaTheme="majorEastAsia"/>
+        </w:rPr>
+        <w:t>Tableau 3 : Hiérarchie et Profil des Barrières Mentionnées</w:t>
+      </w:r>
+    </w:p>
+    <w:tbl>
+      <w:tblPr>
+        <w:tblW w:w="0" w:type="auto"/>
+        <w:tblCellSpacing w:w="15" w:type="dxa"/>
+        <w:tblCellMar>
+          <w:top w:w="15" w:type="dxa"/>
+          <w:left w:w="15" w:type="dxa"/>
+          <w:bottom w:w="15" w:type="dxa"/>
+          <w:right w:w="15" w:type="dxa"/>
+        </w:tblCellMar>
+        <w:tblLook w:val="04A0" w:firstRow="1" w:lastRow="0" w:firstColumn="1" w:lastColumn="0" w:noHBand="0" w:noVBand="1"/>
+      </w:tblPr>
+      <w:tblGrid>
+        <w:gridCol w:w="2554"/>
+        <w:gridCol w:w="1018"/>
+        <w:gridCol w:w="1661"/>
+        <w:gridCol w:w="1789"/>
+        <w:gridCol w:w="2050"/>
+      </w:tblGrid>
+      <w:tr>
+        <w:trPr>
+          <w:tblHeader/>
+          <w:tblCellSpacing w:w="15" w:type="dxa"/>
+        </w:trPr>
+        <w:tc>
+          <w:tcPr>
+            <w:tcW w:w="0" w:type="auto"/>
+            <w:vAlign w:val="center"/>
+            <w:hideMark/>
+          </w:tcPr>
+          <w:p>
+            <w:pPr>
+              <w:jc w:val="center"/>
+              <w:rPr>
+                <w:b/>
+                <w:bCs/>
+              </w:rPr>
+            </w:pPr>
+            <w:r>
+              <w:rPr>
+                <w:b/>
+                <w:bCs/>
+              </w:rPr>
+              <w:t>Type de Barrière</w:t>
+            </w:r>
+          </w:p>
+        </w:tc>
+        <w:tc>
+          <w:tcPr>
+            <w:tcW w:w="0" w:type="auto"/>
+            <w:vAlign w:val="center"/>
+            <w:hideMark/>
+          </w:tcPr>
+          <w:p>
+            <w:pPr>
+              <w:jc w:val="center"/>
+              <w:rPr>
+                <w:b/>
+                <w:bCs/>
+              </w:rPr>
+            </w:pPr>
+            <w:r>
+              <w:rPr>
+                <w:b/>
+                <w:bCs/>
+              </w:rPr>
+              <w:t>Fréquence</w:t>
+            </w:r>
+          </w:p>
+        </w:tc>
+        <w:tc>
+          <w:tcPr>
+            <w:tcW w:w="0" w:type="auto"/>
+            <w:vAlign w:val="center"/>
+            <w:hideMark/>
+          </w:tcPr>
+          <w:p>
+            <w:pPr>
+              <w:jc w:val="center"/>
+              <w:rPr>
+                <w:b/>
+                <w:bCs/>
+              </w:rPr>
+            </w:pPr>
+            <w:r>
+              <w:rPr>
+                <w:b/>
+                <w:bCs/>
+              </w:rPr>
+              <w:t>Ordre de Mention</w:t>
+            </w:r>
+          </w:p>
+        </w:tc>
+        <w:tc>
+          <w:tcPr>
+            <w:tcW w:w="0" w:type="auto"/>
+            <w:vAlign w:val="center"/>
+            <w:hideMark/>
+          </w:tcPr>
+          <w:p>
+            <w:pPr>
+              <w:jc w:val="center"/>
+              <w:rPr>
+                <w:b/>
+                <w:bCs/>
+              </w:rPr>
+            </w:pPr>
+            <w:r>
+              <w:rPr>
+                <w:b/>
+                <w:bCs/>
+              </w:rPr>
+              <w:t>Force du Sentiment</w:t>
+            </w:r>
+          </w:p>
+        </w:tc>
+        <w:tc>
+          <w:tcPr>
+            <w:tcW w:w="0" w:type="auto"/>
+            <w:vAlign w:val="center"/>
+            <w:hideMark/>
+          </w:tcPr>
+          <w:p>
+            <w:pPr>
+              <w:jc w:val="center"/>
+              <w:rPr>
+                <w:b/>
+                <w:bCs/>
+              </w:rPr>
+            </w:pPr>
+            <w:r>
+              <w:rPr>
+                <w:b/>
+                <w:bCs/>
+              </w:rPr>
+              <w:t>Fonction</w:t>
+            </w:r>
+          </w:p>
+        </w:tc>
+      </w:tr>
+      <w:tr>
+        <w:trPr>
+          <w:tblCellSpacing w:w="15" w:type="dxa"/>
+        </w:trPr>
+        <w:tc>
+          <w:tcPr>
+            <w:tcW w:w="0" w:type="auto"/>
+            <w:vAlign w:val="center"/>
+            <w:hideMark/>
+          </w:tcPr>
+          <w:p>
+            <w:pPr>
+              <w:jc w:val="left"/>
+            </w:pPr>
+            <w:r>
+              <w:rPr>
+                <w:rStyle w:val="Strong"/>
+              </w:rPr>
+              <w:t>Barrières Pédagogiques</w:t>
+            </w:r>
+          </w:p>
+        </w:tc>
+        <w:tc>
+          <w:tcPr>
+            <w:tcW w:w="0" w:type="auto"/>
+            <w:vAlign w:val="center"/>
+            <w:hideMark/>
+          </w:tcPr>
+          <w:p>
+            <w:r>
+              <w:t>5/7 (71%)</w:t>
+            </w:r>
+          </w:p>
+        </w:tc>
+        <w:tc>
+          <w:tcPr>
+            <w:tcW w:w="0" w:type="auto"/>
+            <w:vAlign w:val="center"/>
+            <w:hideMark/>
+          </w:tcPr>
+          <w:p>
+            <w:r>
+              <w:t>Première</w:t>
+            </w:r>
+          </w:p>
+        </w:tc>
+        <w:tc>
+          <w:tcPr>
+            <w:tcW w:w="0" w:type="auto"/>
+            <w:vAlign w:val="center"/>
+            <w:hideMark/>
+          </w:tcPr>
+          <w:p>
+            <w:r>
+              <w:t>Forte</w:t>
+            </w:r>
+          </w:p>
+        </w:tc>
+        <w:tc>
+          <w:tcPr>
+            <w:tcW w:w="0" w:type="auto"/>
+            <w:vAlign w:val="center"/>
+            <w:hideMark/>
+          </w:tcPr>
+          <w:p>
+            <w:r>
+              <w:t>Obstacle initial</w:t>
+            </w:r>
+          </w:p>
+        </w:tc>
+      </w:tr>
+      <w:tr>
+        <w:trPr>
+          <w:tblCellSpacing w:w="15" w:type="dxa"/>
+        </w:trPr>
+        <w:tc>
+          <w:tcPr>
+            <w:tcW w:w="0" w:type="auto"/>
+            <w:vAlign w:val="center"/>
+            <w:hideMark/>
+          </w:tcPr>
+          <w:p>
+            <w:r>
+              <w:rPr>
+                <w:rStyle w:val="Strong"/>
+              </w:rPr>
+              <w:t>Barrières Éthiques (général)</w:t>
+            </w:r>
+          </w:p>
+        </w:tc>
+        <w:tc>
+          <w:tcPr>
+            <w:tcW w:w="0" w:type="auto"/>
+            <w:vAlign w:val="center"/>
+            <w:hideMark/>
+          </w:tcPr>
+          <w:p>
+            <w:r>
+              <w:t>5/7 (71%)</w:t>
+            </w:r>
+          </w:p>
+        </w:tc>
+        <w:tc>
+          <w:tcPr>
+            <w:tcW w:w="0" w:type="auto"/>
+            <w:vAlign w:val="center"/>
+            <w:hideMark/>
+          </w:tcPr>
+          <w:p>
+            <w:r>
+              <w:t>Deuxième</w:t>
+            </w:r>
+          </w:p>
+        </w:tc>
+        <w:tc>
+          <w:tcPr>
+            <w:tcW w:w="0" w:type="auto"/>
+            <w:vAlign w:val="center"/>
+            <w:hideMark/>
+          </w:tcPr>
+          <w:p>
+            <w:r>
+              <w:t>Modérée</w:t>
+            </w:r>
+          </w:p>
+        </w:tc>
+        <w:tc>
+          <w:tcPr>
+            <w:tcW w:w="0" w:type="auto"/>
+            <w:vAlign w:val="center"/>
+            <w:hideMark/>
+          </w:tcPr>
+          <w:p>
+            <w:r>
+              <w:t>Renforçateur</w:t>
+            </w:r>
+          </w:p>
+        </w:tc>
+      </w:tr>
+      <w:tr>
+        <w:trPr>
+          <w:tblCellSpacing w:w="15" w:type="dxa"/>
+        </w:trPr>
+        <w:tc>
+          <w:tcPr>
+            <w:tcW w:w="0" w:type="auto"/>
+            <w:vAlign w:val="center"/>
+            <w:hideMark/>
+          </w:tcPr>
+          <w:p>
+            <w:r>
+              <w:rPr>
+                <w:rStyle w:val="Strong"/>
+              </w:rPr>
+              <w:t xml:space="preserve">Data Protection / </w:t>
+            </w:r>
+            <w:proofErr w:type="spellStart"/>
+            <w:r>
+              <w:rPr>
+                <w:rStyle w:val="Strong"/>
+              </w:rPr>
+              <w:t>Privacy</w:t>
+            </w:r>
+            <w:proofErr w:type="spellEnd"/>
+          </w:p>
+        </w:tc>
+        <w:tc>
+          <w:tcPr>
+            <w:tcW w:w="0" w:type="auto"/>
+            <w:vAlign w:val="center"/>
+            <w:hideMark/>
+          </w:tcPr>
+          <w:p>
+            <w:r>
+              <w:t>2/7 (29%)</w:t>
+            </w:r>
+          </w:p>
+        </w:tc>
+        <w:tc>
+          <w:tcPr>
+            <w:tcW w:w="0" w:type="auto"/>
+            <w:vAlign w:val="center"/>
+            <w:hideMark/>
+          </w:tcPr>
+          <w:p>
+            <w:r>
+              <w:t>Troisième</w:t>
+            </w:r>
+          </w:p>
+        </w:tc>
+        <w:tc>
+          <w:tcPr>
+            <w:tcW w:w="0" w:type="auto"/>
+            <w:vAlign w:val="center"/>
+            <w:hideMark/>
+          </w:tcPr>
+          <w:p>
+            <w:r>
+              <w:t>Forte</w:t>
+            </w:r>
+          </w:p>
+        </w:tc>
+        <w:tc>
+          <w:tcPr>
+            <w:tcW w:w="0" w:type="auto"/>
+            <w:vAlign w:val="center"/>
+            <w:hideMark/>
+          </w:tcPr>
+          <w:p>
+            <w:r>
+              <w:t>Justification spécifique</w:t>
+            </w:r>
+          </w:p>
+        </w:tc>
+      </w:tr>
+      <w:tr>
+        <w:trPr>
+          <w:tblCellSpacing w:w="15" w:type="dxa"/>
+        </w:trPr>
+        <w:tc>
+          <w:tcPr>
+            <w:tcW w:w="0" w:type="auto"/>
+            <w:vAlign w:val="center"/>
+            <w:hideMark/>
+          </w:tcPr>
+          <w:p>
+            <w:r>
+              <w:rPr>
+                <w:rStyle w:val="Strong"/>
+              </w:rPr>
+              <w:t>Usage Environnemental</w:t>
+            </w:r>
+          </w:p>
+        </w:tc>
+        <w:tc>
+          <w:tcPr>
+            <w:tcW w:w="0" w:type="auto"/>
+            <w:vAlign w:val="center"/>
+            <w:hideMark/>
+          </w:tcPr>
+          <w:p>
+            <w:r>
+              <w:t>2/7 (29%)</w:t>
+            </w:r>
+          </w:p>
+        </w:tc>
+        <w:tc>
+          <w:tcPr>
+            <w:tcW w:w="0" w:type="auto"/>
+            <w:vAlign w:val="center"/>
+            <w:hideMark/>
+          </w:tcPr>
+          <w:p>
+            <w:r>
+              <w:t>Troisième</w:t>
+            </w:r>
+          </w:p>
+        </w:tc>
+        <w:tc>
+          <w:tcPr>
+            <w:tcW w:w="0" w:type="auto"/>
+            <w:vAlign w:val="center"/>
+            <w:hideMark/>
+          </w:tcPr>
+          <w:p>
+            <w:r>
+              <w:t>Modérée</w:t>
+            </w:r>
+          </w:p>
+        </w:tc>
+        <w:tc>
+          <w:tcPr>
+            <w:tcW w:w="0" w:type="auto"/>
+            <w:vAlign w:val="center"/>
+            <w:hideMark/>
+          </w:tcPr>
+          <w:p>
+            <w:r>
+              <w:t>Justification spécifique</w:t>
+            </w:r>
+          </w:p>
+        </w:tc>
+      </w:tr>
+    </w:tbl>
+    <w:p>
+      <w:pPr>
+        <w:pStyle w:val="font-claude-response-body"/>
+      </w:pPr>
+      <w:r>
+        <w:t>Remarquablement, chaque groupe mentionnait d'abord les défis pédagogiques concrets (erreurs, manque de différenciation), puis, après avoir identifié ces obstacles, invoquait les préoccupations éthiques pour consolider leur position de rejet ou de réticence.</w:t>
+      </w:r>
+    </w:p>
+    <w:p>
+      <w:pPr>
+        <w:pStyle w:val="font-claude-response-body"/>
+      </w:pPr>
+      <w:r>
+        <w:t xml:space="preserve">PE03 a articulé le calcul utilitaire : </w:t>
+      </w:r>
+      <w:r>
+        <w:rPr>
+          <w:rStyle w:val="Emphasis"/>
+          <w:rFonts w:eastAsiaTheme="majorEastAsia"/>
+        </w:rPr>
+        <w:t>"L'IA m'a sauvé du temps à chercher des idées, mais m'a peut-être coûté du temps à adapter. C'est utile pour les enseignants expérimentés qui savent déjà adapter; moins pour ceux qui cherchent une solution clé en main."</w:t>
+      </w:r>
+      <w:r>
+        <w:t xml:space="preserve"> Ce calcul—temps d'économie vs temps d'adaptation—s'est avéré </w:t>
+      </w:r>
+      <w:r>
+        <w:rPr>
+          <w:rStyle w:val="Strong"/>
+          <w:rFonts w:eastAsiaTheme="majorEastAsia"/>
+        </w:rPr>
+        <w:t>négatif pour les intermédiaires</w:t>
+      </w:r>
+      <w:r>
+        <w:t>, ce qui a mené directement à leur réticence à adopter.</w:t>
+      </w:r>
+    </w:p>
+    <w:p>
+      <w:pPr>
+        <w:pStyle w:val="font-claude-response-body"/>
+      </w:pPr>
+      <w:r>
+        <w:t>Les barrières éthiques ont joué un rôle différent selon le profil. PE04 a mentionné l'</w:t>
+      </w:r>
+      <w:r>
+        <w:rPr>
+          <w:rStyle w:val="Emphasis"/>
+          <w:rFonts w:eastAsiaTheme="majorEastAsia"/>
+        </w:rPr>
+        <w:t>"usage excessif d'eau"</w:t>
+      </w:r>
+      <w:r>
+        <w:t xml:space="preserve">; PE06 a cité les </w:t>
+      </w:r>
+      <w:r>
+        <w:rPr>
+          <w:rStyle w:val="Emphasis"/>
+          <w:rFonts w:eastAsiaTheme="majorEastAsia"/>
+        </w:rPr>
+        <w:t>"préoccupations de data protection"</w:t>
+      </w:r>
+      <w:r>
+        <w:t xml:space="preserve">. Cependant, 5/7 ont exprimé des préoccupations générales plus diffuses sur l'usage responsable. La plupart ont </w:t>
+      </w:r>
+      <w:r>
+        <w:lastRenderedPageBreak/>
+        <w:t xml:space="preserve">conclues : </w:t>
+      </w:r>
+      <w:r>
+        <w:rPr>
+          <w:rStyle w:val="Emphasis"/>
+          <w:rFonts w:eastAsiaTheme="majorEastAsia"/>
+        </w:rPr>
+        <w:t>"C'est un bon outil mais ce n'est pas nécessaire en ce moment. Il y a d'autres alternatives."</w:t>
+      </w:r>
+    </w:p>
+    <w:p>
+      <w:pPr>
+        <w:pStyle w:val="font-claude-response-body"/>
+      </w:pPr>
+      <w:r>
+        <w:t xml:space="preserve">En contraste, PE07 (expert, qui avait accepté l'IA), a rapporté une approche complètement différente : </w:t>
+      </w:r>
+      <w:r>
+        <w:rPr>
+          <w:rStyle w:val="Emphasis"/>
+          <w:rFonts w:eastAsiaTheme="majorEastAsia"/>
+        </w:rPr>
+        <w:t>"J'ai appris à garder les informations personnelles hors de l'outil, pour des raisons de sécurité."</w:t>
+      </w:r>
+      <w:r>
+        <w:t xml:space="preserve"> Cette formulation révèle que </w:t>
+      </w:r>
+      <w:r>
+        <w:rPr>
+          <w:rStyle w:val="Strong"/>
+          <w:rFonts w:eastAsiaTheme="majorEastAsia"/>
+        </w:rPr>
+        <w:t>l'expertise technologique + formation éthique</w:t>
+      </w:r>
+      <w:r>
+        <w:t xml:space="preserve"> transforme une barrière en </w:t>
+      </w:r>
+      <w:r>
+        <w:rPr>
+          <w:rStyle w:val="Strong"/>
+          <w:rFonts w:eastAsiaTheme="majorEastAsia"/>
+        </w:rPr>
+        <w:t>protocole de sécurité</w:t>
+      </w:r>
+      <w:r>
+        <w:t>—non une raison d'éviter l'outil, mais une condition pour l'utiliser responsablement.</w:t>
+      </w:r>
+    </w:p>
+    <w:p>
+      <w:pPr>
+        <w:pStyle w:val="font-claude-response-body"/>
+      </w:pPr>
+      <w:r>
+        <w:rPr>
+          <w:rStyle w:val="Strong"/>
+          <w:rFonts w:eastAsiaTheme="majorEastAsia"/>
+        </w:rPr>
+        <w:t>Interpretation:</w:t>
+      </w:r>
+      <w:r>
+        <w:t xml:space="preserve"> Les barrières pédagogiques causent l'</w:t>
+      </w:r>
+      <w:r>
+        <w:rPr>
+          <w:rStyle w:val="Strong"/>
+          <w:rFonts w:eastAsiaTheme="majorEastAsia"/>
+        </w:rPr>
+        <w:t>obstacle immédiat</w:t>
+      </w:r>
+      <w:r>
+        <w:t xml:space="preserve">; les barrières éthiques fournissent la </w:t>
+      </w:r>
+      <w:r>
+        <w:rPr>
+          <w:rStyle w:val="Strong"/>
+          <w:rFonts w:eastAsiaTheme="majorEastAsia"/>
+        </w:rPr>
+        <w:t>rationalisation morale</w:t>
+      </w:r>
+      <w:r>
+        <w:t xml:space="preserve"> pour rester réticent. Pour l'expert, les barrières éthiques deviennent des </w:t>
+      </w:r>
+      <w:r>
+        <w:rPr>
+          <w:rStyle w:val="Strong"/>
+          <w:rFonts w:eastAsiaTheme="majorEastAsia"/>
+        </w:rPr>
+        <w:t>modalités de gestion</w:t>
+      </w:r>
+      <w:r>
+        <w:t>, non des obstacles.</w:t>
+      </w:r>
+    </w:p>
+    <w:p>
+      <w:r>
+        <w:rPr>
+          <w:noProof/>
+        </w:rPr>
+        <w:pict w14:anchorId="64870DFA">
+          <v:rect id="_x0000_i1026" alt="" style="width:451.3pt;height:.05pt;mso-width-percent:0;mso-height-percent:0;mso-width-percent:0;mso-height-percent:0" o:hralign="center" o:hrstd="t" o:hr="t" fillcolor="#a0a0a0" stroked="f"/>
+        </w:pict>
+      </w:r>
+    </w:p>
+    <w:p>
+      <w:pPr>
+        <w:pStyle w:val="Heading3"/>
+      </w:pPr>
+      <w:r>
+        <w:rPr>
+          <w:rStyle w:val="Strong"/>
+          <w:b/>
+          <w:bCs/>
+        </w:rPr>
+        <w:t>5.4 Intention d'Adoption : Une Dichotomie Non-Linéaire</w:t>
+      </w:r>
+    </w:p>
+    <w:p>
+      <w:pPr>
+        <w:pStyle w:val="font-claude-response-body"/>
+      </w:pPr>
+      <w:r>
+        <w:t xml:space="preserve">L'analyse croisée de l'acceptation des suggestions (ce que les enseignants ont </w:t>
+      </w:r>
+      <w:r>
+        <w:rPr>
+          <w:rStyle w:val="Strong"/>
+          <w:rFonts w:eastAsiaTheme="majorEastAsia"/>
+        </w:rPr>
+        <w:t>fait</w:t>
+      </w:r>
+      <w:r>
+        <w:t xml:space="preserve"> avec l'IA) et de l'intention d'adoption future (ce qu'ils </w:t>
+      </w:r>
+      <w:r>
+        <w:rPr>
+          <w:rStyle w:val="Strong"/>
+          <w:rFonts w:eastAsiaTheme="majorEastAsia"/>
+        </w:rPr>
+        <w:t>disent qu'ils feront</w:t>
+      </w:r>
+      <w:r>
+        <w:t xml:space="preserve">) révèle une relation </w:t>
+      </w:r>
+      <w:r>
+        <w:rPr>
+          <w:rStyle w:val="Strong"/>
+          <w:rFonts w:eastAsiaTheme="majorEastAsia"/>
+        </w:rPr>
+        <w:t>non-linéaire et contre-intuitive</w:t>
+      </w:r>
+      <w:r>
+        <w:t xml:space="preserve"> : accepter partiellement l'IA ne préddit pas une adoption future. Au contraire, cela peut consolider la réticence.</w:t>
+      </w:r>
+    </w:p>
+    <w:p>
+      <w:pPr>
+        <w:pStyle w:val="font-claude-response-body"/>
+      </w:pPr>
+      <w:r>
+        <w:rPr>
+          <w:rStyle w:val="Strong"/>
+          <w:rFonts w:eastAsiaTheme="majorEastAsia"/>
+        </w:rPr>
+        <w:t>Tableau 4 : Non-Linéarité : Acceptation Phase II vs Adoption Intention Future</w:t>
+      </w:r>
+    </w:p>
+    <w:tbl>
+      <w:tblPr>
+        <w:tblW w:w="0" w:type="auto"/>
+        <w:tblCellSpacing w:w="15" w:type="dxa"/>
+        <w:tblCellMar>
+          <w:top w:w="15" w:type="dxa"/>
+          <w:left w:w="15" w:type="dxa"/>
+          <w:bottom w:w="15" w:type="dxa"/>
+          <w:right w:w="15" w:type="dxa"/>
+        </w:tblCellMar>
+        <w:tblLook w:val="04A0" w:firstRow="1" w:lastRow="0" w:firstColumn="1" w:lastColumn="0" w:noHBand="0" w:noVBand="1"/>
+      </w:tblPr>
+      <w:tblGrid>
+        <w:gridCol w:w="1684"/>
+        <w:gridCol w:w="2473"/>
+        <w:gridCol w:w="2456"/>
+        <w:gridCol w:w="2459"/>
+      </w:tblGrid>
+      <w:tr>
+        <w:trPr>
+          <w:tblHeader/>
+          <w:tblCellSpacing w:w="15" w:type="dxa"/>
+        </w:trPr>
+        <w:tc>
+          <w:tcPr>
+            <w:tcW w:w="0" w:type="auto"/>
+            <w:vAlign w:val="center"/>
+            <w:hideMark/>
+          </w:tcPr>
+          <w:p>
+            <w:pPr>
+              <w:jc w:val="center"/>
+              <w:rPr>
+                <w:b/>
+                <w:bCs/>
+              </w:rPr>
+            </w:pPr>
+            <w:r>
+              <w:rPr>
+                <w:b/>
+                <w:bCs/>
+              </w:rPr>
+              <w:t>Expertise</w:t>
+            </w:r>
+          </w:p>
+        </w:tc>
+        <w:tc>
+          <w:tcPr>
+            <w:tcW w:w="0" w:type="auto"/>
+            <w:vAlign w:val="center"/>
+            <w:hideMark/>
+          </w:tcPr>
+          <w:p>
+            <w:pPr>
+              <w:jc w:val="center"/>
+              <w:rPr>
+                <w:b/>
+                <w:bCs/>
+              </w:rPr>
+            </w:pPr>
+            <w:r>
+              <w:rPr>
+                <w:b/>
+                <w:bCs/>
+              </w:rPr>
+              <w:t>Acceptation Phase II</w:t>
+            </w:r>
+          </w:p>
+        </w:tc>
+        <w:tc>
+          <w:tcPr>
+            <w:tcW w:w="0" w:type="auto"/>
+            <w:vAlign w:val="center"/>
+            <w:hideMark/>
+          </w:tcPr>
+          <w:p>
+            <w:pPr>
+              <w:jc w:val="center"/>
+              <w:rPr>
+                <w:b/>
+                <w:bCs/>
+              </w:rPr>
+            </w:pPr>
+            <w:r>
+              <w:rPr>
+                <w:b/>
+                <w:bCs/>
+              </w:rPr>
+              <w:t>Intention d'Adoption Future</w:t>
+            </w:r>
+          </w:p>
+        </w:tc>
+        <w:tc>
+          <w:tcPr>
+            <w:tcW w:w="0" w:type="auto"/>
+            <w:vAlign w:val="center"/>
+            <w:hideMark/>
+          </w:tcPr>
+          <w:p>
+            <w:pPr>
+              <w:jc w:val="center"/>
+              <w:rPr>
+                <w:b/>
+                <w:bCs/>
+              </w:rPr>
+            </w:pPr>
+            <w:r>
+              <w:rPr>
+                <w:b/>
+                <w:bCs/>
+              </w:rPr>
+              <w:t>Convergence</w:t>
+            </w:r>
+          </w:p>
+        </w:tc>
+      </w:tr>
+      <w:tr>
+        <w:trPr>
+          <w:tblCellSpacing w:w="15" w:type="dxa"/>
+        </w:trPr>
+        <w:tc>
+          <w:tcPr>
+            <w:tcW w:w="0" w:type="auto"/>
+            <w:vAlign w:val="center"/>
+            <w:hideMark/>
+          </w:tcPr>
+          <w:p>
+            <w:pPr>
+              <w:jc w:val="left"/>
+            </w:pPr>
+            <w:r>
+              <w:rPr>
+                <w:rStyle w:val="Strong"/>
+              </w:rPr>
+              <w:t>Novices (2)</w:t>
+            </w:r>
+          </w:p>
+        </w:tc>
+        <w:tc>
+          <w:tcPr>
+            <w:tcW w:w="0" w:type="auto"/>
+            <w:vAlign w:val="center"/>
+            <w:hideMark/>
+          </w:tcPr>
+          <w:p>
+            <w:r>
+              <w:t>50% accepte / 50% rejette</w:t>
+            </w:r>
+          </w:p>
+        </w:tc>
+        <w:tc>
+          <w:tcPr>
+            <w:tcW w:w="0" w:type="auto"/>
+            <w:vAlign w:val="center"/>
+            <w:hideMark/>
+          </w:tcPr>
+          <w:p>
+            <w:r>
+              <w:t>50% adoptera, 50% non</w:t>
+            </w:r>
+          </w:p>
+        </w:tc>
+        <w:tc>
+          <w:tcPr>
+            <w:tcW w:w="0" w:type="auto"/>
+            <w:vAlign w:val="center"/>
+            <w:hideMark/>
+          </w:tcPr>
+          <w:p>
+            <w:r>
+              <w:t>Polarisée (cohérente)</w:t>
+            </w:r>
+          </w:p>
+        </w:tc>
+      </w:tr>
+      <w:tr>
+        <w:trPr>
+          <w:tblCellSpacing w:w="15" w:type="dxa"/>
+        </w:trPr>
+        <w:tc>
+          <w:tcPr>
+            <w:tcW w:w="0" w:type="auto"/>
+            <w:vAlign w:val="center"/>
+            <w:hideMark/>
+          </w:tcPr>
+          <w:p>
+            <w:r>
+              <w:rPr>
+                <w:rStyle w:val="Strong"/>
+              </w:rPr>
+              <w:t>Intermédiaires (4)</w:t>
+            </w:r>
+          </w:p>
+        </w:tc>
+        <w:tc>
+          <w:tcPr>
+            <w:tcW w:w="0" w:type="auto"/>
+            <w:vAlign w:val="center"/>
+            <w:hideMark/>
+          </w:tcPr>
+          <w:p>
+            <w:r>
+              <w:t>75% modifie partiellement</w:t>
+            </w:r>
+          </w:p>
+        </w:tc>
+        <w:tc>
+          <w:tcPr>
+            <w:tcW w:w="0" w:type="auto"/>
+            <w:vAlign w:val="center"/>
+            <w:hideMark/>
+          </w:tcPr>
+          <w:p>
+            <w:r>
+              <w:t xml:space="preserve">0% </w:t>
+            </w:r>
+            <w:proofErr w:type="gramStart"/>
+            <w:r>
+              <w:t>adoptera;</w:t>
+            </w:r>
+            <w:proofErr w:type="gramEnd"/>
+            <w:r>
+              <w:t xml:space="preserve"> 25% explorera</w:t>
+            </w:r>
+          </w:p>
+        </w:tc>
+        <w:tc>
+          <w:tcPr>
+            <w:tcW w:w="0" w:type="auto"/>
+            <w:vAlign w:val="center"/>
+            <w:hideMark/>
+          </w:tcPr>
+          <w:p>
+            <w:r>
+              <w:rPr>
+                <w:rStyle w:val="Strong"/>
+              </w:rPr>
+              <w:t>Paradoxale</w:t>
+            </w:r>
+            <w:r>
+              <w:t xml:space="preserve"> (non-cohérente)</w:t>
+            </w:r>
+          </w:p>
+        </w:tc>
+      </w:tr>
+      <w:tr>
+        <w:trPr>
+          <w:tblCellSpacing w:w="15" w:type="dxa"/>
+        </w:trPr>
+        <w:tc>
+          <w:tcPr>
+            <w:tcW w:w="0" w:type="auto"/>
+            <w:vAlign w:val="center"/>
+            <w:hideMark/>
+          </w:tcPr>
+          <w:p>
+            <w:r>
+              <w:rPr>
+                <w:rStyle w:val="Strong"/>
+              </w:rPr>
+              <w:t>Expert (1)</w:t>
+            </w:r>
+          </w:p>
+        </w:tc>
+        <w:tc>
+          <w:tcPr>
+            <w:tcW w:w="0" w:type="auto"/>
+            <w:vAlign w:val="center"/>
+            <w:hideMark/>
+          </w:tcPr>
+          <w:p>
+            <w:r>
+              <w:t>100% accepte intégralement</w:t>
+            </w:r>
+          </w:p>
+        </w:tc>
+        <w:tc>
+          <w:tcPr>
+            <w:tcW w:w="0" w:type="auto"/>
+            <w:vAlign w:val="center"/>
+            <w:hideMark/>
+          </w:tcPr>
+          <w:p>
+            <w:r>
+              <w:t>100% adoptera</w:t>
+            </w:r>
+          </w:p>
+        </w:tc>
+        <w:tc>
+          <w:tcPr>
+            <w:tcW w:w="0" w:type="auto"/>
+            <w:vAlign w:val="center"/>
+            <w:hideMark/>
+          </w:tcPr>
+          <w:p>
+            <w:r>
+              <w:t>Linéaire (cohérente)</w:t>
+            </w:r>
+          </w:p>
+        </w:tc>
+      </w:tr>
+    </w:tbl>
+    <w:p>
+      <w:pPr>
+        <w:pStyle w:val="font-claude-response-body"/>
+      </w:pPr>
+      <w:r>
+        <w:t xml:space="preserve">Le paradoxe réside dans le groupe intermédiaire. Ces quatre participants ont trouvé la majorité des suggestions utiles et en ont intégré des éléments dans leurs plans finaux. Pourtant, </w:t>
+      </w:r>
+      <w:r>
+        <w:rPr>
+          <w:rStyle w:val="Strong"/>
+          <w:rFonts w:eastAsiaTheme="majorEastAsia"/>
+        </w:rPr>
+        <w:t>aucun n'a déclaré qu'il réutiliserait l'IA à l'avenir</w:t>
+      </w:r>
+      <w:r>
+        <w:t xml:space="preserve">. PE02 a explicité ce paradoxe lors du post-test : </w:t>
+      </w:r>
+      <w:r>
+        <w:rPr>
+          <w:rStyle w:val="Emphasis"/>
+          <w:rFonts w:eastAsiaTheme="majorEastAsia"/>
+        </w:rPr>
+        <w:t>"J'ai pu utiliser quelques idées, c'est vrai. Mais si je dois corriger les erreurs, adapter le contenu, et vérifier la pédagogie, je fais finalement le même travail qu'avant. L'IA m'aide à avoir une première ébauche, mais c'est compliqué."</w:t>
+      </w:r>
+    </w:p>
+    <w:p>
+      <w:pPr>
+        <w:pStyle w:val="font-claude-response-body"/>
+      </w:pPr>
+      <w:r>
+        <w:t xml:space="preserve">Cette remarque révèle le calcul sous-jacent : </w:t>
+      </w:r>
+      <w:r>
+        <w:rPr>
+          <w:rStyle w:val="Strong"/>
+          <w:rFonts w:eastAsiaTheme="majorEastAsia"/>
+        </w:rPr>
+        <w:t>l'acceptation partielle ne mène à l'adoption que si le rapport effort-bénéfice devient favorable</w:t>
+      </w:r>
+      <w:r>
+        <w:t xml:space="preserve">. Pour les intermédiaires, il reste </w:t>
+      </w:r>
+      <w:r>
+        <w:lastRenderedPageBreak/>
+        <w:t>défavorable (adaptation coûteuse = même effort qu'avant). Pour l'expert, il est fortement favorable (minimal editing). Pour les novices, c'est binaire (promesse vs déception).</w:t>
+      </w:r>
+    </w:p>
+    <w:p>
+      <w:pPr>
+        <w:pStyle w:val="font-claude-response-body"/>
+      </w:pPr>
+      <w:r>
+        <w:rPr>
+          <w:rStyle w:val="Strong"/>
+          <w:rFonts w:eastAsiaTheme="majorEastAsia"/>
+        </w:rPr>
+        <w:t>Tableau 5 : Seuil d'Efficacité et Décision d'Adoption</w:t>
+      </w:r>
+    </w:p>
+    <w:tbl>
+      <w:tblPr>
+        <w:tblW w:w="0" w:type="auto"/>
+        <w:tblCellSpacing w:w="15" w:type="dxa"/>
+        <w:tblCellMar>
+          <w:top w:w="15" w:type="dxa"/>
+          <w:left w:w="15" w:type="dxa"/>
+          <w:bottom w:w="15" w:type="dxa"/>
+          <w:right w:w="15" w:type="dxa"/>
+        </w:tblCellMar>
+        <w:tblLook w:val="04A0" w:firstRow="1" w:lastRow="0" w:firstColumn="1" w:lastColumn="0" w:noHBand="0" w:noVBand="1"/>
+      </w:tblPr>
+      <w:tblGrid>
+        <w:gridCol w:w="2614"/>
+        <w:gridCol w:w="1294"/>
+        <w:gridCol w:w="2154"/>
+        <w:gridCol w:w="3010"/>
+      </w:tblGrid>
+      <w:tr>
+        <w:trPr>
+          <w:tblHeader/>
+          <w:tblCellSpacing w:w="15" w:type="dxa"/>
+        </w:trPr>
+        <w:tc>
+          <w:tcPr>
+            <w:tcW w:w="0" w:type="auto"/>
+            <w:vAlign w:val="center"/>
+            <w:hideMark/>
+          </w:tcPr>
+          <w:p>
+            <w:pPr>
+              <w:jc w:val="center"/>
+              <w:rPr>
+                <w:b/>
+                <w:bCs/>
+              </w:rPr>
+            </w:pPr>
+            <w:r>
+              <w:rPr>
+                <w:b/>
+                <w:bCs/>
+              </w:rPr>
+              <w:t>Rapport Effort Observé</w:t>
+            </w:r>
+          </w:p>
+        </w:tc>
+        <w:tc>
+          <w:tcPr>
+            <w:tcW w:w="0" w:type="auto"/>
+            <w:vAlign w:val="center"/>
+            <w:hideMark/>
+          </w:tcPr>
+          <w:p>
+            <w:pPr>
+              <w:jc w:val="center"/>
+              <w:rPr>
+                <w:b/>
+                <w:bCs/>
+              </w:rPr>
+            </w:pPr>
+            <w:r>
+              <w:rPr>
+                <w:b/>
+                <w:bCs/>
+              </w:rPr>
+              <w:t>Expertise</w:t>
+            </w:r>
+          </w:p>
+        </w:tc>
+        <w:tc>
+          <w:tcPr>
+            <w:tcW w:w="0" w:type="auto"/>
+            <w:vAlign w:val="center"/>
+            <w:hideMark/>
+          </w:tcPr>
+          <w:p>
+            <w:pPr>
+              <w:jc w:val="center"/>
+              <w:rPr>
+                <w:b/>
+                <w:bCs/>
+              </w:rPr>
+            </w:pPr>
+            <w:r>
+              <w:rPr>
+                <w:b/>
+                <w:bCs/>
+              </w:rPr>
+              <w:t>Adoption Intention</w:t>
+            </w:r>
+          </w:p>
+        </w:tc>
+        <w:tc>
+          <w:tcPr>
+            <w:tcW w:w="0" w:type="auto"/>
+            <w:vAlign w:val="center"/>
+            <w:hideMark/>
+          </w:tcPr>
+          <w:p>
+            <w:pPr>
+              <w:jc w:val="center"/>
+              <w:rPr>
+                <w:b/>
+                <w:bCs/>
+              </w:rPr>
+            </w:pPr>
+            <w:r>
+              <w:rPr>
+                <w:b/>
+                <w:bCs/>
+              </w:rPr>
+              <w:t>Justification</w:t>
+            </w:r>
+          </w:p>
+        </w:tc>
+      </w:tr>
+      <w:tr>
+        <w:trPr>
+          <w:tblCellSpacing w:w="15" w:type="dxa"/>
+        </w:trPr>
+        <w:tc>
+          <w:tcPr>
+            <w:tcW w:w="0" w:type="auto"/>
+            <w:vAlign w:val="center"/>
+            <w:hideMark/>
+          </w:tcPr>
+          <w:p>
+            <w:pPr>
+              <w:jc w:val="left"/>
+            </w:pPr>
+            <w:r>
+              <w:rPr>
+                <w:rStyle w:val="Strong"/>
+              </w:rPr>
+              <w:t>Diminue le travail</w:t>
+            </w:r>
+          </w:p>
+        </w:tc>
+        <w:tc>
+          <w:tcPr>
+            <w:tcW w:w="0" w:type="auto"/>
+            <w:vAlign w:val="center"/>
+            <w:hideMark/>
+          </w:tcPr>
+          <w:p>
+            <w:r>
+              <w:t>Expert</w:t>
+            </w:r>
+          </w:p>
+        </w:tc>
+        <w:tc>
+          <w:tcPr>
+            <w:tcW w:w="0" w:type="auto"/>
+            <w:vAlign w:val="center"/>
+            <w:hideMark/>
+          </w:tcPr>
+          <w:p>
+            <w:r>
+              <w:t>"Adoptera définitivement"</w:t>
+            </w:r>
+          </w:p>
+        </w:tc>
+        <w:tc>
+          <w:tcPr>
+            <w:tcW w:w="0" w:type="auto"/>
+            <w:vAlign w:val="center"/>
+            <w:hideMark/>
+          </w:tcPr>
+          <w:p>
+            <w:r>
+              <w:t>PE07 : output immédiatement utilisable</w:t>
+            </w:r>
+          </w:p>
+        </w:tc>
+      </w:tr>
+      <w:tr>
+        <w:trPr>
+          <w:tblCellSpacing w:w="15" w:type="dxa"/>
+        </w:trPr>
+        <w:tc>
+          <w:tcPr>
+            <w:tcW w:w="0" w:type="auto"/>
+            <w:vAlign w:val="center"/>
+            <w:hideMark/>
+          </w:tcPr>
+          <w:p>
+            <w:r>
+              <w:rPr>
+                <w:rStyle w:val="Strong"/>
+              </w:rPr>
+              <w:t>Augmente/maintient le travail</w:t>
+            </w:r>
+          </w:p>
+        </w:tc>
+        <w:tc>
+          <w:tcPr>
+            <w:tcW w:w="0" w:type="auto"/>
+            <w:vAlign w:val="center"/>
+            <w:hideMark/>
+          </w:tcPr>
+          <w:p>
+            <w:r>
+              <w:t>Intermédiaire</w:t>
+            </w:r>
+          </w:p>
+        </w:tc>
+        <w:tc>
+          <w:tcPr>
+            <w:tcW w:w="0" w:type="auto"/>
+            <w:vAlign w:val="center"/>
+            <w:hideMark/>
+          </w:tcPr>
+          <w:p>
+            <w:r>
+              <w:t>"Ne réutilisera pas"</w:t>
+            </w:r>
+          </w:p>
+        </w:tc>
+        <w:tc>
+          <w:tcPr>
+            <w:tcW w:w="0" w:type="auto"/>
+            <w:vAlign w:val="center"/>
+            <w:hideMark/>
+          </w:tcPr>
+          <w:p>
+            <w:r>
+              <w:t>PE02-PE05 : adaptation coûteuse</w:t>
+            </w:r>
+          </w:p>
+        </w:tc>
+      </w:tr>
+      <w:tr>
+        <w:trPr>
+          <w:tblCellSpacing w:w="15" w:type="dxa"/>
+        </w:trPr>
+        <w:tc>
+          <w:tcPr>
+            <w:tcW w:w="0" w:type="auto"/>
+            <w:vAlign w:val="center"/>
+            <w:hideMark/>
+          </w:tcPr>
+          <w:p>
+            <w:r>
+              <w:rPr>
+                <w:rStyle w:val="Strong"/>
+              </w:rPr>
+              <w:t>Crée de la confusion</w:t>
+            </w:r>
+          </w:p>
+        </w:tc>
+        <w:tc>
+          <w:tcPr>
+            <w:tcW w:w="0" w:type="auto"/>
+            <w:vAlign w:val="center"/>
+            <w:hideMark/>
+          </w:tcPr>
+          <w:p>
+            <w:r>
+              <w:t>Novice (PE06)</w:t>
+            </w:r>
+          </w:p>
+        </w:tc>
+        <w:tc>
+          <w:tcPr>
+            <w:tcW w:w="0" w:type="auto"/>
+            <w:vAlign w:val="center"/>
+            <w:hideMark/>
+          </w:tcPr>
+          <w:p>
+            <w:r>
+              <w:t>"Ne réutilisera pas"</w:t>
+            </w:r>
+          </w:p>
+        </w:tc>
+        <w:tc>
+          <w:tcPr>
+            <w:tcW w:w="0" w:type="auto"/>
+            <w:vAlign w:val="center"/>
+            <w:hideMark/>
+          </w:tcPr>
+          <w:p>
+            <w:r>
+              <w:t>Perception négative domine</w:t>
+            </w:r>
+          </w:p>
+        </w:tc>
+      </w:tr>
+      <w:tr>
+        <w:trPr>
+          <w:tblCellSpacing w:w="15" w:type="dxa"/>
+        </w:trPr>
+        <w:tc>
+          <w:tcPr>
+            <w:tcW w:w="0" w:type="auto"/>
+            <w:vAlign w:val="center"/>
+            <w:hideMark/>
+          </w:tcPr>
+          <w:p>
+            <w:r>
+              <w:rPr>
+                <w:rStyle w:val="Strong"/>
+              </w:rPr>
+              <w:t>Ouvre la possibilité</w:t>
+            </w:r>
+          </w:p>
+        </w:tc>
+        <w:tc>
+          <w:tcPr>
+            <w:tcW w:w="0" w:type="auto"/>
+            <w:vAlign w:val="center"/>
+            <w:hideMark/>
+          </w:tcPr>
+          <w:p>
+            <w:r>
+              <w:t>Novice (PE01)</w:t>
+            </w:r>
+          </w:p>
+        </w:tc>
+        <w:tc>
+          <w:tcPr>
+            <w:tcW w:w="0" w:type="auto"/>
+            <w:vAlign w:val="center"/>
+            <w:hideMark/>
+          </w:tcPr>
+          <w:p>
+            <w:r>
+              <w:t>"Explorera à l'avenir"</w:t>
+            </w:r>
+          </w:p>
+        </w:tc>
+        <w:tc>
+          <w:tcPr>
+            <w:tcW w:w="0" w:type="auto"/>
+            <w:vAlign w:val="center"/>
+            <w:hideMark/>
+          </w:tcPr>
+          <w:p>
+            <w:r>
+              <w:t>Volonté d'apprendre domine</w:t>
+            </w:r>
+          </w:p>
+        </w:tc>
+      </w:tr>
+    </w:tbl>
+    <w:p>
+      <w:r>
+        <w:rPr>
+          <w:noProof/>
+        </w:rPr>
+        <w:pict w14:anchorId="2C302948">
+          <v:rect id="_x0000_i1025" alt="" style="width:451.3pt;height:.05pt;mso-width-percent:0;mso-height-percent:0;mso-width-percent:0;mso-height-percent:0" o:hralign="center" o:hrstd="t" o:hr="t" fillcolor="#a0a0a0" stroked="f"/>
+        </w:pict>
+      </w:r>
+    </w:p>
+    <w:p>
+      <w:pPr>
+        <w:pStyle w:val="Heading3"/>
+      </w:pPr>
+      <w:r>
+        <w:rPr>
+          <w:rStyle w:val="Strong"/>
+          <w:b/>
+          <w:bCs/>
+        </w:rPr>
+        <w:t>5.5 Synthèse des Dynamiques Analytiques</w:t>
+      </w:r>
+    </w:p>
+    <w:p>
+      <w:pPr>
+        <w:pStyle w:val="font-claude-response-body"/>
+      </w:pPr>
+      <w:r>
+        <w:t xml:space="preserve">L'analyse croisée des trois axes (questionnaire, phase comparative, feedback) révèle trois </w:t>
+      </w:r>
+      <w:r>
+        <w:rPr>
+          <w:rStyle w:val="Strong"/>
+          <w:rFonts w:eastAsiaTheme="majorEastAsia"/>
+        </w:rPr>
+        <w:t>dynamiques fondamentales</w:t>
+      </w:r>
+      <w:r>
+        <w:t xml:space="preserve"> expliquant pourquoi l'adoption de l'IA reste basse (57.1% ne réutilisera pas) malgré une acceptation partielle et une reconnaissance d'utilité.</w:t>
+      </w:r>
+    </w:p>
+    <w:p>
+      <w:pPr>
+        <w:pStyle w:val="font-claude-response-body"/>
+      </w:pPr>
+      <w:r>
+        <w:rPr>
+          <w:rStyle w:val="Strong"/>
+          <w:rFonts w:eastAsiaTheme="majorEastAsia"/>
+        </w:rPr>
+        <w:t>Dynamique 1 : Expertise crée du discernement, pas juste de la facilité.</w:t>
+      </w:r>
+      <w:r>
+        <w:br/>
+        <w:t xml:space="preserve">Les novices sont binaires dans leur évaluation (tout ou rien). Les intermédiaires émergent comme des </w:t>
+      </w:r>
+      <w:r>
+        <w:rPr>
+          <w:rStyle w:val="Strong"/>
+          <w:rFonts w:eastAsiaTheme="majorEastAsia"/>
+        </w:rPr>
+        <w:t>évaluateurs critiques</w:t>
+      </w:r>
+      <w:r>
+        <w:t xml:space="preserve"> capables de tri sélectif. L'expert devient un </w:t>
+      </w:r>
+      <w:r>
+        <w:rPr>
+          <w:rStyle w:val="Strong"/>
+          <w:rFonts w:eastAsiaTheme="majorEastAsia"/>
+        </w:rPr>
+        <w:t>optimisateur</w:t>
+      </w:r>
+      <w:r>
+        <w:t xml:space="preserve"> capable de formuler exactement ce qu'il veut et de recevoir exactement ce qu'il a demandé. Cette progression ne résout pas automatiquement les barrières pédagogiques disciplinaires, mais elle change complètement la </w:t>
+      </w:r>
+      <w:r>
+        <w:rPr>
+          <w:rStyle w:val="Strong"/>
+          <w:rFonts w:eastAsiaTheme="majorEastAsia"/>
+        </w:rPr>
+        <w:t>relation de négociation</w:t>
+      </w:r>
+      <w:r>
+        <w:t xml:space="preserve"> avec l'outil.</w:t>
+      </w:r>
+    </w:p>
+    <w:p>
+      <w:pPr>
+        <w:pStyle w:val="font-claude-response-body"/>
+      </w:pPr>
+      <w:r>
+        <w:rPr>
+          <w:rStyle w:val="Strong"/>
+          <w:rFonts w:eastAsiaTheme="majorEastAsia"/>
+        </w:rPr>
+        <w:t>Dynamique 2 : La discipline impose des contraintes structurelles inévitables.</w:t>
+      </w:r>
+      <w:r>
+        <w:br/>
+        <w:t xml:space="preserve">Les groupes d'anglais et de français ont rencontré des barrières différentes (généricité vs accuracy), toutes deux liées au </w:t>
+      </w:r>
+      <w:r>
+        <w:rPr>
+          <w:rStyle w:val="Strong"/>
+          <w:rFonts w:eastAsiaTheme="majorEastAsia"/>
+        </w:rPr>
+        <w:t>design et aux données d'entraînement</w:t>
+      </w:r>
+      <w:r>
+        <w:t xml:space="preserve"> du modèle IA, dominés par l'anglais. Aucune formation générale initiale n'a résolu ces contraintes. Chaque groupe a dû adapter indépendamment. Cela suggère que </w:t>
+      </w:r>
+      <w:r>
+        <w:rPr>
+          <w:rStyle w:val="Strong"/>
+          <w:rFonts w:eastAsiaTheme="majorEastAsia"/>
+        </w:rPr>
+        <w:t>les barrières disciplinaires ne sont pas surmontables par l'expertise technologique seule</w:t>
+      </w:r>
+      <w:r>
+        <w:t>.</w:t>
+      </w:r>
+    </w:p>
+    <w:p>
+      <w:pPr>
+        <w:pStyle w:val="font-claude-response-body"/>
+      </w:pPr>
+      <w:r>
+        <w:rPr>
+          <w:rStyle w:val="Strong"/>
+          <w:rFonts w:eastAsiaTheme="majorEastAsia"/>
+        </w:rPr>
+        <w:t>Dynamique 3 : L'adoption future dépend d'un seuil d'efficacité, non d'utilité reconnue.</w:t>
+      </w:r>
+      <w:r>
+        <w:br/>
+        <w:t xml:space="preserve">Les intermédiaires reconnaissent que l'IA a généré "certains bons éléments," mais considèrent que l'adaptation coûteuse rend l'outil </w:t>
+      </w:r>
+      <w:r>
+        <w:rPr>
+          <w:rStyle w:val="Strong"/>
+          <w:rFonts w:eastAsiaTheme="majorEastAsia"/>
+        </w:rPr>
+        <w:t>inefficace en pratique</w:t>
+      </w:r>
+      <w:r>
+        <w:t>. Le calcul n'est pas "est-ce utile?" (réponse : partiellement), mais "est-ce que ça économise du travail net?" (réponse : non). Cette distinction explique pourquoi l'adoption reste faible malgré l'utilité reconnue.</w:t>
+      </w:r>
+    </w:p>
+    <w:p>
+      <w:pPr>
+        <w:rPr>
+          <w:lang w:val="en-FR"/>
+        </w:rPr>
+      </w:pPr>
+    </w:p>
+    <w:p>
+      <w:pPr>
+        <w:pStyle w:val="Heading4"/>
+        <w:rPr>
+          <w:lang w:val="fr-FR"/>
+        </w:rPr>
+      </w:pPr>
+    </w:p>
     <w:p/>
-    <w:p>
-      <w:pPr>
-        <w:pStyle w:val="Heading4"/>
-        <w:rPr>
-          <w:lang w:val="fr-FR"/>
-        </w:rPr>
-      </w:pPr>
-      <w:r>
-        <w:rPr>
-          <w:lang w:val="fr-FR"/>
-        </w:rPr>
-        <w:br w:type="page"/>
-      </w:r>
-    </w:p>
+    <w:p/>
+    <w:p/>
+    <w:p/>
+    <w:p/>
+    <w:p/>
+    <w:p/>
+    <w:p/>
+    <w:p/>
+    <w:p/>
+    <w:p/>
+    <w:p/>
+    <w:p/>
+    <w:p/>
+    <w:p/>
+    <w:p/>
+    <w:p/>
+    <w:p/>
+    <w:p/>
+    <w:p/>
+    <w:p/>
     <w:p>
       <w:pPr>
         <w:pStyle w:val="Heading1"/>
@@ -16118,15 +18622,15 @@
           <w:rFonts w:eastAsia="Times New Roman"/>
           <w:lang w:val="fr-FR" w:eastAsia="en-IN"/>
         </w:rPr>
+        <w:t>Inferences</w:t>
+      </w:r>
+      <w:bookmarkEnd w:id="61"/>
+      <w:proofErr w:type="spellEnd"/>
+    </w:p>
+    <w:p/>
+    <w:p>
+      <w:r>
         <w:lastRenderedPageBreak/>
-        <w:t>Inferences</w:t>
-      </w:r>
-      <w:bookmarkEnd w:id="61"/>
-      <w:proofErr w:type="spellEnd"/>
-    </w:p>
-    <w:p/>
-    <w:p>
-      <w:r>
         <w:t xml:space="preserve">Mox dicta </w:t>
       </w:r>
       <w:proofErr w:type="spellStart"/>
@@ -22499,6 +25003,7 @@
   <w:style w:type="character" w:default="1" w:styleId="DefaultParagraphFont">
     <w:name w:val="Default Paragraph Font"/>
     <w:uiPriority w:val="1"/>
+    <w:semiHidden/>
     <w:unhideWhenUsed/>
   </w:style>
   <w:style w:type="table" w:default="1" w:styleId="TableNormal">
@@ -23377,6 +25882,17 @@
       <w:rFonts w:ascii="Neutra Text" w:hAnsi="Neutra Text"/>
     </w:rPr>
   </w:style>
+  <w:style w:type="character" w:styleId="Emphasis">
+    <w:name w:val="Emphasis"/>
+    <w:basedOn w:val="DefaultParagraphFont"/>
+    <w:uiPriority w:val="20"/>
+    <w:qFormat/>
+    <w:rsid w:val="003277C2"/>
+    <w:rPr>
+      <w:i/>
+      <w:iCs/>
+    </w:rPr>
+  </w:style>
 </w:styles>
 </file>
 

</xml_diff>